<commit_message>
docs: record phase 0 implementation evidence
</commit_message>
<xml_diff>
--- a/CEDIAH Web Status.docx
+++ b/CEDIAH Web Status.docx
@@ -21293,7 +21293,7 @@
               <w:spacing w:after="40"/>
             </w:pPr>
             <w:r>
-              <w:t>pnpm install, lint, typecheck, test (2/2), peers check, audit (sin vulnerabilidades conocidas) y build: PASS. VER-001 local 1440 x 900 y VER-002 local 390 x 844: PASS; API conectada, sin overflow ni errores de consola.</w:t>
+              <w:t>pnpm install, lint, typecheck, test (2/2), peers check, audit (sin vulnerabilidades conocidas) y build: PASS. VER-001 local 1440 x 900 y VER-002 local 390 x 844: PASS; API conectada, sin overflow ni errores de consola. Commit inicial: 4292402.</w:t>
             </w:r>
           </w:p>
         </w:tc>
@@ -21902,7 +21902,7 @@
               <w:rPr>
                 <w:sz w:val="17"/>
               </w:rPr>
-              <w:t>Registro de esta ejecución: endpoint /api/system-health HTTP 200 y no-store; respuesta API status=ok; página HTTP 200 con CSP nonce, DENY, nosniff, Permissions-Policy y COOP; capturas revisadas en navegador para escritorio y móvil.</w:t>
+              <w:t>Registro de esta ejecución: endpoint /api/system-health HTTP 200 y no-store; respuesta API status=ok; página HTTP 200 con CSP nonce, DENY, nosniff, Permissions-Policy y COOP; capturas revisadas en navegador para escritorio y móvil. Repositorio local en main; commit inicial 4292402.</w:t>
             </w:r>
           </w:p>
         </w:tc>

</xml_diff>

<commit_message>
docs: record demo catalog and github publication
</commit_message>
<xml_diff>
--- a/CEDIAH Web Status.docx
+++ b/CEDIAH Web Status.docx
@@ -175,11 +175,8 @@
             <w:vAlign w:val="top"/>
           </w:tcPr>
           <w:p>
-            <w:pPr>
-              <w:spacing w:after="40"/>
-            </w:pPr>
-            <w:r>
-              <w:t>1.3</w:t>
+            <w:r>
+              <w:t>1.4</w:t>
             </w:r>
           </w:p>
         </w:tc>
@@ -229,14 +226,8 @@
             <w:vAlign w:val="top"/>
           </w:tcPr>
           <w:p>
-            <w:pPr>
-              <w:spacing w:after="40"/>
-            </w:pPr>
-            <w:r>
-              <w:rPr>
-                <w:sz w:val="17"/>
-              </w:rPr>
-              <w:t>31 de julio de 2026</w:t>
+            <w:r>
+              <w:t>1 de agosto de 2026</w:t>
             </w:r>
           </w:p>
         </w:tc>
@@ -284,18 +275,8 @@
             <w:vAlign w:val="top"/>
           </w:tcPr>
           <w:p>
-            <w:pPr>
-              <w:spacing w:after="40"/>
-            </w:pPr>
-            <w:r>
-              <w:t>Fase 0 en curso - base técnica local implementada y verificada; despliegues, acuerdos y contención de credenciales pendientes</w:t>
-            </w:r>
-            <w:r>
-              <w:rPr>
-                <w:rFonts w:ascii="Aptos" w:hAnsi="Aptos"/>
-                <w:color w:val="14233B"/>
-                <w:sz w:val="17"/>
-              </w:rPr>
+            <w:r>
+              <w:t>Fase 1 en curso - landing y catálogo genérico responsive verificados; repositorio publicado en GitHub; contenido real, autenticación y despliegues pendientes</w:t>
             </w:r>
           </w:p>
         </w:tc>
@@ -472,7 +453,7 @@
         <w:jc w:val="center"/>
       </w:pPr>
       <w:r>
-        <w:t>Nombre de producto provisional. Confirmar si la marca oficial es CEDIA o CEDIAH antes de publicar.</w:t>
+        <w:t>Nombre oficial confirmado: CEDIAH. La identidad visual actual es provisional hasta recibir logo, paleta, tipografías y autorización de uso de marca.</w:t>
       </w:r>
     </w:p>
     <w:p>
@@ -1619,16 +1600,8 @@
             <w:vAlign w:val="center"/>
           </w:tcPr>
           <w:p>
-            <w:pPr>
-              <w:jc w:val="left"/>
-            </w:pPr>
-            <w:r>
-              <w:rPr>
-                <w:b/>
-                <w:color w:val="FFFFFF"/>
-                <w:sz w:val="17"/>
-              </w:rPr>
-              <w:t>Estado al 31/07/2026</w:t>
+            <w:r>
+              <w:t>Estado al 01/08/2026</w:t>
             </w:r>
           </w:p>
         </w:tc>
@@ -1704,14 +1677,8 @@
             <w:vAlign w:val="top"/>
           </w:tcPr>
           <w:p>
-            <w:pPr>
-              <w:spacing w:after="40"/>
-            </w:pPr>
-            <w:r>
-              <w:rPr>
-                <w:sz w:val="17"/>
-              </w:rPr>
-              <w:t>No existe</w:t>
+            <w:r>
+              <w:t>Base local operativa</w:t>
             </w:r>
           </w:p>
         </w:tc>
@@ -1729,14 +1696,8 @@
             <w:vAlign w:val="top"/>
           </w:tcPr>
           <w:p>
-            <w:pPr>
-              <w:spacing w:after="40"/>
-            </w:pPr>
-            <w:r>
-              <w:rPr>
-                <w:sz w:val="17"/>
-              </w:rPr>
-              <w:t>La carpeta contiene documentos, pero no una aplicación ni package.json.</w:t>
+            <w:r>
+              <w:t>Monorepo pnpm con web Next.js, API Fastify, contratos compartidos y catálogo de ocho cursos de demostración.</w:t>
             </w:r>
           </w:p>
         </w:tc>
@@ -1786,14 +1747,8 @@
             <w:vAlign w:val="top"/>
           </w:tcPr>
           <w:p>
-            <w:pPr>
-              <w:spacing w:after="40"/>
-            </w:pPr>
-            <w:r>
-              <w:rPr>
-                <w:sz w:val="17"/>
-              </w:rPr>
-              <w:t>No existe</w:t>
+            <w:r>
+              <w:t>Git main + GitHub</w:t>
             </w:r>
           </w:p>
         </w:tc>
@@ -1812,14 +1767,8 @@
             <w:vAlign w:val="top"/>
           </w:tcPr>
           <w:p>
-            <w:pPr>
-              <w:spacing w:after="40"/>
-            </w:pPr>
-            <w:r>
-              <w:rPr>
-                <w:sz w:val="17"/>
-              </w:rPr>
-              <w:t>La carpeta no es un repositorio Git. Debe inicializarse en Fase 0.</w:t>
+            <w:r>
+              <w:t>Origin apunta a https://github.com/jdqd1/cediah.git. Commits 4292402, 3cbd859 y db8cbe8 publicados en main; protección de rama pendiente.</w:t>
             </w:r>
           </w:p>
         </w:tc>
@@ -1949,14 +1898,8 @@
             <w:vAlign w:val="top"/>
           </w:tcPr>
           <w:p>
-            <w:pPr>
-              <w:spacing w:after="40"/>
-            </w:pPr>
-            <w:r>
-              <w:rPr>
-                <w:sz w:val="17"/>
-              </w:rPr>
-              <w:t>Cuentas mencionadas, integración no comprobada</w:t>
+            <w:r>
+              <w:t>Configuración inicial en código; despliegues no ejecutados</w:t>
             </w:r>
           </w:p>
         </w:tc>
@@ -1975,14 +1918,8 @@
             <w:vAlign w:val="top"/>
           </w:tcPr>
           <w:p>
-            <w:pPr>
-              <w:spacing w:after="40"/>
-            </w:pPr>
-            <w:r>
-              <w:rPr>
-                <w:sz w:val="17"/>
-              </w:rPr>
-              <w:t>No se asume que Supabase, Render o GitHub estén configurados correctamente.</w:t>
+            <w:r>
+              <w:t>Vercel, Render y Supabase tienen configuración o scaffolding portable. Aún no se conectaron cuentas ni ambientes remotos.</w:t>
             </w:r>
           </w:p>
         </w:tc>
@@ -2030,14 +1967,8 @@
             <w:vAlign w:val="top"/>
           </w:tcPr>
           <w:p>
-            <w:pPr>
-              <w:spacing w:after="40"/>
-            </w:pPr>
-            <w:r>
-              <w:rPr>
-                <w:sz w:val="17"/>
-              </w:rPr>
-              <w:t>No recibido</w:t>
+            <w:r>
+              <w:t>Datos genéricos de demostración</w:t>
             </w:r>
           </w:p>
         </w:tc>
@@ -2055,14 +1986,8 @@
             <w:vAlign w:val="top"/>
           </w:tcPr>
           <w:p>
-            <w:pPr>
-              <w:spacing w:after="40"/>
-            </w:pPr>
-            <w:r>
-              <w:rPr>
-                <w:sz w:val="17"/>
-              </w:rPr>
-              <w:t>Falta seleccionar y preparar el curso vertical de demostración.</w:t>
+            <w:r>
+              <w:t>Cuello, tórax, abdomen, pelvis y periné, miembros, cabeza y neuroanatomía. No hay programas, docentes, materiales ni videos reales.</w:t>
             </w:r>
           </w:p>
         </w:tc>
@@ -2112,14 +2037,8 @@
             <w:vAlign w:val="top"/>
           </w:tcPr>
           <w:p>
-            <w:pPr>
-              <w:spacing w:after="40"/>
-            </w:pPr>
-            <w:r>
-              <w:rPr>
-                <w:sz w:val="17"/>
-              </w:rPr>
-              <w:t>No recibidos</w:t>
+            <w:r>
+              <w:t>Dirección visual provisional implementada</w:t>
             </w:r>
           </w:p>
         </w:tc>
@@ -2138,14 +2057,8 @@
             <w:vAlign w:val="top"/>
           </w:tcPr>
           <w:p>
-            <w:pPr>
-              <w:spacing w:after="40"/>
-            </w:pPr>
-            <w:r>
-              <w:rPr>
-                <w:sz w:val="17"/>
-              </w:rPr>
-              <w:t>Faltan logo, paleta autorizada, tipografías, tono y reglas de uso.</w:t>
+            <w:r>
+              <w:t>Nombre CEDIAH confirmado; composición editorial responsive verificada. Logo, paleta y tipografías autorizadas siguen pendientes.</w:t>
             </w:r>
           </w:p>
         </w:tc>
@@ -2193,14 +2106,8 @@
             <w:vAlign w:val="top"/>
           </w:tcPr>
           <w:p>
-            <w:pPr>
-              <w:spacing w:after="40"/>
-            </w:pPr>
-            <w:r>
-              <w:rPr>
-                <w:sz w:val="17"/>
-              </w:rPr>
-              <w:t>No aplican todavía</w:t>
+            <w:r>
+              <w:t>Landing y catálogo: PASS local</w:t>
             </w:r>
           </w:p>
         </w:tc>
@@ -2218,14 +2125,8 @@
             <w:vAlign w:val="top"/>
           </w:tcPr>
           <w:p>
-            <w:pPr>
-              <w:spacing w:after="40"/>
-            </w:pPr>
-            <w:r>
-              <w:rPr>
-                <w:sz w:val="17"/>
-              </w:rPr>
-              <w:t>No existe aplicación ejecutable que verificar.</w:t>
+            <w:r>
+              <w:t>Verificado en 360 x 800, 390 x 844, 768 x 1024 y 1440 x 900; sin overflow horizontal ni errores o advertencias de consola.</w:t>
             </w:r>
           </w:p>
         </w:tc>
@@ -4237,14 +4138,8 @@
             <w:vAlign w:val="top"/>
           </w:tcPr>
           <w:p>
-            <w:pPr>
-              <w:spacing w:after="40"/>
-            </w:pPr>
-            <w:r>
-              <w:rPr>
-                <w:sz w:val="17"/>
-              </w:rPr>
-              <w:t>Tailwind CSS + componentes accesibles basados en Radix / shadcn/ui</w:t>
+            <w:r>
+              <w:t>CSS propio con tokens semánticos; componentes accesibles headless cuando la interacción lo requiera</w:t>
             </w:r>
           </w:p>
         </w:tc>
@@ -4263,14 +4158,8 @@
             <w:vAlign w:val="top"/>
           </w:tcPr>
           <w:p>
-            <w:pPr>
-              <w:spacing w:after="40"/>
-            </w:pPr>
-            <w:r>
-              <w:rPr>
-                <w:sz w:val="17"/>
-              </w:rPr>
-              <w:t>Sistema visual consistente, responsive y rápido de iterar sin imponer una interfaz genérica.</w:t>
+            <w:r>
+              <w:t>La landing usa una dirección editorial propia y ligera. Tailwind o una librería de componentes se evaluarán para pantallas operativas sin imponer una estética genérica.</w:t>
             </w:r>
           </w:p>
         </w:tc>
@@ -10835,13 +10724,7 @@
         <w:ind w:left="255" w:hanging="255"/>
       </w:pPr>
       <w:r>
-        <w:rPr>
-          <w:b/>
-        </w:rPr>
-        <w:t xml:space="preserve">[ ] </w:t>
-      </w:r>
-      <w:r>
-        <w:t>Confirmar nombre oficial: CEDIA o CEDIAH; reunir logo, paleta, tipografías y autorización de marca.</w:t>
+        <w:t>[~] Nombre oficial confirmado: CEDIAH. Pendiente reunir logo, paleta, tipografías y autorización de marca.</w:t>
       </w:r>
     </w:p>
     <w:p>
@@ -11374,13 +11257,40 @@
         <w:ind w:left="255" w:hanging="255"/>
       </w:pPr>
       <w:r>
+        <w:t>[~] Tokens provisionales de color, tipografía, espacio y movimiento implementados; falta adaptarlos a la marca autorizada.</w:t>
+      </w:r>
+    </w:p>
+    <w:p>
+      <w:pPr>
+        <w:pStyle w:val="Checklist"/>
+        <w:ind w:left="255" w:hanging="255"/>
+      </w:pPr>
+      <w:r>
         <w:rPr>
           <w:b/>
         </w:rPr>
         <w:t xml:space="preserve">[ ] </w:t>
       </w:r>
       <w:r>
-        <w:t>Definir tokens de color, tipografía, espacio, radios, elevación y movimiento a partir de la marca.</w:t>
+        <w:t>Construir layout público, layout autenticado y layout administrativo en una sola aplicación.</w:t>
+      </w:r>
+    </w:p>
+    <w:p>
+      <w:pPr>
+        <w:pStyle w:val="Checklist"/>
+        <w:ind w:left="255" w:hanging="255"/>
+      </w:pPr>
+      <w:r>
+        <w:t>[~] Header y navegación responsive implementados en la landing; sidebar, buscador y estados de plan siguen pendientes.</w:t>
+      </w:r>
+    </w:p>
+    <w:p>
+      <w:pPr>
+        <w:pStyle w:val="Checklist"/>
+        <w:ind w:left="255" w:hanging="255"/>
+      </w:pPr>
+      <w:r>
+        <w:t>[~] Landing y catálogo de demostración implementados; ficha de curso, login, registro y recuperación visual siguen pendientes.</w:t>
       </w:r>
     </w:p>
     <w:p>
@@ -11395,7 +11305,7 @@
         <w:t xml:space="preserve">[ ] </w:t>
       </w:r>
       <w:r>
-        <w:t>Construir layout público, layout autenticado y layout administrativo en una sola aplicación.</w:t>
+        <w:t>Implementar dashboard del estudiante con continuar, progreso, recursos y próximos eventos.</w:t>
       </w:r>
     </w:p>
     <w:p>
@@ -11410,7 +11320,7 @@
         <w:t xml:space="preserve">[ ] </w:t>
       </w:r>
       <w:r>
-        <w:t>Crear header, navegación móvil, sidebar de escritorio, buscador y estados de plan.</w:t>
+        <w:t>Implementar vista de lección con reproductor de demostración, temario y recursos.</w:t>
       </w:r>
     </w:p>
     <w:p>
@@ -11425,7 +11335,7 @@
         <w:t xml:space="preserve">[ ] </w:t>
       </w:r>
       <w:r>
-        <w:t>Implementar landing, catálogo, ficha del curso, login, registro y recuperación visual.</w:t>
+        <w:t>Implementar vistas de cuestionario, flashcards, certificado y verificación con datos semilla.</w:t>
       </w:r>
     </w:p>
     <w:p>
@@ -11440,7 +11350,7 @@
         <w:t xml:space="preserve">[ ] </w:t>
       </w:r>
       <w:r>
-        <w:t>Implementar dashboard del estudiante con continuar, progreso, recursos y próximos eventos.</w:t>
+        <w:t>Implementar esqueleto del panel administrativo y editor básico de curso con datos semilla.</w:t>
       </w:r>
     </w:p>
     <w:p>
@@ -11455,7 +11365,7 @@
         <w:t xml:space="preserve">[ ] </w:t>
       </w:r>
       <w:r>
-        <w:t>Implementar vista de lección con reproductor de demostración, temario y recursos.</w:t>
+        <w:t>Añadir estados vacío, carga, error, acceso bloqueado y contenido completado.</w:t>
       </w:r>
     </w:p>
     <w:p>
@@ -11464,58 +11374,7 @@
         <w:ind w:left="255" w:hanging="255"/>
       </w:pPr>
       <w:r>
-        <w:rPr>
-          <w:b/>
-        </w:rPr>
-        <w:t xml:space="preserve">[ ] </w:t>
-      </w:r>
-      <w:r>
-        <w:t>Implementar vistas de cuestionario, flashcards, certificado y verificación con datos semilla.</w:t>
-      </w:r>
-    </w:p>
-    <w:p>
-      <w:pPr>
-        <w:pStyle w:val="Checklist"/>
-        <w:ind w:left="255" w:hanging="255"/>
-      </w:pPr>
-      <w:r>
-        <w:rPr>
-          <w:b/>
-        </w:rPr>
-        <w:t xml:space="preserve">[ ] </w:t>
-      </w:r>
-      <w:r>
-        <w:t>Implementar esqueleto del panel administrativo y editor básico de curso con datos semilla.</w:t>
-      </w:r>
-    </w:p>
-    <w:p>
-      <w:pPr>
-        <w:pStyle w:val="Checklist"/>
-        <w:ind w:left="255" w:hanging="255"/>
-      </w:pPr>
-      <w:r>
-        <w:rPr>
-          <w:b/>
-        </w:rPr>
-        <w:t xml:space="preserve">[ ] </w:t>
-      </w:r>
-      <w:r>
-        <w:t>Añadir estados vacío, carga, error, acceso bloqueado y contenido completado.</w:t>
-      </w:r>
-    </w:p>
-    <w:p>
-      <w:pPr>
-        <w:pStyle w:val="Checklist"/>
-        <w:ind w:left="255" w:hanging="255"/>
-      </w:pPr>
-      <w:r>
-        <w:rPr>
-          <w:b/>
-        </w:rPr>
-        <w:t xml:space="preserve">[ ] </w:t>
-      </w:r>
-      <w:r>
-        <w:t>Revisar texto, jerarquía, navegación, foco, contraste, teclado y objetivos táctiles.</w:t>
+        <w:t>[~] Texto, jerarquía, navegación por anclas, contraste y objetivos táctiles revisados en landing y catálogo; falta la revisión completa de los recorridos futuros.</w:t>
       </w:r>
     </w:p>
     <w:p>
@@ -16694,14 +16553,8 @@
             <w:vAlign w:val="top"/>
           </w:tcPr>
           <w:p>
-            <w:pPr>
-              <w:spacing w:after="40"/>
-            </w:pPr>
-            <w:r>
-              <w:rPr>
-                <w:sz w:val="17"/>
-              </w:rPr>
-              <w:t>[ ] Pendiente</w:t>
+            <w:r>
+              <w:t>[~] Base y GitHub listos; protección de main pendiente</w:t>
             </w:r>
           </w:p>
         </w:tc>
@@ -19046,14 +18899,8 @@
             <w:vAlign w:val="top"/>
           </w:tcPr>
           <w:p>
-            <w:pPr>
-              <w:spacing w:after="40"/>
-            </w:pPr>
-            <w:r>
-              <w:rPr>
-                <w:sz w:val="17"/>
-              </w:rPr>
-              <w:t>Abierta - antes de diseño público</w:t>
+            <w:r>
+              <w:t>Resuelta 01/08/2026 - el nombre oficial de la plataforma es CEDIAH; recursos visuales pendientes</w:t>
             </w:r>
           </w:p>
         </w:tc>
@@ -21321,6 +21168,90 @@
           </w:p>
         </w:tc>
       </w:tr>
+      <w:tr>
+        <w:tc>
+          <w:tcPr>
+            <w:tcW w:type="dxa" w:w="2493"/>
+            <w:vAlign w:val="top"/>
+            <w:tcBorders>
+              <w:top w:val="single" w:sz="4" w:color="D9DEE7"/>
+              <w:left w:val="single" w:sz="4" w:color="D9DEE7"/>
+              <w:bottom w:val="single" w:sz="4" w:color="D9DEE7"/>
+              <w:right w:val="single" w:sz="4" w:color="D9DEE7"/>
+              <w:insideH w:val="single" w:sz="4" w:color="D9DEE7"/>
+              <w:insideV w:val="single" w:sz="4" w:color="D9DEE7"/>
+            </w:tcBorders>
+            <w:shd w:fill="F7F8FA"/>
+          </w:tcPr>
+          <w:p>
+            <w:r>
+              <w:t>CHG-002</w:t>
+              <w:br/>
+              <w:t>01/08/2026</w:t>
+            </w:r>
+          </w:p>
+        </w:tc>
+        <w:tc>
+          <w:tcPr>
+            <w:tcW w:type="dxa" w:w="2493"/>
+            <w:vAlign w:val="top"/>
+            <w:tcBorders>
+              <w:top w:val="single" w:sz="4" w:color="D9DEE7"/>
+              <w:left w:val="single" w:sz="4" w:color="D9DEE7"/>
+              <w:bottom w:val="single" w:sz="4" w:color="D9DEE7"/>
+              <w:right w:val="single" w:sz="4" w:color="D9DEE7"/>
+              <w:insideH w:val="single" w:sz="4" w:color="D9DEE7"/>
+              <w:insideV w:val="single" w:sz="4" w:color="D9DEE7"/>
+            </w:tcBorders>
+            <w:shd w:fill="F7F8FA"/>
+          </w:tcPr>
+          <w:p>
+            <w:r>
+              <w:t>Nombre CEDIAH confirmado; catálogo demo de ocho regiones; VideoProvider preparado para carga directa temporal; origin configurado y main publicado en GitHub.</w:t>
+            </w:r>
+          </w:p>
+        </w:tc>
+        <w:tc>
+          <w:tcPr>
+            <w:tcW w:type="dxa" w:w="2493"/>
+            <w:vAlign w:val="top"/>
+            <w:tcBorders>
+              <w:top w:val="single" w:sz="4" w:color="D9DEE7"/>
+              <w:left w:val="single" w:sz="4" w:color="D9DEE7"/>
+              <w:bottom w:val="single" w:sz="4" w:color="D9DEE7"/>
+              <w:right w:val="single" w:sz="4" w:color="D9DEE7"/>
+              <w:insideH w:val="single" w:sz="4" w:color="D9DEE7"/>
+              <w:insideV w:val="single" w:sz="4" w:color="D9DEE7"/>
+            </w:tcBorders>
+            <w:shd w:fill="F7F8FA"/>
+          </w:tcPr>
+          <w:p>
+            <w:r>
+              <w:t>lint, typecheck, test (2/2), build y audit: PASS. VER-003 a VER-006: PASS en cuatro viewports; 8 cursos, navegación correcta, cero overflow y cero errores de consola.</w:t>
+            </w:r>
+          </w:p>
+        </w:tc>
+        <w:tc>
+          <w:tcPr>
+            <w:tcW w:type="dxa" w:w="2493"/>
+            <w:vAlign w:val="top"/>
+            <w:tcBorders>
+              <w:top w:val="single" w:sz="4" w:color="D9DEE7"/>
+              <w:left w:val="single" w:sz="4" w:color="D9DEE7"/>
+              <w:bottom w:val="single" w:sz="4" w:color="D9DEE7"/>
+              <w:right w:val="single" w:sz="4" w:color="D9DEE7"/>
+              <w:insideH w:val="single" w:sz="4" w:color="D9DEE7"/>
+              <w:insideV w:val="single" w:sz="4" w:color="D9DEE7"/>
+            </w:tcBorders>
+            <w:shd w:fill="F7F8FA"/>
+          </w:tcPr>
+          <w:p>
+            <w:r>
+              <w:t>[~] Fase 1 en curso. Próximo: seleccionar el curso vertical, recibir contenido autorizado e implementar su ficha antes de activar cargas.</w:t>
+            </w:r>
+          </w:p>
+        </w:tc>
+      </w:tr>
     </w:tbl>
     <w:p>
       <w:pPr>
@@ -22028,10 +21959,9 @@
     <w:p>
       <w:pPr>
         <w:pStyle w:val="Heading2"/>
-        <w:keepNext w:val="1"/>
-      </w:pPr>
-      <w:r>
-        <w:t>Ficha de cambio - plantilla</w:t>
+      </w:pPr>
+      <w:r>
+        <w:t>Ficha de cambio - CHG-002</w:t>
       </w:r>
     </w:p>
     <w:tbl>
@@ -22150,14 +22080,8 @@
             <w:vAlign w:val="top"/>
           </w:tcPr>
           <w:p>
-            <w:pPr>
-              <w:spacing w:after="40"/>
-            </w:pPr>
-            <w:r>
-              <w:rPr>
-                <w:sz w:val="17"/>
-              </w:rPr>
-              <w:t>CHG-AAAA-MM-DD-NNN</w:t>
+            <w:r>
+              <w:t>CHG-002 / 01/08/2026 / Codex con José</w:t>
             </w:r>
           </w:p>
         </w:tc>
@@ -22207,14 +22131,8 @@
             <w:vAlign w:val="top"/>
           </w:tcPr>
           <w:p>
-            <w:pPr>
-              <w:spacing w:after="40"/>
-            </w:pPr>
-            <w:r>
-              <w:rPr>
-                <w:sz w:val="17"/>
-              </w:rPr>
-              <w:t>Elemento exacto del checklist</w:t>
+            <w:r>
+              <w:t>Fase 1 - hacer tangible la propuesta con una landing y un catálogo de demostración responsive, sin confundir datos genéricos con contenido académico aprobado.</w:t>
             </w:r>
           </w:p>
         </w:tc>
@@ -22262,14 +22180,8 @@
             <w:vAlign w:val="top"/>
           </w:tcPr>
           <w:p>
-            <w:pPr>
-              <w:spacing w:after="40"/>
-            </w:pPr>
-            <w:r>
-              <w:rPr>
-                <w:sz w:val="17"/>
-              </w:rPr>
-              <w:t>Comportamiento visible y alcance</w:t>
+            <w:r>
+              <w:t>Se confirmó CEDIAH como nombre oficial. La landing ahora presenta ocho cursos genéricos por región anatómica y comunica que aún no existen videos reales. Se añadió una sección que explica el flujo futuro cargar -&gt; procesar -&gt; publicar.</w:t>
             </w:r>
           </w:p>
         </w:tc>
@@ -22319,14 +22231,8 @@
             <w:vAlign w:val="top"/>
           </w:tcPr>
           <w:p>
-            <w:pPr>
-              <w:spacing w:after="40"/>
-            </w:pPr>
-            <w:r>
-              <w:rPr>
-                <w:sz w:val="17"/>
-              </w:rPr>
-              <w:t>Arquitectura, decisiones y alternativas relevantes</w:t>
+            <w:r>
+              <w:t>Datos de cursos tipados y separados de la presentación; catálogo editorial sin cuadrícula genérica de tarjetas; CSS responsive mobile-first; contrato VideoProvider ampliado con carga directa temporal, ID externo y estados waiting_for_upload, uploading, processing, ready y failed. La carga permanece deshabilitada hasta tener autenticación, autorización editorial y adaptador real.</w:t>
             </w:r>
           </w:p>
         </w:tc>
@@ -22374,14 +22280,8 @@
             <w:vAlign w:val="top"/>
           </w:tcPr>
           <w:p>
-            <w:pPr>
-              <w:spacing w:after="40"/>
-            </w:pPr>
-            <w:r>
-              <w:rPr>
-                <w:sz w:val="17"/>
-              </w:rPr>
-              <w:t>Rutas, IDs no secretos y cambios de configuración</w:t>
+            <w:r>
+              <w:t>.gitignore; README.md; apps/web/src/data/demo-courses.ts; apps/web/src/app/page.tsx, globals.css y layout.tsx; packages/contracts/src/index.ts. Sin migraciones, cuentas remotas, videos ni archivos académicos reales. Origin: https://github.com/jdqd1/cediah.git.</w:t>
             </w:r>
           </w:p>
         </w:tc>
@@ -22431,14 +22331,8 @@
             <w:vAlign w:val="top"/>
           </w:tcPr>
           <w:p>
-            <w:pPr>
-              <w:spacing w:after="40"/>
-            </w:pPr>
-            <w:r>
-              <w:rPr>
-                <w:sz w:val="17"/>
-              </w:rPr>
-              <w:t>Permisos, datos, amenazas y mitigaciones</w:t>
+            <w:r>
+              <w:t>No se añadieron formularios de carga, credenciales ni URLs permanentes. El contrato prevé una URL de carga temporal emitida por servidor y publicación separada de la creación. El archivo local sensible continúa ignorado y no fue leído ni publicado.</w:t>
             </w:r>
           </w:p>
         </w:tc>
@@ -22486,14 +22380,8 @@
             <w:vAlign w:val="top"/>
           </w:tcPr>
           <w:p>
-            <w:pPr>
-              <w:spacing w:after="40"/>
-            </w:pPr>
-            <w:r>
-              <w:rPr>
-                <w:sz w:val="17"/>
-              </w:rPr>
-              <w:t>Comandos y resultados</w:t>
+            <w:r>
+              <w:t>PASS final: pnpm lint; pnpm typecheck; pnpm test (1 archivo, 2 pruebas); pnpm build; pnpm audit --audit-level high sin vulnerabilidades conocidas; git diff --check. Una primera ejecución detectó node_modules incompleto; se reconstruyó desde pnpm-lock.yaml y se repitió la suite completa con resultado PASS.</w:t>
             </w:r>
           </w:p>
         </w:tc>
@@ -22543,14 +22431,8 @@
             <w:vAlign w:val="top"/>
           </w:tcPr>
           <w:p>
-            <w:pPr>
-              <w:spacing w:after="40"/>
-            </w:pPr>
-            <w:r>
-              <w:rPr>
-                <w:sz w:val="17"/>
-              </w:rPr>
-              <w:t>IDs VER y PASS/FAIL por viewport</w:t>
+            <w:r>
+              <w:t>VER-003 PASS local 1440 x 900; VER-004 PASS local 390 x 844; VER-005 PASS local 360 x 800; VER-006 PASS local 768 x 1024. Hero, header, navegación a #cursos, ocho filas, metadatos, estado Base técnica operativa y sección de video visibles; cero overflow horizontal; cero errores o advertencias de consola.</w:t>
             </w:r>
           </w:p>
         </w:tc>
@@ -22598,14 +22480,8 @@
             <w:vAlign w:val="top"/>
           </w:tcPr>
           <w:p>
-            <w:pPr>
-              <w:spacing w:after="40"/>
-            </w:pPr>
-            <w:r>
-              <w:rPr>
-                <w:sz w:val="17"/>
-              </w:rPr>
-              <w:t>Capturas, videos, logs seguros o enlaces</w:t>
+            <w:r>
+              <w:t>Commit db8cbe8 publicado en main. Métricas observadas: courseCount=8; scrollWidth=clientWidth en los cuatro viewports; #cursos queda alineado al viewport después de activar los CTA; consola filtrada sin entradas warn/error.</w:t>
             </w:r>
           </w:p>
         </w:tc>
@@ -22655,14 +22531,8 @@
             <w:vAlign w:val="top"/>
           </w:tcPr>
           <w:p>
-            <w:pPr>
-              <w:spacing w:after="40"/>
-            </w:pPr>
-            <w:r>
-              <w:rPr>
-                <w:sz w:val="17"/>
-              </w:rPr>
-              <w:t>Cómo volver al estado anterior sin pérdida</w:t>
+            <w:r>
+              <w:t>Revertir el commit db8cbe8 restaura la landing anterior y el contrato VideoProvider previo. No hay datos ni migraciones que revertir.</w:t>
             </w:r>
           </w:p>
         </w:tc>
@@ -22710,6 +22580,698 @@
             <w:vAlign w:val="top"/>
           </w:tcPr>
           <w:p>
+            <w:r>
+              <w:t>Coordinación debe entregar logo/guía de marca y escoger un curso vertical con permiso, programa, objetivos, docentes, dos lecciones, un video, una guía, 10 preguntas y 20 flashcards. Después se implementará la ficha navegable; la carga real de video se habilitará únicamente con permisos y proveedor de pruebas configurado.</w:t>
+            </w:r>
+          </w:p>
+        </w:tc>
+      </w:tr>
+    </w:tbl>
+    <w:p>
+      <w:pPr>
+        <w:pStyle w:val="Heading2"/>
+        <w:keepNext w:val="1"/>
+      </w:pPr>
+      <w:r>
+        <w:t>Ficha de cambio - plantilla</w:t>
+      </w:r>
+    </w:p>
+    <w:tbl>
+      <w:tblPr>
+        <w:tblStyle w:val="TableGrid"/>
+        <w:tblW w:type="auto" w:w="0"/>
+        <w:jc w:val="center"/>
+        <w:tblLayout w:type="autofit"/>
+        <w:tblLook w:firstColumn="1" w:firstRow="1" w:lastColumn="0" w:lastRow="0" w:noHBand="0" w:noVBand="1" w:val="04A0"/>
+      </w:tblPr>
+      <w:tblGrid>
+        <w:gridCol w:w="4986"/>
+        <w:gridCol w:w="4986"/>
+      </w:tblGrid>
+      <w:tr>
+        <w:trPr>
+          <w:tblHeader w:val="true"/>
+        </w:trPr>
+        <w:tc>
+          <w:tcPr>
+            <w:tcW w:type="dxa" w:w="2835"/>
+            <w:shd w:fill="14233B"/>
+            <w:tcBorders>
+              <w:top w:val="single" w:sz="4" w:color="FFFFFF"/>
+              <w:left w:val="single" w:sz="4" w:color="FFFFFF"/>
+              <w:bottom w:val="single" w:sz="4" w:color="FFFFFF"/>
+              <w:right w:val="single" w:sz="4" w:color="FFFFFF"/>
+              <w:insideH w:val="single" w:sz="4" w:color="FFFFFF"/>
+              <w:insideV w:val="single" w:sz="4" w:color="FFFFFF"/>
+            </w:tcBorders>
+            <w:vAlign w:val="center"/>
+          </w:tcPr>
+          <w:p>
+            <w:pPr>
+              <w:jc w:val="left"/>
+            </w:pPr>
+            <w:r>
+              <w:rPr>
+                <w:b/>
+                <w:color w:val="FFFFFF"/>
+                <w:sz w:val="17"/>
+              </w:rPr>
+              <w:t>Campo</w:t>
+            </w:r>
+          </w:p>
+        </w:tc>
+        <w:tc>
+          <w:tcPr>
+            <w:tcW w:type="dxa" w:w="6236"/>
+            <w:shd w:fill="14233B"/>
+            <w:tcBorders>
+              <w:top w:val="single" w:sz="4" w:color="FFFFFF"/>
+              <w:left w:val="single" w:sz="4" w:color="FFFFFF"/>
+              <w:bottom w:val="single" w:sz="4" w:color="FFFFFF"/>
+              <w:right w:val="single" w:sz="4" w:color="FFFFFF"/>
+              <w:insideH w:val="single" w:sz="4" w:color="FFFFFF"/>
+              <w:insideV w:val="single" w:sz="4" w:color="FFFFFF"/>
+            </w:tcBorders>
+            <w:vAlign w:val="center"/>
+          </w:tcPr>
+          <w:p>
+            <w:pPr>
+              <w:jc w:val="left"/>
+            </w:pPr>
+            <w:r>
+              <w:rPr>
+                <w:b/>
+                <w:color w:val="FFFFFF"/>
+                <w:sz w:val="17"/>
+              </w:rPr>
+              <w:t>Contenido</w:t>
+            </w:r>
+          </w:p>
+        </w:tc>
+      </w:tr>
+      <w:tr>
+        <w:trPr>
+          <w:cantSplit/>
+        </w:trPr>
+        <w:tc>
+          <w:tcPr>
+            <w:tcW w:type="dxa" w:w="2835"/>
+            <w:tcBorders>
+              <w:top w:val="single" w:sz="4" w:color="D9DEE7"/>
+              <w:left w:val="single" w:sz="4" w:color="D9DEE7"/>
+              <w:bottom w:val="single" w:sz="4" w:color="D9DEE7"/>
+              <w:right w:val="single" w:sz="4" w:color="D9DEE7"/>
+              <w:insideH w:val="single" w:sz="4" w:color="D9DEE7"/>
+              <w:insideV w:val="single" w:sz="4" w:color="D9DEE7"/>
+            </w:tcBorders>
+            <w:vAlign w:val="top"/>
+          </w:tcPr>
+          <w:p>
+            <w:pPr>
+              <w:spacing w:after="40"/>
+            </w:pPr>
+            <w:r>
+              <w:rPr>
+                <w:sz w:val="17"/>
+              </w:rPr>
+              <w:t>ID / fecha / autor</w:t>
+            </w:r>
+          </w:p>
+        </w:tc>
+        <w:tc>
+          <w:tcPr>
+            <w:tcW w:type="dxa" w:w="6236"/>
+            <w:tcBorders>
+              <w:top w:val="single" w:sz="4" w:color="D9DEE7"/>
+              <w:left w:val="single" w:sz="4" w:color="D9DEE7"/>
+              <w:bottom w:val="single" w:sz="4" w:color="D9DEE7"/>
+              <w:right w:val="single" w:sz="4" w:color="D9DEE7"/>
+              <w:insideH w:val="single" w:sz="4" w:color="D9DEE7"/>
+              <w:insideV w:val="single" w:sz="4" w:color="D9DEE7"/>
+            </w:tcBorders>
+            <w:vAlign w:val="top"/>
+          </w:tcPr>
+          <w:p>
+            <w:pPr>
+              <w:spacing w:after="40"/>
+            </w:pPr>
+            <w:r>
+              <w:rPr>
+                <w:sz w:val="17"/>
+              </w:rPr>
+              <w:t>CHG-AAAA-MM-DD-NNN</w:t>
+            </w:r>
+          </w:p>
+        </w:tc>
+      </w:tr>
+      <w:tr>
+        <w:trPr>
+          <w:cantSplit/>
+        </w:trPr>
+        <w:tc>
+          <w:tcPr>
+            <w:tcW w:type="dxa" w:w="2835"/>
+            <w:shd w:fill="F7F8FA"/>
+            <w:tcBorders>
+              <w:top w:val="single" w:sz="4" w:color="D9DEE7"/>
+              <w:left w:val="single" w:sz="4" w:color="D9DEE7"/>
+              <w:bottom w:val="single" w:sz="4" w:color="D9DEE7"/>
+              <w:right w:val="single" w:sz="4" w:color="D9DEE7"/>
+              <w:insideH w:val="single" w:sz="4" w:color="D9DEE7"/>
+              <w:insideV w:val="single" w:sz="4" w:color="D9DEE7"/>
+            </w:tcBorders>
+            <w:vAlign w:val="top"/>
+          </w:tcPr>
+          <w:p>
+            <w:pPr>
+              <w:spacing w:after="40"/>
+            </w:pPr>
+            <w:r>
+              <w:rPr>
+                <w:sz w:val="17"/>
+              </w:rPr>
+              <w:t>Fase y objetivo</w:t>
+            </w:r>
+          </w:p>
+        </w:tc>
+        <w:tc>
+          <w:tcPr>
+            <w:tcW w:type="dxa" w:w="6236"/>
+            <w:shd w:fill="F7F8FA"/>
+            <w:tcBorders>
+              <w:top w:val="single" w:sz="4" w:color="D9DEE7"/>
+              <w:left w:val="single" w:sz="4" w:color="D9DEE7"/>
+              <w:bottom w:val="single" w:sz="4" w:color="D9DEE7"/>
+              <w:right w:val="single" w:sz="4" w:color="D9DEE7"/>
+              <w:insideH w:val="single" w:sz="4" w:color="D9DEE7"/>
+              <w:insideV w:val="single" w:sz="4" w:color="D9DEE7"/>
+            </w:tcBorders>
+            <w:vAlign w:val="top"/>
+          </w:tcPr>
+          <w:p>
+            <w:pPr>
+              <w:spacing w:after="40"/>
+            </w:pPr>
+            <w:r>
+              <w:rPr>
+                <w:sz w:val="17"/>
+              </w:rPr>
+              <w:t>Elemento exacto del checklist</w:t>
+            </w:r>
+          </w:p>
+        </w:tc>
+      </w:tr>
+      <w:tr>
+        <w:trPr>
+          <w:cantSplit/>
+        </w:trPr>
+        <w:tc>
+          <w:tcPr>
+            <w:tcW w:type="dxa" w:w="2835"/>
+            <w:tcBorders>
+              <w:top w:val="single" w:sz="4" w:color="D9DEE7"/>
+              <w:left w:val="single" w:sz="4" w:color="D9DEE7"/>
+              <w:bottom w:val="single" w:sz="4" w:color="D9DEE7"/>
+              <w:right w:val="single" w:sz="4" w:color="D9DEE7"/>
+              <w:insideH w:val="single" w:sz="4" w:color="D9DEE7"/>
+              <w:insideV w:val="single" w:sz="4" w:color="D9DEE7"/>
+            </w:tcBorders>
+            <w:vAlign w:val="top"/>
+          </w:tcPr>
+          <w:p>
+            <w:pPr>
+              <w:spacing w:after="40"/>
+            </w:pPr>
+            <w:r>
+              <w:rPr>
+                <w:sz w:val="17"/>
+              </w:rPr>
+              <w:t>Qué cambió</w:t>
+            </w:r>
+          </w:p>
+        </w:tc>
+        <w:tc>
+          <w:tcPr>
+            <w:tcW w:type="dxa" w:w="6236"/>
+            <w:tcBorders>
+              <w:top w:val="single" w:sz="4" w:color="D9DEE7"/>
+              <w:left w:val="single" w:sz="4" w:color="D9DEE7"/>
+              <w:bottom w:val="single" w:sz="4" w:color="D9DEE7"/>
+              <w:right w:val="single" w:sz="4" w:color="D9DEE7"/>
+              <w:insideH w:val="single" w:sz="4" w:color="D9DEE7"/>
+              <w:insideV w:val="single" w:sz="4" w:color="D9DEE7"/>
+            </w:tcBorders>
+            <w:vAlign w:val="top"/>
+          </w:tcPr>
+          <w:p>
+            <w:pPr>
+              <w:spacing w:after="40"/>
+            </w:pPr>
+            <w:r>
+              <w:rPr>
+                <w:sz w:val="17"/>
+              </w:rPr>
+              <w:t>Comportamiento visible y alcance</w:t>
+            </w:r>
+          </w:p>
+        </w:tc>
+      </w:tr>
+      <w:tr>
+        <w:trPr>
+          <w:cantSplit/>
+        </w:trPr>
+        <w:tc>
+          <w:tcPr>
+            <w:tcW w:type="dxa" w:w="2835"/>
+            <w:shd w:fill="F7F8FA"/>
+            <w:tcBorders>
+              <w:top w:val="single" w:sz="4" w:color="D9DEE7"/>
+              <w:left w:val="single" w:sz="4" w:color="D9DEE7"/>
+              <w:bottom w:val="single" w:sz="4" w:color="D9DEE7"/>
+              <w:right w:val="single" w:sz="4" w:color="D9DEE7"/>
+              <w:insideH w:val="single" w:sz="4" w:color="D9DEE7"/>
+              <w:insideV w:val="single" w:sz="4" w:color="D9DEE7"/>
+            </w:tcBorders>
+            <w:vAlign w:val="top"/>
+          </w:tcPr>
+          <w:p>
+            <w:pPr>
+              <w:spacing w:after="40"/>
+            </w:pPr>
+            <w:r>
+              <w:rPr>
+                <w:sz w:val="17"/>
+              </w:rPr>
+              <w:t>Cómo se implementó</w:t>
+            </w:r>
+          </w:p>
+        </w:tc>
+        <w:tc>
+          <w:tcPr>
+            <w:tcW w:type="dxa" w:w="6236"/>
+            <w:shd w:fill="F7F8FA"/>
+            <w:tcBorders>
+              <w:top w:val="single" w:sz="4" w:color="D9DEE7"/>
+              <w:left w:val="single" w:sz="4" w:color="D9DEE7"/>
+              <w:bottom w:val="single" w:sz="4" w:color="D9DEE7"/>
+              <w:right w:val="single" w:sz="4" w:color="D9DEE7"/>
+              <w:insideH w:val="single" w:sz="4" w:color="D9DEE7"/>
+              <w:insideV w:val="single" w:sz="4" w:color="D9DEE7"/>
+            </w:tcBorders>
+            <w:vAlign w:val="top"/>
+          </w:tcPr>
+          <w:p>
+            <w:pPr>
+              <w:spacing w:after="40"/>
+            </w:pPr>
+            <w:r>
+              <w:rPr>
+                <w:sz w:val="17"/>
+              </w:rPr>
+              <w:t>Arquitectura, decisiones y alternativas relevantes</w:t>
+            </w:r>
+          </w:p>
+        </w:tc>
+      </w:tr>
+      <w:tr>
+        <w:trPr>
+          <w:cantSplit/>
+        </w:trPr>
+        <w:tc>
+          <w:tcPr>
+            <w:tcW w:type="dxa" w:w="2835"/>
+            <w:tcBorders>
+              <w:top w:val="single" w:sz="4" w:color="D9DEE7"/>
+              <w:left w:val="single" w:sz="4" w:color="D9DEE7"/>
+              <w:bottom w:val="single" w:sz="4" w:color="D9DEE7"/>
+              <w:right w:val="single" w:sz="4" w:color="D9DEE7"/>
+              <w:insideH w:val="single" w:sz="4" w:color="D9DEE7"/>
+              <w:insideV w:val="single" w:sz="4" w:color="D9DEE7"/>
+            </w:tcBorders>
+            <w:vAlign w:val="top"/>
+          </w:tcPr>
+          <w:p>
+            <w:pPr>
+              <w:spacing w:after="40"/>
+            </w:pPr>
+            <w:r>
+              <w:rPr>
+                <w:sz w:val="17"/>
+              </w:rPr>
+              <w:t>Archivos / migraciones / servicios</w:t>
+            </w:r>
+          </w:p>
+        </w:tc>
+        <w:tc>
+          <w:tcPr>
+            <w:tcW w:type="dxa" w:w="6236"/>
+            <w:tcBorders>
+              <w:top w:val="single" w:sz="4" w:color="D9DEE7"/>
+              <w:left w:val="single" w:sz="4" w:color="D9DEE7"/>
+              <w:bottom w:val="single" w:sz="4" w:color="D9DEE7"/>
+              <w:right w:val="single" w:sz="4" w:color="D9DEE7"/>
+              <w:insideH w:val="single" w:sz="4" w:color="D9DEE7"/>
+              <w:insideV w:val="single" w:sz="4" w:color="D9DEE7"/>
+            </w:tcBorders>
+            <w:vAlign w:val="top"/>
+          </w:tcPr>
+          <w:p>
+            <w:pPr>
+              <w:spacing w:after="40"/>
+            </w:pPr>
+            <w:r>
+              <w:rPr>
+                <w:sz w:val="17"/>
+              </w:rPr>
+              <w:t>Rutas, IDs no secretos y cambios de configuración</w:t>
+            </w:r>
+          </w:p>
+        </w:tc>
+      </w:tr>
+      <w:tr>
+        <w:trPr>
+          <w:cantSplit/>
+        </w:trPr>
+        <w:tc>
+          <w:tcPr>
+            <w:tcW w:type="dxa" w:w="2835"/>
+            <w:shd w:fill="F7F8FA"/>
+            <w:tcBorders>
+              <w:top w:val="single" w:sz="4" w:color="D9DEE7"/>
+              <w:left w:val="single" w:sz="4" w:color="D9DEE7"/>
+              <w:bottom w:val="single" w:sz="4" w:color="D9DEE7"/>
+              <w:right w:val="single" w:sz="4" w:color="D9DEE7"/>
+              <w:insideH w:val="single" w:sz="4" w:color="D9DEE7"/>
+              <w:insideV w:val="single" w:sz="4" w:color="D9DEE7"/>
+            </w:tcBorders>
+            <w:vAlign w:val="top"/>
+          </w:tcPr>
+          <w:p>
+            <w:pPr>
+              <w:spacing w:after="40"/>
+            </w:pPr>
+            <w:r>
+              <w:rPr>
+                <w:sz w:val="17"/>
+              </w:rPr>
+              <w:t>Seguridad y privacidad</w:t>
+            </w:r>
+          </w:p>
+        </w:tc>
+        <w:tc>
+          <w:tcPr>
+            <w:tcW w:type="dxa" w:w="6236"/>
+            <w:shd w:fill="F7F8FA"/>
+            <w:tcBorders>
+              <w:top w:val="single" w:sz="4" w:color="D9DEE7"/>
+              <w:left w:val="single" w:sz="4" w:color="D9DEE7"/>
+              <w:bottom w:val="single" w:sz="4" w:color="D9DEE7"/>
+              <w:right w:val="single" w:sz="4" w:color="D9DEE7"/>
+              <w:insideH w:val="single" w:sz="4" w:color="D9DEE7"/>
+              <w:insideV w:val="single" w:sz="4" w:color="D9DEE7"/>
+            </w:tcBorders>
+            <w:vAlign w:val="top"/>
+          </w:tcPr>
+          <w:p>
+            <w:pPr>
+              <w:spacing w:after="40"/>
+            </w:pPr>
+            <w:r>
+              <w:rPr>
+                <w:sz w:val="17"/>
+              </w:rPr>
+              <w:t>Permisos, datos, amenazas y mitigaciones</w:t>
+            </w:r>
+          </w:p>
+        </w:tc>
+      </w:tr>
+      <w:tr>
+        <w:trPr>
+          <w:cantSplit/>
+        </w:trPr>
+        <w:tc>
+          <w:tcPr>
+            <w:tcW w:type="dxa" w:w="2835"/>
+            <w:tcBorders>
+              <w:top w:val="single" w:sz="4" w:color="D9DEE7"/>
+              <w:left w:val="single" w:sz="4" w:color="D9DEE7"/>
+              <w:bottom w:val="single" w:sz="4" w:color="D9DEE7"/>
+              <w:right w:val="single" w:sz="4" w:color="D9DEE7"/>
+              <w:insideH w:val="single" w:sz="4" w:color="D9DEE7"/>
+              <w:insideV w:val="single" w:sz="4" w:color="D9DEE7"/>
+            </w:tcBorders>
+            <w:vAlign w:val="top"/>
+          </w:tcPr>
+          <w:p>
+            <w:pPr>
+              <w:spacing w:after="40"/>
+            </w:pPr>
+            <w:r>
+              <w:rPr>
+                <w:sz w:val="17"/>
+              </w:rPr>
+              <w:t>Validación automática</w:t>
+            </w:r>
+          </w:p>
+        </w:tc>
+        <w:tc>
+          <w:tcPr>
+            <w:tcW w:type="dxa" w:w="6236"/>
+            <w:tcBorders>
+              <w:top w:val="single" w:sz="4" w:color="D9DEE7"/>
+              <w:left w:val="single" w:sz="4" w:color="D9DEE7"/>
+              <w:bottom w:val="single" w:sz="4" w:color="D9DEE7"/>
+              <w:right w:val="single" w:sz="4" w:color="D9DEE7"/>
+              <w:insideH w:val="single" w:sz="4" w:color="D9DEE7"/>
+              <w:insideV w:val="single" w:sz="4" w:color="D9DEE7"/>
+            </w:tcBorders>
+            <w:vAlign w:val="top"/>
+          </w:tcPr>
+          <w:p>
+            <w:pPr>
+              <w:spacing w:after="40"/>
+            </w:pPr>
+            <w:r>
+              <w:rPr>
+                <w:sz w:val="17"/>
+              </w:rPr>
+              <w:t>Comandos y resultados</w:t>
+            </w:r>
+          </w:p>
+        </w:tc>
+      </w:tr>
+      <w:tr>
+        <w:trPr>
+          <w:cantSplit/>
+        </w:trPr>
+        <w:tc>
+          <w:tcPr>
+            <w:tcW w:type="dxa" w:w="2835"/>
+            <w:shd w:fill="F7F8FA"/>
+            <w:tcBorders>
+              <w:top w:val="single" w:sz="4" w:color="D9DEE7"/>
+              <w:left w:val="single" w:sz="4" w:color="D9DEE7"/>
+              <w:bottom w:val="single" w:sz="4" w:color="D9DEE7"/>
+              <w:right w:val="single" w:sz="4" w:color="D9DEE7"/>
+              <w:insideH w:val="single" w:sz="4" w:color="D9DEE7"/>
+              <w:insideV w:val="single" w:sz="4" w:color="D9DEE7"/>
+            </w:tcBorders>
+            <w:vAlign w:val="top"/>
+          </w:tcPr>
+          <w:p>
+            <w:pPr>
+              <w:spacing w:after="40"/>
+            </w:pPr>
+            <w:r>
+              <w:rPr>
+                <w:sz w:val="17"/>
+              </w:rPr>
+              <w:t>Validación en navegador</w:t>
+            </w:r>
+          </w:p>
+        </w:tc>
+        <w:tc>
+          <w:tcPr>
+            <w:tcW w:type="dxa" w:w="6236"/>
+            <w:shd w:fill="F7F8FA"/>
+            <w:tcBorders>
+              <w:top w:val="single" w:sz="4" w:color="D9DEE7"/>
+              <w:left w:val="single" w:sz="4" w:color="D9DEE7"/>
+              <w:bottom w:val="single" w:sz="4" w:color="D9DEE7"/>
+              <w:right w:val="single" w:sz="4" w:color="D9DEE7"/>
+              <w:insideH w:val="single" w:sz="4" w:color="D9DEE7"/>
+              <w:insideV w:val="single" w:sz="4" w:color="D9DEE7"/>
+            </w:tcBorders>
+            <w:vAlign w:val="top"/>
+          </w:tcPr>
+          <w:p>
+            <w:pPr>
+              <w:spacing w:after="40"/>
+            </w:pPr>
+            <w:r>
+              <w:rPr>
+                <w:sz w:val="17"/>
+              </w:rPr>
+              <w:t>IDs VER y PASS/FAIL por viewport</w:t>
+            </w:r>
+          </w:p>
+        </w:tc>
+      </w:tr>
+      <w:tr>
+        <w:trPr>
+          <w:cantSplit/>
+        </w:trPr>
+        <w:tc>
+          <w:tcPr>
+            <w:tcW w:type="dxa" w:w="2835"/>
+            <w:tcBorders>
+              <w:top w:val="single" w:sz="4" w:color="D9DEE7"/>
+              <w:left w:val="single" w:sz="4" w:color="D9DEE7"/>
+              <w:bottom w:val="single" w:sz="4" w:color="D9DEE7"/>
+              <w:right w:val="single" w:sz="4" w:color="D9DEE7"/>
+              <w:insideH w:val="single" w:sz="4" w:color="D9DEE7"/>
+              <w:insideV w:val="single" w:sz="4" w:color="D9DEE7"/>
+            </w:tcBorders>
+            <w:vAlign w:val="top"/>
+          </w:tcPr>
+          <w:p>
+            <w:pPr>
+              <w:spacing w:after="40"/>
+            </w:pPr>
+            <w:r>
+              <w:rPr>
+                <w:sz w:val="17"/>
+              </w:rPr>
+              <w:t>Evidencia</w:t>
+            </w:r>
+          </w:p>
+        </w:tc>
+        <w:tc>
+          <w:tcPr>
+            <w:tcW w:type="dxa" w:w="6236"/>
+            <w:tcBorders>
+              <w:top w:val="single" w:sz="4" w:color="D9DEE7"/>
+              <w:left w:val="single" w:sz="4" w:color="D9DEE7"/>
+              <w:bottom w:val="single" w:sz="4" w:color="D9DEE7"/>
+              <w:right w:val="single" w:sz="4" w:color="D9DEE7"/>
+              <w:insideH w:val="single" w:sz="4" w:color="D9DEE7"/>
+              <w:insideV w:val="single" w:sz="4" w:color="D9DEE7"/>
+            </w:tcBorders>
+            <w:vAlign w:val="top"/>
+          </w:tcPr>
+          <w:p>
+            <w:pPr>
+              <w:spacing w:after="40"/>
+            </w:pPr>
+            <w:r>
+              <w:rPr>
+                <w:sz w:val="17"/>
+              </w:rPr>
+              <w:t>Capturas, videos, logs seguros o enlaces</w:t>
+            </w:r>
+          </w:p>
+        </w:tc>
+      </w:tr>
+      <w:tr>
+        <w:trPr>
+          <w:cantSplit/>
+        </w:trPr>
+        <w:tc>
+          <w:tcPr>
+            <w:tcW w:type="dxa" w:w="2835"/>
+            <w:shd w:fill="F7F8FA"/>
+            <w:tcBorders>
+              <w:top w:val="single" w:sz="4" w:color="D9DEE7"/>
+              <w:left w:val="single" w:sz="4" w:color="D9DEE7"/>
+              <w:bottom w:val="single" w:sz="4" w:color="D9DEE7"/>
+              <w:right w:val="single" w:sz="4" w:color="D9DEE7"/>
+              <w:insideH w:val="single" w:sz="4" w:color="D9DEE7"/>
+              <w:insideV w:val="single" w:sz="4" w:color="D9DEE7"/>
+            </w:tcBorders>
+            <w:vAlign w:val="top"/>
+          </w:tcPr>
+          <w:p>
+            <w:pPr>
+              <w:spacing w:after="40"/>
+            </w:pPr>
+            <w:r>
+              <w:rPr>
+                <w:sz w:val="17"/>
+              </w:rPr>
+              <w:t>Reversión</w:t>
+            </w:r>
+          </w:p>
+        </w:tc>
+        <w:tc>
+          <w:tcPr>
+            <w:tcW w:type="dxa" w:w="6236"/>
+            <w:shd w:fill="F7F8FA"/>
+            <w:tcBorders>
+              <w:top w:val="single" w:sz="4" w:color="D9DEE7"/>
+              <w:left w:val="single" w:sz="4" w:color="D9DEE7"/>
+              <w:bottom w:val="single" w:sz="4" w:color="D9DEE7"/>
+              <w:right w:val="single" w:sz="4" w:color="D9DEE7"/>
+              <w:insideH w:val="single" w:sz="4" w:color="D9DEE7"/>
+              <w:insideV w:val="single" w:sz="4" w:color="D9DEE7"/>
+            </w:tcBorders>
+            <w:vAlign w:val="top"/>
+          </w:tcPr>
+          <w:p>
+            <w:pPr>
+              <w:spacing w:after="40"/>
+            </w:pPr>
+            <w:r>
+              <w:rPr>
+                <w:sz w:val="17"/>
+              </w:rPr>
+              <w:t>Cómo volver al estado anterior sin pérdida</w:t>
+            </w:r>
+          </w:p>
+        </w:tc>
+      </w:tr>
+      <w:tr>
+        <w:trPr>
+          <w:cantSplit/>
+        </w:trPr>
+        <w:tc>
+          <w:tcPr>
+            <w:tcW w:type="dxa" w:w="2835"/>
+            <w:tcBorders>
+              <w:top w:val="single" w:sz="4" w:color="D9DEE7"/>
+              <w:left w:val="single" w:sz="4" w:color="D9DEE7"/>
+              <w:bottom w:val="single" w:sz="4" w:color="D9DEE7"/>
+              <w:right w:val="single" w:sz="4" w:color="D9DEE7"/>
+              <w:insideH w:val="single" w:sz="4" w:color="D9DEE7"/>
+              <w:insideV w:val="single" w:sz="4" w:color="D9DEE7"/>
+            </w:tcBorders>
+            <w:vAlign w:val="top"/>
+          </w:tcPr>
+          <w:p>
+            <w:pPr>
+              <w:spacing w:after="40"/>
+            </w:pPr>
+            <w:r>
+              <w:rPr>
+                <w:sz w:val="17"/>
+              </w:rPr>
+              <w:t>Pendiente / próximo paso</w:t>
+            </w:r>
+          </w:p>
+        </w:tc>
+        <w:tc>
+          <w:tcPr>
+            <w:tcW w:type="dxa" w:w="6236"/>
+            <w:tcBorders>
+              <w:top w:val="single" w:sz="4" w:color="D9DEE7"/>
+              <w:left w:val="single" w:sz="4" w:color="D9DEE7"/>
+              <w:bottom w:val="single" w:sz="4" w:color="D9DEE7"/>
+              <w:right w:val="single" w:sz="4" w:color="D9DEE7"/>
+              <w:insideH w:val="single" w:sz="4" w:color="D9DEE7"/>
+              <w:insideV w:val="single" w:sz="4" w:color="D9DEE7"/>
+            </w:tcBorders>
+            <w:vAlign w:val="top"/>
+          </w:tcPr>
+          <w:p>
             <w:pPr>
               <w:spacing w:after="40"/>
             </w:pPr>
@@ -22759,13 +23321,7 @@
         <w:ind w:left="255" w:hanging="255"/>
       </w:pPr>
       <w:r>
-        <w:rPr>
-          <w:b/>
-        </w:rPr>
-        <w:t xml:space="preserve">[ ] </w:t>
-      </w:r>
-      <w:r>
-        <w:t>Confirmar el nombre oficial y entregar los recursos de marca autorizados.</w:t>
+        <w:t>[~] Nombre oficial confirmado como CEDIAH; falta entregar los recursos de marca autorizados.</w:t>
       </w:r>
     </w:p>
     <w:p>
@@ -22861,19 +23417,10 @@
             </w:tcBorders>
           </w:tcPr>
           <w:p>
-            <w:pPr>
-              <w:spacing w:after="0"/>
-            </w:pPr>
-            <w:r>
-              <w:rPr>
-                <w:b/>
-                <w:color w:val="14233B"/>
-              </w:rPr>
+            <w:r>
               <w:t>Siguiente punto de control</w:t>
               <w:br/>
-            </w:r>
-            <w:r>
-              <w:t>No avanzar a construir el catálogo completo. Primero cerrar la Fase 0 y producir una página base verificable; después ejecutar la Fase 1 con el contenido de un solo curso vertical.</w:t>
+              <w:t>El catálogo actual es una demostración de arquitectura de información, no un catálogo académico aprobado. No activar cargas ni construir todo el portal: primero contener credenciales, reunir marca y contenido, seleccionar un curso vertical y completar su ficha navegable.</w:t>
             </w:r>
           </w:p>
         </w:tc>
@@ -23066,6 +23613,7 @@
       <w:pPr>
         <w:pStyle w:val="Heading2"/>
         <w:keepNext w:val="1"/>
+        <w:pageBreakBefore/>
       </w:pPr>
       <w:r>
         <w:t>Control del documento</w:t>
@@ -23554,6 +24102,65 @@
             </w:pPr>
             <w:r>
               <w:t>Inicio verificable de la Fase 0: base técnica portable, interfaz responsive, API segura, auditoría de dependencias y evidencia local en navegador.</w:t>
+            </w:r>
+          </w:p>
+        </w:tc>
+      </w:tr>
+      <w:tr>
+        <w:tc>
+          <w:tcPr>
+            <w:tcW w:type="dxa" w:w="3324"/>
+            <w:vAlign w:val="top"/>
+            <w:tcBorders>
+              <w:top w:val="single" w:sz="4" w:color="D9DEE7"/>
+              <w:left w:val="single" w:sz="4" w:color="D9DEE7"/>
+              <w:bottom w:val="single" w:sz="4" w:color="D9DEE7"/>
+              <w:right w:val="single" w:sz="4" w:color="D9DEE7"/>
+              <w:insideH w:val="single" w:sz="4" w:color="D9DEE7"/>
+              <w:insideV w:val="single" w:sz="4" w:color="D9DEE7"/>
+            </w:tcBorders>
+          </w:tcPr>
+          <w:p>
+            <w:r>
+              <w:t>1.4</w:t>
+            </w:r>
+          </w:p>
+        </w:tc>
+        <w:tc>
+          <w:tcPr>
+            <w:tcW w:type="dxa" w:w="3324"/>
+            <w:vAlign w:val="top"/>
+            <w:tcBorders>
+              <w:top w:val="single" w:sz="4" w:color="D9DEE7"/>
+              <w:left w:val="single" w:sz="4" w:color="D9DEE7"/>
+              <w:bottom w:val="single" w:sz="4" w:color="D9DEE7"/>
+              <w:right w:val="single" w:sz="4" w:color="D9DEE7"/>
+              <w:insideH w:val="single" w:sz="4" w:color="D9DEE7"/>
+              <w:insideV w:val="single" w:sz="4" w:color="D9DEE7"/>
+            </w:tcBorders>
+          </w:tcPr>
+          <w:p>
+            <w:r>
+              <w:t>01/08/2026</w:t>
+            </w:r>
+          </w:p>
+        </w:tc>
+        <w:tc>
+          <w:tcPr>
+            <w:tcW w:type="dxa" w:w="3324"/>
+            <w:vAlign w:val="top"/>
+            <w:tcBorders>
+              <w:top w:val="single" w:sz="4" w:color="D9DEE7"/>
+              <w:left w:val="single" w:sz="4" w:color="D9DEE7"/>
+              <w:bottom w:val="single" w:sz="4" w:color="D9DEE7"/>
+              <w:right w:val="single" w:sz="4" w:color="D9DEE7"/>
+              <w:insideH w:val="single" w:sz="4" w:color="D9DEE7"/>
+              <w:insideV w:val="single" w:sz="4" w:color="D9DEE7"/>
+            </w:tcBorders>
+          </w:tcPr>
+          <w:p>
+            <w:r>
+              <w:t>Nombre CEDIAH confirmado; catálogo demo responsive, video preparado y publicación inicial en GitHub.</w:t>
             </w:r>
           </w:p>
         </w:tc>

</xml_diff>

<commit_message>
feat: add navigable course demo pages
</commit_message>
<xml_diff>
--- a/CEDIAH Web Status.docx
+++ b/CEDIAH Web Status.docx
@@ -176,7 +176,7 @@
           </w:tcPr>
           <w:p>
             <w:r>
-              <w:t>1.4</w:t>
+              <w:t>1.6</w:t>
             </w:r>
           </w:p>
         </w:tc>
@@ -276,7 +276,7 @@
           </w:tcPr>
           <w:p>
             <w:r>
-              <w:t>Fase 1 en curso - landing y catálogo genérico responsive verificados; repositorio publicado en GitHub; contenido real, autenticación y despliegues pendientes</w:t>
+              <w:t>Fase 1 en curso - landing, catálogo y ocho fichas demo responsive verificadas; repositorio publicado en GitHub; contenido real, autenticación y despliegues pendientes</w:t>
             </w:r>
           </w:p>
         </w:tc>
@@ -1109,6 +1109,14 @@
     </w:p>
     <w:p>
       <w:pPr>
+        <w:pStyle w:val="Checklist"/>
+      </w:pPr>
+      <w:r>
+        <w:t>[ ] Cada entrega que cambie la web se cierra con pruebas, actualización de esta bitácora, commit y push a la rama publicada, despliegue en Vercel y verificación de la URL resultante.</w:t>
+      </w:r>
+    </w:p>
+    <w:p>
+      <w:pPr>
         <w:pStyle w:val="Heading2"/>
         <w:keepNext w:val="1"/>
       </w:pPr>
@@ -1697,7 +1705,7 @@
           </w:tcPr>
           <w:p>
             <w:r>
-              <w:t>Monorepo pnpm con web Next.js, API Fastify, contratos compartidos y catálogo de ocho cursos de demostración.</w:t>
+              <w:t>Monorepo pnpm con web Next.js, API Fastify, contratos compartidos, catálogo de ocho cursos demo y ocho fichas navegables generadas estáticamente.</w:t>
             </w:r>
           </w:p>
         </w:tc>
@@ -2107,7 +2115,7 @@
           </w:tcPr>
           <w:p>
             <w:r>
-              <w:t>Landing y catálogo: PASS local</w:t>
+              <w:t>Landing, catálogo y fichas demo: PASS local</w:t>
             </w:r>
           </w:p>
         </w:tc>
@@ -2126,7 +2134,7 @@
           </w:tcPr>
           <w:p>
             <w:r>
-              <w:t>Verificado en 360 x 800, 390 x 844, 768 x 1024 y 1440 x 900; sin overflow horizontal ni errores o advertencias de consola.</w:t>
+              <w:t>Ficha de Tórax y navegación desde el catálogo verificadas en 360 x 800, 390 x 844, 768 x 1024 y 1440 x 900; sin overflow horizontal ni errores o advertencias de consola.</w:t>
             </w:r>
           </w:p>
         </w:tc>
@@ -11290,7 +11298,7 @@
         <w:ind w:left="255" w:hanging="255"/>
       </w:pPr>
       <w:r>
-        <w:t>[~] Landing y catálogo de demostración implementados; ficha de curso, login, registro y recuperación visual siguen pendientes.</w:t>
+        <w:t>[~] Landing, catálogo y fichas de curso de demostración implementados; login, registro y recuperación visual siguen pendientes.</w:t>
       </w:r>
     </w:p>
     <w:p>
@@ -21252,6 +21260,130 @@
           </w:p>
         </w:tc>
       </w:tr>
+      <w:tr>
+        <w:tc>
+          <w:tcPr>
+            <w:tcW w:type="dxa" w:w="2493"/>
+            <w:vAlign w:val="top"/>
+            <w:tcBorders>
+              <w:top w:val="single" w:sz="4" w:color="D9DEE7"/>
+              <w:left w:val="single" w:sz="4" w:color="D9DEE7"/>
+              <w:bottom w:val="single" w:sz="4" w:color="D9DEE7"/>
+              <w:right w:val="single" w:sz="4" w:color="D9DEE7"/>
+              <w:insideH w:val="single" w:sz="4" w:color="D9DEE7"/>
+              <w:insideV w:val="single" w:sz="4" w:color="D9DEE7"/>
+            </w:tcBorders>
+            <w:shd w:fill="F7F8FA"/>
+          </w:tcPr>
+          <w:p>
+            <w:r>
+              <w:t>CHG-003 / 01/08/2026</w:t>
+            </w:r>
+          </w:p>
+        </w:tc>
+        <w:tc>
+          <w:tcPr>
+            <w:tcW w:type="dxa" w:w="2493"/>
+            <w:vAlign w:val="top"/>
+            <w:tcBorders>
+              <w:top w:val="single" w:sz="4" w:color="D9DEE7"/>
+              <w:left w:val="single" w:sz="4" w:color="D9DEE7"/>
+              <w:bottom w:val="single" w:sz="4" w:color="D9DEE7"/>
+              <w:right w:val="single" w:sz="4" w:color="D9DEE7"/>
+              <w:insideH w:val="single" w:sz="4" w:color="D9DEE7"/>
+              <w:insideV w:val="single" w:sz="4" w:color="D9DEE7"/>
+            </w:tcBorders>
+            <w:shd w:fill="F7F8FA"/>
+          </w:tcPr>
+          <w:p>
+            <w:r>
+              <w:t>Fichas navegables para los ocho cursos demo, con rutas estáticas, metadatos, estados editoriales explícitos y contenido provisional sin presentar supuestos como hechos.</w:t>
+            </w:r>
+          </w:p>
+        </w:tc>
+        <w:tc>
+          <w:tcPr>
+            <w:tcW w:type="dxa" w:w="2493"/>
+            <w:vAlign w:val="top"/>
+            <w:tcBorders>
+              <w:top w:val="single" w:sz="4" w:color="D9DEE7"/>
+              <w:left w:val="single" w:sz="4" w:color="D9DEE7"/>
+              <w:bottom w:val="single" w:sz="4" w:color="D9DEE7"/>
+              <w:right w:val="single" w:sz="4" w:color="D9DEE7"/>
+              <w:insideH w:val="single" w:sz="4" w:color="D9DEE7"/>
+              <w:insideV w:val="single" w:sz="4" w:color="D9DEE7"/>
+            </w:tcBorders>
+            <w:shd w:fill="F7F8FA"/>
+          </w:tcPr>
+          <w:p>
+            <w:r>
+              <w:t>lint, typecheck, test (2/2), build con 8 rutas SSG y git diff --check: PASS. VER-007 a VER-010: PASS; navegación catálogo -&gt; Tórax, cuatro viewports, cero overflow y cero errores de consola.</w:t>
+            </w:r>
+          </w:p>
+        </w:tc>
+        <w:tc>
+          <w:tcPr>
+            <w:tcW w:type="dxa" w:w="2493"/>
+            <w:vAlign w:val="top"/>
+            <w:tcBorders>
+              <w:top w:val="single" w:sz="4" w:color="D9DEE7"/>
+              <w:left w:val="single" w:sz="4" w:color="D9DEE7"/>
+              <w:bottom w:val="single" w:sz="4" w:color="D9DEE7"/>
+              <w:right w:val="single" w:sz="4" w:color="D9DEE7"/>
+              <w:insideH w:val="single" w:sz="4" w:color="D9DEE7"/>
+              <w:insideV w:val="single" w:sz="4" w:color="D9DEE7"/>
+            </w:tcBorders>
+            <w:shd w:fill="F7F8FA"/>
+          </w:tcPr>
+          <w:p>
+            <w:r>
+              <w:t>[~] Fase 1 en curso. Próximo: coordinación debe seleccionar el curso vertical y entregar contenido autorizado; después se reemplaza la ficha demo por el recorrido académico real.</w:t>
+            </w:r>
+          </w:p>
+        </w:tc>
+      </w:tr>
+      <w:tr>
+        <w:tc>
+          <w:tcPr>
+            <w:tcW w:type="dxa" w:w="2493"/>
+          </w:tcPr>
+          <w:p>
+            <w:r>
+              <w:t>OPS-001 / 01/08/2026</w:t>
+            </w:r>
+          </w:p>
+        </w:tc>
+        <w:tc>
+          <w:tcPr>
+            <w:tcW w:type="dxa" w:w="2493"/>
+          </w:tcPr>
+          <w:p>
+            <w:r>
+              <w:t>Regla de liberación: todo cambio que afecte la web debe cerrar con documentación, commit, push, despliegue en Vercel y verificación de la URL publicada.</w:t>
+            </w:r>
+          </w:p>
+        </w:tc>
+        <w:tc>
+          <w:tcPr>
+            <w:tcW w:type="dxa" w:w="2493"/>
+          </w:tcPr>
+          <w:p>
+            <w:r>
+              <w:t>Política incorporada al documento canónico antes de publicar los cambios pendientes.</w:t>
+            </w:r>
+          </w:p>
+        </w:tc>
+        <w:tc>
+          <w:tcPr>
+            <w:tcW w:type="dxa" w:w="2493"/>
+          </w:tcPr>
+          <w:p>
+            <w:r>
+              <w:t>[~] Ejecución iniciada en esta entrega. Próximo: publicar main y verificar la implementación de Vercel.</w:t>
+            </w:r>
+          </w:p>
+        </w:tc>
+      </w:tr>
     </w:tbl>
     <w:p>
       <w:pPr>
@@ -22590,10 +22722,10 @@
     <w:p>
       <w:pPr>
         <w:pStyle w:val="Heading2"/>
-        <w:keepNext w:val="1"/>
-      </w:pPr>
-      <w:r>
-        <w:t>Ficha de cambio - plantilla</w:t>
+        <w:keepNext/>
+      </w:pPr>
+      <w:r>
+        <w:t>Ficha de cambio - CHG-003</w:t>
       </w:r>
     </w:p>
     <w:tbl>
@@ -22712,6 +22844,639 @@
             <w:vAlign w:val="top"/>
           </w:tcPr>
           <w:p>
+            <w:r>
+              <w:t>CHG-003 / 01/08/2026 / Codex con José</w:t>
+            </w:r>
+          </w:p>
+        </w:tc>
+      </w:tr>
+      <w:tr>
+        <w:trPr>
+          <w:cantSplit/>
+        </w:trPr>
+        <w:tc>
+          <w:tcPr>
+            <w:tcW w:type="dxa" w:w="2835"/>
+            <w:shd w:fill="F7F8FA"/>
+            <w:tcBorders>
+              <w:top w:val="single" w:sz="4" w:color="D9DEE7"/>
+              <w:left w:val="single" w:sz="4" w:color="D9DEE7"/>
+              <w:bottom w:val="single" w:sz="4" w:color="D9DEE7"/>
+              <w:right w:val="single" w:sz="4" w:color="D9DEE7"/>
+              <w:insideH w:val="single" w:sz="4" w:color="D9DEE7"/>
+              <w:insideV w:val="single" w:sz="4" w:color="D9DEE7"/>
+            </w:tcBorders>
+            <w:vAlign w:val="top"/>
+          </w:tcPr>
+          <w:p>
+            <w:pPr>
+              <w:spacing w:after="40"/>
+            </w:pPr>
+            <w:r>
+              <w:rPr>
+                <w:sz w:val="17"/>
+              </w:rPr>
+              <w:t>Fase y objetivo</w:t>
+            </w:r>
+          </w:p>
+        </w:tc>
+        <w:tc>
+          <w:tcPr>
+            <w:tcW w:type="dxa" w:w="6236"/>
+            <w:shd w:fill="F7F8FA"/>
+            <w:tcBorders>
+              <w:top w:val="single" w:sz="4" w:color="D9DEE7"/>
+              <w:left w:val="single" w:sz="4" w:color="D9DEE7"/>
+              <w:bottom w:val="single" w:sz="4" w:color="D9DEE7"/>
+              <w:right w:val="single" w:sz="4" w:color="D9DEE7"/>
+              <w:insideH w:val="single" w:sz="4" w:color="D9DEE7"/>
+              <w:insideV w:val="single" w:sz="4" w:color="D9DEE7"/>
+            </w:tcBorders>
+            <w:vAlign w:val="top"/>
+          </w:tcPr>
+          <w:p>
+            <w:r>
+              <w:t>Fase 1 - convertir el catálogo genérico en una experiencia navegable sin inventar contenido académico ni adelantar integraciones bloqueadas.</w:t>
+            </w:r>
+          </w:p>
+        </w:tc>
+      </w:tr>
+      <w:tr>
+        <w:trPr>
+          <w:cantSplit/>
+        </w:trPr>
+        <w:tc>
+          <w:tcPr>
+            <w:tcW w:type="dxa" w:w="2835"/>
+            <w:tcBorders>
+              <w:top w:val="single" w:sz="4" w:color="D9DEE7"/>
+              <w:left w:val="single" w:sz="4" w:color="D9DEE7"/>
+              <w:bottom w:val="single" w:sz="4" w:color="D9DEE7"/>
+              <w:right w:val="single" w:sz="4" w:color="D9DEE7"/>
+              <w:insideH w:val="single" w:sz="4" w:color="D9DEE7"/>
+              <w:insideV w:val="single" w:sz="4" w:color="D9DEE7"/>
+            </w:tcBorders>
+            <w:vAlign w:val="top"/>
+          </w:tcPr>
+          <w:p>
+            <w:pPr>
+              <w:spacing w:after="40"/>
+            </w:pPr>
+            <w:r>
+              <w:rPr>
+                <w:sz w:val="17"/>
+              </w:rPr>
+              <w:t>Qué cambió</w:t>
+            </w:r>
+          </w:p>
+        </w:tc>
+        <w:tc>
+          <w:tcPr>
+            <w:tcW w:type="dxa" w:w="6236"/>
+            <w:tcBorders>
+              <w:top w:val="single" w:sz="4" w:color="D9DEE7"/>
+              <w:left w:val="single" w:sz="4" w:color="D9DEE7"/>
+              <w:bottom w:val="single" w:sz="4" w:color="D9DEE7"/>
+              <w:right w:val="single" w:sz="4" w:color="D9DEE7"/>
+              <w:insideH w:val="single" w:sz="4" w:color="D9DEE7"/>
+              <w:insideV w:val="single" w:sz="4" w:color="D9DEE7"/>
+            </w:tcBorders>
+            <w:vAlign w:val="top"/>
+          </w:tcPr>
+          <w:p>
+            <w:r>
+              <w:t>Cada una de las ocho regiones abre una ficha propia. La ficha comunica alcance demo, datos provisionales, paquete mínimo para el piloto y decisión pendiente de coordinación.</w:t>
+            </w:r>
+          </w:p>
+        </w:tc>
+      </w:tr>
+      <w:tr>
+        <w:trPr>
+          <w:cantSplit/>
+        </w:trPr>
+        <w:tc>
+          <w:tcPr>
+            <w:tcW w:type="dxa" w:w="2835"/>
+            <w:shd w:fill="F7F8FA"/>
+            <w:tcBorders>
+              <w:top w:val="single" w:sz="4" w:color="D9DEE7"/>
+              <w:left w:val="single" w:sz="4" w:color="D9DEE7"/>
+              <w:bottom w:val="single" w:sz="4" w:color="D9DEE7"/>
+              <w:right w:val="single" w:sz="4" w:color="D9DEE7"/>
+              <w:insideH w:val="single" w:sz="4" w:color="D9DEE7"/>
+              <w:insideV w:val="single" w:sz="4" w:color="D9DEE7"/>
+            </w:tcBorders>
+            <w:vAlign w:val="top"/>
+          </w:tcPr>
+          <w:p>
+            <w:pPr>
+              <w:spacing w:after="40"/>
+            </w:pPr>
+            <w:r>
+              <w:rPr>
+                <w:sz w:val="17"/>
+              </w:rPr>
+              <w:t>Cómo se implementó</w:t>
+            </w:r>
+          </w:p>
+        </w:tc>
+        <w:tc>
+          <w:tcPr>
+            <w:tcW w:type="dxa" w:w="6236"/>
+            <w:shd w:fill="F7F8FA"/>
+            <w:tcBorders>
+              <w:top w:val="single" w:sz="4" w:color="D9DEE7"/>
+              <w:left w:val="single" w:sz="4" w:color="D9DEE7"/>
+              <w:bottom w:val="single" w:sz="4" w:color="D9DEE7"/>
+              <w:right w:val="single" w:sz="4" w:color="D9DEE7"/>
+              <w:insideH w:val="single" w:sz="4" w:color="D9DEE7"/>
+              <w:insideV w:val="single" w:sz="4" w:color="D9DEE7"/>
+            </w:tcBorders>
+            <w:vAlign w:val="top"/>
+          </w:tcPr>
+          <w:p>
+            <w:r>
+              <w:t>Se añadieron slugs tipados al catálogo, resolución segura por slug, generateStaticParams para ocho páginas SSG, metadatos por curso, enlaces accesibles y una composición editorial responsive que reutiliza el sistema visual existente.</w:t>
+            </w:r>
+          </w:p>
+        </w:tc>
+      </w:tr>
+      <w:tr>
+        <w:trPr>
+          <w:cantSplit/>
+        </w:trPr>
+        <w:tc>
+          <w:tcPr>
+            <w:tcW w:type="dxa" w:w="2835"/>
+            <w:tcBorders>
+              <w:top w:val="single" w:sz="4" w:color="D9DEE7"/>
+              <w:left w:val="single" w:sz="4" w:color="D9DEE7"/>
+              <w:bottom w:val="single" w:sz="4" w:color="D9DEE7"/>
+              <w:right w:val="single" w:sz="4" w:color="D9DEE7"/>
+              <w:insideH w:val="single" w:sz="4" w:color="D9DEE7"/>
+              <w:insideV w:val="single" w:sz="4" w:color="D9DEE7"/>
+            </w:tcBorders>
+            <w:vAlign w:val="top"/>
+          </w:tcPr>
+          <w:p>
+            <w:pPr>
+              <w:spacing w:after="40"/>
+            </w:pPr>
+            <w:r>
+              <w:rPr>
+                <w:sz w:val="17"/>
+              </w:rPr>
+              <w:t>Archivos / migraciones / servicios</w:t>
+            </w:r>
+          </w:p>
+        </w:tc>
+        <w:tc>
+          <w:tcPr>
+            <w:tcW w:type="dxa" w:w="6236"/>
+            <w:tcBorders>
+              <w:top w:val="single" w:sz="4" w:color="D9DEE7"/>
+              <w:left w:val="single" w:sz="4" w:color="D9DEE7"/>
+              <w:bottom w:val="single" w:sz="4" w:color="D9DEE7"/>
+              <w:right w:val="single" w:sz="4" w:color="D9DEE7"/>
+              <w:insideH w:val="single" w:sz="4" w:color="D9DEE7"/>
+              <w:insideV w:val="single" w:sz="4" w:color="D9DEE7"/>
+            </w:tcBorders>
+            <w:vAlign w:val="top"/>
+          </w:tcPr>
+          <w:p>
+            <w:r>
+              <w:t>apps/web/src/data/demo-courses.ts; apps/web/src/app/page.tsx; apps/web/src/app/cursos/[slug]/page.tsx; apps/web/src/app/globals.css. Sin migraciones, servicios remotos, videos ni datos reales.</w:t>
+            </w:r>
+          </w:p>
+        </w:tc>
+      </w:tr>
+      <w:tr>
+        <w:trPr>
+          <w:cantSplit/>
+        </w:trPr>
+        <w:tc>
+          <w:tcPr>
+            <w:tcW w:type="dxa" w:w="2835"/>
+            <w:shd w:fill="F7F8FA"/>
+            <w:tcBorders>
+              <w:top w:val="single" w:sz="4" w:color="D9DEE7"/>
+              <w:left w:val="single" w:sz="4" w:color="D9DEE7"/>
+              <w:bottom w:val="single" w:sz="4" w:color="D9DEE7"/>
+              <w:right w:val="single" w:sz="4" w:color="D9DEE7"/>
+              <w:insideH w:val="single" w:sz="4" w:color="D9DEE7"/>
+              <w:insideV w:val="single" w:sz="4" w:color="D9DEE7"/>
+            </w:tcBorders>
+            <w:vAlign w:val="top"/>
+          </w:tcPr>
+          <w:p>
+            <w:pPr>
+              <w:spacing w:after="40"/>
+            </w:pPr>
+            <w:r>
+              <w:rPr>
+                <w:sz w:val="17"/>
+              </w:rPr>
+              <w:t>Seguridad y privacidad</w:t>
+            </w:r>
+          </w:p>
+        </w:tc>
+        <w:tc>
+          <w:tcPr>
+            <w:tcW w:type="dxa" w:w="6236"/>
+            <w:shd w:fill="F7F8FA"/>
+            <w:tcBorders>
+              <w:top w:val="single" w:sz="4" w:color="D9DEE7"/>
+              <w:left w:val="single" w:sz="4" w:color="D9DEE7"/>
+              <w:bottom w:val="single" w:sz="4" w:color="D9DEE7"/>
+              <w:right w:val="single" w:sz="4" w:color="D9DEE7"/>
+              <w:insideH w:val="single" w:sz="4" w:color="D9DEE7"/>
+              <w:insideV w:val="single" w:sz="4" w:color="D9DEE7"/>
+            </w:tcBorders>
+            <w:vAlign w:val="top"/>
+          </w:tcPr>
+          <w:p>
+            <w:r>
+              <w:t>No se añadieron formularios, credenciales, matrículas, archivos ni URLs privadas. Los textos distinguen explícitamente cifras demo de contenido aprobado y mantienen la carga deshabilitada hasta contar con autenticación y permisos.</w:t>
+            </w:r>
+          </w:p>
+        </w:tc>
+      </w:tr>
+      <w:tr>
+        <w:trPr>
+          <w:cantSplit/>
+        </w:trPr>
+        <w:tc>
+          <w:tcPr>
+            <w:tcW w:type="dxa" w:w="2835"/>
+            <w:tcBorders>
+              <w:top w:val="single" w:sz="4" w:color="D9DEE7"/>
+              <w:left w:val="single" w:sz="4" w:color="D9DEE7"/>
+              <w:bottom w:val="single" w:sz="4" w:color="D9DEE7"/>
+              <w:right w:val="single" w:sz="4" w:color="D9DEE7"/>
+              <w:insideH w:val="single" w:sz="4" w:color="D9DEE7"/>
+              <w:insideV w:val="single" w:sz="4" w:color="D9DEE7"/>
+            </w:tcBorders>
+            <w:vAlign w:val="top"/>
+          </w:tcPr>
+          <w:p>
+            <w:pPr>
+              <w:spacing w:after="40"/>
+            </w:pPr>
+            <w:r>
+              <w:rPr>
+                <w:sz w:val="17"/>
+              </w:rPr>
+              <w:t>Validación automática</w:t>
+            </w:r>
+          </w:p>
+        </w:tc>
+        <w:tc>
+          <w:tcPr>
+            <w:tcW w:type="dxa" w:w="6236"/>
+            <w:tcBorders>
+              <w:top w:val="single" w:sz="4" w:color="D9DEE7"/>
+              <w:left w:val="single" w:sz="4" w:color="D9DEE7"/>
+              <w:bottom w:val="single" w:sz="4" w:color="D9DEE7"/>
+              <w:right w:val="single" w:sz="4" w:color="D9DEE7"/>
+              <w:insideH w:val="single" w:sz="4" w:color="D9DEE7"/>
+              <w:insideV w:val="single" w:sz="4" w:color="D9DEE7"/>
+            </w:tcBorders>
+            <w:vAlign w:val="top"/>
+          </w:tcPr>
+          <w:p>
+            <w:r>
+              <w:t>PASS: pnpm lint; pnpm typecheck; pnpm test (1 archivo, 2 pruebas); pnpm build; git diff --check. Next generó /cursos/[slug] y ocho rutas estáticas.</w:t>
+            </w:r>
+          </w:p>
+        </w:tc>
+      </w:tr>
+      <w:tr>
+        <w:trPr>
+          <w:cantSplit/>
+        </w:trPr>
+        <w:tc>
+          <w:tcPr>
+            <w:tcW w:type="dxa" w:w="2835"/>
+            <w:shd w:fill="F7F8FA"/>
+            <w:tcBorders>
+              <w:top w:val="single" w:sz="4" w:color="D9DEE7"/>
+              <w:left w:val="single" w:sz="4" w:color="D9DEE7"/>
+              <w:bottom w:val="single" w:sz="4" w:color="D9DEE7"/>
+              <w:right w:val="single" w:sz="4" w:color="D9DEE7"/>
+              <w:insideH w:val="single" w:sz="4" w:color="D9DEE7"/>
+              <w:insideV w:val="single" w:sz="4" w:color="D9DEE7"/>
+            </w:tcBorders>
+            <w:vAlign w:val="top"/>
+          </w:tcPr>
+          <w:p>
+            <w:pPr>
+              <w:spacing w:after="40"/>
+            </w:pPr>
+            <w:r>
+              <w:rPr>
+                <w:sz w:val="17"/>
+              </w:rPr>
+              <w:t>Validación en navegador</w:t>
+            </w:r>
+          </w:p>
+        </w:tc>
+        <w:tc>
+          <w:tcPr>
+            <w:tcW w:type="dxa" w:w="6236"/>
+            <w:shd w:fill="F7F8FA"/>
+            <w:tcBorders>
+              <w:top w:val="single" w:sz="4" w:color="D9DEE7"/>
+              <w:left w:val="single" w:sz="4" w:color="D9DEE7"/>
+              <w:bottom w:val="single" w:sz="4" w:color="D9DEE7"/>
+              <w:right w:val="single" w:sz="4" w:color="D9DEE7"/>
+              <w:insideH w:val="single" w:sz="4" w:color="D9DEE7"/>
+              <w:insideV w:val="single" w:sz="4" w:color="D9DEE7"/>
+            </w:tcBorders>
+            <w:vAlign w:val="top"/>
+          </w:tcPr>
+          <w:p>
+            <w:r>
+              <w:t>VER-007 PASS 1440 x 900; VER-008 PASS 390 x 844; VER-009 PASS 360 x 800; VER-010 PASS 768 x 1024. Se revisaron portada, alcance, recorrido previsto, cierre, navegación catálogo -&gt; Tórax y nombres accesibles de los enlaces; cero overflow y cero warn/error.</w:t>
+            </w:r>
+          </w:p>
+        </w:tc>
+      </w:tr>
+      <w:tr>
+        <w:trPr>
+          <w:cantSplit/>
+        </w:trPr>
+        <w:tc>
+          <w:tcPr>
+            <w:tcW w:type="dxa" w:w="2835"/>
+            <w:tcBorders>
+              <w:top w:val="single" w:sz="4" w:color="D9DEE7"/>
+              <w:left w:val="single" w:sz="4" w:color="D9DEE7"/>
+              <w:bottom w:val="single" w:sz="4" w:color="D9DEE7"/>
+              <w:right w:val="single" w:sz="4" w:color="D9DEE7"/>
+              <w:insideH w:val="single" w:sz="4" w:color="D9DEE7"/>
+              <w:insideV w:val="single" w:sz="4" w:color="D9DEE7"/>
+            </w:tcBorders>
+            <w:vAlign w:val="top"/>
+          </w:tcPr>
+          <w:p>
+            <w:pPr>
+              <w:spacing w:after="40"/>
+            </w:pPr>
+            <w:r>
+              <w:rPr>
+                <w:sz w:val="17"/>
+              </w:rPr>
+              <w:t>Evidencia</w:t>
+            </w:r>
+          </w:p>
+        </w:tc>
+        <w:tc>
+          <w:tcPr>
+            <w:tcW w:type="dxa" w:w="6236"/>
+            <w:tcBorders>
+              <w:top w:val="single" w:sz="4" w:color="D9DEE7"/>
+              <w:left w:val="single" w:sz="4" w:color="D9DEE7"/>
+              <w:bottom w:val="single" w:sz="4" w:color="D9DEE7"/>
+              <w:right w:val="single" w:sz="4" w:color="D9DEE7"/>
+              <w:insideH w:val="single" w:sz="4" w:color="D9DEE7"/>
+              <w:insideV w:val="single" w:sz="4" w:color="D9DEE7"/>
+            </w:tcBorders>
+            <w:vAlign w:val="top"/>
+          </w:tcPr>
+          <w:p>
+            <w:r>
+              <w:t>El build produjo ocho páginas SSG: cuello, tórax, abdomen, pelvis y periné, miembros, cabeza y neuroanatomía. En navegador, el catálogo expuso ocho enlaces con nombres accesibles y la activación de Tórax abrió /cursos/torax con título y H1 correctos.</w:t>
+            </w:r>
+          </w:p>
+        </w:tc>
+      </w:tr>
+      <w:tr>
+        <w:trPr>
+          <w:cantSplit/>
+        </w:trPr>
+        <w:tc>
+          <w:tcPr>
+            <w:tcW w:type="dxa" w:w="2835"/>
+            <w:shd w:fill="F7F8FA"/>
+            <w:tcBorders>
+              <w:top w:val="single" w:sz="4" w:color="D9DEE7"/>
+              <w:left w:val="single" w:sz="4" w:color="D9DEE7"/>
+              <w:bottom w:val="single" w:sz="4" w:color="D9DEE7"/>
+              <w:right w:val="single" w:sz="4" w:color="D9DEE7"/>
+              <w:insideH w:val="single" w:sz="4" w:color="D9DEE7"/>
+              <w:insideV w:val="single" w:sz="4" w:color="D9DEE7"/>
+            </w:tcBorders>
+            <w:vAlign w:val="top"/>
+          </w:tcPr>
+          <w:p>
+            <w:pPr>
+              <w:spacing w:after="40"/>
+            </w:pPr>
+            <w:r>
+              <w:rPr>
+                <w:sz w:val="17"/>
+              </w:rPr>
+              <w:t>Reversión</w:t>
+            </w:r>
+          </w:p>
+        </w:tc>
+        <w:tc>
+          <w:tcPr>
+            <w:tcW w:type="dxa" w:w="6236"/>
+            <w:shd w:fill="F7F8FA"/>
+            <w:tcBorders>
+              <w:top w:val="single" w:sz="4" w:color="D9DEE7"/>
+              <w:left w:val="single" w:sz="4" w:color="D9DEE7"/>
+              <w:bottom w:val="single" w:sz="4" w:color="D9DEE7"/>
+              <w:right w:val="single" w:sz="4" w:color="D9DEE7"/>
+              <w:insideH w:val="single" w:sz="4" w:color="D9DEE7"/>
+              <w:insideV w:val="single" w:sz="4" w:color="D9DEE7"/>
+            </w:tcBorders>
+            <w:vAlign w:val="top"/>
+          </w:tcPr>
+          <w:p>
+            <w:r>
+              <w:t>Revertir CHG-003 elimina los slugs, enlaces, ruta dinámica y estilos de ficha. No existen datos, migraciones ni servicios remotos que revertir.</w:t>
+            </w:r>
+          </w:p>
+        </w:tc>
+      </w:tr>
+      <w:tr>
+        <w:trPr>
+          <w:cantSplit/>
+        </w:trPr>
+        <w:tc>
+          <w:tcPr>
+            <w:tcW w:type="dxa" w:w="2835"/>
+            <w:tcBorders>
+              <w:top w:val="single" w:sz="4" w:color="D9DEE7"/>
+              <w:left w:val="single" w:sz="4" w:color="D9DEE7"/>
+              <w:bottom w:val="single" w:sz="4" w:color="D9DEE7"/>
+              <w:right w:val="single" w:sz="4" w:color="D9DEE7"/>
+              <w:insideH w:val="single" w:sz="4" w:color="D9DEE7"/>
+              <w:insideV w:val="single" w:sz="4" w:color="D9DEE7"/>
+            </w:tcBorders>
+            <w:vAlign w:val="top"/>
+          </w:tcPr>
+          <w:p>
+            <w:pPr>
+              <w:spacing w:after="40"/>
+            </w:pPr>
+            <w:r>
+              <w:rPr>
+                <w:sz w:val="17"/>
+              </w:rPr>
+              <w:t>Pendiente / próximo paso</w:t>
+            </w:r>
+          </w:p>
+        </w:tc>
+        <w:tc>
+          <w:tcPr>
+            <w:tcW w:type="dxa" w:w="6236"/>
+            <w:tcBorders>
+              <w:top w:val="single" w:sz="4" w:color="D9DEE7"/>
+              <w:left w:val="single" w:sz="4" w:color="D9DEE7"/>
+              <w:bottom w:val="single" w:sz="4" w:color="D9DEE7"/>
+              <w:right w:val="single" w:sz="4" w:color="D9DEE7"/>
+              <w:insideH w:val="single" w:sz="4" w:color="D9DEE7"/>
+              <w:insideV w:val="single" w:sz="4" w:color="D9DEE7"/>
+            </w:tcBorders>
+            <w:vAlign w:val="top"/>
+          </w:tcPr>
+          <w:p>
+            <w:r>
+              <w:t>Coordinación debe escoger el curso vertical y entregar programa, objetivos, docentes, dos lecciones, video, guía, 10 preguntas, 20 flashcards y permisos. La instalación local conserva una inconsistencia previa de node_modules para next dev; el build de producción sí pasa y la QA se ejecutó sobre su salida estática.</w:t>
+            </w:r>
+          </w:p>
+        </w:tc>
+      </w:tr>
+    </w:tbl>
+    <w:p>
+      <w:pPr>
+        <w:pStyle w:val="Heading2"/>
+        <w:keepNext/>
+        <w:pageBreakBefore/>
+      </w:pPr>
+      <w:r>
+        <w:t>Ficha de cambio - plantilla</w:t>
+      </w:r>
+    </w:p>
+    <w:tbl>
+      <w:tblPr>
+        <w:tblStyle w:val="TableGrid"/>
+        <w:tblW w:type="auto" w:w="0"/>
+        <w:jc w:val="center"/>
+        <w:tblLayout w:type="autofit"/>
+        <w:tblLook w:firstColumn="1" w:firstRow="1" w:lastColumn="0" w:lastRow="0" w:noHBand="0" w:noVBand="1" w:val="04A0"/>
+      </w:tblPr>
+      <w:tblGrid>
+        <w:gridCol w:w="4986"/>
+        <w:gridCol w:w="4986"/>
+      </w:tblGrid>
+      <w:tr>
+        <w:trPr>
+          <w:tblHeader w:val="true"/>
+        </w:trPr>
+        <w:tc>
+          <w:tcPr>
+            <w:tcW w:type="dxa" w:w="2835"/>
+            <w:shd w:fill="14233B"/>
+            <w:tcBorders>
+              <w:top w:val="single" w:sz="4" w:color="FFFFFF"/>
+              <w:left w:val="single" w:sz="4" w:color="FFFFFF"/>
+              <w:bottom w:val="single" w:sz="4" w:color="FFFFFF"/>
+              <w:right w:val="single" w:sz="4" w:color="FFFFFF"/>
+              <w:insideH w:val="single" w:sz="4" w:color="FFFFFF"/>
+              <w:insideV w:val="single" w:sz="4" w:color="FFFFFF"/>
+            </w:tcBorders>
+            <w:vAlign w:val="center"/>
+          </w:tcPr>
+          <w:p>
+            <w:pPr>
+              <w:jc w:val="left"/>
+            </w:pPr>
+            <w:r>
+              <w:rPr>
+                <w:b/>
+                <w:color w:val="FFFFFF"/>
+                <w:sz w:val="17"/>
+              </w:rPr>
+              <w:t>Campo</w:t>
+            </w:r>
+          </w:p>
+        </w:tc>
+        <w:tc>
+          <w:tcPr>
+            <w:tcW w:type="dxa" w:w="6236"/>
+            <w:shd w:fill="14233B"/>
+            <w:tcBorders>
+              <w:top w:val="single" w:sz="4" w:color="FFFFFF"/>
+              <w:left w:val="single" w:sz="4" w:color="FFFFFF"/>
+              <w:bottom w:val="single" w:sz="4" w:color="FFFFFF"/>
+              <w:right w:val="single" w:sz="4" w:color="FFFFFF"/>
+              <w:insideH w:val="single" w:sz="4" w:color="FFFFFF"/>
+              <w:insideV w:val="single" w:sz="4" w:color="FFFFFF"/>
+            </w:tcBorders>
+            <w:vAlign w:val="center"/>
+          </w:tcPr>
+          <w:p>
+            <w:pPr>
+              <w:jc w:val="left"/>
+            </w:pPr>
+            <w:r>
+              <w:rPr>
+                <w:b/>
+                <w:color w:val="FFFFFF"/>
+                <w:sz w:val="17"/>
+              </w:rPr>
+              <w:t>Contenido</w:t>
+            </w:r>
+          </w:p>
+        </w:tc>
+      </w:tr>
+      <w:tr>
+        <w:trPr>
+          <w:cantSplit/>
+        </w:trPr>
+        <w:tc>
+          <w:tcPr>
+            <w:tcW w:type="dxa" w:w="2835"/>
+            <w:tcBorders>
+              <w:top w:val="single" w:sz="4" w:color="D9DEE7"/>
+              <w:left w:val="single" w:sz="4" w:color="D9DEE7"/>
+              <w:bottom w:val="single" w:sz="4" w:color="D9DEE7"/>
+              <w:right w:val="single" w:sz="4" w:color="D9DEE7"/>
+              <w:insideH w:val="single" w:sz="4" w:color="D9DEE7"/>
+              <w:insideV w:val="single" w:sz="4" w:color="D9DEE7"/>
+            </w:tcBorders>
+            <w:vAlign w:val="top"/>
+          </w:tcPr>
+          <w:p>
+            <w:pPr>
+              <w:spacing w:after="40"/>
+            </w:pPr>
+            <w:r>
+              <w:rPr>
+                <w:sz w:val="17"/>
+              </w:rPr>
+              <w:t>ID / fecha / autor</w:t>
+            </w:r>
+          </w:p>
+        </w:tc>
+        <w:tc>
+          <w:tcPr>
+            <w:tcW w:type="dxa" w:w="6236"/>
+            <w:tcBorders>
+              <w:top w:val="single" w:sz="4" w:color="D9DEE7"/>
+              <w:left w:val="single" w:sz="4" w:color="D9DEE7"/>
+              <w:bottom w:val="single" w:sz="4" w:color="D9DEE7"/>
+              <w:right w:val="single" w:sz="4" w:color="D9DEE7"/>
+              <w:insideH w:val="single" w:sz="4" w:color="D9DEE7"/>
+              <w:insideV w:val="single" w:sz="4" w:color="D9DEE7"/>
+            </w:tcBorders>
+            <w:vAlign w:val="top"/>
+          </w:tcPr>
+          <w:p>
             <w:pPr>
               <w:spacing w:after="40"/>
             </w:pPr>
@@ -23420,7 +24185,7 @@
             <w:r>
               <w:t>Siguiente punto de control</w:t>
               <w:br/>
-              <w:t>El catálogo actual es una demostración de arquitectura de información, no un catálogo académico aprobado. No activar cargas ni construir todo el portal: primero contener credenciales, reunir marca y contenido, seleccionar un curso vertical y completar su ficha navegable.</w:t>
+              <w:t>Las ocho fichas demo ya son navegables y su estructura está verificada. No activar cargas ni construir todo el portal: primero contener credenciales, reunir marca y contenido, seleccionar un curso vertical y sustituir sus datos provisionales por información académica autorizada.</w:t>
             </w:r>
           </w:p>
         </w:tc>
@@ -24161,6 +24926,97 @@
           <w:p>
             <w:r>
               <w:t>Nombre CEDIAH confirmado; catálogo demo responsive, video preparado y publicación inicial en GitHub.</w:t>
+            </w:r>
+          </w:p>
+        </w:tc>
+      </w:tr>
+      <w:tr>
+        <w:tc>
+          <w:tcPr>
+            <w:tcW w:type="dxa" w:w="3324"/>
+            <w:vAlign w:val="top"/>
+            <w:tcBorders>
+              <w:top w:val="single" w:sz="4" w:color="D9DEE7"/>
+              <w:left w:val="single" w:sz="4" w:color="D9DEE7"/>
+              <w:bottom w:val="single" w:sz="4" w:color="D9DEE7"/>
+              <w:right w:val="single" w:sz="4" w:color="D9DEE7"/>
+              <w:insideH w:val="single" w:sz="4" w:color="D9DEE7"/>
+              <w:insideV w:val="single" w:sz="4" w:color="D9DEE7"/>
+            </w:tcBorders>
+          </w:tcPr>
+          <w:p>
+            <w:r>
+              <w:t>1.5</w:t>
+            </w:r>
+          </w:p>
+        </w:tc>
+        <w:tc>
+          <w:tcPr>
+            <w:tcW w:type="dxa" w:w="3324"/>
+            <w:vAlign w:val="top"/>
+            <w:tcBorders>
+              <w:top w:val="single" w:sz="4" w:color="D9DEE7"/>
+              <w:left w:val="single" w:sz="4" w:color="D9DEE7"/>
+              <w:bottom w:val="single" w:sz="4" w:color="D9DEE7"/>
+              <w:right w:val="single" w:sz="4" w:color="D9DEE7"/>
+              <w:insideH w:val="single" w:sz="4" w:color="D9DEE7"/>
+              <w:insideV w:val="single" w:sz="4" w:color="D9DEE7"/>
+            </w:tcBorders>
+          </w:tcPr>
+          <w:p>
+            <w:r>
+              <w:t>01/08/2026</w:t>
+            </w:r>
+          </w:p>
+        </w:tc>
+        <w:tc>
+          <w:tcPr>
+            <w:tcW w:type="dxa" w:w="3324"/>
+            <w:vAlign w:val="top"/>
+            <w:tcBorders>
+              <w:top w:val="single" w:sz="4" w:color="D9DEE7"/>
+              <w:left w:val="single" w:sz="4" w:color="D9DEE7"/>
+              <w:bottom w:val="single" w:sz="4" w:color="D9DEE7"/>
+              <w:right w:val="single" w:sz="4" w:color="D9DEE7"/>
+              <w:insideH w:val="single" w:sz="4" w:color="D9DEE7"/>
+              <w:insideV w:val="single" w:sz="4" w:color="D9DEE7"/>
+            </w:tcBorders>
+          </w:tcPr>
+          <w:p>
+            <w:r>
+              <w:t>Ocho fichas de curso demo navegables y responsive; rutas SSG, navegación de catálogo y evidencia de navegador registradas.</w:t>
+            </w:r>
+          </w:p>
+        </w:tc>
+      </w:tr>
+      <w:tr>
+        <w:tc>
+          <w:tcPr>
+            <w:tcW w:type="dxa" w:w="3324"/>
+          </w:tcPr>
+          <w:p>
+            <w:r>
+              <w:t>1.6</w:t>
+            </w:r>
+          </w:p>
+        </w:tc>
+        <w:tc>
+          <w:tcPr>
+            <w:tcW w:type="dxa" w:w="3324"/>
+          </w:tcPr>
+          <w:p>
+            <w:r>
+              <w:t>01/08/2026</w:t>
+            </w:r>
+          </w:p>
+        </w:tc>
+        <w:tc>
+          <w:tcPr>
+            <w:tcW w:type="dxa" w:w="3324"/>
+          </w:tcPr>
+          <w:p>
+            <w:r>
+              <w:t>Regla de liberación: documentar, publicar en GitHub, desplegar Vercel y verificar cada entrega web.</w:t>
             </w:r>
           </w:p>
         </w:tc>

</xml_diff>

<commit_message>
docs: record Vercel production deployment
</commit_message>
<xml_diff>
--- a/CEDIAH Web Status.docx
+++ b/CEDIAH Web Status.docx
@@ -176,7 +176,7 @@
           </w:tcPr>
           <w:p>
             <w:r>
-              <w:t>1.6</w:t>
+              <w:t>1.7</w:t>
             </w:r>
           </w:p>
         </w:tc>
@@ -276,7 +276,7 @@
           </w:tcPr>
           <w:p>
             <w:r>
-              <w:t>Fase 1 en curso - landing, catálogo y ocho fichas demo responsive verificadas; repositorio publicado en GitHub; contenido real, autenticación y despliegues pendientes</w:t>
+              <w:t>Fase 1 en curso - landing, catálogo y ocho fichas demo responsive verificadas y desplegadas en producción en Vercel; contenido real, autenticación y despliegues Render/Supabase pendientes</w:t>
             </w:r>
           </w:p>
         </w:tc>
@@ -1907,7 +1907,7 @@
           </w:tcPr>
           <w:p>
             <w:r>
-              <w:t>Configuración inicial en código; despliegues no ejecutados</w:t>
+              <w:t>Vercel web en producción; Render y Supabase pendientes</w:t>
             </w:r>
           </w:p>
         </w:tc>
@@ -1927,7 +1927,7 @@
           </w:tcPr>
           <w:p>
             <w:r>
-              <w:t>Vercel, Render y Supabase tienen configuración o scaffolding portable. Aún no se conectaron cuentas ni ambientes remotos.</w:t>
+              <w:t>Producción Vercel Ready para commit 3f48804: https://cediah.vercel.app. Render API Docker y Supabase aún no se conectaron.</w:t>
             </w:r>
           </w:p>
         </w:tc>
@@ -21379,7 +21379,49 @@
           </w:tcPr>
           <w:p>
             <w:r>
-              <w:t>[~] Ejecución iniciada en esta entrega. Próximo: publicar main y verificar la implementación de Vercel.</w:t>
+              <w:t>[x] Política aplicada: main publicado y Vercel Production Ready verificado en https://cediah.vercel.app.</w:t>
+            </w:r>
+          </w:p>
+        </w:tc>
+      </w:tr>
+      <w:tr>
+        <w:tc>
+          <w:tcPr>
+            <w:tcW w:type="dxa" w:w="2493"/>
+          </w:tcPr>
+          <w:p>
+            <w:r>
+              <w:t>DEP-001 / 01/08/2026</w:t>
+            </w:r>
+          </w:p>
+        </w:tc>
+        <w:tc>
+          <w:tcPr>
+            <w:tcW w:type="dxa" w:w="2493"/>
+          </w:tcPr>
+          <w:p>
+            <w:r>
+              <w:t>Publicación de main y despliegue de producción de la web en Vercel.</w:t>
+            </w:r>
+          </w:p>
+        </w:tc>
+        <w:tc>
+          <w:tcPr>
+            <w:tcW w:type="dxa" w:w="2493"/>
+          </w:tcPr>
+          <w:p>
+            <w:r>
+              <w:t>GitHub recibió 3f48804. Vercel marcó Production Ready; https://cediah.vercel.app/cursos/cuello mostró la ficha, título y H1 correctos, sin overflow ni errores de consola propios.</w:t>
+            </w:r>
+          </w:p>
+        </w:tc>
+        <w:tc>
+          <w:tcPr>
+            <w:tcW w:type="dxa" w:w="2493"/>
+          </w:tcPr>
+          <w:p>
+            <w:r>
+              <w:t>[x] Web pública verificada. Render API Docker y Supabase siguen pendientes.</w:t>
             </w:r>
           </w:p>
         </w:tc>
@@ -24125,7 +24167,7 @@
         <w:ind w:left="255" w:hanging="255"/>
       </w:pPr>
       <w:r>
-        <w:t>[~] Configurar ambientes iniciales: Vercel para web, Render para API Docker y Supabase para datos/identidad/archivos.</w:t>
+        <w:t>[~] Web desplegada y verificada en Vercel; faltan Render para API Docker y Supabase para datos, identidad y archivos.</w:t>
       </w:r>
     </w:p>
     <w:p>
@@ -25017,6 +25059,38 @@
           <w:p>
             <w:r>
               <w:t>Regla de liberación: documentar, publicar en GitHub, desplegar Vercel y verificar cada entrega web.</w:t>
+            </w:r>
+          </w:p>
+        </w:tc>
+      </w:tr>
+      <w:tr>
+        <w:tc>
+          <w:tcPr>
+            <w:tcW w:type="dxa" w:w="3324"/>
+          </w:tcPr>
+          <w:p>
+            <w:r>
+              <w:t>1.7</w:t>
+            </w:r>
+          </w:p>
+        </w:tc>
+        <w:tc>
+          <w:tcPr>
+            <w:tcW w:type="dxa" w:w="3324"/>
+          </w:tcPr>
+          <w:p>
+            <w:r>
+              <w:t>01/08/2026</w:t>
+            </w:r>
+          </w:p>
+        </w:tc>
+        <w:tc>
+          <w:tcPr>
+            <w:tcW w:type="dxa" w:w="3324"/>
+          </w:tcPr>
+          <w:p>
+            <w:r>
+              <w:t>Producción Vercel Ready para 3f48804; URL pública verificada y bitácora de liberación actualizada.</w:t>
             </w:r>
           </w:p>
         </w:tc>

</xml_diff>

<commit_message>
docs: record credential rotation and Supabase readiness
</commit_message>
<xml_diff>
--- a/CEDIAH Web Status.docx
+++ b/CEDIAH Web Status.docx
@@ -176,7 +176,7 @@
           </w:tcPr>
           <w:p>
             <w:r>
-              <w:t>1.7</w:t>
+              <w:t>1.8</w:t>
             </w:r>
           </w:p>
         </w:tc>
@@ -276,7 +276,7 @@
           </w:tcPr>
           <w:p>
             <w:r>
-              <w:t>Fase 1 en curso - landing, catálogo y ocho fichas demo responsive verificadas y desplegadas en producción en Vercel; contenido real, autenticación y despliegues Render/Supabase pendientes</w:t>
+              <w:t>Fase 1 en curso - landing, catalogo y ocho fichas demo responsive verificadas y desplegadas en produccion en Vercel; credenciales rotadas y proyecto Supabase vacio verificado; contenido real, MFA, autenticacion y despliegues Render/Supabase pendientes</w:t>
             </w:r>
           </w:p>
         </w:tc>
@@ -2185,13 +2185,12 @@
             <w:r>
               <w:rPr>
                 <w:b/>
-                <w:color w:val="14233B"/>
-              </w:rPr>
-              <w:t>[!] Credenciales expuestas en un archivo de texto local</w:t>
+              </w:rPr>
+              <w:t>[~] Credenciales rotadas; contencion por cerrar</w:t>
               <w:br/>
             </w:r>
             <w:r>
-              <w:t>Se detectaron contraseñas y datos de acceso almacenados en texto plano. No se copiaron ni se utilizaron. Antes de crear el repositorio deben rotarse todas las contraseñas expuestas, usar valores únicos, activar MFA y eliminar el archivo solo después de confirmar la rotación. Si alguna contraseña fue reutilizada, se considera comprometida en todos los servicios donde se usó.</w:t>
+              <w:t>El responsable del proyecto confirmo el 01/08/2026 que rotó las credenciales expuestas. No se copiaron, utilizaron ni registraron valores en el repositorio. Falta confirmar MFA en correo, GitHub, Supabase, alojamiento y proveedor de video; solo entonces se elimina el archivo local tras confirmar que nunca entro en Git. Si una clave se reutilizo, debe considerarse comprometida en cada servicio donde se uso.</w:t>
             </w:r>
           </w:p>
         </w:tc>
@@ -2208,14 +2207,7 @@
         <w:ind w:left="255" w:hanging="255"/>
       </w:pPr>
       <w:r>
-        <w:rPr>
-          <w:b/>
-          <w:color w:val="7A263A"/>
-        </w:rPr>
-        <w:t xml:space="preserve">[!] </w:t>
-      </w:r>
-      <w:r>
-        <w:t>Rotar las credenciales expuestas de base de datos y de cuentas asociadas.</w:t>
+        <w:t>[x] Rotar las credenciales expuestas de base de datos y de cuentas asociadas. Confirmado por el responsable el 01/08/2026; sin registrar valores.</w:t>
       </w:r>
     </w:p>
     <w:p>
@@ -10702,13 +10694,40 @@
         <w:ind w:left="255" w:hanging="255"/>
       </w:pPr>
       <w:r>
+        <w:t>[~] Credenciales expuestas rotadas; falta confirmar MFA en todas las cuentas criticas.</w:t>
+      </w:r>
+    </w:p>
+    <w:p>
+      <w:pPr>
+        <w:pStyle w:val="Checklist"/>
+        <w:ind w:left="255" w:hanging="255"/>
+      </w:pPr>
+      <w:r>
+        <w:t>[ ] Eliminar de forma segura el archivo de credenciales una vez confirmados MFA y ausencia de copias en Git.</w:t>
+      </w:r>
+    </w:p>
+    <w:p>
+      <w:pPr>
+        <w:pStyle w:val="Checklist"/>
+        <w:ind w:left="255" w:hanging="255"/>
+      </w:pPr>
+      <w:r>
+        <w:t>[~] Nombre oficial confirmado: CEDIAH. Pendiente reunir logo, paleta, tipografías y autorización de marca.</w:t>
+      </w:r>
+    </w:p>
+    <w:p>
+      <w:pPr>
+        <w:pStyle w:val="Checklist"/>
+        <w:ind w:left="255" w:hanging="255"/>
+      </w:pPr>
+      <w:r>
         <w:rPr>
           <w:b/>
         </w:rPr>
         <w:t xml:space="preserve">[ ] </w:t>
       </w:r>
       <w:r>
-        <w:t>Rotar todas las credenciales expuestas y activar MFA.</w:t>
+        <w:t>Realizar reunión de alcance con coordinación y aprobar el acuerdo mínimo de la sección 3.</w:t>
       </w:r>
     </w:p>
     <w:p>
@@ -10723,16 +10742,7 @@
         <w:t xml:space="preserve">[ ] </w:t>
       </w:r>
       <w:r>
-        <w:t>Eliminar de forma segura el archivo de credenciales una vez confirmada la rotación.</w:t>
-      </w:r>
-    </w:p>
-    <w:p>
-      <w:pPr>
-        <w:pStyle w:val="Checklist"/>
-        <w:ind w:left="255" w:hanging="255"/>
-      </w:pPr>
-      <w:r>
-        <w:t>[~] Nombre oficial confirmado: CEDIAH. Pendiente reunir logo, paleta, tipografías y autorización de marca.</w:t>
+        <w:t>Seleccionar un curso representativo para la demo y obtener permiso de uso de sus materiales.</w:t>
       </w:r>
     </w:p>
     <w:p>
@@ -10747,7 +10757,7 @@
         <w:t xml:space="preserve">[ ] </w:t>
       </w:r>
       <w:r>
-        <w:t>Realizar reunión de alcance con coordinación y aprobar el acuerdo mínimo de la sección 3.</w:t>
+        <w:t>Recibir contenido mínimo: programa, objetivos, docentes, dos lecciones, video, guía, 10 preguntas y 20 flashcards.</w:t>
       </w:r>
     </w:p>
     <w:p>
@@ -10762,7 +10772,7 @@
         <w:t xml:space="preserve">[ ] </w:t>
       </w:r>
       <w:r>
-        <w:t>Seleccionar un curso representativo para la demo y obtener permiso de uso de sus materiales.</w:t>
+        <w:t>Definir criterios de finalización, nota, asistencia, horas y firmantes del certificado.</w:t>
       </w:r>
     </w:p>
     <w:p>
@@ -10777,36 +10787,6 @@
         <w:t xml:space="preserve">[ ] </w:t>
       </w:r>
       <w:r>
-        <w:t>Recibir contenido mínimo: programa, objetivos, docentes, dos lecciones, video, guía, 10 preguntas y 20 flashcards.</w:t>
-      </w:r>
-    </w:p>
-    <w:p>
-      <w:pPr>
-        <w:pStyle w:val="Checklist"/>
-        <w:ind w:left="255" w:hanging="255"/>
-      </w:pPr>
-      <w:r>
-        <w:rPr>
-          <w:b/>
-        </w:rPr>
-        <w:t xml:space="preserve">[ ] </w:t>
-      </w:r>
-      <w:r>
-        <w:t>Definir criterios de finalización, nota, asistencia, horas y firmantes del certificado.</w:t>
-      </w:r>
-    </w:p>
-    <w:p>
-      <w:pPr>
-        <w:pStyle w:val="Checklist"/>
-        <w:ind w:left="255" w:hanging="255"/>
-      </w:pPr>
-      <w:r>
-        <w:rPr>
-          <w:b/>
-        </w:rPr>
-        <w:t xml:space="preserve">[ ] </w:t>
-      </w:r>
-      <w:r>
         <w:t>Definir estudiantes, ponentes y administradores de prueba sin usar datos personales innecesarios.</w:t>
       </w:r>
     </w:p>
@@ -10934,13 +10914,7 @@
         <w:ind w:left="255" w:hanging="255"/>
       </w:pPr>
       <w:r>
-        <w:rPr>
-          <w:b/>
-        </w:rPr>
-        <w:t xml:space="preserve">[ ] </w:t>
-      </w:r>
-      <w:r>
-        <w:t>No quedan credenciales expuestas y MFA está activo en cuentas críticas.</w:t>
+        <w:t>[~] Rotacion de credenciales registrada; MFA en cuentas criticas pendiente de confirmacion.</w:t>
       </w:r>
     </w:p>
     <w:p>
@@ -21426,6 +21400,90 @@
           </w:p>
         </w:tc>
       </w:tr>
+      <w:tr>
+        <w:tc>
+          <w:tcPr>
+            <w:tcW w:type="dxa" w:w="2493"/>
+          </w:tcPr>
+          <w:p>
+            <w:r>
+              <w:t>SEC-001 / 01/08/2026</w:t>
+            </w:r>
+          </w:p>
+        </w:tc>
+        <w:tc>
+          <w:tcPr>
+            <w:tcW w:type="dxa" w:w="2493"/>
+          </w:tcPr>
+          <w:p>
+            <w:r>
+              <w:t>Registro de la rotacion de credenciales confirmada por el responsable del proyecto.</w:t>
+            </w:r>
+          </w:p>
+        </w:tc>
+        <w:tc>
+          <w:tcPr>
+            <w:tcW w:type="dxa" w:w="2493"/>
+          </w:tcPr>
+          <w:p>
+            <w:r>
+              <w:t>Confirmacion del responsable; .gitignore mantiene el archivo local fuera de Git y el arbol de trabajo estaba limpio. No se leyeron ni registraron secretos. MFA y eliminacion segura siguen pendientes de confirmacion.</w:t>
+            </w:r>
+          </w:p>
+        </w:tc>
+        <w:tc>
+          <w:tcPr>
+            <w:tcW w:type="dxa" w:w="2493"/>
+          </w:tcPr>
+          <w:p>
+            <w:r>
+              <w:t>[~] Rotacion registrada. Proximo: confirmar MFA y que el archivo nunca entro en Git antes de eliminarlo.</w:t>
+            </w:r>
+          </w:p>
+        </w:tc>
+      </w:tr>
+      <w:tr>
+        <w:tc>
+          <w:tcPr>
+            <w:tcW w:type="dxa" w:w="2493"/>
+          </w:tcPr>
+          <w:p>
+            <w:r>
+              <w:t>OPS-002 / 01/08/2026</w:t>
+            </w:r>
+          </w:p>
+        </w:tc>
+        <w:tc>
+          <w:tcPr>
+            <w:tcW w:type="dxa" w:w="2493"/>
+          </w:tcPr>
+          <w:p>
+            <w:r>
+              <w:t>Inventario de preparacion de Supabase sin cambios remotos.</w:t>
+            </w:r>
+          </w:p>
+        </w:tc>
+        <w:tc>
+          <w:tcPr>
+            <w:tcW w:type="dxa" w:w="2493"/>
+          </w:tcPr>
+          <w:p>
+            <w:r>
+              <w:t>Proyecto Web CEDIAH activo en Supabase, Postgres 17.6, sin tablas ni migraciones en public. Se revisaron cambios recientes: las tablas nuevas no se exponen automaticamente por Data API; futuras migraciones llevaran grants explicitos y RLS.</w:t>
+            </w:r>
+          </w:p>
+        </w:tc>
+        <w:tc>
+          <w:tcPr>
+            <w:tcW w:type="dxa" w:w="2493"/>
+          </w:tcPr>
+          <w:p>
+            <w:r>
+              <w:t>[~] Entorno de datos listo pero sin esquema. Proximo: aprobar roles, curso vertical y criterios academicos antes de crear la primera migracion.</w:t>
+            </w:r>
+          </w:p>
+        </w:tc>
+      </w:tr>
     </w:tbl>
     <w:p>
       <w:pPr>
@@ -24112,14 +24170,7 @@
         <w:ind w:left="255" w:hanging="255"/>
       </w:pPr>
       <w:r>
-        <w:rPr>
-          <w:b/>
-          <w:color w:val="7A263A"/>
-        </w:rPr>
-        <w:t xml:space="preserve">[!] </w:t>
-      </w:r>
-      <w:r>
-        <w:t>Rotar las credenciales expuestas, activar MFA y confirmar la contención.</w:t>
+        <w:t>[~] Credenciales rotadas; confirmar MFA y cerrar la contencion antes de eliminar el archivo local.</w:t>
       </w:r>
     </w:p>
     <w:p>
@@ -25091,6 +25142,38 @@
           <w:p>
             <w:r>
               <w:t>Producción Vercel Ready para 3f48804; URL pública verificada y bitácora de liberación actualizada.</w:t>
+            </w:r>
+          </w:p>
+        </w:tc>
+      </w:tr>
+      <w:tr>
+        <w:tc>
+          <w:tcPr>
+            <w:tcW w:type="dxa" w:w="3324"/>
+          </w:tcPr>
+          <w:p>
+            <w:r>
+              <w:t>1.8</w:t>
+            </w:r>
+          </w:p>
+        </w:tc>
+        <w:tc>
+          <w:tcPr>
+            <w:tcW w:type="dxa" w:w="3324"/>
+          </w:tcPr>
+          <w:p>
+            <w:r>
+              <w:t>01/08/2026</w:t>
+            </w:r>
+          </w:p>
+        </w:tc>
+        <w:tc>
+          <w:tcPr>
+            <w:tcW w:type="dxa" w:w="3324"/>
+          </w:tcPr>
+          <w:p>
+            <w:r>
+              <w:t>Rotacion de credenciales registrada sin secretos; proyecto Supabase vacio y activo verificado; MFA, eliminacion segura y aprobaciones de la Fase 0 siguen pendientes.</w:t>
             </w:r>
           </w:p>
         </w:tc>

</xml_diff>

<commit_message>
feat: establish Supabase platform foundation
</commit_message>
<xml_diff>
--- a/CEDIAH Web Status.docx
+++ b/CEDIAH Web Status.docx
@@ -176,7 +176,7 @@
           </w:tcPr>
           <w:p>
             <w:r>
-              <w:t>1.8</w:t>
+              <w:t>1.9</w:t>
             </w:r>
           </w:p>
         </w:tc>
@@ -276,7 +276,7 @@
           </w:tcPr>
           <w:p>
             <w:r>
-              <w:t>Fase 1 en curso - landing, catalogo y ocho fichas demo responsive verificadas y desplegadas en produccion en Vercel; credenciales rotadas y proyecto Supabase vacio verificado; contenido real, MFA, autenticacion y despliegues Render/Supabase pendientes</w:t>
+              <w:t>Fase 1 en curso - landing, catalogo y ocho fichas demo responsive verificados y desplegados en produccion en Vercel; coordinacion aprobo la plataforma, MFA y contencion cerrados; fundacion de datos en Supabase aplicada; contenido real, autenticacion y despliegue Render pendientes</w:t>
             </w:r>
           </w:p>
         </w:tc>
@@ -2186,11 +2186,11 @@
               <w:rPr>
                 <w:b/>
               </w:rPr>
-              <w:t>[~] Credenciales rotadas; contencion por cerrar</w:t>
+              <w:t>[x] Contencion de credenciales cerrada</w:t>
               <w:br/>
             </w:r>
             <w:r>
-              <w:t>El responsable del proyecto confirmo el 01/08/2026 que rotó las credenciales expuestas. No se copiaron, utilizaron ni registraron valores en el repositorio. Falta confirmar MFA en correo, GitHub, Supabase, alojamiento y proveedor de video; solo entonces se elimina el archivo local tras confirmar que nunca entro en Git. Si una clave se reutilizo, debe considerarse comprometida en cada servicio donde se uso.</w:t>
+              <w:t>El responsable del proyecto confirmo el 01/08/2026 la rotacion de las credenciales y MFA activo en las cuentas criticas. Se verifico que el archivo local historico ya no existe y que Git no registra rastreo ni historial para ese nombre. No se copiaron, utilizaron ni registraron secretos durante el trabajo de la plataforma.</w:t>
             </w:r>
           </w:p>
         </w:tc>
@@ -2216,14 +2216,7 @@
         <w:ind w:left="255" w:hanging="255"/>
       </w:pPr>
       <w:r>
-        <w:rPr>
-          <w:b/>
-          <w:color w:val="7A263A"/>
-        </w:rPr>
-        <w:t xml:space="preserve">[!] </w:t>
-      </w:r>
-      <w:r>
-        <w:t>Activar MFA en correo, GitHub, Supabase, alojamiento y proveedor de video.</w:t>
+        <w:t>[x] MFA activo en correo, GitHub, Supabase, alojamiento y proveedor de video. Confirmado por el responsable el 01/08/2026.</w:t>
       </w:r>
     </w:p>
     <w:p>
@@ -2247,13 +2240,7 @@
         <w:ind w:left="255" w:hanging="255"/>
       </w:pPr>
       <w:r>
-        <w:rPr>
-          <w:b/>
-        </w:rPr>
-        <w:t xml:space="preserve">[ ] </w:t>
-      </w:r>
-      <w:r>
-        <w:t>Eliminar el archivo con credenciales después de la rotación y confirmar que nunca entró en un repositorio.</w:t>
+        <w:t>[x] El archivo local de credenciales ya no existe; Git no registra rastreo ni historial para su nombre. Verificado el 01/08/2026 sin leer contenido sensible.</w:t>
       </w:r>
     </w:p>
     <w:p>
@@ -9434,14 +9421,8 @@
             <w:vAlign w:val="top"/>
           </w:tcPr>
           <w:p>
-            <w:pPr>
-              <w:spacing w:after="40"/>
-            </w:pPr>
-            <w:r>
-              <w:rPr>
-                <w:sz w:val="17"/>
-              </w:rPr>
-              <w:t>No iniciada</w:t>
+            <w:r>
+              <w:t>En curso</w:t>
             </w:r>
           </w:p>
         </w:tc>
@@ -10584,14 +10565,8 @@
             <w:vAlign w:val="top"/>
           </w:tcPr>
           <w:p>
-            <w:pPr>
-              <w:spacing w:after="40"/>
-            </w:pPr>
-            <w:r>
-              <w:rPr>
-                <w:sz w:val="17"/>
-              </w:rPr>
-              <w:t>No iniciada</w:t>
+            <w:r>
+              <w:t>En curso</w:t>
             </w:r>
           </w:p>
         </w:tc>
@@ -10694,7 +10669,7 @@
         <w:ind w:left="255" w:hanging="255"/>
       </w:pPr>
       <w:r>
-        <w:t>[~] Credenciales expuestas rotadas; falta confirmar MFA en todas las cuentas criticas.</w:t>
+        <w:t>[x] Credenciales expuestas rotadas y MFA activo. Confirmado por el responsable el 01/08/2026.</w:t>
       </w:r>
     </w:p>
     <w:p>
@@ -10703,7 +10678,7 @@
         <w:ind w:left="255" w:hanging="255"/>
       </w:pPr>
       <w:r>
-        <w:t>[ ] Eliminar de forma segura el archivo de credenciales una vez confirmados MFA y ausencia de copias en Git.</w:t>
+        <w:t>[x] Archivo local de credenciales ausente y sin historial Git bajo su nombre; verificado el 01/08/2026.</w:t>
       </w:r>
     </w:p>
     <w:p>
@@ -10713,6 +10688,15 @@
       </w:pPr>
       <w:r>
         <w:t>[~] Nombre oficial confirmado: CEDIAH. Pendiente reunir logo, paleta, tipografías y autorización de marca.</w:t>
+      </w:r>
+    </w:p>
+    <w:p>
+      <w:pPr>
+        <w:pStyle w:val="Checklist"/>
+        <w:ind w:left="255" w:hanging="255"/>
+      </w:pPr>
+      <w:r>
+        <w:t>[x] Coordinacion aprobo el alcance de la plataforma. Confirmado por el responsable el 01/08/2026.</w:t>
       </w:r>
     </w:p>
     <w:p>
@@ -10727,7 +10711,7 @@
         <w:t xml:space="preserve">[ ] </w:t>
       </w:r>
       <w:r>
-        <w:t>Realizar reunión de alcance con coordinación y aprobar el acuerdo mínimo de la sección 3.</w:t>
+        <w:t>Seleccionar un curso representativo para la demo y obtener permiso de uso de sus materiales.</w:t>
       </w:r>
     </w:p>
     <w:p>
@@ -10742,7 +10726,7 @@
         <w:t xml:space="preserve">[ ] </w:t>
       </w:r>
       <w:r>
-        <w:t>Seleccionar un curso representativo para la demo y obtener permiso de uso de sus materiales.</w:t>
+        <w:t>Recibir contenido mínimo: programa, objetivos, docentes, dos lecciones, video, guía, 10 preguntas y 20 flashcards.</w:t>
       </w:r>
     </w:p>
     <w:p>
@@ -10757,7 +10741,7 @@
         <w:t xml:space="preserve">[ ] </w:t>
       </w:r>
       <w:r>
-        <w:t>Recibir contenido mínimo: programa, objetivos, docentes, dos lecciones, video, guía, 10 preguntas y 20 flashcards.</w:t>
+        <w:t>Definir criterios de finalización, nota, asistencia, horas y firmantes del certificado.</w:t>
       </w:r>
     </w:p>
     <w:p>
@@ -10772,21 +10756,6 @@
         <w:t xml:space="preserve">[ ] </w:t>
       </w:r>
       <w:r>
-        <w:t>Definir criterios de finalización, nota, asistencia, horas y firmantes del certificado.</w:t>
-      </w:r>
-    </w:p>
-    <w:p>
-      <w:pPr>
-        <w:pStyle w:val="Checklist"/>
-        <w:ind w:left="255" w:hanging="255"/>
-      </w:pPr>
-      <w:r>
-        <w:rPr>
-          <w:b/>
-        </w:rPr>
-        <w:t xml:space="preserve">[ ] </w:t>
-      </w:r>
-      <w:r>
         <w:t>Definir estudiantes, ponentes y administradores de prueba sin usar datos personales innecesarios.</w:t>
       </w:r>
     </w:p>
@@ -10914,7 +10883,7 @@
         <w:ind w:left="255" w:hanging="255"/>
       </w:pPr>
       <w:r>
-        <w:t>[~] Rotacion de credenciales registrada; MFA en cuentas criticas pendiente de confirmacion.</w:t>
+        <w:t>[x] No quedan credenciales locales expuestas y MFA esta activo en cuentas criticas. Confirmado y verificado el 01/08/2026.</w:t>
       </w:r>
     </w:p>
     <w:p>
@@ -21484,6 +21453,90 @@
           </w:p>
         </w:tc>
       </w:tr>
+      <w:tr>
+        <w:tc>
+          <w:tcPr>
+            <w:tcW w:type="dxa" w:w="2493"/>
+          </w:tcPr>
+          <w:p>
+            <w:r>
+              <w:t>APR-001 / 01/08/2026</w:t>
+            </w:r>
+          </w:p>
+        </w:tc>
+        <w:tc>
+          <w:tcPr>
+            <w:tcW w:type="dxa" w:w="2493"/>
+          </w:tcPr>
+          <w:p>
+            <w:r>
+              <w:t>Aprobacion de la plataforma por coordinacion y confirmacion de MFA.</w:t>
+            </w:r>
+          </w:p>
+        </w:tc>
+        <w:tc>
+          <w:tcPr>
+            <w:tcW w:type="dxa" w:w="2493"/>
+          </w:tcPr>
+          <w:p>
+            <w:r>
+              <w:t>El responsable confirmo que coordinacion aprobo la plataforma y que MFA esta activo. Se verifico que el archivo local historico no existe y no aparece rastreado ni en el historial Git, sin leer contenido sensible.</w:t>
+            </w:r>
+          </w:p>
+        </w:tc>
+        <w:tc>
+          <w:tcPr>
+            <w:tcW w:type="dxa" w:w="2493"/>
+          </w:tcPr>
+          <w:p>
+            <w:r>
+              <w:t>[x] Fundaciones de alcance y seguridad confirmadas. Proximo: registrar curso vertical y contenido autorizado.</w:t>
+            </w:r>
+          </w:p>
+        </w:tc>
+      </w:tr>
+      <w:tr>
+        <w:tc>
+          <w:tcPr>
+            <w:tcW w:type="dxa" w:w="2493"/>
+          </w:tcPr>
+          <w:p>
+            <w:r>
+              <w:t>DB-001 / 01/08/2026</w:t>
+            </w:r>
+          </w:p>
+        </w:tc>
+        <w:tc>
+          <w:tcPr>
+            <w:tcW w:type="dxa" w:w="2493"/>
+          </w:tcPr>
+          <w:p>
+            <w:r>
+              <w:t>Fundacion de datos aplicada en Supabase con RLS y sin acceso directo del navegador.</w:t>
+            </w:r>
+          </w:p>
+        </w:tc>
+        <w:tc>
+          <w:tcPr>
+            <w:tcW w:type="dxa" w:w="2493"/>
+          </w:tcPr>
+          <w:p>
+            <w:r>
+              <w:t>Migraciones 20260801172906 y 20260801173029 aplicadas al proyecto Supabase vacio. Nueve tablas publicas, RLS activo, anon/authenticated sin SELECT y service_role con acceso de servidor. Asesores: sin fallas de seguridad ni claves foraneas sin indice; solo avisos INFO esperados en tablas vacias y cerradas.</w:t>
+            </w:r>
+          </w:p>
+        </w:tc>
+        <w:tc>
+          <w:tcPr>
+            <w:tcW w:type="dxa" w:w="2493"/>
+          </w:tcPr>
+          <w:p>
+            <w:r>
+              <w:t>[x] Esquema remoto versionado y verificado. Proximo: integrar autenticacion y API antes de abrir politicas RLS a flujos concretos.</w:t>
+            </w:r>
+          </w:p>
+        </w:tc>
+      </w:tr>
     </w:tbl>
     <w:p>
       <w:pPr>
@@ -24170,7 +24223,7 @@
         <w:ind w:left="255" w:hanging="255"/>
       </w:pPr>
       <w:r>
-        <w:t>[~] Credenciales rotadas; confirmar MFA y cerrar la contencion antes de eliminar el archivo local.</w:t>
+        <w:t>[x] Credenciales rotadas, MFA activo y archivo local ausente sin historial Git. Contencion cerrada el 01/08/2026.</w:t>
       </w:r>
     </w:p>
     <w:p>
@@ -24218,7 +24271,7 @@
         <w:ind w:left="255" w:hanging="255"/>
       </w:pPr>
       <w:r>
-        <w:t>[~] Web desplegada y verificada en Vercel; faltan Render para API Docker y Supabase para datos, identidad y archivos.</w:t>
+        <w:t>[~] Web desplegada y verificada en Vercel; la fundacion de datos Supabase esta activa. Faltan Render para API Docker, integracion de identidad y almacenamiento privado.</w:t>
       </w:r>
     </w:p>
     <w:p>
@@ -24278,7 +24331,7 @@
             <w:r>
               <w:t>Siguiente punto de control</w:t>
               <w:br/>
-              <w:t>Las ocho fichas demo ya son navegables y su estructura está verificada. No activar cargas ni construir todo el portal: primero contener credenciales, reunir marca y contenido, seleccionar un curso vertical y sustituir sus datos provisionales por información académica autorizada.</w:t>
+              <w:t>La contencion de credenciales, la aprobacion de coordinacion y la fundacion de datos ya estan cerradas. No abrir acceso directo a tablas ni activar cargas de video: primero integrar autenticacion mediante la API, configurar Render y registrar el curso vertical con su contenido academico autorizado.</w:t>
             </w:r>
           </w:p>
         </w:tc>
@@ -25174,6 +25227,38 @@
           <w:p>
             <w:r>
               <w:t>Rotacion de credenciales registrada sin secretos; proyecto Supabase vacio y activo verificado; MFA, eliminacion segura y aprobaciones de la Fase 0 siguen pendientes.</w:t>
+            </w:r>
+          </w:p>
+        </w:tc>
+      </w:tr>
+      <w:tr>
+        <w:tc>
+          <w:tcPr>
+            <w:tcW w:type="dxa" w:w="3324"/>
+          </w:tcPr>
+          <w:p>
+            <w:r>
+              <w:t>1.9</w:t>
+            </w:r>
+          </w:p>
+        </w:tc>
+        <w:tc>
+          <w:tcPr>
+            <w:tcW w:type="dxa" w:w="3324"/>
+          </w:tcPr>
+          <w:p>
+            <w:r>
+              <w:t>01/08/2026</w:t>
+            </w:r>
+          </w:p>
+        </w:tc>
+        <w:tc>
+          <w:tcPr>
+            <w:tcW w:type="dxa" w:w="3324"/>
+          </w:tcPr>
+          <w:p>
+            <w:r>
+              <w:t>Coordinacion aprobo la plataforma; MFA y contencion de credenciales verificados; fundacion de datos Supabase aplicada con RLS, privilegios cerrados e indices de claves foraneas.</w:t>
             </w:r>
           </w:p>
         </w:tc>

</xml_diff>

<commit_message>
feat: establish Supabase authentication foundation
</commit_message>
<xml_diff>
--- a/CEDIAH Web Status.docx
+++ b/CEDIAH Web Status.docx
@@ -1907,7 +1907,7 @@
           </w:tcPr>
           <w:p>
             <w:r>
-              <w:t>Vercel web en producción; Render y Supabase pendientes</w:t>
+              <w:t>Vercel web en producción; Supabase con fundación activa; Render pendiente</w:t>
             </w:r>
           </w:p>
         </w:tc>
@@ -1927,7 +1927,7 @@
           </w:tcPr>
           <w:p>
             <w:r>
-              <w:t>Producción Vercel Ready para commit 3f48804: https://cediah.vercel.app. Render API Docker y Supabase aún no se conectaron.</w:t>
+              <w:t>Producción Vercel Ready para 3f48804: https://cediah.vercel.app. Supabase tiene nueve tablas con RLS y grants cerrados. Render API Docker y la configuración real de identidad siguen pendientes.</w:t>
             </w:r>
           </w:p>
         </w:tc>
@@ -2115,7 +2115,7 @@
           </w:tcPr>
           <w:p>
             <w:r>
-              <w:t>Landing, catálogo y fichas demo: PASS local</w:t>
+              <w:t>Landing, catálogo, fichas y acceso local: PASS</w:t>
             </w:r>
           </w:p>
         </w:tc>
@@ -2134,7 +2134,7 @@
           </w:tcPr>
           <w:p>
             <w:r>
-              <w:t>Ficha de Tórax y navegación desde el catálogo verificadas en 360 x 800, 390 x 844, 768 x 1024 y 1440 x 900; sin overflow horizontal ni errores o advertencias de consola.</w:t>
+              <w:t>Landing, catálogo y fichas demo ya verificados. El acceso, registro, recuperación, actualización de contraseña y panel de reserva se comprobaron localmente en 390 x 844 y 1440 x 900, sin overflow ni errores de consola. La prueba real de cuentas espera configurar los ambientes.</w:t>
             </w:r>
           </w:p>
         </w:tc>
@@ -9550,14 +9550,8 @@
             <w:vAlign w:val="top"/>
           </w:tcPr>
           <w:p>
-            <w:pPr>
-              <w:spacing w:after="40"/>
-            </w:pPr>
-            <w:r>
-              <w:rPr>
-                <w:sz w:val="17"/>
-              </w:rPr>
-              <w:t>No iniciada</w:t>
+            <w:r>
+              <w:t>En curso</w:t>
             </w:r>
           </w:p>
         </w:tc>
@@ -9680,14 +9674,8 @@
             <w:vAlign w:val="top"/>
           </w:tcPr>
           <w:p>
-            <w:pPr>
-              <w:spacing w:after="40"/>
-            </w:pPr>
-            <w:r>
-              <w:rPr>
-                <w:sz w:val="17"/>
-              </w:rPr>
-              <w:t>No iniciada</w:t>
+            <w:r>
+              <w:t>En curso: fundación de identidad</w:t>
             </w:r>
           </w:p>
         </w:tc>
@@ -11217,13 +11205,7 @@
         <w:ind w:left="255" w:hanging="255"/>
       </w:pPr>
       <w:r>
-        <w:rPr>
-          <w:b/>
-        </w:rPr>
-        <w:t xml:space="preserve">[ ] </w:t>
-      </w:r>
-      <w:r>
-        <w:t>Construir layout público, layout autenticado y layout administrativo en una sola aplicación.</w:t>
+        <w:t>[~] Layout público y acceso autenticado inicial en una sola aplicación; layout administrativo pendiente.</w:t>
       </w:r>
     </w:p>
     <w:p>
@@ -11241,7 +11223,7 @@
         <w:ind w:left="255" w:hanging="255"/>
       </w:pPr>
       <w:r>
-        <w:t>[~] Landing, catálogo y fichas de curso de demostración implementados; login, registro y recuperación visual siguen pendientes.</w:t>
+        <w:t>[~] Landing, catálogo, fichas, login, registro y recuperación visual implementados; falta validarlos con cuentas reales tras configurar los ambientes.</w:t>
       </w:r>
     </w:p>
     <w:p>
@@ -11250,13 +11232,7 @@
         <w:ind w:left="255" w:hanging="255"/>
       </w:pPr>
       <w:r>
-        <w:rPr>
-          <w:b/>
-        </w:rPr>
-        <w:t xml:space="preserve">[ ] </w:t>
-      </w:r>
-      <w:r>
-        <w:t>Implementar dashboard del estudiante con continuar, progreso, recursos y próximos eventos.</w:t>
+        <w:t>[~] Panel de estudiante protegido con estado de reserva implementado; faltan progreso, recursos y eventos reales.</w:t>
       </w:r>
     </w:p>
     <w:p>
@@ -11749,7 +11725,7 @@
         <w:ind w:left="255" w:hanging="255"/>
       </w:pPr>
       <w:r>
-        <w:t>[ ] Crear Supabase por ambientes, desplegar API Docker en Render y conectar la web de Vercel mediante configuración validada.</w:t>
+        <w:t>[~] Fundación de Supabase activa y configuración versionada preparada; faltan desplegar la API Docker en Render y conectar la URL de producción en Vercel.</w:t>
       </w:r>
     </w:p>
     <w:p>
@@ -11788,13 +11764,7 @@
         <w:ind w:left="255" w:hanging="255"/>
       </w:pPr>
       <w:r>
-        <w:rPr>
-          <w:b/>
-        </w:rPr>
-        <w:t xml:space="preserve">[ ] </w:t>
-      </w:r>
-      <w:r>
-        <w:t>Implementar registro, verificación, login, recuperación, cierre de sesión y expiración de sesión.</w:t>
+        <w:t>[~] Registro, verificación por callback, login, recuperación, actualización de contraseña y cierre de sesión implementados; falta configurar SMTP, URLs de redirección y ejecutar E2E con cuentas de prueba.</w:t>
       </w:r>
     </w:p>
     <w:p>
@@ -11803,7 +11773,7 @@
         <w:ind w:left="255" w:hanging="255"/>
       </w:pPr>
       <w:r>
-        <w:t>[ ] Implementar autorización en la API y menús por permisos; la web nunca confía solo en ocultar botones.</w:t>
+        <w:t>[~] La API valida el bearer token contra Supabase Auth antes de devolver identidad; faltan roles, matrículas y menús por permisos reales.</w:t>
       </w:r>
     </w:p>
     <w:p>
@@ -16712,14 +16682,8 @@
             <w:vAlign w:val="top"/>
           </w:tcPr>
           <w:p>
-            <w:pPr>
-              <w:spacing w:after="40"/>
-            </w:pPr>
-            <w:r>
-              <w:rPr>
-                <w:sz w:val="17"/>
-              </w:rPr>
-              <w:t>[ ] Pendiente</w:t>
+            <w:r>
+              <w:t>[~] Identidad API y recorridos de cuenta listos localmente; faltan roles, matrículas, video, material y progreso.</w:t>
             </w:r>
           </w:p>
         </w:tc>
@@ -21537,6 +21501,48 @@
           </w:p>
         </w:tc>
       </w:tr>
+      <w:tr>
+        <w:tc>
+          <w:tcPr>
+            <w:tcW w:type="dxa" w:w="2493"/>
+          </w:tcPr>
+          <w:p>
+            <w:r>
+              <w:t>AUTH-001 / 01/08/2026</w:t>
+            </w:r>
+          </w:p>
+        </w:tc>
+        <w:tc>
+          <w:tcPr>
+            <w:tcW w:type="dxa" w:w="2493"/>
+          </w:tcPr>
+          <w:p>
+            <w:r>
+              <w:t>Fundación de identidad mediante Supabase Auth con sesión SSR y API como límite de autorización. Se añadieron acceso, registro, recuperación, actualización de contraseña, callback y panel protegido.</w:t>
+            </w:r>
+          </w:p>
+        </w:tc>
+        <w:tc>
+          <w:tcPr>
+            <w:tcW w:type="dxa" w:w="2493"/>
+          </w:tcPr>
+          <w:p>
+            <w:r>
+              <w:t>Contratos y API: typecheck PASS; Vitest 5/5 PASS; lint web PASS; build Next PASS. VER-011 390 x 844 y VER-012 1440 x 900: formularios, rutas de registro/recuperación/panel, foco y layout PASS; scrollWidth = clientWidth y cero warn/error de consola.</w:t>
+            </w:r>
+          </w:p>
+        </w:tc>
+        <w:tc>
+          <w:tcPr>
+            <w:tcW w:type="dxa" w:w="2493"/>
+          </w:tcPr>
+          <w:p>
+            <w:r>
+              <w:t>[~] Código listo sin abrir tablas al navegador ni exponer clave secreta. Próximo: configurar variables y URLs de Supabase, desplegar Render, conectar Vercel y ejecutar E2E con cuentas de prueba antes de habilitar contenido privado.</w:t>
+            </w:r>
+          </w:p>
+        </w:tc>
+      </w:tr>
     </w:tbl>
     <w:p>
       <w:pPr>
@@ -24305,6 +24311,281 @@
     </w:p>
     <w:tbl>
       <w:tblPr>
+        <w:tblStyle w:val="TableGrid"/>
+        <w:tblW w:type="auto" w:w="0"/>
+        <w:tblLook w:firstColumn="1" w:firstRow="1" w:lastColumn="0" w:lastRow="0" w:noHBand="0" w:noVBand="1" w:val="04A0"/>
+      </w:tblPr>
+      <w:tblGrid>
+        <w:gridCol w:w="4986"/>
+        <w:gridCol w:w="4986"/>
+      </w:tblGrid>
+      <w:tr>
+        <w:tc>
+          <w:tcPr>
+            <w:tcW w:type="dxa" w:w="4986"/>
+          </w:tcPr>
+          <w:p>
+            <w:r>
+              <w:t>Campo</w:t>
+            </w:r>
+          </w:p>
+        </w:tc>
+        <w:tc>
+          <w:tcPr>
+            <w:tcW w:type="dxa" w:w="4986"/>
+          </w:tcPr>
+          <w:p>
+            <w:r>
+              <w:t>Contenido</w:t>
+            </w:r>
+          </w:p>
+        </w:tc>
+      </w:tr>
+      <w:tr>
+        <w:tc>
+          <w:tcPr>
+            <w:tcW w:type="dxa" w:w="4986"/>
+          </w:tcPr>
+          <w:p>
+            <w:r>
+              <w:t>ID / fecha / autor</w:t>
+            </w:r>
+          </w:p>
+        </w:tc>
+        <w:tc>
+          <w:tcPr>
+            <w:tcW w:type="dxa" w:w="4986"/>
+          </w:tcPr>
+          <w:p>
+            <w:r>
+              <w:t>AUTH-001 / 01/08/2026 / Codex con José</w:t>
+            </w:r>
+          </w:p>
+        </w:tc>
+      </w:tr>
+      <w:tr>
+        <w:tc>
+          <w:tcPr>
+            <w:tcW w:type="dxa" w:w="4986"/>
+          </w:tcPr>
+          <w:p>
+            <w:r>
+              <w:t>Fase y objetivo</w:t>
+            </w:r>
+          </w:p>
+        </w:tc>
+        <w:tc>
+          <w:tcPr>
+            <w:tcW w:type="dxa" w:w="4986"/>
+          </w:tcPr>
+          <w:p>
+            <w:r>
+              <w:t>Fases 1 y 2 - convertir el acceso previsto en una base verificable, manteniendo la API como límite de autorización.</w:t>
+            </w:r>
+          </w:p>
+        </w:tc>
+      </w:tr>
+      <w:tr>
+        <w:tc>
+          <w:tcPr>
+            <w:tcW w:type="dxa" w:w="4986"/>
+          </w:tcPr>
+          <w:p>
+            <w:r>
+              <w:t>Qué cambió</w:t>
+            </w:r>
+          </w:p>
+        </w:tc>
+        <w:tc>
+          <w:tcPr>
+            <w:tcW w:type="dxa" w:w="4986"/>
+          </w:tcPr>
+          <w:p>
+            <w:r>
+              <w:t>Se añadieron acceso, registro, recuperación, actualización de contraseña, callback y panel protegido. La API expone GET /v1/auth/me solo tras validar un bearer token contra Supabase Auth.</w:t>
+            </w:r>
+          </w:p>
+        </w:tc>
+      </w:tr>
+      <w:tr>
+        <w:tc>
+          <w:tcPr>
+            <w:tcW w:type="dxa" w:w="4986"/>
+          </w:tcPr>
+          <w:p>
+            <w:r>
+              <w:t>Cómo se implementó</w:t>
+            </w:r>
+          </w:p>
+        </w:tc>
+        <w:tc>
+          <w:tcPr>
+            <w:tcW w:type="dxa" w:w="4986"/>
+          </w:tcPr>
+          <w:p>
+            <w:r>
+              <w:t>Next SSR mantiene la sesión en cookies y refresca claims verificados en proxy. El servidor reenvía el token a la API; Fastify vuelve a validarlo con Supabase Auth y no consulta tablas desde el navegador.</w:t>
+            </w:r>
+          </w:p>
+        </w:tc>
+      </w:tr>
+      <w:tr>
+        <w:tc>
+          <w:tcPr>
+            <w:tcW w:type="dxa" w:w="4986"/>
+          </w:tcPr>
+          <w:p>
+            <w:r>
+              <w:t>Archivos / migraciones / servicios</w:t>
+            </w:r>
+          </w:p>
+        </w:tc>
+        <w:tc>
+          <w:tcPr>
+            <w:tcW w:type="dxa" w:w="4986"/>
+          </w:tcPr>
+          <w:p>
+            <w:r>
+              <w:t>apps/web/src/lib/supabase, rutas de autenticación y panel; apps/api/src/providers/supabase-identity.ts, /v1/auth/me, contratos compartidos; variables de Render. Sin nuevas migraciones ni datos personales.</w:t>
+            </w:r>
+          </w:p>
+        </w:tc>
+      </w:tr>
+      <w:tr>
+        <w:tc>
+          <w:tcPr>
+            <w:tcW w:type="dxa" w:w="4986"/>
+          </w:tcPr>
+          <w:p>
+            <w:r>
+              <w:t>Seguridad y privacidad</w:t>
+            </w:r>
+          </w:p>
+        </w:tc>
+        <w:tc>
+          <w:tcPr>
+            <w:tcW w:type="dxa" w:w="4986"/>
+          </w:tcPr>
+          <w:p>
+            <w:r>
+              <w:t>La clave SUPABASE_SECRET_KEY solo se declara para Render y nunca para la web. La clave publicable se limita a sesión Auth. No se concedieron grants ni políticas nuevas a anon/authenticated; RLS continúa cerrado.</w:t>
+            </w:r>
+          </w:p>
+        </w:tc>
+      </w:tr>
+      <w:tr>
+        <w:tc>
+          <w:tcPr>
+            <w:tcW w:type="dxa" w:w="4986"/>
+          </w:tcPr>
+          <w:p>
+            <w:r>
+              <w:t>Validación automática</w:t>
+            </w:r>
+          </w:p>
+        </w:tc>
+        <w:tc>
+          <w:tcPr>
+            <w:tcW w:type="dxa" w:w="4986"/>
+          </w:tcPr>
+          <w:p>
+            <w:r>
+              <w:t>PASS: contratos build, API typecheck, Vitest 5/5, web lint, web typecheck y Next build. pnpm install se reconstruyó desde pnpm-lock.yaml tras detectar node_modules inconsistente.</w:t>
+            </w:r>
+          </w:p>
+        </w:tc>
+      </w:tr>
+      <w:tr>
+        <w:tc>
+          <w:tcPr>
+            <w:tcW w:type="dxa" w:w="4986"/>
+          </w:tcPr>
+          <w:p>
+            <w:r>
+              <w:t>Validación en navegador</w:t>
+            </w:r>
+          </w:p>
+        </w:tc>
+        <w:tc>
+          <w:tcPr>
+            <w:tcW w:type="dxa" w:w="4986"/>
+          </w:tcPr>
+          <w:p>
+            <w:r>
+              <w:t>VER-011 PASS 390 x 844 y VER-012 PASS 1440 x 900: login responsive, mensaje de configuración explícito, rutas registro/recuperación/panel, foco visible, cero overflow y cero warn/error de consola.</w:t>
+            </w:r>
+          </w:p>
+        </w:tc>
+      </w:tr>
+      <w:tr>
+        <w:tc>
+          <w:tcPr>
+            <w:tcW w:type="dxa" w:w="4986"/>
+          </w:tcPr>
+          <w:p>
+            <w:r>
+              <w:t>Evidencia</w:t>
+            </w:r>
+          </w:p>
+        </w:tc>
+        <w:tc>
+          <w:tcPr>
+            <w:tcW w:type="dxa" w:w="4986"/>
+          </w:tcPr>
+          <w:p>
+            <w:r>
+              <w:t>El panel no se habilita sin identidad y la UI desactiva los formularios hasta que se configure el ambiente. La API prueba aceptación de token válido y rechazo de token ausente.</w:t>
+            </w:r>
+          </w:p>
+        </w:tc>
+      </w:tr>
+      <w:tr>
+        <w:tc>
+          <w:tcPr>
+            <w:tcW w:type="dxa" w:w="4986"/>
+          </w:tcPr>
+          <w:p>
+            <w:r>
+              <w:t>Reversión</w:t>
+            </w:r>
+          </w:p>
+        </w:tc>
+        <w:tc>
+          <w:tcPr>
+            <w:tcW w:type="dxa" w:w="4986"/>
+          </w:tcPr>
+          <w:p>
+            <w:r>
+              <w:t>Revertir el commit de AUTH-001 elimina rutas, adaptador de identidad, contrato de usuario y variables de despliegue. No hay cuentas, sesiones, migraciones ni datos remotos creados por este cambio.</w:t>
+            </w:r>
+          </w:p>
+        </w:tc>
+      </w:tr>
+      <w:tr>
+        <w:tc>
+          <w:tcPr>
+            <w:tcW w:type="dxa" w:w="4986"/>
+          </w:tcPr>
+          <w:p>
+            <w:r>
+              <w:t>Pendiente / próximo paso</w:t>
+            </w:r>
+          </w:p>
+        </w:tc>
+        <w:tc>
+          <w:tcPr>
+            <w:tcW w:type="dxa" w:w="4986"/>
+          </w:tcPr>
+          <w:p>
+            <w:r>
+              <w:t>Configurar Supabase URL/publicable en Vercel y SUPABASE_URL/SUPABASE_SECRET_KEY en Render, autorizar callback/redirect URLs y SMTP, desplegar API Docker, ejecutar E2E con cuentas de prueba y recién entonces habilitar roles o contenido privado.</w:t>
+            </w:r>
+          </w:p>
+        </w:tc>
+      </w:tr>
+    </w:tbl>
+    <w:tbl>
+      <w:tblPr>
         <w:tblW w:type="auto" w:w="0"/>
         <w:jc w:val="center"/>
         <w:tblLayout w:type="autofit"/>
@@ -24329,9 +24610,7 @@
           </w:tcPr>
           <w:p>
             <w:r>
-              <w:t>Siguiente punto de control</w:t>
-              <w:br/>
-              <w:t>La contencion de credenciales, la aprobacion de coordinacion y la fundacion de datos ya estan cerradas. No abrir acceso directo a tablas ni activar cargas de video: primero integrar autenticacion mediante la API, configurar Render y registrar el curso vertical con su contenido academico autorizado.</w:t>
+              <w:t>Siguiente punto de control / La fundación de identidad está lista localmente, pero no se han configurado cuentas ni claves reales. No abrir acceso directo a tablas ni activar cargas de video: primero configurar Supabase y Render, desplegar la API, autorizar URLs de callback, ejecutar E2E de una cuenta de prueba y registrar el curso vertical con contenido académico autorizado.</w:t>
             </w:r>
           </w:p>
         </w:tc>
@@ -25259,6 +25538,38 @@
           <w:p>
             <w:r>
               <w:t>Coordinacion aprobo la plataforma; MFA y contencion de credenciales verificados; fundacion de datos Supabase aplicada con RLS, privilegios cerrados e indices de claves foraneas.</w:t>
+            </w:r>
+          </w:p>
+        </w:tc>
+      </w:tr>
+      <w:tr>
+        <w:tc>
+          <w:tcPr>
+            <w:tcW w:type="dxa" w:w="3324"/>
+          </w:tcPr>
+          <w:p>
+            <w:r>
+              <w:t>2.0</w:t>
+            </w:r>
+          </w:p>
+        </w:tc>
+        <w:tc>
+          <w:tcPr>
+            <w:tcW w:type="dxa" w:w="3324"/>
+          </w:tcPr>
+          <w:p>
+            <w:r>
+              <w:t>01/08/2026</w:t>
+            </w:r>
+          </w:p>
+        </w:tc>
+        <w:tc>
+          <w:tcPr>
+            <w:tcW w:type="dxa" w:w="3324"/>
+          </w:tcPr>
+          <w:p>
+            <w:r>
+              <w:t>Fundación de identidad: sesiones SSR, registro, recuperación, callback y API con validación de bearer token; despliegue y E2E con cuentas reales pendientes.</w:t>
             </w:r>
           </w:p>
         </w:tc>

</xml_diff>

<commit_message>
docs: require push at task completion
</commit_message>
<xml_diff>
--- a/CEDIAH Web Status.docx
+++ b/CEDIAH Web Status.docx
@@ -1112,7 +1112,7 @@
         <w:pStyle w:val="Checklist"/>
       </w:pPr>
       <w:r>
-        <w:t>[ ] Cada entrega que cambie la web se cierra con pruebas, actualización de esta bitácora, commit y push a la rama publicada, despliegue en Vercel y verificación de la URL resultante.</w:t>
+        <w:t>[ ] Al finalizar cada trabajo aprobado para el repositorio: actualizar la bitácora, ejecutar validaciones, crear commit y hacer push a la rama publicada. El push no se delega al responsable salvo que lo solicite expresamente; si el cambio afecta la web, verificar además el despliegue resultante.</w:t>
       </w:r>
     </w:p>
     <w:p>
@@ -21543,6 +21543,48 @@
           </w:p>
         </w:tc>
       </w:tr>
+      <w:tr>
+        <w:tc>
+          <w:tcPr>
+            <w:tcW w:type="dxa" w:w="2493"/>
+          </w:tcPr>
+          <w:p>
+            <w:r>
+              <w:t>OPS-003 / 01/08/2026</w:t>
+            </w:r>
+          </w:p>
+        </w:tc>
+        <w:tc>
+          <w:tcPr>
+            <w:tcW w:type="dxa" w:w="2493"/>
+          </w:tcPr>
+          <w:p>
+            <w:r>
+              <w:t>Regla de cierre actualizada: cada trabajo terminado se publica mediante push para que el responsable pueda verificar los cambios sin hacerlo manualmente.</w:t>
+            </w:r>
+          </w:p>
+        </w:tc>
+        <w:tc>
+          <w:tcPr>
+            <w:tcW w:type="dxa" w:w="2493"/>
+          </w:tcPr>
+          <w:p>
+            <w:r>
+              <w:t>Regla incorporada al documento canónico antes de publicar los commits pendientes.</w:t>
+            </w:r>
+          </w:p>
+        </w:tc>
+        <w:tc>
+          <w:tcPr>
+            <w:tcW w:type="dxa" w:w="2493"/>
+          </w:tcPr>
+          <w:p>
+            <w:r>
+              <w:t>[x] Política registrada. Próximo: push a main y verificación del despliegue web cuando corresponda.</w:t>
+            </w:r>
+          </w:p>
+        </w:tc>
+      </w:tr>
     </w:tbl>
     <w:p>
       <w:pPr>
@@ -25570,6 +25612,38 @@
           <w:p>
             <w:r>
               <w:t>Fundación de identidad: sesiones SSR, registro, recuperación, callback y API con validación de bearer token; despliegue y E2E con cuentas reales pendientes.</w:t>
+            </w:r>
+          </w:p>
+        </w:tc>
+      </w:tr>
+      <w:tr>
+        <w:tc>
+          <w:tcPr>
+            <w:tcW w:type="dxa" w:w="3324"/>
+          </w:tcPr>
+          <w:p>
+            <w:r>
+              <w:t>2.1</w:t>
+            </w:r>
+          </w:p>
+        </w:tc>
+        <w:tc>
+          <w:tcPr>
+            <w:tcW w:type="dxa" w:w="3324"/>
+          </w:tcPr>
+          <w:p>
+            <w:r>
+              <w:t>01/08/2026</w:t>
+            </w:r>
+          </w:p>
+        </w:tc>
+        <w:tc>
+          <w:tcPr>
+            <w:tcW w:type="dxa" w:w="3324"/>
+          </w:tcPr>
+          <w:p>
+            <w:r>
+              <w:t>Política de cierre actualizada: cada trabajo aprobado termina con documentación, validación, commit y push a la rama publicada para revisión sin intervención manual.</w:t>
             </w:r>
           </w:p>
         </w:tc>

</xml_diff>

<commit_message>
docs: record production auth configuration
</commit_message>
<xml_diff>
--- a/CEDIAH Web Status.docx
+++ b/CEDIAH Web Status.docx
@@ -21585,6 +21585,48 @@
           </w:p>
         </w:tc>
       </w:tr>
+      <w:tr>
+        <w:tc>
+          <w:tcPr>
+            <w:tcW w:type="dxa" w:w="2493"/>
+          </w:tcPr>
+          <w:p>
+            <w:r>
+              <w:t>OPS-004\n01/08/2026</w:t>
+            </w:r>
+          </w:p>
+        </w:tc>
+        <w:tc>
+          <w:tcPr>
+            <w:tcW w:type="dxa" w:w="2493"/>
+          </w:tcPr>
+          <w:p>
+            <w:r>
+              <w:t>Configuracion inicial de Supabase Auth y Vercel para produccion; intento de despliegue de API en Render detenido antes de crear recursos porque el proveedor exige registrar una tarjeta.</w:t>
+            </w:r>
+          </w:p>
+        </w:tc>
+        <w:tc>
+          <w:tcPr>
+            <w:tcW w:type="dxa" w:w="2493"/>
+          </w:tcPr>
+          <w:p>
+            <w:r>
+              <w:t>Supabase: Site URL y callback de produccion guardados. Vercel: URL y clave publicable de Supabase guardadas para Production y Preview; redeploy de produccion termino READY. Render: Blueprint detecto render.yaml, pero solicito informacion de pago; no se introdujeron datos ni se creo el servicio.</w:t>
+            </w:r>
+          </w:p>
+        </w:tc>
+        <w:tc>
+          <w:tcPr>
+            <w:tcW w:type="dxa" w:w="2493"/>
+          </w:tcPr>
+          <w:p>
+            <w:r>
+              <w:t>[~] Web preparada para Auth; E2E pendiente hasta contar con API publica y sus variables de servidor. Proximo: elegir proveedor de API sin tarjeta o autorizar Render con su modalidad de pago, configurar WEB_ORIGINS, SUPABASE_URL y SUPABASE_SECRET_KEY solo en el servidor, y ejecutar E2E con cuenta de prueba.</w:t>
+            </w:r>
+          </w:p>
+        </w:tc>
+      </w:tr>
     </w:tbl>
     <w:p>
       <w:pPr>
@@ -24652,7 +24694,7 @@
           </w:tcPr>
           <w:p>
             <w:r>
-              <w:t>Siguiente punto de control / La fundación de identidad está lista localmente, pero no se han configurado cuentas ni claves reales. No abrir acceso directo a tablas ni activar cargas de video: primero configurar Supabase y Render, desplegar la API, autorizar URLs de callback, ejecutar E2E de una cuenta de prueba y registrar el curso vertical con contenido académico autorizado.</w:t>
+              <w:t>Siguiente punto de control / Supabase Auth ya tiene Site URL y callback de produccion; Vercel ya dispone de la URL y clave publicable de Supabase y el redeploy de produccion termino READY. Render exige informacion de pago antes de crear el Blueprint Docker, por lo que no se desplego ni se transmitieron secretos de servidor. No abrir acceso directo a tablas ni activar cargas de video: decidir el alojamiento de API, configurar secretos solo en ese servidor, ejecutar E2E con una cuenta de prueba y registrar el curso vertical con contenido academico autorizado.</w:t>
             </w:r>
           </w:p>
         </w:tc>
@@ -25644,6 +25686,38 @@
           <w:p>
             <w:r>
               <w:t>Política de cierre actualizada: cada trabajo aprobado termina con documentación, validación, commit y push a la rama publicada para revisión sin intervención manual.</w:t>
+            </w:r>
+          </w:p>
+        </w:tc>
+      </w:tr>
+      <w:tr>
+        <w:tc>
+          <w:tcPr>
+            <w:tcW w:type="dxa" w:w="3324"/>
+          </w:tcPr>
+          <w:p>
+            <w:r>
+              <w:t>2.2</w:t>
+            </w:r>
+          </w:p>
+        </w:tc>
+        <w:tc>
+          <w:tcPr>
+            <w:tcW w:type="dxa" w:w="3324"/>
+          </w:tcPr>
+          <w:p>
+            <w:r>
+              <w:t>01/08/2026</w:t>
+            </w:r>
+          </w:p>
+        </w:tc>
+        <w:tc>
+          <w:tcPr>
+            <w:tcW w:type="dxa" w:w="3324"/>
+          </w:tcPr>
+          <w:p>
+            <w:r>
+              <w:t>Supabase Auth configurado para la URL publica y callback; variables publicas de Supabase cargadas en Vercel y redeploy de produccion READY. Despliegue Docker en Render detenido por requisito de pago, sin introducir datos de tarjeta ni secretos.</w:t>
             </w:r>
           </w:p>
         </w:tc>

</xml_diff>

<commit_message>
feat(web): add demo lesson workspace
</commit_message>
<xml_diff>
--- a/CEDIAH Web Status.docx
+++ b/CEDIAH Web Status.docx
@@ -176,7 +176,7 @@
           </w:tcPr>
           <w:p>
             <w:r>
-              <w:t>1.9</w:t>
+              <w:t>2.4</w:t>
             </w:r>
           </w:p>
         </w:tc>
@@ -227,7 +227,7 @@
           </w:tcPr>
           <w:p>
             <w:r>
-              <w:t>1 de agosto de 2026</w:t>
+              <w:t>10 de agosto de 2026</w:t>
             </w:r>
           </w:p>
         </w:tc>
@@ -276,7 +276,7 @@
           </w:tcPr>
           <w:p>
             <w:r>
-              <w:t>Fase 1 en curso - landing, catalogo y ocho fichas demo responsive verificados y desplegados en produccion en Vercel; coordinacion aprobo la plataforma, MFA y contencion cerrados; fundacion de datos en Supabase aplicada; contenido real, autenticacion y despliegue Render pendientes</w:t>
+              <w:t>Fase 1 en curso - landing, catálogo, ocho fichas demo y una lección demo responsive verificados localmente; web desplegada en Vercel; coordinación aprobó la plataforma, MFA y contención cerrados; fundación de datos en Supabase aplicada; contenido real, E2E de autenticación y despliegue Render pendientes</w:t>
             </w:r>
           </w:p>
         </w:tc>
@@ -1609,7 +1609,7 @@
           </w:tcPr>
           <w:p>
             <w:r>
-              <w:t>Estado al 01/08/2026</w:t>
+              <w:t>Estado al 10/08/2026</w:t>
             </w:r>
           </w:p>
         </w:tc>
@@ -1907,7 +1907,7 @@
           </w:tcPr>
           <w:p>
             <w:r>
-              <w:t>Vercel web en producción; Supabase con fundación activa; Render pendiente</w:t>
+              <w:t>Vercel web en producción; Supabase con fundación activa; API Docker preparada y verificada con build local; Render pendiente</w:t>
             </w:r>
           </w:p>
         </w:tc>
@@ -1927,7 +1927,7 @@
           </w:tcPr>
           <w:p>
             <w:r>
-              <w:t>Producción Vercel Ready para 3f48804: https://cediah.vercel.app. Supabase tiene nueve tablas con RLS y grants cerrados. Render API Docker y la configuración real de identidad siguen pendientes.</w:t>
+              <w:t>La web mantiene el despliegue público. La API tiene Dockerfile, health check y configuración portable; Render sigue detenido por requisito de pago, sin secretos transmitidos.</w:t>
             </w:r>
           </w:p>
         </w:tc>
@@ -2115,7 +2115,7 @@
           </w:tcPr>
           <w:p>
             <w:r>
-              <w:t>Landing, catálogo, fichas y acceso local: PASS</w:t>
+              <w:t>Landing, catálogo, fichas, acceso local y lección demo: PASS</w:t>
             </w:r>
           </w:p>
         </w:tc>
@@ -2134,7 +2134,7 @@
           </w:tcPr>
           <w:p>
             <w:r>
-              <w:t>Landing, catálogo y fichas demo ya verificados. El acceso, registro, recuperación, actualización de contraseña y panel de reserva se comprobaron localmente en 390 x 844 y 1440 x 900, sin overflow ni errores de consola. La prueba real de cuentas espera configurar los ambientes.</w:t>
+              <w:t>VER-013 a VER-016 validaron la lección demo en 360 x 800, 390 x 844, 768 x 1024 y 1440 x 900; navegación catálogo -&gt; ficha -&gt; lección, sin overflow, overlays ni errores de aplicación.</w:t>
             </w:r>
           </w:p>
         </w:tc>
@@ -21627,6 +21627,48 @@
           </w:p>
         </w:tc>
       </w:tr>
+      <w:tr>
+        <w:tc>
+          <w:tcPr>
+            <w:tcW w:type="dxa" w:w="2493"/>
+          </w:tcPr>
+          <w:p>
+            <w:r>
+              <w:t>CHG-004 / 10/08/2026</w:t>
+            </w:r>
+          </w:p>
+        </w:tc>
+        <w:tc>
+          <w:tcPr>
+            <w:tcW w:type="dxa" w:w="2493"/>
+          </w:tcPr>
+          <w:p>
+            <w:r>
+              <w:t>Fase 1: vista de lección demo navegable para validar el espacio de estudio sin inventar contenido académico ni habilitar acceso privado.</w:t>
+            </w:r>
+          </w:p>
+        </w:tc>
+        <w:tc>
+          <w:tcPr>
+            <w:tcW w:type="dxa" w:w="2493"/>
+          </w:tcPr>
+          <w:p>
+            <w:r>
+              <w:t>lint web, typecheck web/API, Vitest API 5/5 con timeout de arranque ampliado, build Next, git diff --check y pnpm audit --audit-level high/low: PASS. VER-013 a VER-016: PASS en cuatro viewports; navegación catálogo -&gt; lección PASS.</w:t>
+            </w:r>
+          </w:p>
+        </w:tc>
+        <w:tc>
+          <w:tcPr>
+            <w:tcW w:type="dxa" w:w="2493"/>
+          </w:tcPr>
+          <w:p>
+            <w:r>
+              <w:t>[~] Fase 1 en curso. Próximo: seleccionar el curso vertical y recibir contenido autorizado; después sustituir la lección demo por datos reales y conectar la API pública.</w:t>
+            </w:r>
+          </w:p>
+        </w:tc>
+      </w:tr>
     </w:tbl>
     <w:p>
       <w:pPr>
@@ -24300,6 +24342,267 @@
     </w:p>
     <w:p>
       <w:pPr>
+        <w:pStyle w:val="Heading2"/>
+      </w:pPr>
+      <w:r>
+        <w:t>Ficha de cambio - CHG-004</w:t>
+      </w:r>
+    </w:p>
+    <w:tbl>
+      <w:tblPr>
+        <w:tblStyle w:val="TableGrid"/>
+        <w:tblW w:type="auto" w:w="0"/>
+        <w:tblLook w:firstColumn="1" w:firstRow="1" w:lastColumn="0" w:lastRow="0" w:noHBand="0" w:noVBand="1" w:val="04A0"/>
+      </w:tblPr>
+      <w:tblGrid>
+        <w:gridCol w:w="4986"/>
+        <w:gridCol w:w="4986"/>
+      </w:tblGrid>
+      <w:tr>
+        <w:tc>
+          <w:tcPr>
+            <w:tcW w:type="dxa" w:w="4986"/>
+          </w:tcPr>
+          <w:p>
+            <w:r>
+              <w:t>ID / fecha / autor</w:t>
+            </w:r>
+          </w:p>
+        </w:tc>
+        <w:tc>
+          <w:tcPr>
+            <w:tcW w:type="dxa" w:w="4986"/>
+          </w:tcPr>
+          <w:p>
+            <w:r>
+              <w:t>CHG-004 / 10/08/2026 / Codex con José</w:t>
+            </w:r>
+          </w:p>
+        </w:tc>
+      </w:tr>
+      <w:tr>
+        <w:tc>
+          <w:tcPr>
+            <w:tcW w:type="dxa" w:w="4986"/>
+          </w:tcPr>
+          <w:p>
+            <w:r>
+              <w:t>Fase y objetivo</w:t>
+            </w:r>
+          </w:p>
+        </w:tc>
+        <w:tc>
+          <w:tcPr>
+            <w:tcW w:type="dxa" w:w="4986"/>
+          </w:tcPr>
+          <w:p>
+            <w:r>
+              <w:t>Fase 1 - implementar una vista de lección demostrativa navegable mientras coordinación define el curso vertical y entrega contenido autorizado.</w:t>
+            </w:r>
+          </w:p>
+        </w:tc>
+      </w:tr>
+      <w:tr>
+        <w:tc>
+          <w:tcPr>
+            <w:tcW w:type="dxa" w:w="4986"/>
+          </w:tcPr>
+          <w:p>
+            <w:r>
+              <w:t>Qué cambió</w:t>
+            </w:r>
+          </w:p>
+        </w:tc>
+        <w:tc>
+          <w:tcPr>
+            <w:tcW w:type="dxa" w:w="4986"/>
+          </w:tcPr>
+          <w:p>
+            <w:r>
+              <w:t>Desde cada ficha de curso demo se puede abrir una lección preliminar con reproductor de demostración, temario, recurso bloqueado y CTA de acceso. La interfaz declara que no concede matrícula ni presenta contenido académico aprobado.</w:t>
+            </w:r>
+          </w:p>
+        </w:tc>
+      </w:tr>
+      <w:tr>
+        <w:tc>
+          <w:tcPr>
+            <w:tcW w:type="dxa" w:w="4986"/>
+          </w:tcPr>
+          <w:p>
+            <w:r>
+              <w:t>Cómo se implementó</w:t>
+            </w:r>
+          </w:p>
+        </w:tc>
+        <w:tc>
+          <w:tcPr>
+            <w:tcW w:type="dxa" w:w="4986"/>
+          </w:tcPr>
+          <w:p>
+            <w:r>
+              <w:t>Se añadió DemoLesson en datos tipados, una ruta SSG para la introducción de cada una de las ocho regiones, metadatos, estados de contenido pendiente y estilos responsive coherentes con la dirección editorial existente.</w:t>
+            </w:r>
+          </w:p>
+        </w:tc>
+      </w:tr>
+      <w:tr>
+        <w:tc>
+          <w:tcPr>
+            <w:tcW w:type="dxa" w:w="4986"/>
+          </w:tcPr>
+          <w:p>
+            <w:r>
+              <w:t>Archivos / migraciones / servicios</w:t>
+            </w:r>
+          </w:p>
+        </w:tc>
+        <w:tc>
+          <w:tcPr>
+            <w:tcW w:type="dxa" w:w="4986"/>
+          </w:tcPr>
+          <w:p>
+            <w:r>
+              <w:t>apps/web/src/data/demo-courses.ts; apps/web/src/app/cursos/[slug]/page.tsx; apps/web/src/app/cursos/[slug]/lecciones/[lessonSlug]/page.tsx; apps/web/src/app/globals.css; apps/web/src/proxy.ts; pnpm-workspace.yaml; pnpm-lock.yaml. Sin migraciones, servicios remotos ni datos personales.</w:t>
+            </w:r>
+          </w:p>
+        </w:tc>
+      </w:tr>
+      <w:tr>
+        <w:tc>
+          <w:tcPr>
+            <w:tcW w:type="dxa" w:w="4986"/>
+          </w:tcPr>
+          <w:p>
+            <w:r>
+              <w:t>Seguridad y privacidad</w:t>
+            </w:r>
+          </w:p>
+        </w:tc>
+        <w:tc>
+          <w:tcPr>
+            <w:tcW w:type="dxa" w:w="4986"/>
+          </w:tcPr>
+          <w:p>
+            <w:r>
+              <w:t>No se añadieron URLs de video, descargas, matrículas, formularios de contenido ni acceso directo a tablas de Supabase. El recurso permanece bloqueado y el reproductor no ejecuta sesiones ni expone claves. Se fijaron fast-uri, js-yaml, nanoid y postcss en versiones parcheadas mediante overrides de pnpm.</w:t>
+            </w:r>
+          </w:p>
+        </w:tc>
+      </w:tr>
+      <w:tr>
+        <w:tc>
+          <w:tcPr>
+            <w:tcW w:type="dxa" w:w="4986"/>
+          </w:tcPr>
+          <w:p>
+            <w:r>
+              <w:t>Validación automática</w:t>
+            </w:r>
+          </w:p>
+        </w:tc>
+        <w:tc>
+          <w:tcPr>
+            <w:tcW w:type="dxa" w:w="4986"/>
+          </w:tcPr>
+          <w:p>
+            <w:r>
+              <w:t>PASS: build de @cediah/contracts; lint web; typecheck web y API; Vitest API 5/5 con margen de arranque frío; build Next con 23 páginas y 8 rutas de lección; git diff --check; pnpm audit --audit-level high y low sin vulnerabilidades conocidas.</w:t>
+            </w:r>
+          </w:p>
+        </w:tc>
+      </w:tr>
+      <w:tr>
+        <w:tc>
+          <w:tcPr>
+            <w:tcW w:type="dxa" w:w="4986"/>
+          </w:tcPr>
+          <w:p>
+            <w:r>
+              <w:t>Validación en navegador</w:t>
+            </w:r>
+          </w:p>
+        </w:tc>
+        <w:tc>
+          <w:tcPr>
+            <w:tcW w:type="dxa" w:w="4986"/>
+          </w:tcPr>
+          <w:p>
+            <w:r>
+              <w:t>VER-013 360 x 800; VER-014 390 x 844; VER-015 768 x 1024; VER-016 1440 x 900: HTTP 200, título/video/temario/recurso presentes, sin overflow ni overlays. Navegación catálogo -&gt; ficha -&gt; lección PASS. Las alertas HMR del servidor dev no se consideraron errores de aplicación.</w:t>
+            </w:r>
+          </w:p>
+        </w:tc>
+      </w:tr>
+      <w:tr>
+        <w:tc>
+          <w:tcPr>
+            <w:tcW w:type="dxa" w:w="4986"/>
+          </w:tcPr>
+          <w:p>
+            <w:r>
+              <w:t>Evidencia</w:t>
+            </w:r>
+          </w:p>
+        </w:tc>
+        <w:tc>
+          <w:tcPr>
+            <w:tcW w:type="dxa" w:w="4986"/>
+          </w:tcPr>
+          <w:p>
+            <w:r>
+              <w:t>Capturas internas tmp/lesson-360x800.png, tmp/lesson-390x844.png, tmp/lesson-768x1024.png y tmp/lesson-1440x900.png; build produjo /cursos/[slug]/lecciones/[lessonSlug] con ocho rutas estáticas.</w:t>
+            </w:r>
+          </w:p>
+        </w:tc>
+      </w:tr>
+      <w:tr>
+        <w:tc>
+          <w:tcPr>
+            <w:tcW w:type="dxa" w:w="4986"/>
+          </w:tcPr>
+          <w:p>
+            <w:r>
+              <w:t>Reversión</w:t>
+            </w:r>
+          </w:p>
+        </w:tc>
+        <w:tc>
+          <w:tcPr>
+            <w:tcW w:type="dxa" w:w="4986"/>
+          </w:tcPr>
+          <w:p>
+            <w:r>
+              <w:t>Revertir CHG-004 elimina la ruta de lección, DemoLesson, el enlace desde la ficha, sus estilos y el ajuste de lint en proxy.ts. No hay datos ni migraciones que revertir.</w:t>
+            </w:r>
+          </w:p>
+        </w:tc>
+      </w:tr>
+      <w:tr>
+        <w:tc>
+          <w:tcPr>
+            <w:tcW w:type="dxa" w:w="4986"/>
+          </w:tcPr>
+          <w:p>
+            <w:r>
+              <w:t>Pendiente / próximo paso</w:t>
+            </w:r>
+          </w:p>
+        </w:tc>
+        <w:tc>
+          <w:tcPr>
+            <w:tcW w:type="dxa" w:w="4986"/>
+          </w:tcPr>
+          <w:p>
+            <w:r>
+              <w:t>Coordinación debe escoger el curso vertical y entregar programa, objetivos, docentes, dos lecciones, video, guía, 10 preguntas, 20 flashcards y permisos. Después configurar API pública, E2E de Supabase Auth y sustituir los datos demo por contenido autorizado.</w:t>
+            </w:r>
+          </w:p>
+        </w:tc>
+      </w:tr>
+    </w:tbl>
+    <w:p>
+      <w:pPr>
         <w:pStyle w:val="Heading1"/>
         <w:keepNext w:val="1"/>
       </w:pPr>
@@ -24361,7 +24664,7 @@
         <w:ind w:left="255" w:hanging="255"/>
       </w:pPr>
       <w:r>
-        <w:t>[~] Web desplegada y verificada en Vercel; la fundacion de datos Supabase esta activa. Faltan Render para API Docker, integracion de identidad y almacenamiento privado.</w:t>
+        <w:t>[~] Web desplegada y verificada en Vercel; la fundación de datos Supabase está activa y la lección demo está verificada localmente. Faltan Render para API Docker, E2E de identidad y almacenamiento privado.</w:t>
       </w:r>
     </w:p>
     <w:p>
@@ -24700,6 +25003,22 @@
         </w:tc>
       </w:tr>
     </w:tbl>
+    <w:p>
+      <w:pPr>
+        <w:pStyle w:val="Checklist"/>
+      </w:pPr>
+      <w:r>
+        <w:t>[x] Implementar vista de lección demo con reproductor pendiente, temario preliminar, recurso bloqueado y navegación responsive; VER-013 a VER-016 PASS.</w:t>
+      </w:r>
+    </w:p>
+    <w:p>
+      <w:pPr>
+        <w:pStyle w:val="Checklist"/>
+      </w:pPr>
+      <w:r>
+        <w:t>[x] Auditar y corregir dependencias transitivas de severidad alta/moderada mediante overrides de pnpm; pnpm audit --audit-level high/low sin vulnerabilidades conocidas.</w:t>
+      </w:r>
+    </w:p>
     <w:p>
       <w:pPr>
         <w:pStyle w:val="Heading1"/>
@@ -25718,6 +26037,38 @@
           <w:p>
             <w:r>
               <w:t>Supabase Auth configurado para la URL publica y callback; variables publicas de Supabase cargadas en Vercel y redeploy de produccion READY. Despliegue Docker en Render detenido por requisito de pago, sin introducir datos de tarjeta ni secretos.</w:t>
+            </w:r>
+          </w:p>
+        </w:tc>
+      </w:tr>
+      <w:tr>
+        <w:tc>
+          <w:tcPr>
+            <w:tcW w:type="dxa" w:w="3324"/>
+          </w:tcPr>
+          <w:p>
+            <w:r>
+              <w:t>2.4</w:t>
+            </w:r>
+          </w:p>
+        </w:tc>
+        <w:tc>
+          <w:tcPr>
+            <w:tcW w:type="dxa" w:w="3324"/>
+          </w:tcPr>
+          <w:p>
+            <w:r>
+              <w:t>10/08/2026</w:t>
+            </w:r>
+          </w:p>
+        </w:tc>
+        <w:tc>
+          <w:tcPr>
+            <w:tcW w:type="dxa" w:w="3324"/>
+          </w:tcPr>
+          <w:p>
+            <w:r>
+              <w:t>Vista de lección demo con reproductor pendiente, temario y recurso bloqueado; navegación catálogo -&gt; ficha -&gt; lección y QA responsive registradas. Lint web corregido y dependencias transitivas parcheadas con overrides; despliegue Render y contenido académico real siguen pendientes.</w:t>
             </w:r>
           </w:p>
         </w:tc>

</xml_diff>

<commit_message>
docs(status): record Supabase video test flow
</commit_message>
<xml_diff>
--- a/CEDIAH Web Status.docx
+++ b/CEDIAH Web Status.docx
@@ -59,6 +59,1183 @@
       </w:tr>
     </w:tbl>
     <w:p/>
+    <w:tbl>
+      <w:tblPr>
+        <w:tblStyle w:val="TableGrid"/>
+        <w:tblW w:type="auto" w:w="0"/>
+        <w:jc w:val="center"/>
+        <w:tblLayout w:type="autofit"/>
+        <w:tblLook w:firstColumn="1" w:firstRow="1" w:lastColumn="0" w:lastRow="0" w:noHBand="0" w:noVBand="1" w:val="04A0"/>
+      </w:tblPr>
+      <w:tblGrid>
+        <w:gridCol w:w="2493"/>
+        <w:gridCol w:w="2493"/>
+        <w:gridCol w:w="2493"/>
+        <w:gridCol w:w="2493"/>
+      </w:tblGrid>
+      <w:tr>
+        <w:trPr>
+          <w:tblHeader w:val="true"/>
+        </w:trPr>
+        <w:tc>
+          <w:tcPr>
+            <w:tcW w:type="dxa" w:w="1417"/>
+            <w:shd w:fill="14233B"/>
+            <w:tcBorders>
+              <w:top w:val="single" w:sz="4" w:color="FFFFFF"/>
+              <w:left w:val="single" w:sz="4" w:color="FFFFFF"/>
+              <w:bottom w:val="single" w:sz="4" w:color="FFFFFF"/>
+              <w:right w:val="single" w:sz="4" w:color="FFFFFF"/>
+              <w:insideH w:val="single" w:sz="4" w:color="FFFFFF"/>
+              <w:insideV w:val="single" w:sz="4" w:color="FFFFFF"/>
+            </w:tcBorders>
+            <w:vAlign w:val="center"/>
+          </w:tcPr>
+          <w:p>
+            <w:pPr>
+              <w:jc w:val="left"/>
+            </w:pPr>
+            <w:r>
+              <w:rPr>
+                <w:b/>
+                <w:color w:val="FFFFFF"/>
+                <w:sz w:val="17"/>
+              </w:rPr>
+              <w:t>ID / fecha</w:t>
+            </w:r>
+          </w:p>
+        </w:tc>
+        <w:tc>
+          <w:tcPr>
+            <w:tcW w:type="dxa" w:w="3685"/>
+            <w:shd w:fill="14233B"/>
+            <w:tcBorders>
+              <w:top w:val="single" w:sz="4" w:color="FFFFFF"/>
+              <w:left w:val="single" w:sz="4" w:color="FFFFFF"/>
+              <w:bottom w:val="single" w:sz="4" w:color="FFFFFF"/>
+              <w:right w:val="single" w:sz="4" w:color="FFFFFF"/>
+              <w:insideH w:val="single" w:sz="4" w:color="FFFFFF"/>
+              <w:insideV w:val="single" w:sz="4" w:color="FFFFFF"/>
+            </w:tcBorders>
+            <w:vAlign w:val="center"/>
+          </w:tcPr>
+          <w:p>
+            <w:pPr>
+              <w:jc w:val="left"/>
+            </w:pPr>
+            <w:r>
+              <w:rPr>
+                <w:b/>
+                <w:color w:val="FFFFFF"/>
+                <w:sz w:val="17"/>
+              </w:rPr>
+              <w:t>Cambio</w:t>
+            </w:r>
+          </w:p>
+        </w:tc>
+        <w:tc>
+          <w:tcPr>
+            <w:tcW w:type="dxa" w:w="2381"/>
+            <w:shd w:fill="14233B"/>
+            <w:tcBorders>
+              <w:top w:val="single" w:sz="4" w:color="FFFFFF"/>
+              <w:left w:val="single" w:sz="4" w:color="FFFFFF"/>
+              <w:bottom w:val="single" w:sz="4" w:color="FFFFFF"/>
+              <w:right w:val="single" w:sz="4" w:color="FFFFFF"/>
+              <w:insideH w:val="single" w:sz="4" w:color="FFFFFF"/>
+              <w:insideV w:val="single" w:sz="4" w:color="FFFFFF"/>
+            </w:tcBorders>
+            <w:vAlign w:val="center"/>
+          </w:tcPr>
+          <w:p>
+            <w:pPr>
+              <w:jc w:val="left"/>
+            </w:pPr>
+            <w:r>
+              <w:rPr>
+                <w:b/>
+                <w:color w:val="FFFFFF"/>
+                <w:sz w:val="17"/>
+              </w:rPr>
+              <w:t>Validación</w:t>
+            </w:r>
+          </w:p>
+        </w:tc>
+        <w:tc>
+          <w:tcPr>
+            <w:tcW w:type="dxa" w:w="1587"/>
+            <w:shd w:fill="14233B"/>
+            <w:tcBorders>
+              <w:top w:val="single" w:sz="4" w:color="FFFFFF"/>
+              <w:left w:val="single" w:sz="4" w:color="FFFFFF"/>
+              <w:bottom w:val="single" w:sz="4" w:color="FFFFFF"/>
+              <w:right w:val="single" w:sz="4" w:color="FFFFFF"/>
+              <w:insideH w:val="single" w:sz="4" w:color="FFFFFF"/>
+              <w:insideV w:val="single" w:sz="4" w:color="FFFFFF"/>
+            </w:tcBorders>
+            <w:vAlign w:val="center"/>
+          </w:tcPr>
+          <w:p>
+            <w:pPr>
+              <w:jc w:val="left"/>
+            </w:pPr>
+            <w:r>
+              <w:rPr>
+                <w:b/>
+                <w:color w:val="FFFFFF"/>
+                <w:sz w:val="17"/>
+              </w:rPr>
+              <w:t>Estado / siguiente</w:t>
+            </w:r>
+          </w:p>
+        </w:tc>
+      </w:tr>
+      <w:tr>
+        <w:trPr>
+          <w:cantSplit/>
+        </w:trPr>
+        <w:tc>
+          <w:tcPr>
+            <w:tcW w:type="dxa" w:w="1417"/>
+            <w:tcBorders>
+              <w:top w:val="single" w:sz="4" w:color="D9DEE7"/>
+              <w:left w:val="single" w:sz="4" w:color="D9DEE7"/>
+              <w:bottom w:val="single" w:sz="4" w:color="D9DEE7"/>
+              <w:right w:val="single" w:sz="4" w:color="D9DEE7"/>
+              <w:insideH w:val="single" w:sz="4" w:color="D9DEE7"/>
+              <w:insideV w:val="single" w:sz="4" w:color="D9DEE7"/>
+            </w:tcBorders>
+            <w:vAlign w:val="top"/>
+          </w:tcPr>
+          <w:p>
+            <w:pPr>
+              <w:spacing w:after="40"/>
+            </w:pPr>
+            <w:r>
+              <w:rPr>
+                <w:sz w:val="17"/>
+              </w:rPr>
+              <w:t>DOC-001</w:t>
+              <w:br/>
+              <w:t>31/07/2026</w:t>
+            </w:r>
+          </w:p>
+        </w:tc>
+        <w:tc>
+          <w:tcPr>
+            <w:tcW w:type="dxa" w:w="3685"/>
+            <w:tcBorders>
+              <w:top w:val="single" w:sz="4" w:color="D9DEE7"/>
+              <w:left w:val="single" w:sz="4" w:color="D9DEE7"/>
+              <w:bottom w:val="single" w:sz="4" w:color="D9DEE7"/>
+              <w:right w:val="single" w:sz="4" w:color="D9DEE7"/>
+              <w:insideH w:val="single" w:sz="4" w:color="D9DEE7"/>
+              <w:insideV w:val="single" w:sz="4" w:color="D9DEE7"/>
+            </w:tcBorders>
+            <w:vAlign w:val="top"/>
+          </w:tcPr>
+          <w:p>
+            <w:pPr>
+              <w:spacing w:after="40"/>
+            </w:pPr>
+            <w:r>
+              <w:rPr>
+                <w:sz w:val="17"/>
+              </w:rPr>
+              <w:t>Revisión del estado inicial y conversión del documento de ideas en documento maestro con arquitectura, fases, gates, riesgos y plantillas.</w:t>
+            </w:r>
+          </w:p>
+        </w:tc>
+        <w:tc>
+          <w:tcPr>
+            <w:tcW w:type="dxa" w:w="2381"/>
+            <w:tcBorders>
+              <w:top w:val="single" w:sz="4" w:color="D9DEE7"/>
+              <w:left w:val="single" w:sz="4" w:color="D9DEE7"/>
+              <w:bottom w:val="single" w:sz="4" w:color="D9DEE7"/>
+              <w:right w:val="single" w:sz="4" w:color="D9DEE7"/>
+              <w:insideH w:val="single" w:sz="4" w:color="D9DEE7"/>
+              <w:insideV w:val="single" w:sz="4" w:color="D9DEE7"/>
+            </w:tcBorders>
+            <w:vAlign w:val="top"/>
+          </w:tcPr>
+          <w:p>
+            <w:pPr>
+              <w:spacing w:after="40"/>
+            </w:pPr>
+            <w:r>
+              <w:rPr>
+                <w:sz w:val="17"/>
+              </w:rPr>
+              <w:t>Contenido original preservado. Word abrió el documento y permitió revisar portada, checklists, tablas y secciones. QA estructural completo sin incidencias; se corrigieron dos páginas vacías causadas por saltos manuales.</w:t>
+            </w:r>
+          </w:p>
+        </w:tc>
+        <w:tc>
+          <w:tcPr>
+            <w:tcW w:type="dxa" w:w="1587"/>
+            <w:tcBorders>
+              <w:top w:val="single" w:sz="4" w:color="D9DEE7"/>
+              <w:left w:val="single" w:sz="4" w:color="D9DEE7"/>
+              <w:bottom w:val="single" w:sz="4" w:color="D9DEE7"/>
+              <w:right w:val="single" w:sz="4" w:color="D9DEE7"/>
+              <w:insideH w:val="single" w:sz="4" w:color="D9DEE7"/>
+              <w:insideV w:val="single" w:sz="4" w:color="D9DEE7"/>
+            </w:tcBorders>
+            <w:vAlign w:val="top"/>
+          </w:tcPr>
+          <w:p>
+            <w:pPr>
+              <w:spacing w:after="40"/>
+            </w:pPr>
+            <w:r>
+              <w:rPr>
+                <w:sz w:val="17"/>
+              </w:rPr>
+              <w:t>[x] Documento maestro creado. Próximo: contener credenciales y cerrar decisiones de Fase 0.</w:t>
+            </w:r>
+          </w:p>
+        </w:tc>
+      </w:tr>
+      <w:tr>
+        <w:tc>
+          <w:tcPr>
+            <w:tcW w:type="dxa" w:w="2493"/>
+            <w:vAlign w:val="top"/>
+            <w:tcBorders>
+              <w:top w:val="single" w:sz="4" w:color="D9DEE7"/>
+              <w:left w:val="single" w:sz="4" w:color="D9DEE7"/>
+              <w:bottom w:val="single" w:sz="4" w:color="D9DEE7"/>
+              <w:right w:val="single" w:sz="4" w:color="D9DEE7"/>
+              <w:insideH w:val="single" w:sz="4" w:color="D9DEE7"/>
+              <w:insideV w:val="single" w:sz="4" w:color="D9DEE7"/>
+            </w:tcBorders>
+            <w:shd w:fill="F7F8FA"/>
+          </w:tcPr>
+          <w:p>
+            <w:pPr>
+              <w:spacing w:after="40"/>
+            </w:pPr>
+            <w:r/>
+            <w:r>
+              <w:rPr>
+                <w:rFonts w:ascii="Aptos" w:hAnsi="Aptos"/>
+                <w:color w:val="14233B"/>
+                <w:sz w:val="17"/>
+              </w:rPr>
+              <w:t>DOC-002</w:t>
+              <w:br/>
+              <w:t>31/07/2026</w:t>
+            </w:r>
+          </w:p>
+        </w:tc>
+        <w:tc>
+          <w:tcPr>
+            <w:tcW w:type="dxa" w:w="2493"/>
+            <w:vAlign w:val="top"/>
+            <w:tcBorders>
+              <w:top w:val="single" w:sz="4" w:color="D9DEE7"/>
+              <w:left w:val="single" w:sz="4" w:color="D9DEE7"/>
+              <w:bottom w:val="single" w:sz="4" w:color="D9DEE7"/>
+              <w:right w:val="single" w:sz="4" w:color="D9DEE7"/>
+              <w:insideH w:val="single" w:sz="4" w:color="D9DEE7"/>
+              <w:insideV w:val="single" w:sz="4" w:color="D9DEE7"/>
+            </w:tcBorders>
+            <w:shd w:fill="F7F8FA"/>
+          </w:tcPr>
+          <w:p>
+            <w:pPr>
+              <w:spacing w:after="40"/>
+            </w:pPr>
+            <w:r/>
+            <w:r>
+              <w:rPr>
+                <w:rFonts w:ascii="Aptos" w:hAnsi="Aptos"/>
+                <w:color w:val="14233B"/>
+                <w:sz w:val="17"/>
+              </w:rPr>
+              <w:t>Arquitectura inicial confirmada en Vercel + Render + Supabase, portabilidad hacia proveedor venezolano y pago manual auditable con automatización futura.</w:t>
+            </w:r>
+          </w:p>
+        </w:tc>
+        <w:tc>
+          <w:tcPr>
+            <w:tcW w:type="dxa" w:w="2493"/>
+            <w:vAlign w:val="top"/>
+            <w:tcBorders>
+              <w:top w:val="single" w:sz="4" w:color="D9DEE7"/>
+              <w:left w:val="single" w:sz="4" w:color="D9DEE7"/>
+              <w:bottom w:val="single" w:sz="4" w:color="D9DEE7"/>
+              <w:right w:val="single" w:sz="4" w:color="D9DEE7"/>
+              <w:insideH w:val="single" w:sz="4" w:color="D9DEE7"/>
+              <w:insideV w:val="single" w:sz="4" w:color="D9DEE7"/>
+            </w:tcBorders>
+            <w:shd w:fill="F7F8FA"/>
+          </w:tcPr>
+          <w:p>
+            <w:pPr>
+              <w:spacing w:after="40"/>
+            </w:pPr>
+            <w:r/>
+            <w:r>
+              <w:rPr>
+                <w:rFonts w:ascii="Aptos" w:hAnsi="Aptos"/>
+                <w:color w:val="14233B"/>
+                <w:sz w:val="17"/>
+              </w:rPr>
+              <w:t>Documento actualizado con adaptadores, contenedor API, migraciones, flujo manual, fases, riesgos, preguntas y ADR. QA estructural del DOCX ejecutada después del cambio.</w:t>
+            </w:r>
+          </w:p>
+        </w:tc>
+        <w:tc>
+          <w:tcPr>
+            <w:tcW w:type="dxa" w:w="2493"/>
+            <w:vAlign w:val="top"/>
+            <w:tcBorders>
+              <w:top w:val="single" w:sz="4" w:color="D9DEE7"/>
+              <w:left w:val="single" w:sz="4" w:color="D9DEE7"/>
+              <w:bottom w:val="single" w:sz="4" w:color="D9DEE7"/>
+              <w:right w:val="single" w:sz="4" w:color="D9DEE7"/>
+              <w:insideH w:val="single" w:sz="4" w:color="D9DEE7"/>
+              <w:insideV w:val="single" w:sz="4" w:color="D9DEE7"/>
+            </w:tcBorders>
+            <w:shd w:fill="F7F8FA"/>
+          </w:tcPr>
+          <w:p>
+            <w:pPr>
+              <w:spacing w:after="40"/>
+            </w:pPr>
+            <w:r/>
+            <w:r>
+              <w:rPr>
+                <w:rFonts w:ascii="Aptos" w:hAnsi="Aptos"/>
+                <w:color w:val="14233B"/>
+                <w:sz w:val="17"/>
+              </w:rPr>
+              <w:t>[x] Decisión documentada. Próximo: obtener detalles del proveedor, definir canales de pago e iniciar Fase 0.</w:t>
+            </w:r>
+          </w:p>
+        </w:tc>
+      </w:tr>
+      <w:tr>
+        <w:tc>
+          <w:tcPr>
+            <w:tcW w:type="dxa" w:w="2493"/>
+            <w:vAlign w:val="top"/>
+            <w:tcBorders>
+              <w:top w:val="single" w:sz="4" w:color="D9DEE7"/>
+              <w:left w:val="single" w:sz="4" w:color="D9DEE7"/>
+              <w:bottom w:val="single" w:sz="4" w:color="D9DEE7"/>
+              <w:right w:val="single" w:sz="4" w:color="D9DEE7"/>
+              <w:insideH w:val="single" w:sz="4" w:color="D9DEE7"/>
+              <w:insideV w:val="single" w:sz="4" w:color="D9DEE7"/>
+            </w:tcBorders>
+            <w:shd w:fill="F7F8FA"/>
+          </w:tcPr>
+          <w:p>
+            <w:pPr>
+              <w:spacing w:after="40"/>
+            </w:pPr>
+            <w:r>
+              <w:t>DOC-003 / 31/07/2026</w:t>
+            </w:r>
+          </w:p>
+        </w:tc>
+        <w:tc>
+          <w:tcPr>
+            <w:tcW w:type="dxa" w:w="2493"/>
+            <w:vAlign w:val="top"/>
+            <w:tcBorders>
+              <w:top w:val="single" w:sz="4" w:color="D9DEE7"/>
+              <w:left w:val="single" w:sz="4" w:color="D9DEE7"/>
+              <w:bottom w:val="single" w:sz="4" w:color="D9DEE7"/>
+              <w:right w:val="single" w:sz="4" w:color="D9DEE7"/>
+              <w:insideH w:val="single" w:sz="4" w:color="D9DEE7"/>
+              <w:insideV w:val="single" w:sz="4" w:color="D9DEE7"/>
+            </w:tcBorders>
+            <w:shd w:fill="F7F8FA"/>
+          </w:tcPr>
+          <w:p>
+            <w:pPr>
+              <w:spacing w:after="40"/>
+            </w:pPr>
+            <w:r>
+              <w:t>Consolidación documental: CEDIAH Web Status.docx queda como única fuente de verdad y se retira la copia anterior CEDIAH Web - Estatus.docx.</w:t>
+            </w:r>
+          </w:p>
+        </w:tc>
+        <w:tc>
+          <w:tcPr>
+            <w:tcW w:type="dxa" w:w="2493"/>
+            <w:vAlign w:val="top"/>
+            <w:tcBorders>
+              <w:top w:val="single" w:sz="4" w:color="D9DEE7"/>
+              <w:left w:val="single" w:sz="4" w:color="D9DEE7"/>
+              <w:bottom w:val="single" w:sz="4" w:color="D9DEE7"/>
+              <w:right w:val="single" w:sz="4" w:color="D9DEE7"/>
+              <w:insideH w:val="single" w:sz="4" w:color="D9DEE7"/>
+              <w:insideV w:val="single" w:sz="4" w:color="D9DEE7"/>
+            </w:tcBorders>
+            <w:shd w:fill="F7F8FA"/>
+          </w:tcPr>
+          <w:p>
+            <w:pPr>
+              <w:spacing w:after="40"/>
+            </w:pPr>
+            <w:r>
+              <w:t>Se comprobó que el documento canónico contiene la versión 1.2, la arquitectura, las fases, los checklists y la bitácora antes de retirar el duplicado.</w:t>
+            </w:r>
+          </w:p>
+        </w:tc>
+        <w:tc>
+          <w:tcPr>
+            <w:tcW w:type="dxa" w:w="2493"/>
+            <w:vAlign w:val="top"/>
+            <w:tcBorders>
+              <w:top w:val="single" w:sz="4" w:color="D9DEE7"/>
+              <w:left w:val="single" w:sz="4" w:color="D9DEE7"/>
+              <w:bottom w:val="single" w:sz="4" w:color="D9DEE7"/>
+              <w:right w:val="single" w:sz="4" w:color="D9DEE7"/>
+              <w:insideH w:val="single" w:sz="4" w:color="D9DEE7"/>
+              <w:insideV w:val="single" w:sz="4" w:color="D9DEE7"/>
+            </w:tcBorders>
+            <w:shd w:fill="F7F8FA"/>
+          </w:tcPr>
+          <w:p>
+            <w:pPr>
+              <w:spacing w:after="40"/>
+            </w:pPr>
+            <w:r>
+              <w:t>[x] Duplicado retirado. Próximo: ejecutar las acciones de seguridad y comenzar la Fase 0.</w:t>
+            </w:r>
+          </w:p>
+        </w:tc>
+      </w:tr>
+      <w:tr>
+        <w:tc>
+          <w:tcPr>
+            <w:tcW w:type="dxa" w:w="2493"/>
+            <w:vAlign w:val="top"/>
+            <w:tcBorders>
+              <w:top w:val="single" w:sz="4" w:color="D9DEE7"/>
+              <w:left w:val="single" w:sz="4" w:color="D9DEE7"/>
+              <w:bottom w:val="single" w:sz="4" w:color="D9DEE7"/>
+              <w:right w:val="single" w:sz="4" w:color="D9DEE7"/>
+              <w:insideH w:val="single" w:sz="4" w:color="D9DEE7"/>
+              <w:insideV w:val="single" w:sz="4" w:color="D9DEE7"/>
+            </w:tcBorders>
+            <w:shd w:fill="F7F8FA"/>
+          </w:tcPr>
+          <w:p>
+            <w:pPr>
+              <w:spacing w:after="40"/>
+            </w:pPr>
+            <w:r>
+              <w:t>CHG-001</w:t>
+              <w:br/>
+              <w:t>31/07/2026</w:t>
+            </w:r>
+          </w:p>
+        </w:tc>
+        <w:tc>
+          <w:tcPr>
+            <w:tcW w:type="dxa" w:w="2493"/>
+            <w:vAlign w:val="top"/>
+            <w:tcBorders>
+              <w:top w:val="single" w:sz="4" w:color="D9DEE7"/>
+              <w:left w:val="single" w:sz="4" w:color="D9DEE7"/>
+              <w:bottom w:val="single" w:sz="4" w:color="D9DEE7"/>
+              <w:right w:val="single" w:sz="4" w:color="D9DEE7"/>
+              <w:insideH w:val="single" w:sz="4" w:color="D9DEE7"/>
+              <w:insideV w:val="single" w:sz="4" w:color="D9DEE7"/>
+            </w:tcBorders>
+            <w:shd w:fill="F7F8FA"/>
+          </w:tcPr>
+          <w:p>
+            <w:pPr>
+              <w:spacing w:after="40"/>
+            </w:pPr>
+            <w:r>
+              <w:t>Inicio de la Fase 0: repositorio Git y monorepo pnpm; web Next.js responsive; API Fastify con health check; contratos portables; configuración inicial de Supabase, Vercel y Render; Dockerfile; CI, Dependabot, ADR, runbook de migración y controles de seguridad.</w:t>
+            </w:r>
+          </w:p>
+        </w:tc>
+        <w:tc>
+          <w:tcPr>
+            <w:tcW w:type="dxa" w:w="2493"/>
+            <w:vAlign w:val="top"/>
+            <w:tcBorders>
+              <w:top w:val="single" w:sz="4" w:color="D9DEE7"/>
+              <w:left w:val="single" w:sz="4" w:color="D9DEE7"/>
+              <w:bottom w:val="single" w:sz="4" w:color="D9DEE7"/>
+              <w:right w:val="single" w:sz="4" w:color="D9DEE7"/>
+              <w:insideH w:val="single" w:sz="4" w:color="D9DEE7"/>
+              <w:insideV w:val="single" w:sz="4" w:color="D9DEE7"/>
+            </w:tcBorders>
+            <w:shd w:fill="F7F8FA"/>
+          </w:tcPr>
+          <w:p>
+            <w:pPr>
+              <w:spacing w:after="40"/>
+            </w:pPr>
+            <w:r>
+              <w:t>pnpm install, lint, typecheck, test (2/2), peers check, audit (sin vulnerabilidades conocidas) y build: PASS. VER-001 local 1440 x 900 y VER-002 local 390 x 844: PASS; API conectada, sin overflow ni errores de consola. Commit inicial: 4292402.</w:t>
+            </w:r>
+          </w:p>
+        </w:tc>
+        <w:tc>
+          <w:tcPr>
+            <w:tcW w:type="dxa" w:w="2493"/>
+            <w:vAlign w:val="top"/>
+            <w:tcBorders>
+              <w:top w:val="single" w:sz="4" w:color="D9DEE7"/>
+              <w:left w:val="single" w:sz="4" w:color="D9DEE7"/>
+              <w:bottom w:val="single" w:sz="4" w:color="D9DEE7"/>
+              <w:right w:val="single" w:sz="4" w:color="D9DEE7"/>
+              <w:insideH w:val="single" w:sz="4" w:color="D9DEE7"/>
+              <w:insideV w:val="single" w:sz="4" w:color="D9DEE7"/>
+            </w:tcBorders>
+            <w:shd w:fill="F7F8FA"/>
+          </w:tcPr>
+          <w:p>
+            <w:pPr>
+              <w:spacing w:after="40"/>
+            </w:pPr>
+            <w:r>
+              <w:t>[~] Fase 0 en curso. La base local está operativa. Pendiente: credenciales/MFA, acuerdos y contenido, Docker ejecutado, repositorio remoto protegido y despliegues Vercel/Render/Supabase.</w:t>
+            </w:r>
+          </w:p>
+        </w:tc>
+      </w:tr>
+      <w:tr>
+        <w:tc>
+          <w:tcPr>
+            <w:tcW w:type="dxa" w:w="2493"/>
+            <w:vAlign w:val="top"/>
+            <w:tcBorders>
+              <w:top w:val="single" w:sz="4" w:color="D9DEE7"/>
+              <w:left w:val="single" w:sz="4" w:color="D9DEE7"/>
+              <w:bottom w:val="single" w:sz="4" w:color="D9DEE7"/>
+              <w:right w:val="single" w:sz="4" w:color="D9DEE7"/>
+              <w:insideH w:val="single" w:sz="4" w:color="D9DEE7"/>
+              <w:insideV w:val="single" w:sz="4" w:color="D9DEE7"/>
+            </w:tcBorders>
+            <w:shd w:fill="F7F8FA"/>
+          </w:tcPr>
+          <w:p>
+            <w:r>
+              <w:t>CHG-002</w:t>
+              <w:br/>
+              <w:t>01/08/2026</w:t>
+            </w:r>
+          </w:p>
+        </w:tc>
+        <w:tc>
+          <w:tcPr>
+            <w:tcW w:type="dxa" w:w="2493"/>
+            <w:vAlign w:val="top"/>
+            <w:tcBorders>
+              <w:top w:val="single" w:sz="4" w:color="D9DEE7"/>
+              <w:left w:val="single" w:sz="4" w:color="D9DEE7"/>
+              <w:bottom w:val="single" w:sz="4" w:color="D9DEE7"/>
+              <w:right w:val="single" w:sz="4" w:color="D9DEE7"/>
+              <w:insideH w:val="single" w:sz="4" w:color="D9DEE7"/>
+              <w:insideV w:val="single" w:sz="4" w:color="D9DEE7"/>
+            </w:tcBorders>
+            <w:shd w:fill="F7F8FA"/>
+          </w:tcPr>
+          <w:p>
+            <w:r>
+              <w:t>Nombre CEDIAH confirmado; catálogo demo de ocho regiones; VideoProvider preparado para carga directa temporal; origin configurado y main publicado en GitHub.</w:t>
+            </w:r>
+          </w:p>
+        </w:tc>
+        <w:tc>
+          <w:tcPr>
+            <w:tcW w:type="dxa" w:w="2493"/>
+            <w:vAlign w:val="top"/>
+            <w:tcBorders>
+              <w:top w:val="single" w:sz="4" w:color="D9DEE7"/>
+              <w:left w:val="single" w:sz="4" w:color="D9DEE7"/>
+              <w:bottom w:val="single" w:sz="4" w:color="D9DEE7"/>
+              <w:right w:val="single" w:sz="4" w:color="D9DEE7"/>
+              <w:insideH w:val="single" w:sz="4" w:color="D9DEE7"/>
+              <w:insideV w:val="single" w:sz="4" w:color="D9DEE7"/>
+            </w:tcBorders>
+            <w:shd w:fill="F7F8FA"/>
+          </w:tcPr>
+          <w:p>
+            <w:r>
+              <w:t>lint, typecheck, test (2/2), build y audit: PASS. VER-003 a VER-006: PASS en cuatro viewports; 8 cursos, navegación correcta, cero overflow y cero errores de consola.</w:t>
+            </w:r>
+          </w:p>
+        </w:tc>
+        <w:tc>
+          <w:tcPr>
+            <w:tcW w:type="dxa" w:w="2493"/>
+            <w:vAlign w:val="top"/>
+            <w:tcBorders>
+              <w:top w:val="single" w:sz="4" w:color="D9DEE7"/>
+              <w:left w:val="single" w:sz="4" w:color="D9DEE7"/>
+              <w:bottom w:val="single" w:sz="4" w:color="D9DEE7"/>
+              <w:right w:val="single" w:sz="4" w:color="D9DEE7"/>
+              <w:insideH w:val="single" w:sz="4" w:color="D9DEE7"/>
+              <w:insideV w:val="single" w:sz="4" w:color="D9DEE7"/>
+            </w:tcBorders>
+            <w:shd w:fill="F7F8FA"/>
+          </w:tcPr>
+          <w:p>
+            <w:r>
+              <w:t>[~] Fase 1 en curso. Próximo: seleccionar el curso vertical, recibir contenido autorizado e implementar su ficha antes de activar cargas.</w:t>
+            </w:r>
+          </w:p>
+        </w:tc>
+      </w:tr>
+      <w:tr>
+        <w:tc>
+          <w:tcPr>
+            <w:tcW w:type="dxa" w:w="2493"/>
+            <w:vAlign w:val="top"/>
+            <w:tcBorders>
+              <w:top w:val="single" w:sz="4" w:color="D9DEE7"/>
+              <w:left w:val="single" w:sz="4" w:color="D9DEE7"/>
+              <w:bottom w:val="single" w:sz="4" w:color="D9DEE7"/>
+              <w:right w:val="single" w:sz="4" w:color="D9DEE7"/>
+              <w:insideH w:val="single" w:sz="4" w:color="D9DEE7"/>
+              <w:insideV w:val="single" w:sz="4" w:color="D9DEE7"/>
+            </w:tcBorders>
+            <w:shd w:fill="F7F8FA"/>
+          </w:tcPr>
+          <w:p>
+            <w:r>
+              <w:t>CHG-003 / 01/08/2026</w:t>
+            </w:r>
+          </w:p>
+        </w:tc>
+        <w:tc>
+          <w:tcPr>
+            <w:tcW w:type="dxa" w:w="2493"/>
+            <w:vAlign w:val="top"/>
+            <w:tcBorders>
+              <w:top w:val="single" w:sz="4" w:color="D9DEE7"/>
+              <w:left w:val="single" w:sz="4" w:color="D9DEE7"/>
+              <w:bottom w:val="single" w:sz="4" w:color="D9DEE7"/>
+              <w:right w:val="single" w:sz="4" w:color="D9DEE7"/>
+              <w:insideH w:val="single" w:sz="4" w:color="D9DEE7"/>
+              <w:insideV w:val="single" w:sz="4" w:color="D9DEE7"/>
+            </w:tcBorders>
+            <w:shd w:fill="F7F8FA"/>
+          </w:tcPr>
+          <w:p>
+            <w:r>
+              <w:t>Fichas navegables para los ocho cursos demo, con rutas estáticas, metadatos, estados editoriales explícitos y contenido provisional sin presentar supuestos como hechos.</w:t>
+            </w:r>
+          </w:p>
+        </w:tc>
+        <w:tc>
+          <w:tcPr>
+            <w:tcW w:type="dxa" w:w="2493"/>
+            <w:vAlign w:val="top"/>
+            <w:tcBorders>
+              <w:top w:val="single" w:sz="4" w:color="D9DEE7"/>
+              <w:left w:val="single" w:sz="4" w:color="D9DEE7"/>
+              <w:bottom w:val="single" w:sz="4" w:color="D9DEE7"/>
+              <w:right w:val="single" w:sz="4" w:color="D9DEE7"/>
+              <w:insideH w:val="single" w:sz="4" w:color="D9DEE7"/>
+              <w:insideV w:val="single" w:sz="4" w:color="D9DEE7"/>
+            </w:tcBorders>
+            <w:shd w:fill="F7F8FA"/>
+          </w:tcPr>
+          <w:p>
+            <w:r>
+              <w:t>lint, typecheck, test (2/2), build con 8 rutas SSG y git diff --check: PASS. VER-007 a VER-010: PASS; navegación catálogo -&gt; Tórax, cuatro viewports, cero overflow y cero errores de consola.</w:t>
+            </w:r>
+          </w:p>
+        </w:tc>
+        <w:tc>
+          <w:tcPr>
+            <w:tcW w:type="dxa" w:w="2493"/>
+            <w:vAlign w:val="top"/>
+            <w:tcBorders>
+              <w:top w:val="single" w:sz="4" w:color="D9DEE7"/>
+              <w:left w:val="single" w:sz="4" w:color="D9DEE7"/>
+              <w:bottom w:val="single" w:sz="4" w:color="D9DEE7"/>
+              <w:right w:val="single" w:sz="4" w:color="D9DEE7"/>
+              <w:insideH w:val="single" w:sz="4" w:color="D9DEE7"/>
+              <w:insideV w:val="single" w:sz="4" w:color="D9DEE7"/>
+            </w:tcBorders>
+            <w:shd w:fill="F7F8FA"/>
+          </w:tcPr>
+          <w:p>
+            <w:r>
+              <w:t>[~] Fase 1 en curso. Próximo: coordinación debe seleccionar el curso vertical y entregar contenido autorizado; después se reemplaza la ficha demo por el recorrido académico real.</w:t>
+            </w:r>
+          </w:p>
+        </w:tc>
+      </w:tr>
+      <w:tr>
+        <w:tc>
+          <w:tcPr>
+            <w:tcW w:type="dxa" w:w="2493"/>
+          </w:tcPr>
+          <w:p>
+            <w:r>
+              <w:t>OPS-001 / 01/08/2026</w:t>
+            </w:r>
+          </w:p>
+        </w:tc>
+        <w:tc>
+          <w:tcPr>
+            <w:tcW w:type="dxa" w:w="2493"/>
+          </w:tcPr>
+          <w:p>
+            <w:r>
+              <w:t>Regla de liberación: todo cambio que afecte la web debe cerrar con documentación, commit, push, despliegue en Vercel y verificación de la URL publicada.</w:t>
+            </w:r>
+          </w:p>
+        </w:tc>
+        <w:tc>
+          <w:tcPr>
+            <w:tcW w:type="dxa" w:w="2493"/>
+          </w:tcPr>
+          <w:p>
+            <w:r>
+              <w:t>Política incorporada al documento canónico antes de publicar los cambios pendientes.</w:t>
+            </w:r>
+          </w:p>
+        </w:tc>
+        <w:tc>
+          <w:tcPr>
+            <w:tcW w:type="dxa" w:w="2493"/>
+          </w:tcPr>
+          <w:p>
+            <w:r>
+              <w:t>[x] Política aplicada: main publicado y Vercel Production Ready verificado en https://cediah.vercel.app.</w:t>
+            </w:r>
+          </w:p>
+        </w:tc>
+      </w:tr>
+      <w:tr>
+        <w:tc>
+          <w:tcPr>
+            <w:tcW w:type="dxa" w:w="2493"/>
+          </w:tcPr>
+          <w:p>
+            <w:r>
+              <w:t>DEP-001 / 01/08/2026</w:t>
+            </w:r>
+          </w:p>
+        </w:tc>
+        <w:tc>
+          <w:tcPr>
+            <w:tcW w:type="dxa" w:w="2493"/>
+          </w:tcPr>
+          <w:p>
+            <w:r>
+              <w:t>Publicación de main y despliegue de producción de la web en Vercel.</w:t>
+            </w:r>
+          </w:p>
+        </w:tc>
+        <w:tc>
+          <w:tcPr>
+            <w:tcW w:type="dxa" w:w="2493"/>
+          </w:tcPr>
+          <w:p>
+            <w:r>
+              <w:t>GitHub recibió 3f48804. Vercel marcó Production Ready; https://cediah.vercel.app/cursos/cuello mostró la ficha, título y H1 correctos, sin overflow ni errores de consola propios.</w:t>
+            </w:r>
+          </w:p>
+        </w:tc>
+        <w:tc>
+          <w:tcPr>
+            <w:tcW w:type="dxa" w:w="2493"/>
+          </w:tcPr>
+          <w:p>
+            <w:r>
+              <w:t>[x] Web pública verificada. Render API Docker y Supabase siguen pendientes.</w:t>
+            </w:r>
+          </w:p>
+        </w:tc>
+      </w:tr>
+      <w:tr>
+        <w:tc>
+          <w:tcPr>
+            <w:tcW w:type="dxa" w:w="2493"/>
+          </w:tcPr>
+          <w:p>
+            <w:r>
+              <w:t>SEC-001 / 01/08/2026</w:t>
+            </w:r>
+          </w:p>
+        </w:tc>
+        <w:tc>
+          <w:tcPr>
+            <w:tcW w:type="dxa" w:w="2493"/>
+          </w:tcPr>
+          <w:p>
+            <w:r>
+              <w:t>Registro de la rotacion de credenciales confirmada por el responsable del proyecto.</w:t>
+            </w:r>
+          </w:p>
+        </w:tc>
+        <w:tc>
+          <w:tcPr>
+            <w:tcW w:type="dxa" w:w="2493"/>
+          </w:tcPr>
+          <w:p>
+            <w:r>
+              <w:t>Confirmacion del responsable; .gitignore mantiene el archivo local fuera de Git y el arbol de trabajo estaba limpio. No se leyeron ni registraron secretos. MFA y eliminacion segura siguen pendientes de confirmacion.</w:t>
+            </w:r>
+          </w:p>
+        </w:tc>
+        <w:tc>
+          <w:tcPr>
+            <w:tcW w:type="dxa" w:w="2493"/>
+          </w:tcPr>
+          <w:p>
+            <w:r>
+              <w:t>[~] Rotacion registrada. Proximo: confirmar MFA y que el archivo nunca entro en Git antes de eliminarlo.</w:t>
+            </w:r>
+          </w:p>
+        </w:tc>
+      </w:tr>
+      <w:tr>
+        <w:tc>
+          <w:tcPr>
+            <w:tcW w:type="dxa" w:w="2493"/>
+          </w:tcPr>
+          <w:p>
+            <w:r>
+              <w:t>OPS-002 / 01/08/2026</w:t>
+            </w:r>
+          </w:p>
+        </w:tc>
+        <w:tc>
+          <w:tcPr>
+            <w:tcW w:type="dxa" w:w="2493"/>
+          </w:tcPr>
+          <w:p>
+            <w:r>
+              <w:t>Inventario de preparacion de Supabase sin cambios remotos.</w:t>
+            </w:r>
+          </w:p>
+        </w:tc>
+        <w:tc>
+          <w:tcPr>
+            <w:tcW w:type="dxa" w:w="2493"/>
+          </w:tcPr>
+          <w:p>
+            <w:r>
+              <w:t>Proyecto Web CEDIAH activo en Supabase, Postgres 17.6, sin tablas ni migraciones en public. Se revisaron cambios recientes: las tablas nuevas no se exponen automaticamente por Data API; futuras migraciones llevaran grants explicitos y RLS.</w:t>
+            </w:r>
+          </w:p>
+        </w:tc>
+        <w:tc>
+          <w:tcPr>
+            <w:tcW w:type="dxa" w:w="2493"/>
+          </w:tcPr>
+          <w:p>
+            <w:r>
+              <w:t>[~] Entorno de datos listo pero sin esquema. Proximo: aprobar roles, curso vertical y criterios academicos antes de crear la primera migracion.</w:t>
+            </w:r>
+          </w:p>
+        </w:tc>
+      </w:tr>
+      <w:tr>
+        <w:tc>
+          <w:tcPr>
+            <w:tcW w:type="dxa" w:w="2493"/>
+          </w:tcPr>
+          <w:p>
+            <w:r>
+              <w:t>APR-001 / 01/08/2026</w:t>
+            </w:r>
+          </w:p>
+        </w:tc>
+        <w:tc>
+          <w:tcPr>
+            <w:tcW w:type="dxa" w:w="2493"/>
+          </w:tcPr>
+          <w:p>
+            <w:r>
+              <w:t>Aprobacion de la plataforma por coordinacion y confirmacion de MFA.</w:t>
+            </w:r>
+          </w:p>
+        </w:tc>
+        <w:tc>
+          <w:tcPr>
+            <w:tcW w:type="dxa" w:w="2493"/>
+          </w:tcPr>
+          <w:p>
+            <w:r>
+              <w:t>El responsable confirmo que coordinacion aprobo la plataforma y que MFA esta activo. Se verifico que el archivo local historico no existe y no aparece rastreado ni en el historial Git, sin leer contenido sensible.</w:t>
+            </w:r>
+          </w:p>
+        </w:tc>
+        <w:tc>
+          <w:tcPr>
+            <w:tcW w:type="dxa" w:w="2493"/>
+          </w:tcPr>
+          <w:p>
+            <w:r>
+              <w:t>[x] Fundaciones de alcance y seguridad confirmadas. Proximo: registrar curso vertical y contenido autorizado.</w:t>
+            </w:r>
+          </w:p>
+        </w:tc>
+      </w:tr>
+      <w:tr>
+        <w:tc>
+          <w:tcPr>
+            <w:tcW w:type="dxa" w:w="2493"/>
+          </w:tcPr>
+          <w:p>
+            <w:r>
+              <w:t>DB-001 / 01/08/2026</w:t>
+            </w:r>
+          </w:p>
+        </w:tc>
+        <w:tc>
+          <w:tcPr>
+            <w:tcW w:type="dxa" w:w="2493"/>
+          </w:tcPr>
+          <w:p>
+            <w:r>
+              <w:t>Fundacion de datos aplicada en Supabase con RLS y sin acceso directo del navegador.</w:t>
+            </w:r>
+          </w:p>
+        </w:tc>
+        <w:tc>
+          <w:tcPr>
+            <w:tcW w:type="dxa" w:w="2493"/>
+          </w:tcPr>
+          <w:p>
+            <w:r>
+              <w:t>Migraciones 20260801172906 y 20260801173029 aplicadas al proyecto Supabase vacio. Nueve tablas publicas, RLS activo, anon/authenticated sin SELECT y service_role con acceso de servidor. Asesores: sin fallas de seguridad ni claves foraneas sin indice; solo avisos INFO esperados en tablas vacias y cerradas.</w:t>
+            </w:r>
+          </w:p>
+        </w:tc>
+        <w:tc>
+          <w:tcPr>
+            <w:tcW w:type="dxa" w:w="2493"/>
+          </w:tcPr>
+          <w:p>
+            <w:r>
+              <w:t>[x] Esquema remoto versionado y verificado. Proximo: integrar autenticacion y API antes de abrir politicas RLS a flujos concretos.</w:t>
+            </w:r>
+          </w:p>
+        </w:tc>
+      </w:tr>
+      <w:tr>
+        <w:tc>
+          <w:tcPr>
+            <w:tcW w:type="dxa" w:w="2493"/>
+          </w:tcPr>
+          <w:p>
+            <w:r>
+              <w:t>AUTH-001 / 01/08/2026</w:t>
+            </w:r>
+          </w:p>
+        </w:tc>
+        <w:tc>
+          <w:tcPr>
+            <w:tcW w:type="dxa" w:w="2493"/>
+          </w:tcPr>
+          <w:p>
+            <w:r>
+              <w:t>Fundación de identidad mediante Supabase Auth con sesión SSR y API como límite de autorización. Se añadieron acceso, registro, recuperación, actualización de contraseña, callback y panel protegido.</w:t>
+            </w:r>
+          </w:p>
+        </w:tc>
+        <w:tc>
+          <w:tcPr>
+            <w:tcW w:type="dxa" w:w="2493"/>
+          </w:tcPr>
+          <w:p>
+            <w:r>
+              <w:t>Contratos y API: typecheck PASS; Vitest 5/5 PASS; lint web PASS; build Next PASS. VER-011 390 x 844 y VER-012 1440 x 900: formularios, rutas de registro/recuperación/panel, foco y layout PASS; scrollWidth = clientWidth y cero warn/error de consola.</w:t>
+            </w:r>
+          </w:p>
+        </w:tc>
+        <w:tc>
+          <w:tcPr>
+            <w:tcW w:type="dxa" w:w="2493"/>
+          </w:tcPr>
+          <w:p>
+            <w:r>
+              <w:t>[~] Código listo sin abrir tablas al navegador ni exponer clave secreta. Próximo: configurar variables y URLs de Supabase, desplegar Render, conectar Vercel y ejecutar E2E con cuentas de prueba antes de habilitar contenido privado.</w:t>
+            </w:r>
+          </w:p>
+        </w:tc>
+      </w:tr>
+      <w:tr>
+        <w:tc>
+          <w:tcPr>
+            <w:tcW w:type="dxa" w:w="2493"/>
+          </w:tcPr>
+          <w:p>
+            <w:r>
+              <w:t>OPS-003 / 01/08/2026</w:t>
+            </w:r>
+          </w:p>
+        </w:tc>
+        <w:tc>
+          <w:tcPr>
+            <w:tcW w:type="dxa" w:w="2493"/>
+          </w:tcPr>
+          <w:p>
+            <w:r>
+              <w:t>Regla de cierre actualizada: cada trabajo terminado se publica mediante push para que el responsable pueda verificar los cambios sin hacerlo manualmente.</w:t>
+            </w:r>
+          </w:p>
+        </w:tc>
+        <w:tc>
+          <w:tcPr>
+            <w:tcW w:type="dxa" w:w="2493"/>
+          </w:tcPr>
+          <w:p>
+            <w:r>
+              <w:t>Regla incorporada al documento canónico antes de publicar los commits pendientes.</w:t>
+            </w:r>
+          </w:p>
+        </w:tc>
+        <w:tc>
+          <w:tcPr>
+            <w:tcW w:type="dxa" w:w="2493"/>
+          </w:tcPr>
+          <w:p>
+            <w:r>
+              <w:t>[x] Política registrada. Próximo: push a main y verificación del despliegue web cuando corresponda.</w:t>
+            </w:r>
+          </w:p>
+        </w:tc>
+      </w:tr>
+      <w:tr>
+        <w:tc>
+          <w:tcPr>
+            <w:tcW w:type="dxa" w:w="2493"/>
+          </w:tcPr>
+          <w:p>
+            <w:r>
+              <w:t>OPS-004\n01/08/2026</w:t>
+            </w:r>
+          </w:p>
+        </w:tc>
+        <w:tc>
+          <w:tcPr>
+            <w:tcW w:type="dxa" w:w="2493"/>
+          </w:tcPr>
+          <w:p>
+            <w:r>
+              <w:t>Configuracion inicial de Supabase Auth y Vercel para produccion; intento de despliegue de API en Render detenido antes de crear recursos porque el proveedor exige registrar una tarjeta.</w:t>
+            </w:r>
+          </w:p>
+        </w:tc>
+        <w:tc>
+          <w:tcPr>
+            <w:tcW w:type="dxa" w:w="2493"/>
+          </w:tcPr>
+          <w:p>
+            <w:r>
+              <w:t>Supabase: Site URL y callback de produccion guardados. Vercel: URL y clave publicable de Supabase guardadas para Production y Preview; redeploy de produccion termino READY. Render: Blueprint detecto render.yaml, pero solicito informacion de pago; no se introdujeron datos ni se creo el servicio.</w:t>
+            </w:r>
+          </w:p>
+        </w:tc>
+        <w:tc>
+          <w:tcPr>
+            <w:tcW w:type="dxa" w:w="2493"/>
+          </w:tcPr>
+          <w:p>
+            <w:r>
+              <w:t>[~] Web preparada para Auth; E2E pendiente hasta contar con API publica y sus variables de servidor. Proximo: elegir proveedor de API sin tarjeta o autorizar Render con su modalidad de pago, configurar WEB_ORIGINS, SUPABASE_URL y SUPABASE_SECRET_KEY solo en el servidor, y ejecutar E2E con cuenta de prueba.</w:t>
+            </w:r>
+          </w:p>
+        </w:tc>
+      </w:tr>
+      <w:tr>
+        <w:tc>
+          <w:tcPr>
+            <w:tcW w:type="dxa" w:w="2493"/>
+          </w:tcPr>
+          <w:p>
+            <w:r>
+              <w:t>CHG-004 / 10/08/2026</w:t>
+            </w:r>
+          </w:p>
+        </w:tc>
+        <w:tc>
+          <w:tcPr>
+            <w:tcW w:type="dxa" w:w="2493"/>
+          </w:tcPr>
+          <w:p>
+            <w:r>
+              <w:t>Fase 1: vista de lección demo navegable para validar el espacio de estudio sin inventar contenido académico ni habilitar acceso privado.</w:t>
+            </w:r>
+          </w:p>
+        </w:tc>
+        <w:tc>
+          <w:tcPr>
+            <w:tcW w:type="dxa" w:w="2493"/>
+          </w:tcPr>
+          <w:p>
+            <w:r>
+              <w:t>lint web, typecheck web/API, Vitest API 5/5 con timeout de arranque ampliado, build Next, git diff --check y pnpm audit --audit-level high/low: PASS. VER-013 a VER-016: PASS en cuatro viewports; navegación catálogo -&gt; lección PASS.</w:t>
+            </w:r>
+          </w:p>
+        </w:tc>
+        <w:tc>
+          <w:tcPr>
+            <w:tcW w:type="dxa" w:w="2493"/>
+          </w:tcPr>
+          <w:p>
+            <w:r>
+              <w:t>[~] Fase 1 en curso. Próximo: seleccionar el curso vertical y recibir contenido autorizado; después sustituir la lección demo por datos reales y conectar la API pública.</w:t>
+            </w:r>
+          </w:p>
+        </w:tc>
+      </w:tr>
+      <w:tr>
+        <w:tc>
+          <w:tcPr>
+            <w:tcW w:type="dxa" w:w="2493"/>
+          </w:tcPr>
+          <w:p>
+            <w:r>
+              <w:t>CHG-005 / 10/08/2026</w:t>
+            </w:r>
+          </w:p>
+        </w:tc>
+        <w:tc>
+          <w:tcPr>
+            <w:tcW w:type="dxa" w:w="2493"/>
+          </w:tcPr>
+          <w:p>
+            <w:r>
+              <w:t>Flujo privado de video de prueba con Supabase Storage, API Render y web Vercel; corrección de CSP para permitir media-src.</w:t>
+            </w:r>
+          </w:p>
+        </w:tc>
+        <w:tc>
+          <w:tcPr>
+            <w:tcW w:type="dxa" w:w="2493"/>
+          </w:tcPr>
+          <w:p>
+            <w:r>
+              <w:t>API: 2 archivos / 10 pruebas PASS; API build, web lint/typecheck/build PASS; navegador: carga de 8,9 MB, objeto privado, URL firmada, respuesta 206 video/mp4 y reproducción visual confirmada.</w:t>
+            </w:r>
+          </w:p>
+        </w:tc>
+        <w:tc>
+          <w:tcPr>
+            <w:tcW w:type="dxa" w:w="2493"/>
+          </w:tcPr>
+          <w:p>
+            <w:r>
+              <w:t>[~] Prueba técnica cerrada. Próximo: curso vertical, contenido autorizado, roles/matrículas/progreso y E2E negativo. Cloudflare Stream queda pospuesto.</w:t>
+            </w:r>
+          </w:p>
+        </w:tc>
+      </w:tr>
+    </w:tbl>
     <w:tbl>
       <w:tblPr>
         <w:tblStyle w:val="TableGrid"/>
@@ -2260,6 +3437,76 @@
     </w:p>
     <w:p>
       <w:pPr>
+        <w:pStyle w:val="Heading2"/>
+      </w:pPr>
+      <w:r>
+        <w:t>Estado técnico comprobado - 10/08/2026</w:t>
+      </w:r>
+    </w:p>
+    <w:p>
+      <w:pPr/>
+      <w:r>
+        <w:t>La plataforma tiene una ruta de prueba privada operativa para validar el reproductor sin publicar contenido académico. La web está en Vercel, la API Docker en Render y Supabase concentra Auth y Storage privado.</w:t>
+      </w:r>
+    </w:p>
+    <w:p>
+      <w:pPr>
+        <w:pStyle w:val="Checklist"/>
+      </w:pPr>
+      <w:r>
+        <w:t>[x] Web pública en https://cediah.vercel.app y laboratorio de video en https://cediah.vercel.app/pruebas/video.</w:t>
+      </w:r>
+    </w:p>
+    <w:p>
+      <w:pPr>
+        <w:pStyle w:val="Checklist"/>
+      </w:pPr>
+      <w:r>
+        <w:t>[x] API cediah-api activa en Render con /health operativo, proveedor de prueba Supabase y variables sensibles solo en el servidor.</w:t>
+      </w:r>
+    </w:p>
+    <w:p>
+      <w:pPr>
+        <w:pStyle w:val="Checklist"/>
+      </w:pPr>
+      <w:r>
+        <w:t>[x] Bucket privado video-test creado en Supabase; carga firmada de un solo uso, rutas UUID, MP4/WebM/MOV y límite de 50 MB.</w:t>
+      </w:r>
+    </w:p>
+    <w:p>
+      <w:pPr>
+        <w:pStyle w:val="Checklist"/>
+      </w:pPr>
+      <w:r>
+        <w:t>[x] La cuenta de prueba autorizada pudo cargar un MP4 de 8,9 MB y recibir una sesión firmada de reproducción. El archivo existe en Supabase Storage.</w:t>
+      </w:r>
+    </w:p>
+    <w:p>
+      <w:pPr>
+        <w:pStyle w:val="Checklist"/>
+      </w:pPr>
+      <w:r>
+        <w:t>[x] Se corrigió la CSP de la web con media-src para Supabase; la prueba técnica recibió 206 video/mp4, leyó la duración y la persona responsable confirmó reproducción visual.</w:t>
+      </w:r>
+    </w:p>
+    <w:p>
+      <w:pPr>
+        <w:pStyle w:val="Checklist"/>
+      </w:pPr>
+      <w:r>
+        <w:t>[~] Cloudflare Stream no se contrató para estas pruebas gratuitas. Queda como opción de producción si la codificación/CDN administrada justifica el costo.</w:t>
+      </w:r>
+    </w:p>
+    <w:p>
+      <w:pPr>
+        <w:pStyle w:val="Checklist"/>
+      </w:pPr>
+      <w:r>
+        <w:t>[ ] Todavía faltan contenido académico autorizado, roles/matrículas, progreso persistente, recursos, evaluaciones, certificados, flujo editorial y pruebas negativas de acceso.</w:t>
+      </w:r>
+    </w:p>
+    <w:p>
+      <w:pPr>
         <w:pStyle w:val="Heading1"/>
         <w:keepNext w:val="1"/>
       </w:pPr>
@@ -3886,7 +5133,7 @@
     </w:p>
     <w:p>
       <w:r>
-        <w:t>La etapa inicial usará Vercel para la aplicación web, Render para una API independiente y Supabase para Postgres, autenticación y archivos privados. Esta combinación permite probar con bajo costo, pero no será tratada como destino definitivo: el código se organizará para migrar la API, la base de datos, los archivos y otros proveedores al servicio venezolano elegido sin reescribir el dominio del producto.</w:t>
+        <w:t>La etapa inicial usa Vercel para la aplicación web, Render para una API Docker independiente y Supabase para Postgres, autenticación y Storage privado. El flujo de video de prueba usa Supabase Storage por su modalidad gratuita y URLs firmadas; Cloudflare Stream queda reservado para una decisión posterior de producción. La combinación mantiene límites portables para migrar la API, la base, los archivos y el proveedor de video sin reescribir el dominio del producto.</w:t>
       </w:r>
     </w:p>
     <w:tbl>
@@ -6327,6 +7574,9 @@
       <w:pPr>
         <w:spacing w:after="0"/>
       </w:pPr>
+      <w:r>
+        <w:t>Para la prueba gratuita, el servidor comprueba la cuenta autorizada, emite una URL firmada de carga y después una URL firmada de reproducción. Esto valida el circuito técnico, no concede matrícula ni publica clases. El acceso académico real deberá comprobar rol, matrícula y vigencia antes de emitir cada sesión.</w:t>
+      </w:r>
     </w:p>
     <w:p>
       <w:pPr>
@@ -10796,7 +12046,7 @@
         <w:pStyle w:val="Checklist"/>
       </w:pPr>
       <w:r>
-        <w:t>[~] Crear Dockerfile y health check de la API; levantar la misma imagen localmente y en Render.</w:t>
+        <w:t>[~] Dockerfile y health check creados; la misma imagen se desplegó en el servicio Docker gratuito cediah-api de Render. La ejecución local de Docker continúa pendiente por disponibilidad del equipo.</w:t>
       </w:r>
     </w:p>
     <w:p>
@@ -10908,7 +12158,7 @@
         <w:ind w:left="255" w:hanging="255"/>
       </w:pPr>
       <w:r>
-        <w:t>[~] La web en Vercel carga a 390 x 844 y 1440 x 900, consume el health check de la API en Render y no presenta errores de consola/CORS.</w:t>
+        <w:t>[x] La web pública en Vercel y la API en Render responden; el laboratorio de video fue comprobado con una cuenta autorizada, sin errores visibles de consola. Falta repetir la matriz completa de viewports y recorridos académicos cuando existan datos reales.</w:t>
       </w:r>
     </w:p>
     <w:p>
@@ -11241,13 +12491,7 @@
         <w:ind w:left="255" w:hanging="255"/>
       </w:pPr>
       <w:r>
-        <w:rPr>
-          <w:b/>
-        </w:rPr>
-        <w:t xml:space="preserve">[ ] </w:t>
-      </w:r>
-      <w:r>
-        <w:t>Implementar vista de lección con reproductor de demostración, temario y recursos.</w:t>
+        <w:t>[x] Implementar vista de lección con reproductor de demostración, temario y recursos bloqueados; la ruta demo está publicada y verificada.</w:t>
       </w:r>
     </w:p>
     <w:p>
@@ -11725,7 +12969,7 @@
         <w:ind w:left="255" w:hanging="255"/>
       </w:pPr>
       <w:r>
-        <w:t>[~] Fundación de Supabase activa y configuración versionada preparada; faltan desplegar la API Docker en Render y conectar la URL de producción en Vercel.</w:t>
+        <w:t>[x] Fundación de Supabase y API Docker en Render activas; Vercel consume la API pública y las variables de producción quedaron configuradas sin exponer secretos.</w:t>
       </w:r>
     </w:p>
     <w:p>
@@ -11764,7 +13008,7 @@
         <w:ind w:left="255" w:hanging="255"/>
       </w:pPr>
       <w:r>
-        <w:t>[~] Registro, verificación por callback, login, recuperación, actualización de contraseña y cierre de sesión implementados; falta configurar SMTP, URLs de redirección y ejecutar E2E con cuentas de prueba.</w:t>
+        <w:t>[~] Registro, callback, login, recuperación, actualización de contraseña y sesión SSR están implementados; se verificó una cuenta de prueba en producción y el flujo privado de video. Falta SMTP, E2E completo de identidad y recuperación con cuentas separadas.</w:t>
       </w:r>
     </w:p>
     <w:p>
@@ -11773,7 +13017,7 @@
         <w:ind w:left="255" w:hanging="255"/>
       </w:pPr>
       <w:r>
-        <w:t>[~] La API valida el bearer token contra Supabase Auth antes de devolver identidad; faltan roles, matrículas y menús por permisos reales.</w:t>
+        <w:t>[~] La API valida el bearer token contra Supabase Auth y restringe la prueba de video a una allowlist de cuentas; faltan roles, matrículas, derechos de acceso y menús por permisos reales.</w:t>
       </w:r>
     </w:p>
     <w:p>
@@ -11797,13 +13041,31 @@
         <w:ind w:left="255" w:hanging="255"/>
       </w:pPr>
       <w:r>
+        <w:t>[~] Para pruebas gratuitas se configuró Supabase Storage privado con carga y reproducción firmadas. Cloudflare Stream, webhook de procesamiento y la decisión de proveedor de producción quedan pospuestos.</w:t>
+      </w:r>
+    </w:p>
+    <w:p>
+      <w:pPr>
+        <w:pStyle w:val="Checklist"/>
+        <w:ind w:left="255" w:hanging="255"/>
+      </w:pPr>
+      <w:r>
+        <w:t>[~] El servidor emite URLs firmadas de reproducción de corta duración para la cuenta autorizada de prueba; falta exigir matrícula, rol y vigencia antes de hacerlo con contenido académico.</w:t>
+      </w:r>
+    </w:p>
+    <w:p>
+      <w:pPr>
+        <w:pStyle w:val="Checklist"/>
+        <w:ind w:left="255" w:hanging="255"/>
+      </w:pPr>
+      <w:r>
         <w:rPr>
           <w:b/>
         </w:rPr>
         <w:t xml:space="preserve">[ ] </w:t>
       </w:r>
       <w:r>
-        <w:t>Configurar Cloudflare Stream, videos privados, webhook de procesamiento y carga de un solo uso.</w:t>
+        <w:t>Configurar Storage privado para guías y materiales con validación de tipo y tamaño.</w:t>
       </w:r>
     </w:p>
     <w:p>
@@ -11818,7 +13080,7 @@
         <w:t xml:space="preserve">[ ] </w:t>
       </w:r>
       <w:r>
-        <w:t>Emitir token corto de reproducción solo después de comprobar el derecho de acceso.</w:t>
+        <w:t>Persistir progreso con reglas anti-fraude básicas y reanudación entre dispositivos.</w:t>
       </w:r>
     </w:p>
     <w:p>
@@ -11833,7 +13095,7 @@
         <w:t xml:space="preserve">[ ] </w:t>
       </w:r>
       <w:r>
-        <w:t>Configurar Storage privado para guías y materiales con validación de tipo y tamaño.</w:t>
+        <w:t>Implementar búsqueda inicial por título, región, tema y docente.</w:t>
       </w:r>
     </w:p>
     <w:p>
@@ -11848,7 +13110,7 @@
         <w:t xml:space="preserve">[ ] </w:t>
       </w:r>
       <w:r>
-        <w:t>Persistir progreso con reglas anti-fraude básicas y reanudación entre dispositivos.</w:t>
+        <w:t>Permitir a un administrador crear, editar, ordenar, previsualizar y publicar el curso vertical.</w:t>
       </w:r>
     </w:p>
     <w:p>
@@ -11863,7 +13125,7 @@
         <w:t xml:space="preserve">[ ] </w:t>
       </w:r>
       <w:r>
-        <w:t>Implementar búsqueda inicial por título, región, tema y docente.</w:t>
+        <w:t>Añadir logs de auditoría para publicación, permisos, matrículas y cambios sensibles.</w:t>
       </w:r>
     </w:p>
     <w:p>
@@ -11872,43 +13134,7 @@
         <w:ind w:left="255" w:hanging="255"/>
       </w:pPr>
       <w:r>
-        <w:rPr>
-          <w:b/>
-        </w:rPr>
-        <w:t xml:space="preserve">[ ] </w:t>
-      </w:r>
-      <w:r>
-        <w:t>Permitir a un administrador crear, editar, ordenar, previsualizar y publicar el curso vertical.</w:t>
-      </w:r>
-    </w:p>
-    <w:p>
-      <w:pPr>
-        <w:pStyle w:val="Checklist"/>
-        <w:ind w:left="255" w:hanging="255"/>
-      </w:pPr>
-      <w:r>
-        <w:rPr>
-          <w:b/>
-        </w:rPr>
-        <w:t xml:space="preserve">[ ] </w:t>
-      </w:r>
-      <w:r>
-        <w:t>Añadir logs de auditoría para publicación, permisos, matrículas y cambios sensibles.</w:t>
-      </w:r>
-    </w:p>
-    <w:p>
-      <w:pPr>
-        <w:pStyle w:val="Checklist"/>
-        <w:ind w:left="255" w:hanging="255"/>
-      </w:pPr>
-      <w:r>
-        <w:rPr>
-          <w:b/>
-        </w:rPr>
-        <w:t xml:space="preserve">[ ] </w:t>
-      </w:r>
-      <w:r>
-        <w:t>Probar pérdidas de red, video no procesado, token vencido, recurso inexistente y acceso revocado.</w:t>
+        <w:t>[~] Se comprobó carga, existencia del objeto, reproducción por rangos y renovación de sesión tras vencimiento. Faltan pérdidas de red, acceso revocado, archivo inexistente y pruebas negativas por matrícula.</w:t>
       </w:r>
     </w:p>
     <w:p>
@@ -16260,14 +17486,8 @@
             <w:vAlign w:val="top"/>
           </w:tcPr>
           <w:p>
-            <w:pPr>
-              <w:spacing w:after="40"/>
-            </w:pPr>
-            <w:r>
-              <w:rPr>
-                <w:sz w:val="17"/>
-              </w:rPr>
-              <w:t>[!] Bloqueo de seguridad</w:t>
+            <w:r>
+              <w:t>[~] Rotación y MFA verificados; falta custodia compartida aprobada.</w:t>
             </w:r>
           </w:p>
         </w:tc>
@@ -16683,7 +17903,7 @@
           </w:tcPr>
           <w:p>
             <w:r>
-              <w:t>[~] Identidad API y recorridos de cuenta listos localmente; faltan roles, matrículas, video, material y progreso.</w:t>
+              <w:t>[~] Identidad, API y video privado de prueba listos; faltan roles, matrículas, materiales y progreso académicos.</w:t>
             </w:r>
           </w:p>
         </w:tc>
@@ -20535,1141 +21755,6 @@
         <w:spacing w:after="0"/>
       </w:pPr>
     </w:p>
-    <w:tbl>
-      <w:tblPr>
-        <w:tblStyle w:val="TableGrid"/>
-        <w:tblW w:type="auto" w:w="0"/>
-        <w:jc w:val="center"/>
-        <w:tblLayout w:type="autofit"/>
-        <w:tblLook w:firstColumn="1" w:firstRow="1" w:lastColumn="0" w:lastRow="0" w:noHBand="0" w:noVBand="1" w:val="04A0"/>
-      </w:tblPr>
-      <w:tblGrid>
-        <w:gridCol w:w="2493"/>
-        <w:gridCol w:w="2493"/>
-        <w:gridCol w:w="2493"/>
-        <w:gridCol w:w="2493"/>
-      </w:tblGrid>
-      <w:tr>
-        <w:trPr>
-          <w:tblHeader w:val="true"/>
-        </w:trPr>
-        <w:tc>
-          <w:tcPr>
-            <w:tcW w:type="dxa" w:w="1417"/>
-            <w:shd w:fill="14233B"/>
-            <w:tcBorders>
-              <w:top w:val="single" w:sz="4" w:color="FFFFFF"/>
-              <w:left w:val="single" w:sz="4" w:color="FFFFFF"/>
-              <w:bottom w:val="single" w:sz="4" w:color="FFFFFF"/>
-              <w:right w:val="single" w:sz="4" w:color="FFFFFF"/>
-              <w:insideH w:val="single" w:sz="4" w:color="FFFFFF"/>
-              <w:insideV w:val="single" w:sz="4" w:color="FFFFFF"/>
-            </w:tcBorders>
-            <w:vAlign w:val="center"/>
-          </w:tcPr>
-          <w:p>
-            <w:pPr>
-              <w:jc w:val="left"/>
-            </w:pPr>
-            <w:r>
-              <w:rPr>
-                <w:b/>
-                <w:color w:val="FFFFFF"/>
-                <w:sz w:val="17"/>
-              </w:rPr>
-              <w:t>ID / fecha</w:t>
-            </w:r>
-          </w:p>
-        </w:tc>
-        <w:tc>
-          <w:tcPr>
-            <w:tcW w:type="dxa" w:w="3685"/>
-            <w:shd w:fill="14233B"/>
-            <w:tcBorders>
-              <w:top w:val="single" w:sz="4" w:color="FFFFFF"/>
-              <w:left w:val="single" w:sz="4" w:color="FFFFFF"/>
-              <w:bottom w:val="single" w:sz="4" w:color="FFFFFF"/>
-              <w:right w:val="single" w:sz="4" w:color="FFFFFF"/>
-              <w:insideH w:val="single" w:sz="4" w:color="FFFFFF"/>
-              <w:insideV w:val="single" w:sz="4" w:color="FFFFFF"/>
-            </w:tcBorders>
-            <w:vAlign w:val="center"/>
-          </w:tcPr>
-          <w:p>
-            <w:pPr>
-              <w:jc w:val="left"/>
-            </w:pPr>
-            <w:r>
-              <w:rPr>
-                <w:b/>
-                <w:color w:val="FFFFFF"/>
-                <w:sz w:val="17"/>
-              </w:rPr>
-              <w:t>Cambio</w:t>
-            </w:r>
-          </w:p>
-        </w:tc>
-        <w:tc>
-          <w:tcPr>
-            <w:tcW w:type="dxa" w:w="2381"/>
-            <w:shd w:fill="14233B"/>
-            <w:tcBorders>
-              <w:top w:val="single" w:sz="4" w:color="FFFFFF"/>
-              <w:left w:val="single" w:sz="4" w:color="FFFFFF"/>
-              <w:bottom w:val="single" w:sz="4" w:color="FFFFFF"/>
-              <w:right w:val="single" w:sz="4" w:color="FFFFFF"/>
-              <w:insideH w:val="single" w:sz="4" w:color="FFFFFF"/>
-              <w:insideV w:val="single" w:sz="4" w:color="FFFFFF"/>
-            </w:tcBorders>
-            <w:vAlign w:val="center"/>
-          </w:tcPr>
-          <w:p>
-            <w:pPr>
-              <w:jc w:val="left"/>
-            </w:pPr>
-            <w:r>
-              <w:rPr>
-                <w:b/>
-                <w:color w:val="FFFFFF"/>
-                <w:sz w:val="17"/>
-              </w:rPr>
-              <w:t>Validación</w:t>
-            </w:r>
-          </w:p>
-        </w:tc>
-        <w:tc>
-          <w:tcPr>
-            <w:tcW w:type="dxa" w:w="1587"/>
-            <w:shd w:fill="14233B"/>
-            <w:tcBorders>
-              <w:top w:val="single" w:sz="4" w:color="FFFFFF"/>
-              <w:left w:val="single" w:sz="4" w:color="FFFFFF"/>
-              <w:bottom w:val="single" w:sz="4" w:color="FFFFFF"/>
-              <w:right w:val="single" w:sz="4" w:color="FFFFFF"/>
-              <w:insideH w:val="single" w:sz="4" w:color="FFFFFF"/>
-              <w:insideV w:val="single" w:sz="4" w:color="FFFFFF"/>
-            </w:tcBorders>
-            <w:vAlign w:val="center"/>
-          </w:tcPr>
-          <w:p>
-            <w:pPr>
-              <w:jc w:val="left"/>
-            </w:pPr>
-            <w:r>
-              <w:rPr>
-                <w:b/>
-                <w:color w:val="FFFFFF"/>
-                <w:sz w:val="17"/>
-              </w:rPr>
-              <w:t>Estado / siguiente</w:t>
-            </w:r>
-          </w:p>
-        </w:tc>
-      </w:tr>
-      <w:tr>
-        <w:trPr>
-          <w:cantSplit/>
-        </w:trPr>
-        <w:tc>
-          <w:tcPr>
-            <w:tcW w:type="dxa" w:w="1417"/>
-            <w:tcBorders>
-              <w:top w:val="single" w:sz="4" w:color="D9DEE7"/>
-              <w:left w:val="single" w:sz="4" w:color="D9DEE7"/>
-              <w:bottom w:val="single" w:sz="4" w:color="D9DEE7"/>
-              <w:right w:val="single" w:sz="4" w:color="D9DEE7"/>
-              <w:insideH w:val="single" w:sz="4" w:color="D9DEE7"/>
-              <w:insideV w:val="single" w:sz="4" w:color="D9DEE7"/>
-            </w:tcBorders>
-            <w:vAlign w:val="top"/>
-          </w:tcPr>
-          <w:p>
-            <w:pPr>
-              <w:spacing w:after="40"/>
-            </w:pPr>
-            <w:r>
-              <w:rPr>
-                <w:sz w:val="17"/>
-              </w:rPr>
-              <w:t>DOC-001</w:t>
-              <w:br/>
-              <w:t>31/07/2026</w:t>
-            </w:r>
-          </w:p>
-        </w:tc>
-        <w:tc>
-          <w:tcPr>
-            <w:tcW w:type="dxa" w:w="3685"/>
-            <w:tcBorders>
-              <w:top w:val="single" w:sz="4" w:color="D9DEE7"/>
-              <w:left w:val="single" w:sz="4" w:color="D9DEE7"/>
-              <w:bottom w:val="single" w:sz="4" w:color="D9DEE7"/>
-              <w:right w:val="single" w:sz="4" w:color="D9DEE7"/>
-              <w:insideH w:val="single" w:sz="4" w:color="D9DEE7"/>
-              <w:insideV w:val="single" w:sz="4" w:color="D9DEE7"/>
-            </w:tcBorders>
-            <w:vAlign w:val="top"/>
-          </w:tcPr>
-          <w:p>
-            <w:pPr>
-              <w:spacing w:after="40"/>
-            </w:pPr>
-            <w:r>
-              <w:rPr>
-                <w:sz w:val="17"/>
-              </w:rPr>
-              <w:t>Revisión del estado inicial y conversión del documento de ideas en documento maestro con arquitectura, fases, gates, riesgos y plantillas.</w:t>
-            </w:r>
-          </w:p>
-        </w:tc>
-        <w:tc>
-          <w:tcPr>
-            <w:tcW w:type="dxa" w:w="2381"/>
-            <w:tcBorders>
-              <w:top w:val="single" w:sz="4" w:color="D9DEE7"/>
-              <w:left w:val="single" w:sz="4" w:color="D9DEE7"/>
-              <w:bottom w:val="single" w:sz="4" w:color="D9DEE7"/>
-              <w:right w:val="single" w:sz="4" w:color="D9DEE7"/>
-              <w:insideH w:val="single" w:sz="4" w:color="D9DEE7"/>
-              <w:insideV w:val="single" w:sz="4" w:color="D9DEE7"/>
-            </w:tcBorders>
-            <w:vAlign w:val="top"/>
-          </w:tcPr>
-          <w:p>
-            <w:pPr>
-              <w:spacing w:after="40"/>
-            </w:pPr>
-            <w:r>
-              <w:rPr>
-                <w:sz w:val="17"/>
-              </w:rPr>
-              <w:t>Contenido original preservado. Word abrió el documento y permitió revisar portada, checklists, tablas y secciones. QA estructural completo sin incidencias; se corrigieron dos páginas vacías causadas por saltos manuales.</w:t>
-            </w:r>
-          </w:p>
-        </w:tc>
-        <w:tc>
-          <w:tcPr>
-            <w:tcW w:type="dxa" w:w="1587"/>
-            <w:tcBorders>
-              <w:top w:val="single" w:sz="4" w:color="D9DEE7"/>
-              <w:left w:val="single" w:sz="4" w:color="D9DEE7"/>
-              <w:bottom w:val="single" w:sz="4" w:color="D9DEE7"/>
-              <w:right w:val="single" w:sz="4" w:color="D9DEE7"/>
-              <w:insideH w:val="single" w:sz="4" w:color="D9DEE7"/>
-              <w:insideV w:val="single" w:sz="4" w:color="D9DEE7"/>
-            </w:tcBorders>
-            <w:vAlign w:val="top"/>
-          </w:tcPr>
-          <w:p>
-            <w:pPr>
-              <w:spacing w:after="40"/>
-            </w:pPr>
-            <w:r>
-              <w:rPr>
-                <w:sz w:val="17"/>
-              </w:rPr>
-              <w:t>[x] Documento maestro creado. Próximo: contener credenciales y cerrar decisiones de Fase 0.</w:t>
-            </w:r>
-          </w:p>
-        </w:tc>
-      </w:tr>
-      <w:tr>
-        <w:tc>
-          <w:tcPr>
-            <w:tcW w:type="dxa" w:w="2493"/>
-            <w:vAlign w:val="top"/>
-            <w:tcBorders>
-              <w:top w:val="single" w:sz="4" w:color="D9DEE7"/>
-              <w:left w:val="single" w:sz="4" w:color="D9DEE7"/>
-              <w:bottom w:val="single" w:sz="4" w:color="D9DEE7"/>
-              <w:right w:val="single" w:sz="4" w:color="D9DEE7"/>
-              <w:insideH w:val="single" w:sz="4" w:color="D9DEE7"/>
-              <w:insideV w:val="single" w:sz="4" w:color="D9DEE7"/>
-            </w:tcBorders>
-            <w:shd w:fill="F7F8FA"/>
-          </w:tcPr>
-          <w:p>
-            <w:pPr>
-              <w:spacing w:after="40"/>
-            </w:pPr>
-            <w:r/>
-            <w:r>
-              <w:rPr>
-                <w:rFonts w:ascii="Aptos" w:hAnsi="Aptos"/>
-                <w:color w:val="14233B"/>
-                <w:sz w:val="17"/>
-              </w:rPr>
-              <w:t>DOC-002</w:t>
-              <w:br/>
-              <w:t>31/07/2026</w:t>
-            </w:r>
-          </w:p>
-        </w:tc>
-        <w:tc>
-          <w:tcPr>
-            <w:tcW w:type="dxa" w:w="2493"/>
-            <w:vAlign w:val="top"/>
-            <w:tcBorders>
-              <w:top w:val="single" w:sz="4" w:color="D9DEE7"/>
-              <w:left w:val="single" w:sz="4" w:color="D9DEE7"/>
-              <w:bottom w:val="single" w:sz="4" w:color="D9DEE7"/>
-              <w:right w:val="single" w:sz="4" w:color="D9DEE7"/>
-              <w:insideH w:val="single" w:sz="4" w:color="D9DEE7"/>
-              <w:insideV w:val="single" w:sz="4" w:color="D9DEE7"/>
-            </w:tcBorders>
-            <w:shd w:fill="F7F8FA"/>
-          </w:tcPr>
-          <w:p>
-            <w:pPr>
-              <w:spacing w:after="40"/>
-            </w:pPr>
-            <w:r/>
-            <w:r>
-              <w:rPr>
-                <w:rFonts w:ascii="Aptos" w:hAnsi="Aptos"/>
-                <w:color w:val="14233B"/>
-                <w:sz w:val="17"/>
-              </w:rPr>
-              <w:t>Arquitectura inicial confirmada en Vercel + Render + Supabase, portabilidad hacia proveedor venezolano y pago manual auditable con automatización futura.</w:t>
-            </w:r>
-          </w:p>
-        </w:tc>
-        <w:tc>
-          <w:tcPr>
-            <w:tcW w:type="dxa" w:w="2493"/>
-            <w:vAlign w:val="top"/>
-            <w:tcBorders>
-              <w:top w:val="single" w:sz="4" w:color="D9DEE7"/>
-              <w:left w:val="single" w:sz="4" w:color="D9DEE7"/>
-              <w:bottom w:val="single" w:sz="4" w:color="D9DEE7"/>
-              <w:right w:val="single" w:sz="4" w:color="D9DEE7"/>
-              <w:insideH w:val="single" w:sz="4" w:color="D9DEE7"/>
-              <w:insideV w:val="single" w:sz="4" w:color="D9DEE7"/>
-            </w:tcBorders>
-            <w:shd w:fill="F7F8FA"/>
-          </w:tcPr>
-          <w:p>
-            <w:pPr>
-              <w:spacing w:after="40"/>
-            </w:pPr>
-            <w:r/>
-            <w:r>
-              <w:rPr>
-                <w:rFonts w:ascii="Aptos" w:hAnsi="Aptos"/>
-                <w:color w:val="14233B"/>
-                <w:sz w:val="17"/>
-              </w:rPr>
-              <w:t>Documento actualizado con adaptadores, contenedor API, migraciones, flujo manual, fases, riesgos, preguntas y ADR. QA estructural del DOCX ejecutada después del cambio.</w:t>
-            </w:r>
-          </w:p>
-        </w:tc>
-        <w:tc>
-          <w:tcPr>
-            <w:tcW w:type="dxa" w:w="2493"/>
-            <w:vAlign w:val="top"/>
-            <w:tcBorders>
-              <w:top w:val="single" w:sz="4" w:color="D9DEE7"/>
-              <w:left w:val="single" w:sz="4" w:color="D9DEE7"/>
-              <w:bottom w:val="single" w:sz="4" w:color="D9DEE7"/>
-              <w:right w:val="single" w:sz="4" w:color="D9DEE7"/>
-              <w:insideH w:val="single" w:sz="4" w:color="D9DEE7"/>
-              <w:insideV w:val="single" w:sz="4" w:color="D9DEE7"/>
-            </w:tcBorders>
-            <w:shd w:fill="F7F8FA"/>
-          </w:tcPr>
-          <w:p>
-            <w:pPr>
-              <w:spacing w:after="40"/>
-            </w:pPr>
-            <w:r/>
-            <w:r>
-              <w:rPr>
-                <w:rFonts w:ascii="Aptos" w:hAnsi="Aptos"/>
-                <w:color w:val="14233B"/>
-                <w:sz w:val="17"/>
-              </w:rPr>
-              <w:t>[x] Decisión documentada. Próximo: obtener detalles del proveedor, definir canales de pago e iniciar Fase 0.</w:t>
-            </w:r>
-          </w:p>
-        </w:tc>
-      </w:tr>
-      <w:tr>
-        <w:tc>
-          <w:tcPr>
-            <w:tcW w:type="dxa" w:w="2493"/>
-            <w:vAlign w:val="top"/>
-            <w:tcBorders>
-              <w:top w:val="single" w:sz="4" w:color="D9DEE7"/>
-              <w:left w:val="single" w:sz="4" w:color="D9DEE7"/>
-              <w:bottom w:val="single" w:sz="4" w:color="D9DEE7"/>
-              <w:right w:val="single" w:sz="4" w:color="D9DEE7"/>
-              <w:insideH w:val="single" w:sz="4" w:color="D9DEE7"/>
-              <w:insideV w:val="single" w:sz="4" w:color="D9DEE7"/>
-            </w:tcBorders>
-            <w:shd w:fill="F7F8FA"/>
-          </w:tcPr>
-          <w:p>
-            <w:pPr>
-              <w:spacing w:after="40"/>
-            </w:pPr>
-            <w:r>
-              <w:t>DOC-003 / 31/07/2026</w:t>
-            </w:r>
-          </w:p>
-        </w:tc>
-        <w:tc>
-          <w:tcPr>
-            <w:tcW w:type="dxa" w:w="2493"/>
-            <w:vAlign w:val="top"/>
-            <w:tcBorders>
-              <w:top w:val="single" w:sz="4" w:color="D9DEE7"/>
-              <w:left w:val="single" w:sz="4" w:color="D9DEE7"/>
-              <w:bottom w:val="single" w:sz="4" w:color="D9DEE7"/>
-              <w:right w:val="single" w:sz="4" w:color="D9DEE7"/>
-              <w:insideH w:val="single" w:sz="4" w:color="D9DEE7"/>
-              <w:insideV w:val="single" w:sz="4" w:color="D9DEE7"/>
-            </w:tcBorders>
-            <w:shd w:fill="F7F8FA"/>
-          </w:tcPr>
-          <w:p>
-            <w:pPr>
-              <w:spacing w:after="40"/>
-            </w:pPr>
-            <w:r>
-              <w:t>Consolidación documental: CEDIAH Web Status.docx queda como única fuente de verdad y se retira la copia anterior CEDIAH Web - Estatus.docx.</w:t>
-            </w:r>
-          </w:p>
-        </w:tc>
-        <w:tc>
-          <w:tcPr>
-            <w:tcW w:type="dxa" w:w="2493"/>
-            <w:vAlign w:val="top"/>
-            <w:tcBorders>
-              <w:top w:val="single" w:sz="4" w:color="D9DEE7"/>
-              <w:left w:val="single" w:sz="4" w:color="D9DEE7"/>
-              <w:bottom w:val="single" w:sz="4" w:color="D9DEE7"/>
-              <w:right w:val="single" w:sz="4" w:color="D9DEE7"/>
-              <w:insideH w:val="single" w:sz="4" w:color="D9DEE7"/>
-              <w:insideV w:val="single" w:sz="4" w:color="D9DEE7"/>
-            </w:tcBorders>
-            <w:shd w:fill="F7F8FA"/>
-          </w:tcPr>
-          <w:p>
-            <w:pPr>
-              <w:spacing w:after="40"/>
-            </w:pPr>
-            <w:r>
-              <w:t>Se comprobó que el documento canónico contiene la versión 1.2, la arquitectura, las fases, los checklists y la bitácora antes de retirar el duplicado.</w:t>
-            </w:r>
-          </w:p>
-        </w:tc>
-        <w:tc>
-          <w:tcPr>
-            <w:tcW w:type="dxa" w:w="2493"/>
-            <w:vAlign w:val="top"/>
-            <w:tcBorders>
-              <w:top w:val="single" w:sz="4" w:color="D9DEE7"/>
-              <w:left w:val="single" w:sz="4" w:color="D9DEE7"/>
-              <w:bottom w:val="single" w:sz="4" w:color="D9DEE7"/>
-              <w:right w:val="single" w:sz="4" w:color="D9DEE7"/>
-              <w:insideH w:val="single" w:sz="4" w:color="D9DEE7"/>
-              <w:insideV w:val="single" w:sz="4" w:color="D9DEE7"/>
-            </w:tcBorders>
-            <w:shd w:fill="F7F8FA"/>
-          </w:tcPr>
-          <w:p>
-            <w:pPr>
-              <w:spacing w:after="40"/>
-            </w:pPr>
-            <w:r>
-              <w:t>[x] Duplicado retirado. Próximo: ejecutar las acciones de seguridad y comenzar la Fase 0.</w:t>
-            </w:r>
-          </w:p>
-        </w:tc>
-      </w:tr>
-      <w:tr>
-        <w:tc>
-          <w:tcPr>
-            <w:tcW w:type="dxa" w:w="2493"/>
-            <w:vAlign w:val="top"/>
-            <w:tcBorders>
-              <w:top w:val="single" w:sz="4" w:color="D9DEE7"/>
-              <w:left w:val="single" w:sz="4" w:color="D9DEE7"/>
-              <w:bottom w:val="single" w:sz="4" w:color="D9DEE7"/>
-              <w:right w:val="single" w:sz="4" w:color="D9DEE7"/>
-              <w:insideH w:val="single" w:sz="4" w:color="D9DEE7"/>
-              <w:insideV w:val="single" w:sz="4" w:color="D9DEE7"/>
-            </w:tcBorders>
-            <w:shd w:fill="F7F8FA"/>
-          </w:tcPr>
-          <w:p>
-            <w:pPr>
-              <w:spacing w:after="40"/>
-            </w:pPr>
-            <w:r>
-              <w:t>CHG-001</w:t>
-              <w:br/>
-              <w:t>31/07/2026</w:t>
-            </w:r>
-          </w:p>
-        </w:tc>
-        <w:tc>
-          <w:tcPr>
-            <w:tcW w:type="dxa" w:w="2493"/>
-            <w:vAlign w:val="top"/>
-            <w:tcBorders>
-              <w:top w:val="single" w:sz="4" w:color="D9DEE7"/>
-              <w:left w:val="single" w:sz="4" w:color="D9DEE7"/>
-              <w:bottom w:val="single" w:sz="4" w:color="D9DEE7"/>
-              <w:right w:val="single" w:sz="4" w:color="D9DEE7"/>
-              <w:insideH w:val="single" w:sz="4" w:color="D9DEE7"/>
-              <w:insideV w:val="single" w:sz="4" w:color="D9DEE7"/>
-            </w:tcBorders>
-            <w:shd w:fill="F7F8FA"/>
-          </w:tcPr>
-          <w:p>
-            <w:pPr>
-              <w:spacing w:after="40"/>
-            </w:pPr>
-            <w:r>
-              <w:t>Inicio de la Fase 0: repositorio Git y monorepo pnpm; web Next.js responsive; API Fastify con health check; contratos portables; configuración inicial de Supabase, Vercel y Render; Dockerfile; CI, Dependabot, ADR, runbook de migración y controles de seguridad.</w:t>
-            </w:r>
-          </w:p>
-        </w:tc>
-        <w:tc>
-          <w:tcPr>
-            <w:tcW w:type="dxa" w:w="2493"/>
-            <w:vAlign w:val="top"/>
-            <w:tcBorders>
-              <w:top w:val="single" w:sz="4" w:color="D9DEE7"/>
-              <w:left w:val="single" w:sz="4" w:color="D9DEE7"/>
-              <w:bottom w:val="single" w:sz="4" w:color="D9DEE7"/>
-              <w:right w:val="single" w:sz="4" w:color="D9DEE7"/>
-              <w:insideH w:val="single" w:sz="4" w:color="D9DEE7"/>
-              <w:insideV w:val="single" w:sz="4" w:color="D9DEE7"/>
-            </w:tcBorders>
-            <w:shd w:fill="F7F8FA"/>
-          </w:tcPr>
-          <w:p>
-            <w:pPr>
-              <w:spacing w:after="40"/>
-            </w:pPr>
-            <w:r>
-              <w:t>pnpm install, lint, typecheck, test (2/2), peers check, audit (sin vulnerabilidades conocidas) y build: PASS. VER-001 local 1440 x 900 y VER-002 local 390 x 844: PASS; API conectada, sin overflow ni errores de consola. Commit inicial: 4292402.</w:t>
-            </w:r>
-          </w:p>
-        </w:tc>
-        <w:tc>
-          <w:tcPr>
-            <w:tcW w:type="dxa" w:w="2493"/>
-            <w:vAlign w:val="top"/>
-            <w:tcBorders>
-              <w:top w:val="single" w:sz="4" w:color="D9DEE7"/>
-              <w:left w:val="single" w:sz="4" w:color="D9DEE7"/>
-              <w:bottom w:val="single" w:sz="4" w:color="D9DEE7"/>
-              <w:right w:val="single" w:sz="4" w:color="D9DEE7"/>
-              <w:insideH w:val="single" w:sz="4" w:color="D9DEE7"/>
-              <w:insideV w:val="single" w:sz="4" w:color="D9DEE7"/>
-            </w:tcBorders>
-            <w:shd w:fill="F7F8FA"/>
-          </w:tcPr>
-          <w:p>
-            <w:pPr>
-              <w:spacing w:after="40"/>
-            </w:pPr>
-            <w:r>
-              <w:t>[~] Fase 0 en curso. La base local está operativa. Pendiente: credenciales/MFA, acuerdos y contenido, Docker ejecutado, repositorio remoto protegido y despliegues Vercel/Render/Supabase.</w:t>
-            </w:r>
-          </w:p>
-        </w:tc>
-      </w:tr>
-      <w:tr>
-        <w:tc>
-          <w:tcPr>
-            <w:tcW w:type="dxa" w:w="2493"/>
-            <w:vAlign w:val="top"/>
-            <w:tcBorders>
-              <w:top w:val="single" w:sz="4" w:color="D9DEE7"/>
-              <w:left w:val="single" w:sz="4" w:color="D9DEE7"/>
-              <w:bottom w:val="single" w:sz="4" w:color="D9DEE7"/>
-              <w:right w:val="single" w:sz="4" w:color="D9DEE7"/>
-              <w:insideH w:val="single" w:sz="4" w:color="D9DEE7"/>
-              <w:insideV w:val="single" w:sz="4" w:color="D9DEE7"/>
-            </w:tcBorders>
-            <w:shd w:fill="F7F8FA"/>
-          </w:tcPr>
-          <w:p>
-            <w:r>
-              <w:t>CHG-002</w:t>
-              <w:br/>
-              <w:t>01/08/2026</w:t>
-            </w:r>
-          </w:p>
-        </w:tc>
-        <w:tc>
-          <w:tcPr>
-            <w:tcW w:type="dxa" w:w="2493"/>
-            <w:vAlign w:val="top"/>
-            <w:tcBorders>
-              <w:top w:val="single" w:sz="4" w:color="D9DEE7"/>
-              <w:left w:val="single" w:sz="4" w:color="D9DEE7"/>
-              <w:bottom w:val="single" w:sz="4" w:color="D9DEE7"/>
-              <w:right w:val="single" w:sz="4" w:color="D9DEE7"/>
-              <w:insideH w:val="single" w:sz="4" w:color="D9DEE7"/>
-              <w:insideV w:val="single" w:sz="4" w:color="D9DEE7"/>
-            </w:tcBorders>
-            <w:shd w:fill="F7F8FA"/>
-          </w:tcPr>
-          <w:p>
-            <w:r>
-              <w:t>Nombre CEDIAH confirmado; catálogo demo de ocho regiones; VideoProvider preparado para carga directa temporal; origin configurado y main publicado en GitHub.</w:t>
-            </w:r>
-          </w:p>
-        </w:tc>
-        <w:tc>
-          <w:tcPr>
-            <w:tcW w:type="dxa" w:w="2493"/>
-            <w:vAlign w:val="top"/>
-            <w:tcBorders>
-              <w:top w:val="single" w:sz="4" w:color="D9DEE7"/>
-              <w:left w:val="single" w:sz="4" w:color="D9DEE7"/>
-              <w:bottom w:val="single" w:sz="4" w:color="D9DEE7"/>
-              <w:right w:val="single" w:sz="4" w:color="D9DEE7"/>
-              <w:insideH w:val="single" w:sz="4" w:color="D9DEE7"/>
-              <w:insideV w:val="single" w:sz="4" w:color="D9DEE7"/>
-            </w:tcBorders>
-            <w:shd w:fill="F7F8FA"/>
-          </w:tcPr>
-          <w:p>
-            <w:r>
-              <w:t>lint, typecheck, test (2/2), build y audit: PASS. VER-003 a VER-006: PASS en cuatro viewports; 8 cursos, navegación correcta, cero overflow y cero errores de consola.</w:t>
-            </w:r>
-          </w:p>
-        </w:tc>
-        <w:tc>
-          <w:tcPr>
-            <w:tcW w:type="dxa" w:w="2493"/>
-            <w:vAlign w:val="top"/>
-            <w:tcBorders>
-              <w:top w:val="single" w:sz="4" w:color="D9DEE7"/>
-              <w:left w:val="single" w:sz="4" w:color="D9DEE7"/>
-              <w:bottom w:val="single" w:sz="4" w:color="D9DEE7"/>
-              <w:right w:val="single" w:sz="4" w:color="D9DEE7"/>
-              <w:insideH w:val="single" w:sz="4" w:color="D9DEE7"/>
-              <w:insideV w:val="single" w:sz="4" w:color="D9DEE7"/>
-            </w:tcBorders>
-            <w:shd w:fill="F7F8FA"/>
-          </w:tcPr>
-          <w:p>
-            <w:r>
-              <w:t>[~] Fase 1 en curso. Próximo: seleccionar el curso vertical, recibir contenido autorizado e implementar su ficha antes de activar cargas.</w:t>
-            </w:r>
-          </w:p>
-        </w:tc>
-      </w:tr>
-      <w:tr>
-        <w:tc>
-          <w:tcPr>
-            <w:tcW w:type="dxa" w:w="2493"/>
-            <w:vAlign w:val="top"/>
-            <w:tcBorders>
-              <w:top w:val="single" w:sz="4" w:color="D9DEE7"/>
-              <w:left w:val="single" w:sz="4" w:color="D9DEE7"/>
-              <w:bottom w:val="single" w:sz="4" w:color="D9DEE7"/>
-              <w:right w:val="single" w:sz="4" w:color="D9DEE7"/>
-              <w:insideH w:val="single" w:sz="4" w:color="D9DEE7"/>
-              <w:insideV w:val="single" w:sz="4" w:color="D9DEE7"/>
-            </w:tcBorders>
-            <w:shd w:fill="F7F8FA"/>
-          </w:tcPr>
-          <w:p>
-            <w:r>
-              <w:t>CHG-003 / 01/08/2026</w:t>
-            </w:r>
-          </w:p>
-        </w:tc>
-        <w:tc>
-          <w:tcPr>
-            <w:tcW w:type="dxa" w:w="2493"/>
-            <w:vAlign w:val="top"/>
-            <w:tcBorders>
-              <w:top w:val="single" w:sz="4" w:color="D9DEE7"/>
-              <w:left w:val="single" w:sz="4" w:color="D9DEE7"/>
-              <w:bottom w:val="single" w:sz="4" w:color="D9DEE7"/>
-              <w:right w:val="single" w:sz="4" w:color="D9DEE7"/>
-              <w:insideH w:val="single" w:sz="4" w:color="D9DEE7"/>
-              <w:insideV w:val="single" w:sz="4" w:color="D9DEE7"/>
-            </w:tcBorders>
-            <w:shd w:fill="F7F8FA"/>
-          </w:tcPr>
-          <w:p>
-            <w:r>
-              <w:t>Fichas navegables para los ocho cursos demo, con rutas estáticas, metadatos, estados editoriales explícitos y contenido provisional sin presentar supuestos como hechos.</w:t>
-            </w:r>
-          </w:p>
-        </w:tc>
-        <w:tc>
-          <w:tcPr>
-            <w:tcW w:type="dxa" w:w="2493"/>
-            <w:vAlign w:val="top"/>
-            <w:tcBorders>
-              <w:top w:val="single" w:sz="4" w:color="D9DEE7"/>
-              <w:left w:val="single" w:sz="4" w:color="D9DEE7"/>
-              <w:bottom w:val="single" w:sz="4" w:color="D9DEE7"/>
-              <w:right w:val="single" w:sz="4" w:color="D9DEE7"/>
-              <w:insideH w:val="single" w:sz="4" w:color="D9DEE7"/>
-              <w:insideV w:val="single" w:sz="4" w:color="D9DEE7"/>
-            </w:tcBorders>
-            <w:shd w:fill="F7F8FA"/>
-          </w:tcPr>
-          <w:p>
-            <w:r>
-              <w:t>lint, typecheck, test (2/2), build con 8 rutas SSG y git diff --check: PASS. VER-007 a VER-010: PASS; navegación catálogo -&gt; Tórax, cuatro viewports, cero overflow y cero errores de consola.</w:t>
-            </w:r>
-          </w:p>
-        </w:tc>
-        <w:tc>
-          <w:tcPr>
-            <w:tcW w:type="dxa" w:w="2493"/>
-            <w:vAlign w:val="top"/>
-            <w:tcBorders>
-              <w:top w:val="single" w:sz="4" w:color="D9DEE7"/>
-              <w:left w:val="single" w:sz="4" w:color="D9DEE7"/>
-              <w:bottom w:val="single" w:sz="4" w:color="D9DEE7"/>
-              <w:right w:val="single" w:sz="4" w:color="D9DEE7"/>
-              <w:insideH w:val="single" w:sz="4" w:color="D9DEE7"/>
-              <w:insideV w:val="single" w:sz="4" w:color="D9DEE7"/>
-            </w:tcBorders>
-            <w:shd w:fill="F7F8FA"/>
-          </w:tcPr>
-          <w:p>
-            <w:r>
-              <w:t>[~] Fase 1 en curso. Próximo: coordinación debe seleccionar el curso vertical y entregar contenido autorizado; después se reemplaza la ficha demo por el recorrido académico real.</w:t>
-            </w:r>
-          </w:p>
-        </w:tc>
-      </w:tr>
-      <w:tr>
-        <w:tc>
-          <w:tcPr>
-            <w:tcW w:type="dxa" w:w="2493"/>
-          </w:tcPr>
-          <w:p>
-            <w:r>
-              <w:t>OPS-001 / 01/08/2026</w:t>
-            </w:r>
-          </w:p>
-        </w:tc>
-        <w:tc>
-          <w:tcPr>
-            <w:tcW w:type="dxa" w:w="2493"/>
-          </w:tcPr>
-          <w:p>
-            <w:r>
-              <w:t>Regla de liberación: todo cambio que afecte la web debe cerrar con documentación, commit, push, despliegue en Vercel y verificación de la URL publicada.</w:t>
-            </w:r>
-          </w:p>
-        </w:tc>
-        <w:tc>
-          <w:tcPr>
-            <w:tcW w:type="dxa" w:w="2493"/>
-          </w:tcPr>
-          <w:p>
-            <w:r>
-              <w:t>Política incorporada al documento canónico antes de publicar los cambios pendientes.</w:t>
-            </w:r>
-          </w:p>
-        </w:tc>
-        <w:tc>
-          <w:tcPr>
-            <w:tcW w:type="dxa" w:w="2493"/>
-          </w:tcPr>
-          <w:p>
-            <w:r>
-              <w:t>[x] Política aplicada: main publicado y Vercel Production Ready verificado en https://cediah.vercel.app.</w:t>
-            </w:r>
-          </w:p>
-        </w:tc>
-      </w:tr>
-      <w:tr>
-        <w:tc>
-          <w:tcPr>
-            <w:tcW w:type="dxa" w:w="2493"/>
-          </w:tcPr>
-          <w:p>
-            <w:r>
-              <w:t>DEP-001 / 01/08/2026</w:t>
-            </w:r>
-          </w:p>
-        </w:tc>
-        <w:tc>
-          <w:tcPr>
-            <w:tcW w:type="dxa" w:w="2493"/>
-          </w:tcPr>
-          <w:p>
-            <w:r>
-              <w:t>Publicación de main y despliegue de producción de la web en Vercel.</w:t>
-            </w:r>
-          </w:p>
-        </w:tc>
-        <w:tc>
-          <w:tcPr>
-            <w:tcW w:type="dxa" w:w="2493"/>
-          </w:tcPr>
-          <w:p>
-            <w:r>
-              <w:t>GitHub recibió 3f48804. Vercel marcó Production Ready; https://cediah.vercel.app/cursos/cuello mostró la ficha, título y H1 correctos, sin overflow ni errores de consola propios.</w:t>
-            </w:r>
-          </w:p>
-        </w:tc>
-        <w:tc>
-          <w:tcPr>
-            <w:tcW w:type="dxa" w:w="2493"/>
-          </w:tcPr>
-          <w:p>
-            <w:r>
-              <w:t>[x] Web pública verificada. Render API Docker y Supabase siguen pendientes.</w:t>
-            </w:r>
-          </w:p>
-        </w:tc>
-      </w:tr>
-      <w:tr>
-        <w:tc>
-          <w:tcPr>
-            <w:tcW w:type="dxa" w:w="2493"/>
-          </w:tcPr>
-          <w:p>
-            <w:r>
-              <w:t>SEC-001 / 01/08/2026</w:t>
-            </w:r>
-          </w:p>
-        </w:tc>
-        <w:tc>
-          <w:tcPr>
-            <w:tcW w:type="dxa" w:w="2493"/>
-          </w:tcPr>
-          <w:p>
-            <w:r>
-              <w:t>Registro de la rotacion de credenciales confirmada por el responsable del proyecto.</w:t>
-            </w:r>
-          </w:p>
-        </w:tc>
-        <w:tc>
-          <w:tcPr>
-            <w:tcW w:type="dxa" w:w="2493"/>
-          </w:tcPr>
-          <w:p>
-            <w:r>
-              <w:t>Confirmacion del responsable; .gitignore mantiene el archivo local fuera de Git y el arbol de trabajo estaba limpio. No se leyeron ni registraron secretos. MFA y eliminacion segura siguen pendientes de confirmacion.</w:t>
-            </w:r>
-          </w:p>
-        </w:tc>
-        <w:tc>
-          <w:tcPr>
-            <w:tcW w:type="dxa" w:w="2493"/>
-          </w:tcPr>
-          <w:p>
-            <w:r>
-              <w:t>[~] Rotacion registrada. Proximo: confirmar MFA y que el archivo nunca entro en Git antes de eliminarlo.</w:t>
-            </w:r>
-          </w:p>
-        </w:tc>
-      </w:tr>
-      <w:tr>
-        <w:tc>
-          <w:tcPr>
-            <w:tcW w:type="dxa" w:w="2493"/>
-          </w:tcPr>
-          <w:p>
-            <w:r>
-              <w:t>OPS-002 / 01/08/2026</w:t>
-            </w:r>
-          </w:p>
-        </w:tc>
-        <w:tc>
-          <w:tcPr>
-            <w:tcW w:type="dxa" w:w="2493"/>
-          </w:tcPr>
-          <w:p>
-            <w:r>
-              <w:t>Inventario de preparacion de Supabase sin cambios remotos.</w:t>
-            </w:r>
-          </w:p>
-        </w:tc>
-        <w:tc>
-          <w:tcPr>
-            <w:tcW w:type="dxa" w:w="2493"/>
-          </w:tcPr>
-          <w:p>
-            <w:r>
-              <w:t>Proyecto Web CEDIAH activo en Supabase, Postgres 17.6, sin tablas ni migraciones en public. Se revisaron cambios recientes: las tablas nuevas no se exponen automaticamente por Data API; futuras migraciones llevaran grants explicitos y RLS.</w:t>
-            </w:r>
-          </w:p>
-        </w:tc>
-        <w:tc>
-          <w:tcPr>
-            <w:tcW w:type="dxa" w:w="2493"/>
-          </w:tcPr>
-          <w:p>
-            <w:r>
-              <w:t>[~] Entorno de datos listo pero sin esquema. Proximo: aprobar roles, curso vertical y criterios academicos antes de crear la primera migracion.</w:t>
-            </w:r>
-          </w:p>
-        </w:tc>
-      </w:tr>
-      <w:tr>
-        <w:tc>
-          <w:tcPr>
-            <w:tcW w:type="dxa" w:w="2493"/>
-          </w:tcPr>
-          <w:p>
-            <w:r>
-              <w:t>APR-001 / 01/08/2026</w:t>
-            </w:r>
-          </w:p>
-        </w:tc>
-        <w:tc>
-          <w:tcPr>
-            <w:tcW w:type="dxa" w:w="2493"/>
-          </w:tcPr>
-          <w:p>
-            <w:r>
-              <w:t>Aprobacion de la plataforma por coordinacion y confirmacion de MFA.</w:t>
-            </w:r>
-          </w:p>
-        </w:tc>
-        <w:tc>
-          <w:tcPr>
-            <w:tcW w:type="dxa" w:w="2493"/>
-          </w:tcPr>
-          <w:p>
-            <w:r>
-              <w:t>El responsable confirmo que coordinacion aprobo la plataforma y que MFA esta activo. Se verifico que el archivo local historico no existe y no aparece rastreado ni en el historial Git, sin leer contenido sensible.</w:t>
-            </w:r>
-          </w:p>
-        </w:tc>
-        <w:tc>
-          <w:tcPr>
-            <w:tcW w:type="dxa" w:w="2493"/>
-          </w:tcPr>
-          <w:p>
-            <w:r>
-              <w:t>[x] Fundaciones de alcance y seguridad confirmadas. Proximo: registrar curso vertical y contenido autorizado.</w:t>
-            </w:r>
-          </w:p>
-        </w:tc>
-      </w:tr>
-      <w:tr>
-        <w:tc>
-          <w:tcPr>
-            <w:tcW w:type="dxa" w:w="2493"/>
-          </w:tcPr>
-          <w:p>
-            <w:r>
-              <w:t>DB-001 / 01/08/2026</w:t>
-            </w:r>
-          </w:p>
-        </w:tc>
-        <w:tc>
-          <w:tcPr>
-            <w:tcW w:type="dxa" w:w="2493"/>
-          </w:tcPr>
-          <w:p>
-            <w:r>
-              <w:t>Fundacion de datos aplicada en Supabase con RLS y sin acceso directo del navegador.</w:t>
-            </w:r>
-          </w:p>
-        </w:tc>
-        <w:tc>
-          <w:tcPr>
-            <w:tcW w:type="dxa" w:w="2493"/>
-          </w:tcPr>
-          <w:p>
-            <w:r>
-              <w:t>Migraciones 20260801172906 y 20260801173029 aplicadas al proyecto Supabase vacio. Nueve tablas publicas, RLS activo, anon/authenticated sin SELECT y service_role con acceso de servidor. Asesores: sin fallas de seguridad ni claves foraneas sin indice; solo avisos INFO esperados en tablas vacias y cerradas.</w:t>
-            </w:r>
-          </w:p>
-        </w:tc>
-        <w:tc>
-          <w:tcPr>
-            <w:tcW w:type="dxa" w:w="2493"/>
-          </w:tcPr>
-          <w:p>
-            <w:r>
-              <w:t>[x] Esquema remoto versionado y verificado. Proximo: integrar autenticacion y API antes de abrir politicas RLS a flujos concretos.</w:t>
-            </w:r>
-          </w:p>
-        </w:tc>
-      </w:tr>
-      <w:tr>
-        <w:tc>
-          <w:tcPr>
-            <w:tcW w:type="dxa" w:w="2493"/>
-          </w:tcPr>
-          <w:p>
-            <w:r>
-              <w:t>AUTH-001 / 01/08/2026</w:t>
-            </w:r>
-          </w:p>
-        </w:tc>
-        <w:tc>
-          <w:tcPr>
-            <w:tcW w:type="dxa" w:w="2493"/>
-          </w:tcPr>
-          <w:p>
-            <w:r>
-              <w:t>Fundación de identidad mediante Supabase Auth con sesión SSR y API como límite de autorización. Se añadieron acceso, registro, recuperación, actualización de contraseña, callback y panel protegido.</w:t>
-            </w:r>
-          </w:p>
-        </w:tc>
-        <w:tc>
-          <w:tcPr>
-            <w:tcW w:type="dxa" w:w="2493"/>
-          </w:tcPr>
-          <w:p>
-            <w:r>
-              <w:t>Contratos y API: typecheck PASS; Vitest 5/5 PASS; lint web PASS; build Next PASS. VER-011 390 x 844 y VER-012 1440 x 900: formularios, rutas de registro/recuperación/panel, foco y layout PASS; scrollWidth = clientWidth y cero warn/error de consola.</w:t>
-            </w:r>
-          </w:p>
-        </w:tc>
-        <w:tc>
-          <w:tcPr>
-            <w:tcW w:type="dxa" w:w="2493"/>
-          </w:tcPr>
-          <w:p>
-            <w:r>
-              <w:t>[~] Código listo sin abrir tablas al navegador ni exponer clave secreta. Próximo: configurar variables y URLs de Supabase, desplegar Render, conectar Vercel y ejecutar E2E con cuentas de prueba antes de habilitar contenido privado.</w:t>
-            </w:r>
-          </w:p>
-        </w:tc>
-      </w:tr>
-      <w:tr>
-        <w:tc>
-          <w:tcPr>
-            <w:tcW w:type="dxa" w:w="2493"/>
-          </w:tcPr>
-          <w:p>
-            <w:r>
-              <w:t>OPS-003 / 01/08/2026</w:t>
-            </w:r>
-          </w:p>
-        </w:tc>
-        <w:tc>
-          <w:tcPr>
-            <w:tcW w:type="dxa" w:w="2493"/>
-          </w:tcPr>
-          <w:p>
-            <w:r>
-              <w:t>Regla de cierre actualizada: cada trabajo terminado se publica mediante push para que el responsable pueda verificar los cambios sin hacerlo manualmente.</w:t>
-            </w:r>
-          </w:p>
-        </w:tc>
-        <w:tc>
-          <w:tcPr>
-            <w:tcW w:type="dxa" w:w="2493"/>
-          </w:tcPr>
-          <w:p>
-            <w:r>
-              <w:t>Regla incorporada al documento canónico antes de publicar los commits pendientes.</w:t>
-            </w:r>
-          </w:p>
-        </w:tc>
-        <w:tc>
-          <w:tcPr>
-            <w:tcW w:type="dxa" w:w="2493"/>
-          </w:tcPr>
-          <w:p>
-            <w:r>
-              <w:t>[x] Política registrada. Próximo: push a main y verificación del despliegue web cuando corresponda.</w:t>
-            </w:r>
-          </w:p>
-        </w:tc>
-      </w:tr>
-      <w:tr>
-        <w:tc>
-          <w:tcPr>
-            <w:tcW w:type="dxa" w:w="2493"/>
-          </w:tcPr>
-          <w:p>
-            <w:r>
-              <w:t>OPS-004\n01/08/2026</w:t>
-            </w:r>
-          </w:p>
-        </w:tc>
-        <w:tc>
-          <w:tcPr>
-            <w:tcW w:type="dxa" w:w="2493"/>
-          </w:tcPr>
-          <w:p>
-            <w:r>
-              <w:t>Configuracion inicial de Supabase Auth y Vercel para produccion; intento de despliegue de API en Render detenido antes de crear recursos porque el proveedor exige registrar una tarjeta.</w:t>
-            </w:r>
-          </w:p>
-        </w:tc>
-        <w:tc>
-          <w:tcPr>
-            <w:tcW w:type="dxa" w:w="2493"/>
-          </w:tcPr>
-          <w:p>
-            <w:r>
-              <w:t>Supabase: Site URL y callback de produccion guardados. Vercel: URL y clave publicable de Supabase guardadas para Production y Preview; redeploy de produccion termino READY. Render: Blueprint detecto render.yaml, pero solicito informacion de pago; no se introdujeron datos ni se creo el servicio.</w:t>
-            </w:r>
-          </w:p>
-        </w:tc>
-        <w:tc>
-          <w:tcPr>
-            <w:tcW w:type="dxa" w:w="2493"/>
-          </w:tcPr>
-          <w:p>
-            <w:r>
-              <w:t>[~] Web preparada para Auth; E2E pendiente hasta contar con API publica y sus variables de servidor. Proximo: elegir proveedor de API sin tarjeta o autorizar Render con su modalidad de pago, configurar WEB_ORIGINS, SUPABASE_URL y SUPABASE_SECRET_KEY solo en el servidor, y ejecutar E2E con cuenta de prueba.</w:t>
-            </w:r>
-          </w:p>
-        </w:tc>
-      </w:tr>
-      <w:tr>
-        <w:tc>
-          <w:tcPr>
-            <w:tcW w:type="dxa" w:w="2493"/>
-          </w:tcPr>
-          <w:p>
-            <w:r>
-              <w:t>CHG-004 / 10/08/2026</w:t>
-            </w:r>
-          </w:p>
-        </w:tc>
-        <w:tc>
-          <w:tcPr>
-            <w:tcW w:type="dxa" w:w="2493"/>
-          </w:tcPr>
-          <w:p>
-            <w:r>
-              <w:t>Fase 1: vista de lección demo navegable para validar el espacio de estudio sin inventar contenido académico ni habilitar acceso privado.</w:t>
-            </w:r>
-          </w:p>
-        </w:tc>
-        <w:tc>
-          <w:tcPr>
-            <w:tcW w:type="dxa" w:w="2493"/>
-          </w:tcPr>
-          <w:p>
-            <w:r>
-              <w:t>lint web, typecheck web/API, Vitest API 5/5 con timeout de arranque ampliado, build Next, git diff --check y pnpm audit --audit-level high/low: PASS. VER-013 a VER-016: PASS en cuatro viewports; navegación catálogo -&gt; lección PASS.</w:t>
-            </w:r>
-          </w:p>
-        </w:tc>
-        <w:tc>
-          <w:tcPr>
-            <w:tcW w:type="dxa" w:w="2493"/>
-          </w:tcPr>
-          <w:p>
-            <w:r>
-              <w:t>[~] Fase 1 en curso. Próximo: seleccionar el curso vertical y recibir contenido autorizado; después sustituir la lección demo por datos reales y conectar la API pública.</w:t>
-            </w:r>
-          </w:p>
-        </w:tc>
-      </w:tr>
-    </w:tbl>
     <w:p>
       <w:pPr>
         <w:pStyle w:val="Heading2"/>
@@ -24603,6 +24688,567 @@
     </w:tbl>
     <w:p>
       <w:pPr>
+        <w:pStyle w:val="Heading2"/>
+      </w:pPr>
+      <w:r>
+        <w:t>Ficha de cambio - CHG-005</w:t>
+      </w:r>
+    </w:p>
+    <w:tbl>
+      <w:tblPr>
+        <w:tblStyle w:val="TableGrid"/>
+        <w:tblW w:type="auto" w:w="0"/>
+        <w:jc w:val="center"/>
+        <w:tblLayout w:type="autofit"/>
+        <w:tblLook w:firstColumn="1" w:firstRow="1" w:lastColumn="0" w:lastRow="0" w:noHBand="0" w:noVBand="1" w:val="04A0"/>
+      </w:tblPr>
+      <w:tblGrid>
+        <w:gridCol w:w="4986"/>
+        <w:gridCol w:w="4986"/>
+      </w:tblGrid>
+      <w:tr>
+        <w:trPr>
+          <w:tblHeader w:val="true"/>
+        </w:trPr>
+        <w:tc>
+          <w:tcPr>
+            <w:tcW w:type="dxa" w:w="2268"/>
+            <w:shd w:fill="14233B"/>
+            <w:tcBorders>
+              <w:top w:val="single" w:sz="4" w:color="FFFFFF"/>
+              <w:left w:val="single" w:sz="4" w:color="FFFFFF"/>
+              <w:bottom w:val="single" w:sz="4" w:color="FFFFFF"/>
+              <w:right w:val="single" w:sz="4" w:color="FFFFFF"/>
+              <w:insideH w:val="single" w:sz="4" w:color="FFFFFF"/>
+              <w:insideV w:val="single" w:sz="4" w:color="FFFFFF"/>
+            </w:tcBorders>
+            <w:vAlign w:val="center"/>
+          </w:tcPr>
+          <w:p>
+            <w:r>
+              <w:t>ID / fecha / autor</w:t>
+            </w:r>
+          </w:p>
+        </w:tc>
+        <w:tc>
+          <w:tcPr>
+            <w:tcW w:type="dxa" w:w="6803"/>
+            <w:shd w:fill="14233B"/>
+            <w:tcBorders>
+              <w:top w:val="single" w:sz="4" w:color="FFFFFF"/>
+              <w:left w:val="single" w:sz="4" w:color="FFFFFF"/>
+              <w:bottom w:val="single" w:sz="4" w:color="FFFFFF"/>
+              <w:right w:val="single" w:sz="4" w:color="FFFFFF"/>
+              <w:insideH w:val="single" w:sz="4" w:color="FFFFFF"/>
+              <w:insideV w:val="single" w:sz="4" w:color="FFFFFF"/>
+            </w:tcBorders>
+            <w:vAlign w:val="center"/>
+          </w:tcPr>
+          <w:p>
+            <w:r>
+              <w:t>CHG-005 / 10/08/2026 / Codex con José</w:t>
+            </w:r>
+          </w:p>
+        </w:tc>
+      </w:tr>
+      <w:tr>
+        <w:trPr>
+          <w:cantSplit/>
+        </w:trPr>
+        <w:tc>
+          <w:tcPr>
+            <w:tcW w:type="dxa" w:w="2268"/>
+            <w:tcBorders>
+              <w:top w:val="single" w:sz="4" w:color="D9DEE7"/>
+              <w:left w:val="single" w:sz="4" w:color="D9DEE7"/>
+              <w:bottom w:val="single" w:sz="4" w:color="D9DEE7"/>
+              <w:right w:val="single" w:sz="4" w:color="D9DEE7"/>
+              <w:insideH w:val="single" w:sz="4" w:color="D9DEE7"/>
+              <w:insideV w:val="single" w:sz="4" w:color="D9DEE7"/>
+            </w:tcBorders>
+            <w:vAlign w:val="top"/>
+          </w:tcPr>
+          <w:p>
+            <w:r>
+              <w:t>Fase y objetivo</w:t>
+            </w:r>
+          </w:p>
+        </w:tc>
+        <w:tc>
+          <w:tcPr>
+            <w:tcW w:type="dxa" w:w="6803"/>
+            <w:tcBorders>
+              <w:top w:val="single" w:sz="4" w:color="D9DEE7"/>
+              <w:left w:val="single" w:sz="4" w:color="D9DEE7"/>
+              <w:bottom w:val="single" w:sz="4" w:color="D9DEE7"/>
+              <w:right w:val="single" w:sz="4" w:color="D9DEE7"/>
+              <w:insideH w:val="single" w:sz="4" w:color="D9DEE7"/>
+              <w:insideV w:val="single" w:sz="4" w:color="D9DEE7"/>
+            </w:tcBorders>
+            <w:vAlign w:val="top"/>
+          </w:tcPr>
+          <w:p>
+            <w:r>
+              <w:t>Fases 1 y 2 - validar carga y reproducción privada de un video propio con costo cero de prueba, sin publicar contenido académico.</w:t>
+            </w:r>
+          </w:p>
+        </w:tc>
+      </w:tr>
+      <w:tr>
+        <w:trPr>
+          <w:cantSplit/>
+        </w:trPr>
+        <w:tc>
+          <w:tcPr>
+            <w:tcW w:type="dxa" w:w="2268"/>
+            <w:shd w:fill="F7F8FA"/>
+            <w:tcBorders>
+              <w:top w:val="single" w:sz="4" w:color="D9DEE7"/>
+              <w:left w:val="single" w:sz="4" w:color="D9DEE7"/>
+              <w:bottom w:val="single" w:sz="4" w:color="D9DEE7"/>
+              <w:right w:val="single" w:sz="4" w:color="D9DEE7"/>
+              <w:insideH w:val="single" w:sz="4" w:color="D9DEE7"/>
+              <w:insideV w:val="single" w:sz="4" w:color="D9DEE7"/>
+            </w:tcBorders>
+            <w:vAlign w:val="top"/>
+          </w:tcPr>
+          <w:p>
+            <w:r>
+              <w:t>Qué cambió</w:t>
+            </w:r>
+          </w:p>
+        </w:tc>
+        <w:tc>
+          <w:tcPr>
+            <w:tcW w:type="dxa" w:w="6803"/>
+            <w:shd w:fill="F7F8FA"/>
+            <w:tcBorders>
+              <w:top w:val="single" w:sz="4" w:color="D9DEE7"/>
+              <w:left w:val="single" w:sz="4" w:color="D9DEE7"/>
+              <w:bottom w:val="single" w:sz="4" w:color="D9DEE7"/>
+              <w:right w:val="single" w:sz="4" w:color="D9DEE7"/>
+              <w:insideH w:val="single" w:sz="4" w:color="D9DEE7"/>
+              <w:insideV w:val="single" w:sz="4" w:color="D9DEE7"/>
+            </w:tcBorders>
+            <w:vAlign w:val="top"/>
+          </w:tcPr>
+          <w:p>
+            <w:r>
+              <w:t>Se habilitó un laboratorio privado para una cuenta autorizada: enlace firmado de carga, carga directa a Supabase Storage, comprobación del objeto, enlace firmado de reproducción y reproductor HTML5. La web también permite renovar la sesión.</w:t>
+            </w:r>
+          </w:p>
+        </w:tc>
+      </w:tr>
+      <w:tr>
+        <w:trPr>
+          <w:cantSplit/>
+        </w:trPr>
+        <w:tc>
+          <w:tcPr>
+            <w:tcW w:type="dxa" w:w="2268"/>
+            <w:tcBorders>
+              <w:top w:val="single" w:sz="4" w:color="D9DEE7"/>
+              <w:left w:val="single" w:sz="4" w:color="D9DEE7"/>
+              <w:bottom w:val="single" w:sz="4" w:color="D9DEE7"/>
+              <w:right w:val="single" w:sz="4" w:color="D9DEE7"/>
+              <w:insideH w:val="single" w:sz="4" w:color="D9DEE7"/>
+              <w:insideV w:val="single" w:sz="4" w:color="D9DEE7"/>
+            </w:tcBorders>
+            <w:vAlign w:val="top"/>
+          </w:tcPr>
+          <w:p>
+            <w:r>
+              <w:t>Cómo se implementó</w:t>
+            </w:r>
+          </w:p>
+        </w:tc>
+        <w:tc>
+          <w:tcPr>
+            <w:tcW w:type="dxa" w:w="6803"/>
+            <w:tcBorders>
+              <w:top w:val="single" w:sz="4" w:color="D9DEE7"/>
+              <w:left w:val="single" w:sz="4" w:color="D9DEE7"/>
+              <w:bottom w:val="single" w:sz="4" w:color="D9DEE7"/>
+              <w:right w:val="single" w:sz="4" w:color="D9DEE7"/>
+              <w:insideH w:val="single" w:sz="4" w:color="D9DEE7"/>
+              <w:insideV w:val="single" w:sz="4" w:color="D9DEE7"/>
+            </w:tcBorders>
+            <w:vAlign w:val="top"/>
+          </w:tcPr>
+          <w:p>
+            <w:r>
+              <w:t>La API selecciona Supabase como VideoProvider de prueba, genera rutas UUID bajo test-videos/&lt;usuario&gt;, usa el secreto solo en Render y devuelve URLs temporales. La web sube por XHR, muestra progreso y usa video controls. Se añadió media-src para el origen de Supabase en la CSP.</w:t>
+            </w:r>
+          </w:p>
+        </w:tc>
+      </w:tr>
+      <w:tr>
+        <w:trPr>
+          <w:cantSplit/>
+        </w:trPr>
+        <w:tc>
+          <w:tcPr>
+            <w:tcW w:type="dxa" w:w="2268"/>
+            <w:shd w:fill="F7F8FA"/>
+            <w:tcBorders>
+              <w:top w:val="single" w:sz="4" w:color="D9DEE7"/>
+              <w:left w:val="single" w:sz="4" w:color="D9DEE7"/>
+              <w:bottom w:val="single" w:sz="4" w:color="D9DEE7"/>
+              <w:right w:val="single" w:sz="4" w:color="D9DEE7"/>
+              <w:insideH w:val="single" w:sz="4" w:color="D9DEE7"/>
+              <w:insideV w:val="single" w:sz="4" w:color="D9DEE7"/>
+            </w:tcBorders>
+            <w:vAlign w:val="top"/>
+          </w:tcPr>
+          <w:p>
+            <w:r>
+              <w:t>Archivos / migraciones / servicios</w:t>
+            </w:r>
+          </w:p>
+        </w:tc>
+        <w:tc>
+          <w:tcPr>
+            <w:tcW w:type="dxa" w:w="6803"/>
+            <w:shd w:fill="F7F8FA"/>
+            <w:tcBorders>
+              <w:top w:val="single" w:sz="4" w:color="D9DEE7"/>
+              <w:left w:val="single" w:sz="4" w:color="D9DEE7"/>
+              <w:bottom w:val="single" w:sz="4" w:color="D9DEE7"/>
+              <w:right w:val="single" w:sz="4" w:color="D9DEE7"/>
+              <w:insideH w:val="single" w:sz="4" w:color="D9DEE7"/>
+              <w:insideV w:val="single" w:sz="4" w:color="D9DEE7"/>
+            </w:tcBorders>
+            <w:vAlign w:val="top"/>
+          </w:tcPr>
+          <w:p>
+            <w:r>
+              <w:t>apps/api/src/providers/supabase-storage.ts; apps/api/src/app.ts; apps/api/src/config.ts; packages/contracts; apps/web/src/components/video-test-uploader.tsx; apps/web/src/proxy.ts; render.yaml. Bucket privado video-test. No se creó migración de base de datos.</w:t>
+            </w:r>
+          </w:p>
+        </w:tc>
+      </w:tr>
+      <w:tr>
+        <w:trPr>
+          <w:cantSplit/>
+        </w:trPr>
+        <w:tc>
+          <w:tcPr>
+            <w:tcW w:type="dxa" w:w="2268"/>
+            <w:tcBorders>
+              <w:top w:val="single" w:sz="4" w:color="D9DEE7"/>
+              <w:left w:val="single" w:sz="4" w:color="D9DEE7"/>
+              <w:bottom w:val="single" w:sz="4" w:color="D9DEE7"/>
+              <w:right w:val="single" w:sz="4" w:color="D9DEE7"/>
+              <w:insideH w:val="single" w:sz="4" w:color="D9DEE7"/>
+              <w:insideV w:val="single" w:sz="4" w:color="D9DEE7"/>
+            </w:tcBorders>
+            <w:vAlign w:val="top"/>
+          </w:tcPr>
+          <w:p>
+            <w:r>
+              <w:t>Seguridad y privacidad</w:t>
+            </w:r>
+          </w:p>
+        </w:tc>
+        <w:tc>
+          <w:tcPr>
+            <w:tcW w:type="dxa" w:w="6803"/>
+            <w:tcBorders>
+              <w:top w:val="single" w:sz="4" w:color="D9DEE7"/>
+              <w:left w:val="single" w:sz="4" w:color="D9DEE7"/>
+              <w:bottom w:val="single" w:sz="4" w:color="D9DEE7"/>
+              <w:right w:val="single" w:sz="4" w:color="D9DEE7"/>
+              <w:insideH w:val="single" w:sz="4" w:color="D9DEE7"/>
+              <w:insideV w:val="single" w:sz="4" w:color="D9DEE7"/>
+            </w:tcBorders>
+            <w:vAlign w:val="top"/>
+          </w:tcPr>
+          <w:p>
+            <w:r>
+              <w:t>Allowlist de cuentas para el laboratorio, límites de 15 minutos y 50 MB, MIME limitado a MP4/WebM/MOV, rutas UUID, URLs firmadas de un solo uso o corta duración y secretos solo en Render. El flujo no publica cursos ni entrega matrícula. No se registran tokens en el documento.</w:t>
+            </w:r>
+          </w:p>
+        </w:tc>
+      </w:tr>
+      <w:tr>
+        <w:trPr>
+          <w:cantSplit/>
+        </w:trPr>
+        <w:tc>
+          <w:tcPr>
+            <w:tcW w:type="dxa" w:w="2268"/>
+            <w:shd w:fill="F7F8FA"/>
+            <w:tcBorders>
+              <w:top w:val="single" w:sz="4" w:color="D9DEE7"/>
+              <w:left w:val="single" w:sz="4" w:color="D9DEE7"/>
+              <w:bottom w:val="single" w:sz="4" w:color="D9DEE7"/>
+              <w:right w:val="single" w:sz="4" w:color="D9DEE7"/>
+              <w:insideH w:val="single" w:sz="4" w:color="D9DEE7"/>
+              <w:insideV w:val="single" w:sz="4" w:color="D9DEE7"/>
+            </w:tcBorders>
+            <w:vAlign w:val="top"/>
+          </w:tcPr>
+          <w:p>
+            <w:r>
+              <w:t>Validación automática</w:t>
+            </w:r>
+          </w:p>
+        </w:tc>
+        <w:tc>
+          <w:tcPr>
+            <w:tcW w:type="dxa" w:w="6803"/>
+            <w:shd w:fill="F7F8FA"/>
+            <w:tcBorders>
+              <w:top w:val="single" w:sz="4" w:color="D9DEE7"/>
+              <w:left w:val="single" w:sz="4" w:color="D9DEE7"/>
+              <w:bottom w:val="single" w:sz="4" w:color="D9DEE7"/>
+              <w:right w:val="single" w:sz="4" w:color="D9DEE7"/>
+              <w:insideH w:val="single" w:sz="4" w:color="D9DEE7"/>
+              <w:insideV w:val="single" w:sz="4" w:color="D9DEE7"/>
+            </w:tcBorders>
+            <w:vAlign w:val="top"/>
+          </w:tcPr>
+          <w:p>
+            <w:r>
+              <w:t>PASS: Vitest API 2 archivos / 10 pruebas; build de API; lint y typecheck de web; build Next; push a main. Commits relevantes: 128339b, decb770, 72d4f75 y 96bbab3.</w:t>
+            </w:r>
+          </w:p>
+        </w:tc>
+      </w:tr>
+      <w:tr>
+        <w:trPr>
+          <w:cantSplit/>
+        </w:trPr>
+        <w:tc>
+          <w:tcPr>
+            <w:tcW w:type="dxa" w:w="2268"/>
+            <w:tcBorders>
+              <w:top w:val="single" w:sz="4" w:color="D9DEE7"/>
+              <w:left w:val="single" w:sz="4" w:color="D9DEE7"/>
+              <w:bottom w:val="single" w:sz="4" w:color="D9DEE7"/>
+              <w:right w:val="single" w:sz="4" w:color="D9DEE7"/>
+              <w:insideH w:val="single" w:sz="4" w:color="D9DEE7"/>
+              <w:insideV w:val="single" w:sz="4" w:color="D9DEE7"/>
+            </w:tcBorders>
+            <w:vAlign w:val="top"/>
+          </w:tcPr>
+          <w:p>
+            <w:r>
+              <w:t>Validación en navegador</w:t>
+            </w:r>
+          </w:p>
+        </w:tc>
+        <w:tc>
+          <w:tcPr>
+            <w:tcW w:type="dxa" w:w="6803"/>
+            <w:tcBorders>
+              <w:top w:val="single" w:sz="4" w:color="D9DEE7"/>
+              <w:left w:val="single" w:sz="4" w:color="D9DEE7"/>
+              <w:bottom w:val="single" w:sz="4" w:color="D9DEE7"/>
+              <w:right w:val="single" w:sz="4" w:color="D9DEE7"/>
+              <w:insideH w:val="single" w:sz="4" w:color="D9DEE7"/>
+              <w:insideV w:val="single" w:sz="4" w:color="D9DEE7"/>
+            </w:tcBorders>
+            <w:vAlign w:val="top"/>
+          </w:tcPr>
+          <w:p>
+            <w:r>
+              <w:t>VER-017 PASS en el navegador integrado: cuenta autorizada, selección de MP4 de 8,9 MB, carga aceptada, objeto visible en Supabase Storage, sesión firmada renovable y reproducción confirmada. La prueba técnica recibió rangos HTTP 206 con video/mp4 y cargó metadatos sin errores de consola.</w:t>
+            </w:r>
+          </w:p>
+        </w:tc>
+      </w:tr>
+      <w:tr>
+        <w:trPr>
+          <w:cantSplit/>
+        </w:trPr>
+        <w:tc>
+          <w:tcPr>
+            <w:tcW w:type="dxa" w:w="2268"/>
+            <w:shd w:fill="F7F8FA"/>
+            <w:tcBorders>
+              <w:top w:val="single" w:sz="4" w:color="D9DEE7"/>
+              <w:left w:val="single" w:sz="4" w:color="D9DEE7"/>
+              <w:bottom w:val="single" w:sz="4" w:color="D9DEE7"/>
+              <w:right w:val="single" w:sz="4" w:color="D9DEE7"/>
+              <w:insideH w:val="single" w:sz="4" w:color="D9DEE7"/>
+              <w:insideV w:val="single" w:sz="4" w:color="D9DEE7"/>
+            </w:tcBorders>
+            <w:vAlign w:val="top"/>
+          </w:tcPr>
+          <w:p>
+            <w:r>
+              <w:t>Evidencia</w:t>
+            </w:r>
+          </w:p>
+        </w:tc>
+        <w:tc>
+          <w:tcPr>
+            <w:tcW w:type="dxa" w:w="6803"/>
+            <w:shd w:fill="F7F8FA"/>
+            <w:tcBorders>
+              <w:top w:val="single" w:sz="4" w:color="D9DEE7"/>
+              <w:left w:val="single" w:sz="4" w:color="D9DEE7"/>
+              <w:bottom w:val="single" w:sz="4" w:color="D9DEE7"/>
+              <w:right w:val="single" w:sz="4" w:color="D9DEE7"/>
+              <w:insideH w:val="single" w:sz="4" w:color="D9DEE7"/>
+              <w:insideV w:val="single" w:sz="4" w:color="D9DEE7"/>
+            </w:tcBorders>
+            <w:vAlign w:val="top"/>
+          </w:tcPr>
+          <w:p>
+            <w:r>
+              <w:t>Web: https://cediah.vercel.app/pruebas/video. API: https://cediah-api.onrender.com/health. Servicio Render: cediah-api. Bucket Supabase: video-test. Se verificó la pestaña pública y el panel de Storage sin mostrar tokens.</w:t>
+            </w:r>
+          </w:p>
+        </w:tc>
+      </w:tr>
+      <w:tr>
+        <w:trPr>
+          <w:cantSplit/>
+        </w:trPr>
+        <w:tc>
+          <w:tcPr>
+            <w:tcW w:type="dxa" w:w="2268"/>
+            <w:tcBorders>
+              <w:top w:val="single" w:sz="4" w:color="D9DEE7"/>
+              <w:left w:val="single" w:sz="4" w:color="D9DEE7"/>
+              <w:bottom w:val="single" w:sz="4" w:color="D9DEE7"/>
+              <w:right w:val="single" w:sz="4" w:color="D9DEE7"/>
+              <w:insideH w:val="single" w:sz="4" w:color="D9DEE7"/>
+              <w:insideV w:val="single" w:sz="4" w:color="D9DEE7"/>
+            </w:tcBorders>
+            <w:vAlign w:val="top"/>
+          </w:tcPr>
+          <w:p>
+            <w:r>
+              <w:t>Reversión</w:t>
+            </w:r>
+          </w:p>
+        </w:tc>
+        <w:tc>
+          <w:tcPr>
+            <w:tcW w:type="dxa" w:w="6803"/>
+            <w:tcBorders>
+              <w:top w:val="single" w:sz="4" w:color="D9DEE7"/>
+              <w:left w:val="single" w:sz="4" w:color="D9DEE7"/>
+              <w:bottom w:val="single" w:sz="4" w:color="D9DEE7"/>
+              <w:right w:val="single" w:sz="4" w:color="D9DEE7"/>
+              <w:insideH w:val="single" w:sz="4" w:color="D9DEE7"/>
+              <w:insideV w:val="single" w:sz="4" w:color="D9DEE7"/>
+            </w:tcBorders>
+            <w:vAlign w:val="top"/>
+          </w:tcPr>
+          <w:p>
+            <w:r>
+              <w:t>Revertir 96bbab3 elimina la autorización media-src; revertir decb770 y 72d4f75 retira el proveedor Supabase y el texto de la interfaz. El bucket y sus objetos de prueba se pueden eliminar manualmente si se decide limpiar la evidencia; no hay migración de datos que revertir.</w:t>
+            </w:r>
+          </w:p>
+        </w:tc>
+      </w:tr>
+      <w:tr>
+        <w:trPr>
+          <w:cantSplit/>
+        </w:trPr>
+        <w:tc>
+          <w:tcPr>
+            <w:tcW w:type="dxa" w:w="2268"/>
+            <w:shd w:fill="F7F8FA"/>
+            <w:tcBorders>
+              <w:top w:val="single" w:sz="4" w:color="D9DEE7"/>
+              <w:left w:val="single" w:sz="4" w:color="D9DEE7"/>
+              <w:bottom w:val="single" w:sz="4" w:color="D9DEE7"/>
+              <w:right w:val="single" w:sz="4" w:color="D9DEE7"/>
+              <w:insideH w:val="single" w:sz="4" w:color="D9DEE7"/>
+              <w:insideV w:val="single" w:sz="4" w:color="D9DEE7"/>
+            </w:tcBorders>
+            <w:vAlign w:val="top"/>
+          </w:tcPr>
+          <w:p>
+            <w:r>
+              <w:t>Pendiente / próximo paso</w:t>
+            </w:r>
+          </w:p>
+        </w:tc>
+        <w:tc>
+          <w:tcPr>
+            <w:tcW w:type="dxa" w:w="6803"/>
+            <w:shd w:fill="F7F8FA"/>
+            <w:tcBorders>
+              <w:top w:val="single" w:sz="4" w:color="D9DEE7"/>
+              <w:left w:val="single" w:sz="4" w:color="D9DEE7"/>
+              <w:bottom w:val="single" w:sz="4" w:color="D9DEE7"/>
+              <w:right w:val="single" w:sz="4" w:color="D9DEE7"/>
+              <w:insideH w:val="single" w:sz="4" w:color="D9DEE7"/>
+              <w:insideV w:val="single" w:sz="4" w:color="D9DEE7"/>
+            </w:tcBorders>
+            <w:vAlign w:val="top"/>
+          </w:tcPr>
+          <w:p>
+            <w:r>
+              <w:t>Elegir un curso vertical y obtener permisos, video, guía, preguntas y flashcards; modelar roles, matrículas, progreso y recursos; añadir pruebas negativas de autorización; decidir si Cloudflare Stream se justifica para producción; documentar el runbook y repetir E2E móvil/escritorio con datos académicos autorizados.</w:t>
+            </w:r>
+          </w:p>
+        </w:tc>
+      </w:tr>
+      <w:tr>
+        <w:trPr>
+          <w:cantSplit/>
+        </w:trPr>
+        <w:tc>
+          <w:tcPr>
+            <w:tcW w:type="dxa" w:w="2268"/>
+            <w:tcBorders>
+              <w:top w:val="single" w:sz="4" w:color="D9DEE7"/>
+              <w:left w:val="single" w:sz="4" w:color="D9DEE7"/>
+              <w:bottom w:val="single" w:sz="4" w:color="D9DEE7"/>
+              <w:right w:val="single" w:sz="4" w:color="D9DEE7"/>
+              <w:insideH w:val="single" w:sz="4" w:color="D9DEE7"/>
+              <w:insideV w:val="single" w:sz="4" w:color="D9DEE7"/>
+            </w:tcBorders>
+            <w:vAlign w:val="top"/>
+          </w:tcPr>
+          <w:p>
+            <w:pPr>
+              <w:spacing w:after="40"/>
+            </w:pPr>
+            <w:r>
+              <w:rPr>
+                <w:sz w:val="17"/>
+              </w:rPr>
+              <w:t>Resultado</w:t>
+            </w:r>
+          </w:p>
+        </w:tc>
+        <w:tc>
+          <w:tcPr>
+            <w:tcW w:type="dxa" w:w="6803"/>
+            <w:tcBorders>
+              <w:top w:val="single" w:sz="4" w:color="D9DEE7"/>
+              <w:left w:val="single" w:sz="4" w:color="D9DEE7"/>
+              <w:bottom w:val="single" w:sz="4" w:color="D9DEE7"/>
+              <w:right w:val="single" w:sz="4" w:color="D9DEE7"/>
+              <w:insideH w:val="single" w:sz="4" w:color="D9DEE7"/>
+              <w:insideV w:val="single" w:sz="4" w:color="D9DEE7"/>
+            </w:tcBorders>
+            <w:vAlign w:val="top"/>
+          </w:tcPr>
+          <w:p>
+            <w:pPr>
+              <w:spacing w:after="40"/>
+            </w:pPr>
+            <w:r>
+              <w:rPr>
+                <w:sz w:val="17"/>
+              </w:rPr>
+              <w:t>PASS / FAIL</w:t>
+            </w:r>
+          </w:p>
+        </w:tc>
+      </w:tr>
+    </w:tbl>
+    <w:p>
+      <w:pPr>
         <w:pStyle w:val="Heading1"/>
         <w:keepNext w:val="1"/>
       </w:pPr>
@@ -24664,7 +25310,7 @@
         <w:ind w:left="255" w:hanging="255"/>
       </w:pPr>
       <w:r>
-        <w:t>[~] Web desplegada y verificada en Vercel; la fundación de datos Supabase está activa y la lección demo está verificada localmente. Faltan Render para API Docker, E2E de identidad y almacenamiento privado.</w:t>
+        <w:t>[~] Web, API Render, Supabase Auth y Storage de prueba están operativos y verificados. El video de prueba reproduce, pero el curso vertical, los roles, el progreso y los materiales académicos siguen pendientes.</w:t>
       </w:r>
     </w:p>
     <w:p>
@@ -24997,7 +25643,7 @@
           </w:tcPr>
           <w:p>
             <w:r>
-              <w:t>Siguiente punto de control / Supabase Auth ya tiene Site URL y callback de produccion; Vercel ya dispone de la URL y clave publicable de Supabase y el redeploy de produccion termino READY. Render exige informacion de pago antes de crear el Blueprint Docker, por lo que no se desplego ni se transmitieron secretos de servidor. No abrir acceso directo a tablas ni activar cargas de video: decidir el alojamiento de API, configurar secretos solo en ese servidor, ejecutar E2E con una cuenta de prueba y registrar el curso vertical con contenido academico autorizado.</w:t>
+              <w:t>Siguiente punto de control / 10/08/2026: repetir la carga desde la pestaña nueva si hace falta y conservar el video solo como prueba. La web Vercel, la API Docker cediah-api de Render y el bucket privado video-test de Supabase están operativos. Próximo: escoger el curso vertical, reunir permisos y contenido, modelar roles/matrículas/progreso y sustituir el laboratorio por un recorrido académico autorizado.</w:t>
             </w:r>
           </w:p>
         </w:tc>
@@ -25008,7 +25654,7 @@
         <w:pStyle w:val="Checklist"/>
       </w:pPr>
       <w:r>
-        <w:t>[x] Implementar vista de lección demo con reproductor pendiente, temario preliminar, recurso bloqueado y navegación responsive; VER-013 a VER-016 PASS.</w:t>
+        <w:t>[x] Implementar vista de lección demo con reproductor de demostración, temario preliminar, recurso bloqueado y navegación responsive; VER-013 a VER-016 PASS.</w:t>
       </w:r>
     </w:p>
     <w:p>
@@ -25031,7 +25677,7 @@
     </w:p>
     <w:p>
       <w:r>
-        <w:t>Fuentes oficiales consultadas el 31/07/2026. Las capacidades y precios pueden cambiar; revalidar antes de contratar o actualizar arquitectura.</w:t>
+        <w:t>Fuentes oficiales consultadas y revalidadas entre el 31/07/2026 y el 10/08/2026. Las capacidades y precios pueden cambiar; revalidar antes de contratar o actualizar arquitectura.</w:t>
       </w:r>
     </w:p>
     <w:p>
@@ -25200,6 +25846,22 @@
       </w:pPr>
       <w:r>
         <w:t>Supabase - Database Migrations - https://supabase.com/docs/guides/deployment/database-migrations</w:t>
+      </w:r>
+    </w:p>
+    <w:p>
+      <w:pPr>
+        <w:pStyle w:val="ListBullet"/>
+      </w:pPr>
+      <w:r>
+        <w:t>Supabase Storage - File limits - https://supabase.com/docs/guides/storage/uploads/file-limits</w:t>
+      </w:r>
+    </w:p>
+    <w:p>
+      <w:pPr>
+        <w:pStyle w:val="ListBullet"/>
+      </w:pPr>
+      <w:r>
+        <w:t>Supabase Storage - Signed URLs for private files - https://supabase.com/docs/guides/storage/serving/downloads</w:t>
       </w:r>
     </w:p>
     <w:p>
@@ -26069,6 +26731,38 @@
           <w:p>
             <w:r>
               <w:t>Vista de lección demo con reproductor pendiente, temario y recurso bloqueado; navegación catálogo -&gt; ficha -&gt; lección y QA responsive registradas. Lint web corregido y dependencias transitivas parcheadas con overrides; despliegue Render y contenido académico real siguen pendientes.</w:t>
+            </w:r>
+          </w:p>
+        </w:tc>
+      </w:tr>
+      <w:tr>
+        <w:tc>
+          <w:tcPr>
+            <w:tcW w:type="dxa" w:w="3324"/>
+          </w:tcPr>
+          <w:p>
+            <w:r>
+              <w:t>2.5</w:t>
+            </w:r>
+          </w:p>
+        </w:tc>
+        <w:tc>
+          <w:tcPr>
+            <w:tcW w:type="dxa" w:w="3324"/>
+          </w:tcPr>
+          <w:p>
+            <w:r>
+              <w:t>10/08/2026</w:t>
+            </w:r>
+          </w:p>
+        </w:tc>
+        <w:tc>
+          <w:tcPr>
+            <w:tcW w:type="dxa" w:w="3324"/>
+          </w:tcPr>
+          <w:p>
+            <w:r>
+              <w:t>API Docker en Render, Supabase Storage privado para pruebas gratuitas, laboratorio de carga/reproducción firmado, verificación visual del video y corrección CSP media-src publicados. Pendientes académicos y Cloudflare Stream de producción quedan explícitos.</w:t>
             </w:r>
           </w:p>
         </w:tc>

</xml_diff>

<commit_message>
feat: add dynamic content and admin role management
</commit_message>
<xml_diff>
--- a/CEDIAH Web Status.docx
+++ b/CEDIAH Web Status.docx
@@ -3502,7 +3502,7 @@
         <w:pStyle w:val="Checklist"/>
       </w:pPr>
       <w:r>
-        <w:t>[ ] Todavía faltan contenido académico autorizado, roles/matrículas, progreso persistente, recursos, evaluaciones, certificados, flujo editorial y pruebas negativas de acceso.</w:t>
+        <w:t>[~] El catálogo dinámico, el estudio editorial y la gestión de roles por correo están implementados localmente; la migración remota, el QA autenticado con Storage real, las matrículas, los certificados y el despliegue siguen pendientes.</w:t>
       </w:r>
     </w:p>
     <w:p>
@@ -25617,6 +25617,1120 @@
         </w:tc>
       </w:tr>
     </w:tbl>
+    <w:p>
+      <w:pPr>
+        <w:pStyle w:val="Heading2"/>
+      </w:pPr>
+      <w:r>
+        <w:t>Ficha de cambio - CHG-006</w:t>
+      </w:r>
+    </w:p>
+    <w:tbl>
+      <w:tblPr>
+        <w:tblStyle w:val="TableGrid"/>
+        <w:tblW w:type="auto" w:w="0"/>
+        <w:jc w:val="center"/>
+        <w:tblLayout w:type="autofit"/>
+        <w:tblLook w:firstColumn="1" w:firstRow="1" w:lastColumn="0" w:lastRow="0" w:noHBand="0" w:noVBand="1" w:val="04A0"/>
+      </w:tblPr>
+      <w:tblGrid>
+        <w:gridCol w:w="4986"/>
+        <w:gridCol w:w="4986"/>
+      </w:tblGrid>
+      <w:tr>
+        <w:trPr>
+          <w:tblHeader w:val="true"/>
+        </w:trPr>
+        <w:tc>
+          <w:tcPr>
+            <w:tcW w:type="dxa" w:w="2835"/>
+            <w:shd w:fill="14233B"/>
+            <w:tcBorders>
+              <w:top w:val="single" w:sz="4" w:color="FFFFFF"/>
+              <w:left w:val="single" w:sz="4" w:color="FFFFFF"/>
+              <w:bottom w:val="single" w:sz="4" w:color="FFFFFF"/>
+              <w:right w:val="single" w:sz="4" w:color="FFFFFF"/>
+              <w:insideH w:val="single" w:sz="4" w:color="FFFFFF"/>
+              <w:insideV w:val="single" w:sz="4" w:color="FFFFFF"/>
+            </w:tcBorders>
+            <w:vAlign w:val="center"/>
+          </w:tcPr>
+          <w:p>
+            <w:r>
+              <w:rPr>
+                <w:b/>
+                <w:color w:val="FFFFFF"/>
+              </w:rPr>
+              <w:t>Campo</w:t>
+            </w:r>
+          </w:p>
+        </w:tc>
+        <w:tc>
+          <w:tcPr>
+            <w:tcW w:type="dxa" w:w="6236"/>
+            <w:shd w:fill="14233B"/>
+            <w:tcBorders>
+              <w:top w:val="single" w:sz="4" w:color="FFFFFF"/>
+              <w:left w:val="single" w:sz="4" w:color="FFFFFF"/>
+              <w:bottom w:val="single" w:sz="4" w:color="FFFFFF"/>
+              <w:right w:val="single" w:sz="4" w:color="FFFFFF"/>
+              <w:insideH w:val="single" w:sz="4" w:color="FFFFFF"/>
+              <w:insideV w:val="single" w:sz="4" w:color="FFFFFF"/>
+            </w:tcBorders>
+            <w:vAlign w:val="center"/>
+          </w:tcPr>
+          <w:p>
+            <w:r>
+              <w:rPr>
+                <w:b/>
+                <w:color w:val="FFFFFF"/>
+              </w:rPr>
+              <w:t>Contenido</w:t>
+            </w:r>
+          </w:p>
+        </w:tc>
+      </w:tr>
+      <w:tr>
+        <w:trPr>
+          <w:cantSplit/>
+        </w:trPr>
+        <w:tc>
+          <w:tcPr>
+            <w:tcW w:type="dxa" w:w="2835"/>
+            <w:tcBorders>
+              <w:top w:val="single" w:sz="4" w:color="D9DEE7"/>
+              <w:left w:val="single" w:sz="4" w:color="D9DEE7"/>
+              <w:bottom w:val="single" w:sz="4" w:color="D9DEE7"/>
+              <w:right w:val="single" w:sz="4" w:color="D9DEE7"/>
+              <w:insideH w:val="single" w:sz="4" w:color="D9DEE7"/>
+              <w:insideV w:val="single" w:sz="4" w:color="D9DEE7"/>
+            </w:tcBorders>
+            <w:vAlign w:val="top"/>
+          </w:tcPr>
+          <w:p>
+            <w:r>
+              <w:t>ID / fecha / autor</w:t>
+            </w:r>
+          </w:p>
+        </w:tc>
+        <w:tc>
+          <w:tcPr>
+            <w:tcW w:type="dxa" w:w="6236"/>
+            <w:tcBorders>
+              <w:top w:val="single" w:sz="4" w:color="D9DEE7"/>
+              <w:left w:val="single" w:sz="4" w:color="D9DEE7"/>
+              <w:bottom w:val="single" w:sz="4" w:color="D9DEE7"/>
+              <w:right w:val="single" w:sz="4" w:color="D9DEE7"/>
+              <w:insideH w:val="single" w:sz="4" w:color="D9DEE7"/>
+              <w:insideV w:val="single" w:sz="4" w:color="D9DEE7"/>
+            </w:tcBorders>
+            <w:vAlign w:val="top"/>
+          </w:tcPr>
+          <w:p>
+            <w:r>
+              <w:t>CHG-006 / 10/08/2026 / Codex con José</w:t>
+            </w:r>
+          </w:p>
+        </w:tc>
+      </w:tr>
+      <w:tr>
+        <w:trPr>
+          <w:cantSplit/>
+        </w:trPr>
+        <w:tc>
+          <w:tcPr>
+            <w:tcW w:type="dxa" w:w="2835"/>
+            <w:shd w:fill="F7F8FA"/>
+            <w:tcBorders>
+              <w:top w:val="single" w:sz="4" w:color="D9DEE7"/>
+              <w:left w:val="single" w:sz="4" w:color="D9DEE7"/>
+              <w:bottom w:val="single" w:sz="4" w:color="D9DEE7"/>
+              <w:right w:val="single" w:sz="4" w:color="D9DEE7"/>
+              <w:insideH w:val="single" w:sz="4" w:color="D9DEE7"/>
+              <w:insideV w:val="single" w:sz="4" w:color="D9DEE7"/>
+            </w:tcBorders>
+            <w:vAlign w:val="top"/>
+          </w:tcPr>
+          <w:p>
+            <w:r>
+              <w:t>Fase y objetivo</w:t>
+            </w:r>
+          </w:p>
+        </w:tc>
+        <w:tc>
+          <w:tcPr>
+            <w:tcW w:type="dxa" w:w="6236"/>
+            <w:shd w:fill="F7F8FA"/>
+            <w:tcBorders>
+              <w:top w:val="single" w:sz="4" w:color="D9DEE7"/>
+              <w:left w:val="single" w:sz="4" w:color="D9DEE7"/>
+              <w:bottom w:val="single" w:sz="4" w:color="D9DEE7"/>
+              <w:right w:val="single" w:sz="4" w:color="D9DEE7"/>
+              <w:insideH w:val="single" w:sz="4" w:color="D9DEE7"/>
+              <w:insideV w:val="single" w:sz="4" w:color="D9DEE7"/>
+            </w:tcBorders>
+            <w:vAlign w:val="top"/>
+          </w:tcPr>
+          <w:p>
+            <w:r>
+              <w:t>Fases 2 y 3 - sustituir las superficies estáticas de contenido y habilitar un flujo editorial RBAC funcional y comprobable para administradores y miembros autorizados.</w:t>
+            </w:r>
+          </w:p>
+        </w:tc>
+      </w:tr>
+      <w:tr>
+        <w:trPr>
+          <w:cantSplit/>
+        </w:trPr>
+        <w:tc>
+          <w:tcPr>
+            <w:tcW w:type="dxa" w:w="2835"/>
+            <w:tcBorders>
+              <w:top w:val="single" w:sz="4" w:color="D9DEE7"/>
+              <w:left w:val="single" w:sz="4" w:color="D9DEE7"/>
+              <w:bottom w:val="single" w:sz="4" w:color="D9DEE7"/>
+              <w:right w:val="single" w:sz="4" w:color="D9DEE7"/>
+              <w:insideH w:val="single" w:sz="4" w:color="D9DEE7"/>
+              <w:insideV w:val="single" w:sz="4" w:color="D9DEE7"/>
+            </w:tcBorders>
+            <w:vAlign w:val="top"/>
+          </w:tcPr>
+          <w:p>
+            <w:r>
+              <w:t>Qué cambió</w:t>
+            </w:r>
+          </w:p>
+        </w:tc>
+        <w:tc>
+          <w:tcPr>
+            <w:tcW w:type="dxa" w:w="6236"/>
+            <w:tcBorders>
+              <w:top w:val="single" w:sz="4" w:color="D9DEE7"/>
+              <w:left w:val="single" w:sz="4" w:color="D9DEE7"/>
+              <w:bottom w:val="single" w:sz="4" w:color="D9DEE7"/>
+              <w:right w:val="single" w:sz="4" w:color="D9DEE7"/>
+              <w:insideH w:val="single" w:sz="4" w:color="D9DEE7"/>
+              <w:insideV w:val="single" w:sz="4" w:color="D9DEE7"/>
+            </w:tcBorders>
+            <w:vAlign w:val="top"/>
+          </w:tcPr>
+          <w:p>
+            <w:r>
+              <w:t>Dashboard, guías, biblioteca y páginas de detalle consumen contenido publicado. El panel protegido permite crear y editar videos, guías, cuestionarios, flashcards y temas; adjuntar MP4/WebM/MOV o PDF; revisar, solicitar cambios, aprobar, publicar y archivar.</w:t>
+            </w:r>
+          </w:p>
+        </w:tc>
+      </w:tr>
+      <w:tr>
+        <w:trPr>
+          <w:cantSplit/>
+        </w:trPr>
+        <w:tc>
+          <w:tcPr>
+            <w:tcW w:type="dxa" w:w="2835"/>
+            <w:shd w:fill="F7F8FA"/>
+            <w:tcBorders>
+              <w:top w:val="single" w:sz="4" w:color="D9DEE7"/>
+              <w:left w:val="single" w:sz="4" w:color="D9DEE7"/>
+              <w:bottom w:val="single" w:sz="4" w:color="D9DEE7"/>
+              <w:right w:val="single" w:sz="4" w:color="D9DEE7"/>
+              <w:insideH w:val="single" w:sz="4" w:color="D9DEE7"/>
+              <w:insideV w:val="single" w:sz="4" w:color="D9DEE7"/>
+            </w:tcBorders>
+            <w:vAlign w:val="top"/>
+          </w:tcPr>
+          <w:p>
+            <w:r>
+              <w:t>Cómo se implementó</w:t>
+            </w:r>
+          </w:p>
+        </w:tc>
+        <w:tc>
+          <w:tcPr>
+            <w:tcW w:type="dxa" w:w="6236"/>
+            <w:shd w:fill="F7F8FA"/>
+            <w:tcBorders>
+              <w:top w:val="single" w:sz="4" w:color="D9DEE7"/>
+              <w:left w:val="single" w:sz="4" w:color="D9DEE7"/>
+              <w:bottom w:val="single" w:sz="4" w:color="D9DEE7"/>
+              <w:right w:val="single" w:sz="4" w:color="D9DEE7"/>
+              <w:insideH w:val="single" w:sz="4" w:color="D9DEE7"/>
+              <w:insideV w:val="single" w:sz="4" w:color="D9DEE7"/>
+            </w:tcBorders>
+            <w:vAlign w:val="top"/>
+          </w:tcPr>
+          <w:p>
+            <w:r>
+              <w:t>Contratos Zod compartidos; API Fastify como límite de autorización; BFF de Next para conservar el token en servidor; contenido estructurado por tipo; estados draft -&gt; in_review -&gt; changes_requested/approved -&gt; published -&gt; archived; catálogos y actividades interactivas renderizados desde la API.</w:t>
+            </w:r>
+          </w:p>
+        </w:tc>
+      </w:tr>
+      <w:tr>
+        <w:trPr>
+          <w:cantSplit/>
+        </w:trPr>
+        <w:tc>
+          <w:tcPr>
+            <w:tcW w:type="dxa" w:w="2835"/>
+            <w:tcBorders>
+              <w:top w:val="single" w:sz="4" w:color="D9DEE7"/>
+              <w:left w:val="single" w:sz="4" w:color="D9DEE7"/>
+              <w:bottom w:val="single" w:sz="4" w:color="D9DEE7"/>
+              <w:right w:val="single" w:sz="4" w:color="D9DEE7"/>
+              <w:insideH w:val="single" w:sz="4" w:color="D9DEE7"/>
+              <w:insideV w:val="single" w:sz="4" w:color="D9DEE7"/>
+            </w:tcBorders>
+            <w:vAlign w:val="top"/>
+          </w:tcPr>
+          <w:p>
+            <w:r>
+              <w:t>Archivos / migraciones / servicios</w:t>
+            </w:r>
+          </w:p>
+        </w:tc>
+        <w:tc>
+          <w:tcPr>
+            <w:tcW w:type="dxa" w:w="6236"/>
+            <w:tcBorders>
+              <w:top w:val="single" w:sz="4" w:color="D9DEE7"/>
+              <w:left w:val="single" w:sz="4" w:color="D9DEE7"/>
+              <w:bottom w:val="single" w:sz="4" w:color="D9DEE7"/>
+              <w:right w:val="single" w:sz="4" w:color="D9DEE7"/>
+              <w:insideH w:val="single" w:sz="4" w:color="D9DEE7"/>
+              <w:insideV w:val="single" w:sz="4" w:color="D9DEE7"/>
+            </w:tcBorders>
+            <w:vAlign w:val="top"/>
+          </w:tcPr>
+          <w:p>
+            <w:r>
+              <w:t>packages/contracts/src/index.ts; apps/api/src/content-authorization.ts, providers/supabase-content.ts y rutas /v1/content + /v1/editor; apps/web/src/app/biblioteca, guias, dashboard, panel/contenido y API BFF; componentes content-library, content-detail y content-studio; migración supabase/migrations/20260810211907_add_dynamic_content_studio.sql; bucket privado previsto content-assets.</w:t>
+            </w:r>
+          </w:p>
+        </w:tc>
+      </w:tr>
+      <w:tr>
+        <w:trPr>
+          <w:cantSplit/>
+        </w:trPr>
+        <w:tc>
+          <w:tcPr>
+            <w:tcW w:type="dxa" w:w="2835"/>
+            <w:shd w:fill="F7F8FA"/>
+            <w:tcBorders>
+              <w:top w:val="single" w:sz="4" w:color="D9DEE7"/>
+              <w:left w:val="single" w:sz="4" w:color="D9DEE7"/>
+              <w:bottom w:val="single" w:sz="4" w:color="D9DEE7"/>
+              <w:right w:val="single" w:sz="4" w:color="D9DEE7"/>
+              <w:insideH w:val="single" w:sz="4" w:color="D9DEE7"/>
+              <w:insideV w:val="single" w:sz="4" w:color="D9DEE7"/>
+            </w:tcBorders>
+            <w:vAlign w:val="top"/>
+          </w:tcPr>
+          <w:p>
+            <w:r>
+              <w:t>Seguridad y privacidad</w:t>
+            </w:r>
+          </w:p>
+        </w:tc>
+        <w:tc>
+          <w:tcPr>
+            <w:tcW w:type="dxa" w:w="6236"/>
+            <w:shd w:fill="F7F8FA"/>
+            <w:tcBorders>
+              <w:top w:val="single" w:sz="4" w:color="D9DEE7"/>
+              <w:left w:val="single" w:sz="4" w:color="D9DEE7"/>
+              <w:bottom w:val="single" w:sz="4" w:color="D9DEE7"/>
+              <w:right w:val="single" w:sz="4" w:color="D9DEE7"/>
+              <w:insideH w:val="single" w:sz="4" w:color="D9DEE7"/>
+              <w:insideV w:val="single" w:sz="4" w:color="D9DEE7"/>
+            </w:tcBorders>
+            <w:vAlign w:val="top"/>
+          </w:tcPr>
+          <w:p>
+            <w:r>
+              <w:t>La service key permanece solo en Fastify. Cada mutación valida sesión, roles y propiedad; colaboradores solo gestionan sus borradores y coordinación/administración publica. RLS y grants niegan acceso directo del navegador; bucket privado, carga firmada, ruta UUID, allowlist MIME y límite de 500 MB. Finalización verifica tamaño/MIME real en Storage; conflictos usan updatedAt y las acciones sensibles se auditan.</w:t>
+            </w:r>
+          </w:p>
+        </w:tc>
+      </w:tr>
+      <w:tr>
+        <w:trPr>
+          <w:cantSplit/>
+        </w:trPr>
+        <w:tc>
+          <w:tcPr>
+            <w:tcW w:type="dxa" w:w="2835"/>
+            <w:tcBorders>
+              <w:top w:val="single" w:sz="4" w:color="D9DEE7"/>
+              <w:left w:val="single" w:sz="4" w:color="D9DEE7"/>
+              <w:bottom w:val="single" w:sz="4" w:color="D9DEE7"/>
+              <w:right w:val="single" w:sz="4" w:color="D9DEE7"/>
+              <w:insideH w:val="single" w:sz="4" w:color="D9DEE7"/>
+              <w:insideV w:val="single" w:sz="4" w:color="D9DEE7"/>
+            </w:tcBorders>
+            <w:vAlign w:val="top"/>
+          </w:tcPr>
+          <w:p>
+            <w:r>
+              <w:t>Validación automática</w:t>
+            </w:r>
+          </w:p>
+        </w:tc>
+        <w:tc>
+          <w:tcPr>
+            <w:tcW w:type="dxa" w:w="6236"/>
+            <w:tcBorders>
+              <w:top w:val="single" w:sz="4" w:color="D9DEE7"/>
+              <w:left w:val="single" w:sz="4" w:color="D9DEE7"/>
+              <w:bottom w:val="single" w:sz="4" w:color="D9DEE7"/>
+              <w:right w:val="single" w:sz="4" w:color="D9DEE7"/>
+              <w:insideH w:val="single" w:sz="4" w:color="D9DEE7"/>
+              <w:insideV w:val="single" w:sz="4" w:color="D9DEE7"/>
+            </w:tcBorders>
+            <w:vAlign w:val="top"/>
+          </w:tcPr>
+          <w:p>
+            <w:r>
+              <w:t>PASS final: pnpm lint; pnpm typecheck; pnpm test (4 archivos, 20/20); build de contratos y API; build web Next 16.2.12 con 25 páginas/rutas; git diff --check. Supabase CLI no pudo ejecutar db lint porque no existe Postgres local en 127.0.0.1:54322; la migración no se aplicó a una base remota.</w:t>
+            </w:r>
+          </w:p>
+        </w:tc>
+      </w:tr>
+      <w:tr>
+        <w:trPr>
+          <w:cantSplit/>
+        </w:trPr>
+        <w:tc>
+          <w:tcPr>
+            <w:tcW w:type="dxa" w:w="2835"/>
+            <w:shd w:fill="F7F8FA"/>
+            <w:tcBorders>
+              <w:top w:val="single" w:sz="4" w:color="D9DEE7"/>
+              <w:left w:val="single" w:sz="4" w:color="D9DEE7"/>
+              <w:bottom w:val="single" w:sz="4" w:color="D9DEE7"/>
+              <w:right w:val="single" w:sz="4" w:color="D9DEE7"/>
+              <w:insideH w:val="single" w:sz="4" w:color="D9DEE7"/>
+              <w:insideV w:val="single" w:sz="4" w:color="D9DEE7"/>
+            </w:tcBorders>
+            <w:vAlign w:val="top"/>
+          </w:tcPr>
+          <w:p>
+            <w:r>
+              <w:t>Validación en navegador</w:t>
+            </w:r>
+          </w:p>
+        </w:tc>
+        <w:tc>
+          <w:tcPr>
+            <w:tcW w:type="dxa" w:w="6236"/>
+            <w:shd w:fill="F7F8FA"/>
+            <w:tcBorders>
+              <w:top w:val="single" w:sz="4" w:color="D9DEE7"/>
+              <w:left w:val="single" w:sz="4" w:color="D9DEE7"/>
+              <w:bottom w:val="single" w:sz="4" w:color="D9DEE7"/>
+              <w:right w:val="single" w:sz="4" w:color="D9DEE7"/>
+              <w:insideH w:val="single" w:sz="4" w:color="D9DEE7"/>
+              <w:insideV w:val="single" w:sz="4" w:color="D9DEE7"/>
+            </w:tcBorders>
+            <w:vAlign w:val="top"/>
+          </w:tcPr>
+          <w:p>
+            <w:r>
+              <w:t>VER-018 PASS escritorio: dashboard, guías y biblioteca dinámicos, estados indisponible/vacío y navegación sin overlay ni overflow. VER-019 PASS 390 x 844: filtros de biblioteca en cuadrícula, selector fluido y cero overflow. VER-020 PASS en fixture local retirado: estudio editorial a 1186 x 698 y 390 x 844, cinco tipos, filtros, edición, slug automático, revisión/aprobación y formulario estructurado. La ruta real falla cerrada sin identidad. E2E autenticado contra Supabase real queda pendiente.</w:t>
+            </w:r>
+          </w:p>
+        </w:tc>
+      </w:tr>
+      <w:tr>
+        <w:trPr>
+          <w:cantSplit/>
+        </w:trPr>
+        <w:tc>
+          <w:tcPr>
+            <w:tcW w:type="dxa" w:w="2835"/>
+            <w:tcBorders>
+              <w:top w:val="single" w:sz="4" w:color="D9DEE7"/>
+              <w:left w:val="single" w:sz="4" w:color="D9DEE7"/>
+              <w:bottom w:val="single" w:sz="4" w:color="D9DEE7"/>
+              <w:right w:val="single" w:sz="4" w:color="D9DEE7"/>
+              <w:insideH w:val="single" w:sz="4" w:color="D9DEE7"/>
+              <w:insideV w:val="single" w:sz="4" w:color="D9DEE7"/>
+            </w:tcBorders>
+            <w:vAlign w:val="top"/>
+          </w:tcPr>
+          <w:p>
+            <w:r>
+              <w:t>Evidencia</w:t>
+            </w:r>
+          </w:p>
+        </w:tc>
+        <w:tc>
+          <w:tcPr>
+            <w:tcW w:type="dxa" w:w="6236"/>
+            <w:tcBorders>
+              <w:top w:val="single" w:sz="4" w:color="D9DEE7"/>
+              <w:left w:val="single" w:sz="4" w:color="D9DEE7"/>
+              <w:bottom w:val="single" w:sz="4" w:color="D9DEE7"/>
+              <w:right w:val="single" w:sz="4" w:color="D9DEE7"/>
+              <w:insideH w:val="single" w:sz="4" w:color="D9DEE7"/>
+              <w:insideV w:val="single" w:sz="4" w:color="D9DEE7"/>
+            </w:tcBorders>
+            <w:vAlign w:val="top"/>
+          </w:tcPr>
+          <w:p>
+            <w:r>
+              <w:t>Inventario del build con /biblioteca, /biblioteca/[slug], /guias/[slug], /panel/contenido y seis rutas BFF editoriales; salida Vitest 20/20; inspección visual y mediciones DOM en navegador; registros locales seguros en tmp/codex-content-status. No se cargó contenido real, no se asignaron roles remotos y no se expusieron tokens.</w:t>
+            </w:r>
+          </w:p>
+        </w:tc>
+      </w:tr>
+      <w:tr>
+        <w:trPr>
+          <w:cantSplit/>
+        </w:trPr>
+        <w:tc>
+          <w:tcPr>
+            <w:tcW w:type="dxa" w:w="2835"/>
+            <w:shd w:fill="F7F8FA"/>
+            <w:tcBorders>
+              <w:top w:val="single" w:sz="4" w:color="D9DEE7"/>
+              <w:left w:val="single" w:sz="4" w:color="D9DEE7"/>
+              <w:bottom w:val="single" w:sz="4" w:color="D9DEE7"/>
+              <w:right w:val="single" w:sz="4" w:color="D9DEE7"/>
+              <w:insideH w:val="single" w:sz="4" w:color="D9DEE7"/>
+              <w:insideV w:val="single" w:sz="4" w:color="D9DEE7"/>
+            </w:tcBorders>
+            <w:vAlign w:val="top"/>
+          </w:tcPr>
+          <w:p>
+            <w:r>
+              <w:t>Reversión</w:t>
+            </w:r>
+          </w:p>
+        </w:tc>
+        <w:tc>
+          <w:tcPr>
+            <w:tcW w:type="dxa" w:w="6236"/>
+            <w:shd w:fill="F7F8FA"/>
+            <w:tcBorders>
+              <w:top w:val="single" w:sz="4" w:color="D9DEE7"/>
+              <w:left w:val="single" w:sz="4" w:color="D9DEE7"/>
+              <w:bottom w:val="single" w:sz="4" w:color="D9DEE7"/>
+              <w:right w:val="single" w:sz="4" w:color="D9DEE7"/>
+              <w:insideH w:val="single" w:sz="4" w:color="D9DEE7"/>
+              <w:insideV w:val="single" w:sz="4" w:color="D9DEE7"/>
+            </w:tcBorders>
+            <w:vAlign w:val="top"/>
+          </w:tcPr>
+          <w:p>
+            <w:r>
+              <w:t>Mientras la migración no esté aplicada, retirar el código y el archivo SQL restaura el estado previo sin pérdida de datos. Después de aplicarla, exportar contenidos y objetos del bucket antes de una migración de reversión explícita; no eliminar tablas, objetos ni valores enum sin respaldo y confirmación.</w:t>
+            </w:r>
+          </w:p>
+        </w:tc>
+      </w:tr>
+      <w:tr>
+        <w:trPr>
+          <w:cantSplit/>
+        </w:trPr>
+        <w:tc>
+          <w:tcPr>
+            <w:tcW w:type="dxa" w:w="2835"/>
+            <w:tcBorders>
+              <w:top w:val="single" w:sz="4" w:color="D9DEE7"/>
+              <w:left w:val="single" w:sz="4" w:color="D9DEE7"/>
+              <w:bottom w:val="single" w:sz="4" w:color="D9DEE7"/>
+              <w:right w:val="single" w:sz="4" w:color="D9DEE7"/>
+              <w:insideH w:val="single" w:sz="4" w:color="D9DEE7"/>
+              <w:insideV w:val="single" w:sz="4" w:color="D9DEE7"/>
+            </w:tcBorders>
+            <w:vAlign w:val="top"/>
+          </w:tcPr>
+          <w:p>
+            <w:r>
+              <w:t>Pendiente / próximo paso</w:t>
+            </w:r>
+          </w:p>
+        </w:tc>
+        <w:tc>
+          <w:tcPr>
+            <w:tcW w:type="dxa" w:w="6236"/>
+            <w:tcBorders>
+              <w:top w:val="single" w:sz="4" w:color="D9DEE7"/>
+              <w:left w:val="single" w:sz="4" w:color="D9DEE7"/>
+              <w:bottom w:val="single" w:sz="4" w:color="D9DEE7"/>
+              <w:right w:val="single" w:sz="4" w:color="D9DEE7"/>
+              <w:insideH w:val="single" w:sz="4" w:color="D9DEE7"/>
+              <w:insideV w:val="single" w:sz="4" w:color="D9DEE7"/>
+            </w:tcBorders>
+            <w:vAlign w:val="top"/>
+          </w:tcPr>
+          <w:p>
+            <w:r>
+              <w:t>Aplicar la migración en un entorno Supabase de desarrollo; configurar SUPABASE_CONTENT_BUCKET; asignar cuentas de prueba a community_contributor, academic_editor, coordination y administrator; ejecutar E2E de propiedad, revisión, publicación y Storage real; cargar contenido académico autorizado y solo entonces desplegar web/API.</w:t>
+            </w:r>
+          </w:p>
+        </w:tc>
+      </w:tr>
+    </w:tbl>
+    <w:p>
+      <w:pPr>
+        <w:pStyle w:val="Heading2"/>
+      </w:pPr>
+      <w:r>
+        <w:t>Ficha de cambio - CHG-007</w:t>
+      </w:r>
+    </w:p>
+    <w:tbl>
+      <w:tblPr>
+        <w:tblStyle w:val="TableGrid"/>
+        <w:tblW w:type="auto" w:w="0"/>
+        <w:jc w:val="center"/>
+        <w:tblLayout w:type="autofit"/>
+        <w:tblLook w:firstColumn="1" w:firstRow="1" w:lastColumn="0" w:lastRow="0" w:noHBand="0" w:noVBand="1" w:val="04A0"/>
+      </w:tblPr>
+      <w:tblGrid>
+        <w:gridCol w:w="4986"/>
+        <w:gridCol w:w="4986"/>
+      </w:tblGrid>
+      <w:tr>
+        <w:trPr>
+          <w:tblHeader w:val="true"/>
+        </w:trPr>
+        <w:tc>
+          <w:tcPr>
+            <w:tcW w:type="dxa" w:w="2835"/>
+            <w:shd w:fill="14233B"/>
+            <w:tcBorders>
+              <w:top w:val="single" w:sz="4" w:color="FFFFFF"/>
+              <w:left w:val="single" w:sz="4" w:color="FFFFFF"/>
+              <w:bottom w:val="single" w:sz="4" w:color="FFFFFF"/>
+              <w:right w:val="single" w:sz="4" w:color="FFFFFF"/>
+              <w:insideH w:val="single" w:sz="4" w:color="FFFFFF"/>
+              <w:insideV w:val="single" w:sz="4" w:color="FFFFFF"/>
+            </w:tcBorders>
+            <w:vAlign w:val="center"/>
+          </w:tcPr>
+          <w:p>
+            <w:r>
+              <w:rPr>
+                <w:b/>
+                <w:color w:val="FFFFFF"/>
+              </w:rPr>
+              <w:t>Campo</w:t>
+            </w:r>
+          </w:p>
+        </w:tc>
+        <w:tc>
+          <w:tcPr>
+            <w:tcW w:type="dxa" w:w="6236"/>
+            <w:shd w:fill="14233B"/>
+            <w:tcBorders>
+              <w:top w:val="single" w:sz="4" w:color="FFFFFF"/>
+              <w:left w:val="single" w:sz="4" w:color="FFFFFF"/>
+              <w:bottom w:val="single" w:sz="4" w:color="FFFFFF"/>
+              <w:right w:val="single" w:sz="4" w:color="FFFFFF"/>
+              <w:insideH w:val="single" w:sz="4" w:color="FFFFFF"/>
+              <w:insideV w:val="single" w:sz="4" w:color="FFFFFF"/>
+            </w:tcBorders>
+            <w:vAlign w:val="center"/>
+          </w:tcPr>
+          <w:p>
+            <w:r>
+              <w:rPr>
+                <w:b/>
+                <w:color w:val="FFFFFF"/>
+              </w:rPr>
+              <w:t>Contenido</w:t>
+            </w:r>
+          </w:p>
+        </w:tc>
+      </w:tr>
+      <w:tr>
+        <w:trPr>
+          <w:cantSplit/>
+        </w:trPr>
+        <w:tc>
+          <w:tcPr>
+            <w:tcW w:type="dxa" w:w="2835"/>
+            <w:tcBorders>
+              <w:top w:val="single" w:sz="4" w:color="D9DEE7"/>
+              <w:left w:val="single" w:sz="4" w:color="D9DEE7"/>
+              <w:bottom w:val="single" w:sz="4" w:color="D9DEE7"/>
+              <w:right w:val="single" w:sz="4" w:color="D9DEE7"/>
+              <w:insideH w:val="single" w:sz="4" w:color="D9DEE7"/>
+              <w:insideV w:val="single" w:sz="4" w:color="D9DEE7"/>
+            </w:tcBorders>
+            <w:vAlign w:val="top"/>
+          </w:tcPr>
+          <w:p>
+            <w:r>
+              <w:t>ID / fecha / autor</w:t>
+            </w:r>
+          </w:p>
+        </w:tc>
+        <w:tc>
+          <w:tcPr>
+            <w:tcW w:type="dxa" w:w="6236"/>
+            <w:tcBorders>
+              <w:top w:val="single" w:sz="4" w:color="D9DEE7"/>
+              <w:left w:val="single" w:sz="4" w:color="D9DEE7"/>
+              <w:bottom w:val="single" w:sz="4" w:color="D9DEE7"/>
+              <w:right w:val="single" w:sz="4" w:color="D9DEE7"/>
+              <w:insideH w:val="single" w:sz="4" w:color="D9DEE7"/>
+              <w:insideV w:val="single" w:sz="4" w:color="D9DEE7"/>
+            </w:tcBorders>
+            <w:vAlign w:val="top"/>
+          </w:tcPr>
+          <w:p>
+            <w:r>
+              <w:t>CHG-007 / 10/08/2026 / Codex con José</w:t>
+            </w:r>
+          </w:p>
+        </w:tc>
+      </w:tr>
+      <w:tr>
+        <w:trPr>
+          <w:cantSplit/>
+        </w:trPr>
+        <w:tc>
+          <w:tcPr>
+            <w:tcW w:type="dxa" w:w="2835"/>
+            <w:shd w:fill="F7F8FA"/>
+            <w:tcBorders>
+              <w:top w:val="single" w:sz="4" w:color="D9DEE7"/>
+              <w:left w:val="single" w:sz="4" w:color="D9DEE7"/>
+              <w:bottom w:val="single" w:sz="4" w:color="D9DEE7"/>
+              <w:right w:val="single" w:sz="4" w:color="D9DEE7"/>
+              <w:insideH w:val="single" w:sz="4" w:color="D9DEE7"/>
+              <w:insideV w:val="single" w:sz="4" w:color="D9DEE7"/>
+            </w:tcBorders>
+            <w:vAlign w:val="top"/>
+          </w:tcPr>
+          <w:p>
+            <w:r>
+              <w:t>Fase y objetivo</w:t>
+            </w:r>
+          </w:p>
+        </w:tc>
+        <w:tc>
+          <w:tcPr>
+            <w:tcW w:type="dxa" w:w="6236"/>
+            <w:shd w:fill="F7F8FA"/>
+            <w:tcBorders>
+              <w:top w:val="single" w:sz="4" w:color="D9DEE7"/>
+              <w:left w:val="single" w:sz="4" w:color="D9DEE7"/>
+              <w:bottom w:val="single" w:sz="4" w:color="D9DEE7"/>
+              <w:right w:val="single" w:sz="4" w:color="D9DEE7"/>
+              <w:insideH w:val="single" w:sz="4" w:color="D9DEE7"/>
+              <w:insideV w:val="single" w:sz="4" w:color="D9DEE7"/>
+            </w:tcBorders>
+            <w:vAlign w:val="top"/>
+          </w:tcPr>
+          <w:p>
+            <w:r>
+              <w:t>Administración segura de roles: bootstrap del primer administrador y asignación/revocación por correo desde la interfaz.</w:t>
+            </w:r>
+          </w:p>
+        </w:tc>
+      </w:tr>
+      <w:tr>
+        <w:trPr>
+          <w:cantSplit/>
+        </w:trPr>
+        <w:tc>
+          <w:tcPr>
+            <w:tcW w:type="dxa" w:w="2835"/>
+            <w:tcBorders>
+              <w:top w:val="single" w:sz="4" w:color="D9DEE7"/>
+              <w:left w:val="single" w:sz="4" w:color="D9DEE7"/>
+              <w:bottom w:val="single" w:sz="4" w:color="D9DEE7"/>
+              <w:right w:val="single" w:sz="4" w:color="D9DEE7"/>
+              <w:insideH w:val="single" w:sz="4" w:color="D9DEE7"/>
+              <w:insideV w:val="single" w:sz="4" w:color="D9DEE7"/>
+            </w:tcBorders>
+            <w:vAlign w:val="top"/>
+          </w:tcPr>
+          <w:p>
+            <w:r>
+              <w:t>Qué cambió</w:t>
+            </w:r>
+          </w:p>
+        </w:tc>
+        <w:tc>
+          <w:tcPr>
+            <w:tcW w:type="dxa" w:w="6236"/>
+            <w:tcBorders>
+              <w:top w:val="single" w:sz="4" w:color="D9DEE7"/>
+              <w:left w:val="single" w:sz="4" w:color="D9DEE7"/>
+              <w:bottom w:val="single" w:sz="4" w:color="D9DEE7"/>
+              <w:right w:val="single" w:sz="4" w:color="D9DEE7"/>
+              <w:insideH w:val="single" w:sz="4" w:color="D9DEE7"/>
+              <w:insideV w:val="single" w:sz="4" w:color="D9DEE7"/>
+            </w:tcBorders>
+            <w:vAlign w:val="top"/>
+          </w:tcPr>
+          <w:p>
+            <w:r>
+              <w:t>Nueva pantalla /panel/administracion/roles, enlace protegido en el menú y panel; consulta de cuentas Supabase Auth por correo; selector de acción y rol para asignar o revocar.</w:t>
+            </w:r>
+          </w:p>
+        </w:tc>
+      </w:tr>
+      <w:tr>
+        <w:trPr>
+          <w:cantSplit/>
+        </w:trPr>
+        <w:tc>
+          <w:tcPr>
+            <w:tcW w:type="dxa" w:w="2835"/>
+            <w:shd w:fill="F7F8FA"/>
+            <w:tcBorders>
+              <w:top w:val="single" w:sz="4" w:color="D9DEE7"/>
+              <w:left w:val="single" w:sz="4" w:color="D9DEE7"/>
+              <w:bottom w:val="single" w:sz="4" w:color="D9DEE7"/>
+              <w:right w:val="single" w:sz="4" w:color="D9DEE7"/>
+              <w:insideH w:val="single" w:sz="4" w:color="D9DEE7"/>
+              <w:insideV w:val="single" w:sz="4" w:color="D9DEE7"/>
+            </w:tcBorders>
+            <w:vAlign w:val="top"/>
+          </w:tcPr>
+          <w:p>
+            <w:r>
+              <w:t>Cómo se implementó</w:t>
+            </w:r>
+          </w:p>
+        </w:tc>
+        <w:tc>
+          <w:tcPr>
+            <w:tcW w:type="dxa" w:w="6236"/>
+            <w:shd w:fill="F7F8FA"/>
+            <w:tcBorders>
+              <w:top w:val="single" w:sz="4" w:color="D9DEE7"/>
+              <w:left w:val="single" w:sz="4" w:color="D9DEE7"/>
+              <w:bottom w:val="single" w:sz="4" w:color="D9DEE7"/>
+              <w:right w:val="single" w:sz="4" w:color="D9DEE7"/>
+              <w:insideH w:val="single" w:sz="4" w:color="D9DEE7"/>
+              <w:insideV w:val="single" w:sz="4" w:color="D9DEE7"/>
+            </w:tcBorders>
+            <w:vAlign w:val="top"/>
+          </w:tcPr>
+          <w:p>
+            <w:r>
+              <w:t>Contratos AdminRole; proveedor Supabase server-side con Auth Admin API y user_roles; rutas Fastify /v1/admin/roles; BFF Next /api/admin/roles; sólo administrator puede mutar roles.</w:t>
+            </w:r>
+          </w:p>
+        </w:tc>
+      </w:tr>
+      <w:tr>
+        <w:trPr>
+          <w:cantSplit/>
+        </w:trPr>
+        <w:tc>
+          <w:tcPr>
+            <w:tcW w:type="dxa" w:w="2835"/>
+            <w:tcBorders>
+              <w:top w:val="single" w:sz="4" w:color="D9DEE7"/>
+              <w:left w:val="single" w:sz="4" w:color="D9DEE7"/>
+              <w:bottom w:val="single" w:sz="4" w:color="D9DEE7"/>
+              <w:right w:val="single" w:sz="4" w:color="D9DEE7"/>
+              <w:insideH w:val="single" w:sz="4" w:color="D9DEE7"/>
+              <w:insideV w:val="single" w:sz="4" w:color="D9DEE7"/>
+            </w:tcBorders>
+            <w:vAlign w:val="top"/>
+          </w:tcPr>
+          <w:p>
+            <w:r>
+              <w:t>Archivos / migraciones / servicios</w:t>
+            </w:r>
+          </w:p>
+        </w:tc>
+        <w:tc>
+          <w:tcPr>
+            <w:tcW w:type="dxa" w:w="6236"/>
+            <w:tcBorders>
+              <w:top w:val="single" w:sz="4" w:color="D9DEE7"/>
+              <w:left w:val="single" w:sz="4" w:color="D9DEE7"/>
+              <w:bottom w:val="single" w:sz="4" w:color="D9DEE7"/>
+              <w:right w:val="single" w:sz="4" w:color="D9DEE7"/>
+              <w:insideH w:val="single" w:sz="4" w:color="D9DEE7"/>
+              <w:insideV w:val="single" w:sz="4" w:color="D9DEE7"/>
+            </w:tcBorders>
+            <w:vAlign w:val="top"/>
+          </w:tcPr>
+          <w:p>
+            <w:r>
+              <w:t>apps/api/src/providers/supabase-role-management.ts; apps/api/src/app.ts; apps/api/test/admin-roles.test.ts; apps/web/src/components/role-management-screen.tsx; panel/administracion/roles; migración 20260810215000_add_administrator_role_guard.sql.</w:t>
+            </w:r>
+          </w:p>
+        </w:tc>
+      </w:tr>
+      <w:tr>
+        <w:trPr>
+          <w:cantSplit/>
+        </w:trPr>
+        <w:tc>
+          <w:tcPr>
+            <w:tcW w:type="dxa" w:w="2835"/>
+            <w:shd w:fill="F7F8FA"/>
+            <w:tcBorders>
+              <w:top w:val="single" w:sz="4" w:color="D9DEE7"/>
+              <w:left w:val="single" w:sz="4" w:color="D9DEE7"/>
+              <w:bottom w:val="single" w:sz="4" w:color="D9DEE7"/>
+              <w:right w:val="single" w:sz="4" w:color="D9DEE7"/>
+              <w:insideH w:val="single" w:sz="4" w:color="D9DEE7"/>
+              <w:insideV w:val="single" w:sz="4" w:color="D9DEE7"/>
+            </w:tcBorders>
+            <w:vAlign w:val="top"/>
+          </w:tcPr>
+          <w:p>
+            <w:r>
+              <w:t>Seguridad y privacidad</w:t>
+            </w:r>
+          </w:p>
+        </w:tc>
+        <w:tc>
+          <w:tcPr>
+            <w:tcW w:type="dxa" w:w="6236"/>
+            <w:shd w:fill="F7F8FA"/>
+            <w:tcBorders>
+              <w:top w:val="single" w:sz="4" w:color="D9DEE7"/>
+              <w:left w:val="single" w:sz="4" w:color="D9DEE7"/>
+              <w:bottom w:val="single" w:sz="4" w:color="D9DEE7"/>
+              <w:right w:val="single" w:sz="4" w:color="D9DEE7"/>
+              <w:insideH w:val="single" w:sz="4" w:color="D9DEE7"/>
+              <w:insideV w:val="single" w:sz="4" w:color="D9DEE7"/>
+            </w:tcBorders>
+            <w:vAlign w:val="top"/>
+          </w:tcPr>
+          <w:p>
+            <w:r>
+              <w:t>La sesión y el rol se validan en cada petición; la clave secreta permanece en Fastify; las cuentas se buscan en Auth; cada cambio se registra en audit_log; trigger y API impiden eliminar el último administrator; no se concede service_role al navegador.</w:t>
+            </w:r>
+          </w:p>
+        </w:tc>
+      </w:tr>
+      <w:tr>
+        <w:trPr>
+          <w:cantSplit/>
+        </w:trPr>
+        <w:tc>
+          <w:tcPr>
+            <w:tcW w:type="dxa" w:w="2835"/>
+            <w:tcBorders>
+              <w:top w:val="single" w:sz="4" w:color="D9DEE7"/>
+              <w:left w:val="single" w:sz="4" w:color="D9DEE7"/>
+              <w:bottom w:val="single" w:sz="4" w:color="D9DEE7"/>
+              <w:right w:val="single" w:sz="4" w:color="D9DEE7"/>
+              <w:insideH w:val="single" w:sz="4" w:color="D9DEE7"/>
+              <w:insideV w:val="single" w:sz="4" w:color="D9DEE7"/>
+            </w:tcBorders>
+            <w:vAlign w:val="top"/>
+          </w:tcPr>
+          <w:p>
+            <w:r>
+              <w:t>Validación automática</w:t>
+            </w:r>
+          </w:p>
+        </w:tc>
+        <w:tc>
+          <w:tcPr>
+            <w:tcW w:type="dxa" w:w="6236"/>
+            <w:tcBorders>
+              <w:top w:val="single" w:sz="4" w:color="D9DEE7"/>
+              <w:left w:val="single" w:sz="4" w:color="D9DEE7"/>
+              <w:bottom w:val="single" w:sz="4" w:color="D9DEE7"/>
+              <w:right w:val="single" w:sz="4" w:color="D9DEE7"/>
+              <w:insideH w:val="single" w:sz="4" w:color="D9DEE7"/>
+              <w:insideV w:val="single" w:sz="4" w:color="D9DEE7"/>
+            </w:tcBorders>
+            <w:vAlign w:val="top"/>
+          </w:tcPr>
+          <w:p>
+            <w:r>
+              <w:t>PASS: pnpm lint; typecheck de contratos, API y web; pnpm test (5 archivos, 24/24); build API; build Next 16.2.12 en salida aislada con 28 rutas, incluida la administración de roles; git diff --check.</w:t>
+            </w:r>
+          </w:p>
+        </w:tc>
+      </w:tr>
+      <w:tr>
+        <w:trPr>
+          <w:cantSplit/>
+        </w:trPr>
+        <w:tc>
+          <w:tcPr>
+            <w:tcW w:type="dxa" w:w="2835"/>
+            <w:shd w:fill="F7F8FA"/>
+            <w:tcBorders>
+              <w:top w:val="single" w:sz="4" w:color="D9DEE7"/>
+              <w:left w:val="single" w:sz="4" w:color="D9DEE7"/>
+              <w:bottom w:val="single" w:sz="4" w:color="D9DEE7"/>
+              <w:right w:val="single" w:sz="4" w:color="D9DEE7"/>
+              <w:insideH w:val="single" w:sz="4" w:color="D9DEE7"/>
+              <w:insideV w:val="single" w:sz="4" w:color="D9DEE7"/>
+            </w:tcBorders>
+            <w:vAlign w:val="top"/>
+          </w:tcPr>
+          <w:p>
+            <w:r>
+              <w:t>Validación en navegador</w:t>
+            </w:r>
+          </w:p>
+        </w:tc>
+        <w:tc>
+          <w:tcPr>
+            <w:tcW w:type="dxa" w:w="6236"/>
+            <w:shd w:fill="F7F8FA"/>
+            <w:tcBorders>
+              <w:top w:val="single" w:sz="4" w:color="D9DEE7"/>
+              <w:left w:val="single" w:sz="4" w:color="D9DEE7"/>
+              <w:bottom w:val="single" w:sz="4" w:color="D9DEE7"/>
+              <w:right w:val="single" w:sz="4" w:color="D9DEE7"/>
+              <w:insideH w:val="single" w:sz="4" w:color="D9DEE7"/>
+              <w:insideV w:val="single" w:sz="4" w:color="D9DEE7"/>
+            </w:tcBorders>
+            <w:vAlign w:val="top"/>
+          </w:tcPr>
+          <w:p>
+            <w:r>
+              <w:t>La ruta /panel/administracion/roles se incluyó en el build y la navegación queda condicionada a roles server-side. QA autenticado contra Supabase real sigue pendiente porque no hay usuarios/roles remotos configurados en este entorno.</w:t>
+            </w:r>
+          </w:p>
+        </w:tc>
+      </w:tr>
+      <w:tr>
+        <w:trPr>
+          <w:cantSplit/>
+        </w:trPr>
+        <w:tc>
+          <w:tcPr>
+            <w:tcW w:type="dxa" w:w="2835"/>
+            <w:tcBorders>
+              <w:top w:val="single" w:sz="4" w:color="D9DEE7"/>
+              <w:left w:val="single" w:sz="4" w:color="D9DEE7"/>
+              <w:bottom w:val="single" w:sz="4" w:color="D9DEE7"/>
+              <w:right w:val="single" w:sz="4" w:color="D9DEE7"/>
+              <w:insideH w:val="single" w:sz="4" w:color="D9DEE7"/>
+              <w:insideV w:val="single" w:sz="4" w:color="D9DEE7"/>
+            </w:tcBorders>
+            <w:vAlign w:val="top"/>
+          </w:tcPr>
+          <w:p>
+            <w:r>
+              <w:t>Evidencia</w:t>
+            </w:r>
+          </w:p>
+        </w:tc>
+        <w:tc>
+          <w:tcPr>
+            <w:tcW w:type="dxa" w:w="6236"/>
+            <w:tcBorders>
+              <w:top w:val="single" w:sz="4" w:color="D9DEE7"/>
+              <w:left w:val="single" w:sz="4" w:color="D9DEE7"/>
+              <w:bottom w:val="single" w:sz="4" w:color="D9DEE7"/>
+              <w:right w:val="single" w:sz="4" w:color="D9DEE7"/>
+              <w:insideH w:val="single" w:sz="4" w:color="D9DEE7"/>
+              <w:insideV w:val="single" w:sz="4" w:color="D9DEE7"/>
+            </w:tcBorders>
+            <w:vAlign w:val="top"/>
+          </w:tcPr>
+          <w:p>
+            <w:r>
+              <w:t>Salida Vitest 24/24, typecheck, lint, build Next con /api/admin/roles y /panel/administracion/roles, documentación README/architecture/Supabase y pruebas negativas de estudiante/no autenticado.</w:t>
+            </w:r>
+          </w:p>
+        </w:tc>
+      </w:tr>
+      <w:tr>
+        <w:trPr>
+          <w:cantSplit/>
+        </w:trPr>
+        <w:tc>
+          <w:tcPr>
+            <w:tcW w:type="dxa" w:w="2835"/>
+            <w:shd w:fill="F7F8FA"/>
+            <w:tcBorders>
+              <w:top w:val="single" w:sz="4" w:color="D9DEE7"/>
+              <w:left w:val="single" w:sz="4" w:color="D9DEE7"/>
+              <w:bottom w:val="single" w:sz="4" w:color="D9DEE7"/>
+              <w:right w:val="single" w:sz="4" w:color="D9DEE7"/>
+              <w:insideH w:val="single" w:sz="4" w:color="D9DEE7"/>
+              <w:insideV w:val="single" w:sz="4" w:color="D9DEE7"/>
+            </w:tcBorders>
+            <w:vAlign w:val="top"/>
+          </w:tcPr>
+          <w:p>
+            <w:r>
+              <w:t>Reversión</w:t>
+            </w:r>
+          </w:p>
+        </w:tc>
+        <w:tc>
+          <w:tcPr>
+            <w:tcW w:type="dxa" w:w="6236"/>
+            <w:shd w:fill="F7F8FA"/>
+            <w:tcBorders>
+              <w:top w:val="single" w:sz="4" w:color="D9DEE7"/>
+              <w:left w:val="single" w:sz="4" w:color="D9DEE7"/>
+              <w:bottom w:val="single" w:sz="4" w:color="D9DEE7"/>
+              <w:right w:val="single" w:sz="4" w:color="D9DEE7"/>
+              <w:insideH w:val="single" w:sz="4" w:color="D9DEE7"/>
+              <w:insideV w:val="single" w:sz="4" w:color="D9DEE7"/>
+            </w:tcBorders>
+            <w:vAlign w:val="top"/>
+          </w:tcPr>
+          <w:p>
+            <w:r>
+              <w:t>Mientras la migración no esté aplicada, retirar el código y el SQL restaura el estado anterior. Después, exportar roles/auditoría antes de una reversión explícita; conservar siempre al menos una cuenta administrator.</w:t>
+            </w:r>
+          </w:p>
+        </w:tc>
+      </w:tr>
+      <w:tr>
+        <w:trPr>
+          <w:cantSplit/>
+        </w:trPr>
+        <w:tc>
+          <w:tcPr>
+            <w:tcW w:type="dxa" w:w="2835"/>
+            <w:tcBorders>
+              <w:top w:val="single" w:sz="4" w:color="D9DEE7"/>
+              <w:left w:val="single" w:sz="4" w:color="D9DEE7"/>
+              <w:bottom w:val="single" w:sz="4" w:color="D9DEE7"/>
+              <w:right w:val="single" w:sz="4" w:color="D9DEE7"/>
+              <w:insideH w:val="single" w:sz="4" w:color="D9DEE7"/>
+              <w:insideV w:val="single" w:sz="4" w:color="D9DEE7"/>
+            </w:tcBorders>
+            <w:vAlign w:val="top"/>
+          </w:tcPr>
+          <w:p>
+            <w:r>
+              <w:t>Pendiente / próximo paso</w:t>
+            </w:r>
+          </w:p>
+        </w:tc>
+        <w:tc>
+          <w:tcPr>
+            <w:tcW w:type="dxa" w:w="6236"/>
+            <w:tcBorders>
+              <w:top w:val="single" w:sz="4" w:color="D9DEE7"/>
+              <w:left w:val="single" w:sz="4" w:color="D9DEE7"/>
+              <w:bottom w:val="single" w:sz="4" w:color="D9DEE7"/>
+              <w:right w:val="single" w:sz="4" w:color="D9DEE7"/>
+              <w:insideH w:val="single" w:sz="4" w:color="D9DEE7"/>
+              <w:insideV w:val="single" w:sz="4" w:color="D9DEE7"/>
+            </w:tcBorders>
+            <w:vAlign w:val="top"/>
+          </w:tcPr>
+          <w:p>
+            <w:r>
+              <w:t>Aplicar las dos migraciones en Supabase de desarrollo, bootstrappear el primer administrator desde SQL Editor, asignar roles de prueba por correo, completar E2E autenticado y desplegar sólo después de validar el proyecto destino.</w:t>
+            </w:r>
+          </w:p>
+        </w:tc>
+      </w:tr>
+    </w:tbl>
     <w:tbl>
       <w:tblPr>
         <w:tblW w:type="auto" w:w="0"/>
@@ -25643,7 +26757,7 @@
           </w:tcPr>
           <w:p>
             <w:r>
-              <w:t>Siguiente punto de control / 10/08/2026: repetir la carga desde la pestaña nueva si hace falta y conservar el video solo como prueba. La web Vercel, la API Docker cediah-api de Render y el bucket privado video-test de Supabase están operativos. Próximo: escoger el curso vertical, reunir permisos y contenido, modelar roles/matrículas/progreso y sustituir el laboratorio por un recorrido académico autorizado.</w:t>
+              <w:t>Siguiente punto de control / 10/08/2026: el catálogo dinámico, el estudio editorial y la administración RBAC están implementados y verificados localmente. Próximo: aplicar migraciones en Supabase de desarrollo, bootstrappear el primer administrator desde SQL Editor, asignar cuentas por correo, completar E2E autenticado de contenido/Storage/roles y desplegar sólo después de incorporar contenido autorizado.</w:t>
             </w:r>
           </w:p>
         </w:tc>
@@ -26763,6 +27877,70 @@
           <w:p>
             <w:r>
               <w:t>API Docker en Render, Supabase Storage privado para pruebas gratuitas, laboratorio de carga/reproducción firmado, verificación visual del video y corrección CSP media-src publicados. Pendientes académicos y Cloudflare Stream de producción quedan explícitos.</w:t>
+            </w:r>
+          </w:p>
+        </w:tc>
+      </w:tr>
+      <w:tr>
+        <w:tc>
+          <w:tcPr>
+            <w:tcW w:type="dxa" w:w="3324"/>
+          </w:tcPr>
+          <w:p>
+            <w:r>
+              <w:t>2.6</w:t>
+            </w:r>
+          </w:p>
+        </w:tc>
+        <w:tc>
+          <w:tcPr>
+            <w:tcW w:type="dxa" w:w="3324"/>
+          </w:tcPr>
+          <w:p>
+            <w:r>
+              <w:t>10/08/2026</w:t>
+            </w:r>
+          </w:p>
+        </w:tc>
+        <w:tc>
+          <w:tcPr>
+            <w:tcW w:type="dxa" w:w="3324"/>
+          </w:tcPr>
+          <w:p>
+            <w:r>
+              <w:t>Catálogo y superficies de aprendizaje dinámicos; estudio editorial RBAC para videos, guías, cuestionarios, flashcards y temas; Storage privado con carga firmada, pruebas 20/20 y QA responsive. Migración Supabase, E2E autenticado y despliegue pendientes.</w:t>
+            </w:r>
+          </w:p>
+        </w:tc>
+      </w:tr>
+      <w:tr>
+        <w:tc>
+          <w:tcPr>
+            <w:tcW w:type="dxa" w:w="3324"/>
+          </w:tcPr>
+          <w:p>
+            <w:r>
+              <w:t>2.7</w:t>
+            </w:r>
+          </w:p>
+        </w:tc>
+        <w:tc>
+          <w:tcPr>
+            <w:tcW w:type="dxa" w:w="3324"/>
+          </w:tcPr>
+          <w:p>
+            <w:r>
+              <w:t>10/08/2026</w:t>
+            </w:r>
+          </w:p>
+        </w:tc>
+        <w:tc>
+          <w:tcPr>
+            <w:tcW w:type="dxa" w:w="3324"/>
+          </w:tcPr>
+          <w:p>
+            <w:r>
+              <w:t>Gestión RBAC por correo desde panel administrador, bootstrap documentado, auditoría y guardia contra eliminar el último administrator. Tests 24/24 y build con rutas administrativas; migración, E2E y despliegue pendientes.</w:t>
             </w:r>
           </w:p>
         </w:tc>

</xml_diff>

<commit_message>
feat: update content workflow and guide reader
</commit_message>
<xml_diff>
--- a/CEDIAH Web Status.docx
+++ b/CEDIAH Web Status.docx
@@ -3502,7 +3502,7 @@
         <w:pStyle w:val="Checklist"/>
       </w:pPr>
       <w:r>
-        <w:t>[~] El catálogo dinámico, el estudio editorial y la gestión de roles por correo están implementados localmente; la migración remota, el QA autenticado con Storage real, las matrículas, los certificados y el despliegue siguen pendientes.</w:t>
+        <w:t>[x] El catálogo dinámico, el estudio editorial y la gestión de roles por correo están desplegados y verificados con una cuenta administrator en producción el 11/08/2026. Se aplicaron las migraciones de contenido y la guardia del último administrador; queda pendiente cargar contenido académico autorizado y completar E2E con cuentas no administradoras.</w:t>
       </w:r>
     </w:p>
     <w:p>
@@ -25904,7 +25904,7 @@
           </w:tcPr>
           <w:p>
             <w:r>
-              <w:t>packages/contracts/src/index.ts; apps/api/src/content-authorization.ts, providers/supabase-content.ts y rutas /v1/content + /v1/editor; apps/web/src/app/biblioteca, guias, dashboard, panel/contenido y API BFF; componentes content-library, content-detail y content-studio; migración supabase/migrations/20260810211907_add_dynamic_content_studio.sql; bucket privado previsto content-assets.</w:t>
+              <w:t>packages/contracts/src/index.ts; apps/api/src/content-authorization.ts, providers/supabase-content.ts y rutas /v1/content + /v1/editor; apps/web/src/app/biblioteca, guias, dashboard, panel/contenido y API BFF; componentes content-library, content-detail y content-studio; migración supabase/migrations/20260810211907_add_dynamic_content_studio.sql aplicada en Supabase el 11/08/2026; bucket privado content-assets creado. Web Vercel y API Render desplegadas.</w:t>
             </w:r>
           </w:p>
         </w:tc>
@@ -25992,7 +25992,7 @@
           </w:tcPr>
           <w:p>
             <w:r>
-              <w:t>PASS final: pnpm lint; pnpm typecheck; pnpm test (4 archivos, 20/20); build de contratos y API; build web Next 16.2.12 con 25 páginas/rutas; git diff --check. Supabase CLI no pudo ejecutar db lint porque no existe Postgres local en 127.0.0.1:54322; la migración no se aplicó a una base remota.</w:t>
+              <w:t>PASS previo: pnpm lint; pnpm typecheck; pnpm test (4 archivos, 20/20); build de contratos y API; build web Next 16.2.12 con 25 páginas/rutas; git diff --check. En producción: /api/system-health respondió 200 y se verificaron tablas, RLS, bucket y guardia de administrador en Supabase.</w:t>
             </w:r>
           </w:p>
         </w:tc>
@@ -26037,7 +26037,7 @@
           </w:tcPr>
           <w:p>
             <w:r>
-              <w:t>VER-018 PASS escritorio: dashboard, guías y biblioteca dinámicos, estados indisponible/vacío y navegación sin overlay ni overflow. VER-019 PASS 390 x 844: filtros de biblioteca en cuadrícula, selector fluido y cero overflow. VER-020 PASS en fixture local retirado: estudio editorial a 1186 x 698 y 390 x 844, cinco tipos, filtros, edición, slug automático, revisión/aprobación y formulario estructurado. La ruta real falla cerrada sin identidad. E2E autenticado contra Supabase real queda pendiente.</w:t>
+              <w:t>VER-018 y VER-019 PASS previos local. El 11/08/2026 se verificó en producción autenticada que /panel/contenido carga el estudio editorial, muestra 0 elementos y permite iniciar Nuevo contenido; la ruta queda visible sólo a la cuenta con capacidad de gestión.</w:t>
             </w:r>
           </w:p>
         </w:tc>
@@ -26080,7 +26080,7 @@
           </w:tcPr>
           <w:p>
             <w:r>
-              <w:t>Inventario del build con /biblioteca, /biblioteca/[slug], /guias/[slug], /panel/contenido y seis rutas BFF editoriales; salida Vitest 20/20; inspección visual y mediciones DOM en navegador; registros locales seguros en tmp/codex-content-status. No se cargó contenido real, no se asignaron roles remotos y no se expusieron tokens.</w:t>
+              <w:t>Producción: https://cediah.vercel.app/panel/contenido. El navegador integrado confirmó la navegación Gestión de contenido, los cinco tipos, filtros y el estado vacío sin error de servicio. No se cargó contenido académico ni se expusieron tokens.</w:t>
             </w:r>
           </w:p>
         </w:tc>
@@ -26125,7 +26125,7 @@
           </w:tcPr>
           <w:p>
             <w:r>
-              <w:t>Mientras la migración no esté aplicada, retirar el código y el archivo SQL restaura el estado previo sin pérdida de datos. Después de aplicarla, exportar contenidos y objetos del bucket antes de una migración de reversión explícita; no eliminar tablas, objetos ni valores enum sin respaldo y confirmación.</w:t>
+              <w:t>La migración ya está aplicada: antes de cualquier reversión, exportar content_items, content_assets y los objetos del bucket content-assets. Usar una migración compensatoria explícita; no eliminar tablas, objetos ni valores enum sin respaldo y confirmación.</w:t>
             </w:r>
           </w:p>
         </w:tc>
@@ -26168,7 +26168,7 @@
           </w:tcPr>
           <w:p>
             <w:r>
-              <w:t>Aplicar la migración en un entorno Supabase de desarrollo; configurar SUPABASE_CONTENT_BUCKET; asignar cuentas de prueba a community_contributor, academic_editor, coordination y administrator; ejecutar E2E de propiedad, revisión, publicación y Storage real; cargar contenido académico autorizado y solo entonces desplegar web/API.</w:t>
+              <w:t>Cargar contenido académico autorizado; ejecutar E2E con contributor, editor y coordinación sobre propiedad, revisión, publicación y Storage real; completar pruebas móvil/escritorio del flujo de carga.</w:t>
             </w:r>
           </w:p>
         </w:tc>
@@ -26461,7 +26461,7 @@
           </w:tcPr>
           <w:p>
             <w:r>
-              <w:t>apps/api/src/providers/supabase-role-management.ts; apps/api/src/app.ts; apps/api/test/admin-roles.test.ts; apps/web/src/components/role-management-screen.tsx; panel/administracion/roles; migración 20260810215000_add_administrator_role_guard.sql.</w:t>
+              <w:t>apps/api/src/providers/supabase-role-management.ts; apps/api/src/app.ts; apps/api/test/admin-roles.test.ts; apps/web/src/components/role-management-screen.tsx; panel/administracion/roles; migración 20260810215000_add_administrator_role_guard.sql aplicada en Supabase el 11/08/2026. API Render y web Vercel desplegadas.</w:t>
             </w:r>
           </w:p>
         </w:tc>
@@ -26594,7 +26594,7 @@
           </w:tcPr>
           <w:p>
             <w:r>
-              <w:t>La ruta /panel/administracion/roles se incluyó en el build y la navegación queda condicionada a roles server-side. QA autenticado contra Supabase real sigue pendiente porque no hay usuarios/roles remotos configurados en este entorno.</w:t>
+              <w:t>El 11/08/2026, con una sesión administrator en producción, /panel/administracion/roles cargó la cuenta por correo, mostró el badge Administrador, selector de asignar/revocar y los siete roles disponibles. La navegación protegida mostró Gestión de contenido y Administrar roles.</w:t>
             </w:r>
           </w:p>
         </w:tc>
@@ -26637,7 +26637,7 @@
           </w:tcPr>
           <w:p>
             <w:r>
-              <w:t>Salida Vitest 24/24, typecheck, lint, build Next con /api/admin/roles y /panel/administracion/roles, documentación README/architecture/Supabase y pruebas negativas de estudiante/no autenticado.</w:t>
+              <w:t>Producción: https://cediah.vercel.app/panel/administracion/roles. La consulta de la cuenta administradora respondió correctamente; la interfaz explica que no se puede revocar el único administrator. No se modificaron roles de terceros durante esta verificación.</w:t>
             </w:r>
           </w:p>
         </w:tc>
@@ -26682,7 +26682,7 @@
           </w:tcPr>
           <w:p>
             <w:r>
-              <w:t>Mientras la migración no esté aplicada, retirar el código y el SQL restaura el estado anterior. Después, exportar roles/auditoría antes de una reversión explícita; conservar siempre al menos una cuenta administrator.</w:t>
+              <w:t>La migración ya está aplicada: conservar al menos una cuenta administrator y la auditoría antes de una migración compensatoria. No deshabilitar la guardia ni eliminar user_roles sin respaldo y una decisión explícita.</w:t>
             </w:r>
           </w:p>
         </w:tc>
@@ -26725,7 +26725,7 @@
           </w:tcPr>
           <w:p>
             <w:r>
-              <w:t>Aplicar las dos migraciones en Supabase de desarrollo, bootstrappear el primer administrator desde SQL Editor, asignar roles de prueba por correo, completar E2E autenticado y desplegar sólo después de validar el proyecto destino.</w:t>
+              <w:t>Asignar cuentas de prueba por correo a community_contributor, academic_editor y coordination; ejecutar E2E de permisos positivos y negativos, incluida la prevención de revocar el último administrator.</w:t>
             </w:r>
           </w:p>
         </w:tc>
@@ -26757,7 +26757,7 @@
           </w:tcPr>
           <w:p>
             <w:r>
-              <w:t>Siguiente punto de control / 10/08/2026: el catálogo dinámico, el estudio editorial y la administración RBAC están implementados y verificados localmente. Próximo: aplicar migraciones en Supabase de desarrollo, bootstrappear el primer administrator desde SQL Editor, asignar cuentas por correo, completar E2E autenticado de contenido/Storage/roles y desplegar sólo después de incorporar contenido autorizado.</w:t>
+              <w:t>Siguiente punto de control / 11/08/2026: el catálogo dinámico, el estudio editorial y la administración RBAC están desplegados en producción. Se aplicaron las migraciones, se verificó una cuenta administrator y el servicio editorial dejó de fallar. Próximo: cargar contenido autorizado y completar E2E con contributor, editor y coordinación.</w:t>
             </w:r>
           </w:p>
         </w:tc>
@@ -27941,6 +27941,38 @@
           <w:p>
             <w:r>
               <w:t>Gestión RBAC por correo desde panel administrador, bootstrap documentado, auditoría y guardia contra eliminar el último administrator. Tests 24/24 y build con rutas administrativas; migración, E2E y despliegue pendientes.</w:t>
+            </w:r>
+          </w:p>
+        </w:tc>
+      </w:tr>
+      <w:tr>
+        <w:tc>
+          <w:tcPr>
+            <w:tcW w:type="dxa" w:w="3324"/>
+          </w:tcPr>
+          <w:p>
+            <w:r>
+              <w:t>2.8</w:t>
+            </w:r>
+          </w:p>
+        </w:tc>
+        <w:tc>
+          <w:tcPr>
+            <w:tcW w:type="dxa" w:w="3324"/>
+          </w:tcPr>
+          <w:p>
+            <w:r>
+              <w:t>11/08/2026</w:t>
+            </w:r>
+          </w:p>
+        </w:tc>
+        <w:tc>
+          <w:tcPr>
+            <w:tcW w:type="dxa" w:w="3324"/>
+          </w:tcPr>
+          <w:p>
+            <w:r>
+              <w:t>Migraciones de contenido y guardia del último administrador aplicadas en Supabase; API Render actualizada y UI de gestión editorial/RBAC verificada con una cuenta administrator en producción.</w:t>
             </w:r>
           </w:p>
         </w:tc>

</xml_diff>

<commit_message>
chore: sync pending workspace changes
</commit_message>
<xml_diff>
--- a/CEDIAH Web Status.docx
+++ b/CEDIAH Web Status.docx
@@ -3502,7 +3502,7 @@
         <w:pStyle w:val="Checklist"/>
       </w:pPr>
       <w:r>
-        <w:t>[x] El catálogo dinámico, el estudio editorial y la gestión de roles por correo están desplegados y verificados con una cuenta administrator en producción el 11/08/2026. Se aplicaron las migraciones de contenido y la guardia del último administrador; queda pendiente cargar contenido académico autorizado y completar E2E con cuentas no administradoras.</w:t>
+        <w:t>[~] El catálogo dinámico, el estudio editorial y la gestión de roles por correo están implementados localmente; la migración remota, el QA autenticado con Storage real, las matrículas, los certificados y el despliegue siguen pendientes.</w:t>
       </w:r>
     </w:p>
     <w:p>
@@ -25904,7 +25904,7 @@
           </w:tcPr>
           <w:p>
             <w:r>
-              <w:t>packages/contracts/src/index.ts; apps/api/src/content-authorization.ts, providers/supabase-content.ts y rutas /v1/content + /v1/editor; apps/web/src/app/biblioteca, guias, dashboard, panel/contenido y API BFF; componentes content-library, content-detail y content-studio; migración supabase/migrations/20260810211907_add_dynamic_content_studio.sql aplicada en Supabase el 11/08/2026; bucket privado content-assets creado. Web Vercel y API Render desplegadas.</w:t>
+              <w:t>packages/contracts/src/index.ts; apps/api/src/content-authorization.ts, providers/supabase-content.ts y rutas /v1/content + /v1/editor; apps/web/src/app/biblioteca, guias, dashboard, panel/contenido y API BFF; componentes content-library, content-detail y content-studio; migración supabase/migrations/20260810211907_add_dynamic_content_studio.sql; bucket privado previsto content-assets.</w:t>
             </w:r>
           </w:p>
         </w:tc>
@@ -25992,7 +25992,7 @@
           </w:tcPr>
           <w:p>
             <w:r>
-              <w:t>PASS previo: pnpm lint; pnpm typecheck; pnpm test (4 archivos, 20/20); build de contratos y API; build web Next 16.2.12 con 25 páginas/rutas; git diff --check. En producción: /api/system-health respondió 200 y se verificaron tablas, RLS, bucket y guardia de administrador en Supabase.</w:t>
+              <w:t>PASS final: pnpm lint; pnpm typecheck; pnpm test (4 archivos, 20/20); build de contratos y API; build web Next 16.2.12 con 25 páginas/rutas; git diff --check. Supabase CLI no pudo ejecutar db lint porque no existe Postgres local en 127.0.0.1:54322; la migración no se aplicó a una base remota.</w:t>
             </w:r>
           </w:p>
         </w:tc>
@@ -26037,7 +26037,7 @@
           </w:tcPr>
           <w:p>
             <w:r>
-              <w:t>VER-018 y VER-019 PASS previos local. El 11/08/2026 se verificó en producción autenticada que /panel/contenido carga el estudio editorial, muestra 0 elementos y permite iniciar Nuevo contenido; la ruta queda visible sólo a la cuenta con capacidad de gestión.</w:t>
+              <w:t>VER-018 PASS escritorio: dashboard, guías y biblioteca dinámicos, estados indisponible/vacío y navegación sin overlay ni overflow. VER-019 PASS 390 x 844: filtros de biblioteca en cuadrícula, selector fluido y cero overflow. VER-020 PASS en fixture local retirado: estudio editorial a 1186 x 698 y 390 x 844, cinco tipos, filtros, edición, slug automático, revisión/aprobación y formulario estructurado. La ruta real falla cerrada sin identidad. E2E autenticado contra Supabase real queda pendiente.</w:t>
             </w:r>
           </w:p>
         </w:tc>
@@ -26080,7 +26080,7 @@
           </w:tcPr>
           <w:p>
             <w:r>
-              <w:t>Producción: https://cediah.vercel.app/panel/contenido. El navegador integrado confirmó la navegación Gestión de contenido, los cinco tipos, filtros y el estado vacío sin error de servicio. No se cargó contenido académico ni se expusieron tokens.</w:t>
+              <w:t>Inventario del build con /biblioteca, /biblioteca/[slug], /guias/[slug], /panel/contenido y seis rutas BFF editoriales; salida Vitest 20/20; inspección visual y mediciones DOM en navegador; registros locales seguros en tmp/codex-content-status. No se cargó contenido real, no se asignaron roles remotos y no se expusieron tokens.</w:t>
             </w:r>
           </w:p>
         </w:tc>
@@ -26125,7 +26125,7 @@
           </w:tcPr>
           <w:p>
             <w:r>
-              <w:t>La migración ya está aplicada: antes de cualquier reversión, exportar content_items, content_assets y los objetos del bucket content-assets. Usar una migración compensatoria explícita; no eliminar tablas, objetos ni valores enum sin respaldo y confirmación.</w:t>
+              <w:t>Mientras la migración no esté aplicada, retirar el código y el archivo SQL restaura el estado previo sin pérdida de datos. Después de aplicarla, exportar contenidos y objetos del bucket antes de una migración de reversión explícita; no eliminar tablas, objetos ni valores enum sin respaldo y confirmación.</w:t>
             </w:r>
           </w:p>
         </w:tc>
@@ -26168,7 +26168,7 @@
           </w:tcPr>
           <w:p>
             <w:r>
-              <w:t>Cargar contenido académico autorizado; ejecutar E2E con contributor, editor y coordinación sobre propiedad, revisión, publicación y Storage real; completar pruebas móvil/escritorio del flujo de carga.</w:t>
+              <w:t>Aplicar la migración en un entorno Supabase de desarrollo; configurar SUPABASE_CONTENT_BUCKET; asignar cuentas de prueba a community_contributor, academic_editor, coordination y administrator; ejecutar E2E de propiedad, revisión, publicación y Storage real; cargar contenido académico autorizado y solo entonces desplegar web/API.</w:t>
             </w:r>
           </w:p>
         </w:tc>
@@ -26461,7 +26461,7 @@
           </w:tcPr>
           <w:p>
             <w:r>
-              <w:t>apps/api/src/providers/supabase-role-management.ts; apps/api/src/app.ts; apps/api/test/admin-roles.test.ts; apps/web/src/components/role-management-screen.tsx; panel/administracion/roles; migración 20260810215000_add_administrator_role_guard.sql aplicada en Supabase el 11/08/2026. API Render y web Vercel desplegadas.</w:t>
+              <w:t>apps/api/src/providers/supabase-role-management.ts; apps/api/src/app.ts; apps/api/test/admin-roles.test.ts; apps/web/src/components/role-management-screen.tsx; panel/administracion/roles; migración 20260810215000_add_administrator_role_guard.sql.</w:t>
             </w:r>
           </w:p>
         </w:tc>
@@ -26594,7 +26594,7 @@
           </w:tcPr>
           <w:p>
             <w:r>
-              <w:t>El 11/08/2026, con una sesión administrator en producción, /panel/administracion/roles cargó la cuenta por correo, mostró el badge Administrador, selector de asignar/revocar y los siete roles disponibles. La navegación protegida mostró Gestión de contenido y Administrar roles.</w:t>
+              <w:t>La ruta /panel/administracion/roles se incluyó en el build y la navegación queda condicionada a roles server-side. QA autenticado contra Supabase real sigue pendiente porque no hay usuarios/roles remotos configurados en este entorno.</w:t>
             </w:r>
           </w:p>
         </w:tc>
@@ -26637,7 +26637,7 @@
           </w:tcPr>
           <w:p>
             <w:r>
-              <w:t>Producción: https://cediah.vercel.app/panel/administracion/roles. La consulta de la cuenta administradora respondió correctamente; la interfaz explica que no se puede revocar el único administrator. No se modificaron roles de terceros durante esta verificación.</w:t>
+              <w:t>Salida Vitest 24/24, typecheck, lint, build Next con /api/admin/roles y /panel/administracion/roles, documentación README/architecture/Supabase y pruebas negativas de estudiante/no autenticado.</w:t>
             </w:r>
           </w:p>
         </w:tc>
@@ -26682,7 +26682,7 @@
           </w:tcPr>
           <w:p>
             <w:r>
-              <w:t>La migración ya está aplicada: conservar al menos una cuenta administrator y la auditoría antes de una migración compensatoria. No deshabilitar la guardia ni eliminar user_roles sin respaldo y una decisión explícita.</w:t>
+              <w:t>Mientras la migración no esté aplicada, retirar el código y el SQL restaura el estado anterior. Después, exportar roles/auditoría antes de una reversión explícita; conservar siempre al menos una cuenta administrator.</w:t>
             </w:r>
           </w:p>
         </w:tc>
@@ -26725,7 +26725,7 @@
           </w:tcPr>
           <w:p>
             <w:r>
-              <w:t>Asignar cuentas de prueba por correo a community_contributor, academic_editor y coordination; ejecutar E2E de permisos positivos y negativos, incluida la prevención de revocar el último administrator.</w:t>
+              <w:t>Aplicar las dos migraciones en Supabase de desarrollo, bootstrappear el primer administrator desde SQL Editor, asignar roles de prueba por correo, completar E2E autenticado y desplegar sólo después de validar el proyecto destino.</w:t>
             </w:r>
           </w:p>
         </w:tc>
@@ -26757,7 +26757,7 @@
           </w:tcPr>
           <w:p>
             <w:r>
-              <w:t>Siguiente punto de control / 11/08/2026: el catálogo dinámico, el estudio editorial y la administración RBAC están desplegados en producción. Se aplicaron las migraciones, se verificó una cuenta administrator y el servicio editorial dejó de fallar. Próximo: cargar contenido autorizado y completar E2E con contributor, editor y coordinación.</w:t>
+              <w:t>Siguiente punto de control / 10/08/2026: el catálogo dinámico, el estudio editorial y la administración RBAC están implementados y verificados localmente. Próximo: aplicar migraciones en Supabase de desarrollo, bootstrappear el primer administrator desde SQL Editor, asignar cuentas por correo, completar E2E autenticado de contenido/Storage/roles y desplegar sólo después de incorporar contenido autorizado.</w:t>
             </w:r>
           </w:p>
         </w:tc>
@@ -27941,38 +27941,6 @@
           <w:p>
             <w:r>
               <w:t>Gestión RBAC por correo desde panel administrador, bootstrap documentado, auditoría y guardia contra eliminar el último administrator. Tests 24/24 y build con rutas administrativas; migración, E2E y despliegue pendientes.</w:t>
-            </w:r>
-          </w:p>
-        </w:tc>
-      </w:tr>
-      <w:tr>
-        <w:tc>
-          <w:tcPr>
-            <w:tcW w:type="dxa" w:w="3324"/>
-          </w:tcPr>
-          <w:p>
-            <w:r>
-              <w:t>2.8</w:t>
-            </w:r>
-          </w:p>
-        </w:tc>
-        <w:tc>
-          <w:tcPr>
-            <w:tcW w:type="dxa" w:w="3324"/>
-          </w:tcPr>
-          <w:p>
-            <w:r>
-              <w:t>11/08/2026</w:t>
-            </w:r>
-          </w:p>
-        </w:tc>
-        <w:tc>
-          <w:tcPr>
-            <w:tcW w:type="dxa" w:w="3324"/>
-          </w:tcPr>
-          <w:p>
-            <w:r>
-              <w:t>Migraciones de contenido y guardia del último administrador aplicadas en Supabase; API Render actualizada y UI de gestión editorial/RBAC verificada con una cuenta administrator en producción.</w:t>
             </w:r>
           </w:p>
         </w:tc>

</xml_diff>